<commit_message>
Map official titles to template roles
</commit_message>
<xml_diff>
--- a/templates/CGV AICS Template.fixed.docx
+++ b/templates/CGV AICS Template.fixed.docx
@@ -1,6 +1,6 @@
 
 <file path=word/document.xml><?xml version="1.0" encoding="utf-8"?>
-<w:document xmlns:wpc="http://schemas.microsoft.com/office/word/2010/wordprocessingCanvas" xmlns:cx="http://schemas.microsoft.com/office/drawing/2014/chartex" xmlns:cx1="http://schemas.microsoft.com/office/drawing/2015/9/8/chartex" xmlns:cx2="http://schemas.microsoft.com/office/drawing/2015/10/21/chartex" xmlns:cx3="http://schemas.microsoft.com/office/drawing/2016/5/9/chartex" xmlns:cx4="http://schemas.microsoft.com/office/drawing/2016/5/10/chartex" xmlns:cx5="http://schemas.microsoft.com/office/drawing/2016/5/11/chartex" xmlns:cx6="http://schemas.microsoft.com/office/drawing/2016/5/12/chartex" xmlns:cx7="http://schemas.microsoft.com/office/drawing/2016/5/13/chartex" xmlns:cx8="http://schemas.microsoft.com/office/drawing/2016/5/14/chartex" xmlns:mc="http://schemas.openxmlformats.org/markup-compatibility/2006" xmlns:aink="http://schemas.microsoft.com/office/drawing/2016/ink" xmlns:am3d="http://schemas.microsoft.com/office/drawing/2017/model3d" xmlns:o="urn:schemas-microsoft-com:office:office" xmlns:oel="http://schemas.microsoft.com/office/2019/extlst" xmlns:r="http://schemas.openxmlformats.org/officeDocument/2006/relationships" xmlns:m="http://schemas.openxmlformats.org/officeDocument/2006/math" xmlns:v="urn:schemas-microsoft-com:vml" xmlns:wp14="http://schemas.microsoft.com/office/word/2010/wordprocessingDrawing" xmlns:wp="http://schemas.openxmlformats.org/drawingml/2006/wordprocessingDrawing" xmlns:w10="urn:schemas-microsoft-com:office:word" xmlns:w="http://schemas.openxmlformats.org/wordprocessingml/2006/main" xmlns:w14="http://schemas.microsoft.com/office/word/2010/wordml" xmlns:w15="http://schemas.microsoft.com/office/word/2012/wordml" xmlns:w16cex="http://schemas.microsoft.com/office/word/2018/wordml/cex" xmlns:w16cid="http://schemas.microsoft.com/office/word/2016/wordml/cid" xmlns:w16="http://schemas.microsoft.com/office/word/2018/wordml" xmlns:w16du="http://schemas.microsoft.com/office/word/2023/wordml/word16du" xmlns:w16sdtdh="http://schemas.microsoft.com/office/word/2020/wordml/sdtdatahash" xmlns:w16sdtfl="http://schemas.microsoft.com/office/word/2024/wordml/sdtformatlock" xmlns:w16se="http://schemas.microsoft.com/office/word/2015/wordml/symex" xmlns:wpg="http://schemas.microsoft.com/office/word/2010/wordprocessingGroup" xmlns:wpi="http://schemas.microsoft.com/office/word/2010/wordprocessingInk" xmlns:wne="http://schemas.microsoft.com/office/word/2006/wordml" xmlns:wps="http://schemas.microsoft.com/office/word/2010/wordprocessingShape" mc:Ignorable="w14 w15 w16se w16cid w16 w16cex w16sdtdh w16sdtfl w16du wp14">
+<w:document xmlns:wpc="http://schemas.microsoft.com/office/word/2010/wordprocessingCanvas" xmlns:cx="http://schemas.microsoft.com/office/drawing/2014/chartex" xmlns:cx1="http://schemas.microsoft.com/office/drawing/2015/9/8/chartex" xmlns:cx2="http://schemas.microsoft.com/office/drawing/2015/10/21/chartex" xmlns:cx3="http://schemas.microsoft.com/office/drawing/2016/5/9/chartex" xmlns:cx4="http://schemas.microsoft.com/office/drawing/2016/5/10/chartex" xmlns:cx5="http://schemas.microsoft.com/office/drawing/2016/5/11/chartex" xmlns:cx6="http://schemas.microsoft.com/office/drawing/2016/5/12/chartex" xmlns:cx7="http://schemas.microsoft.com/office/drawing/2016/5/13/chartex" xmlns:cx8="http://schemas.microsoft.com/office/drawing/2016/5/14/chartex" xmlns:mc="http://schemas.openxmlformats.org/markup-compatibility/2006" xmlns:aink="http://schemas.microsoft.com/office/drawing/2016/ink" xmlns:am3d="http://schemas.microsoft.com/office/drawing/2017/model3d" xmlns:o="urn:schemas-microsoft-com:office:office" xmlns:oel="http://schemas.microsoft.com/office/2019/extlst" xmlns:r="http://schemas.openxmlformats.org/officeDocument/2006/relationships" xmlns:m="http://schemas.openxmlformats.org/officeDocument/2006/math" xmlns:v="urn:schemas-microsoft-com:vml" xmlns:wp14="http://schemas.microsoft.com/office/word/2010/wordprocessingDrawing" xmlns:wp="http://schemas.openxmlformats.org/drawingml/2006/wordprocessingDrawing" xmlns:w10="urn:schemas-microsoft-com:office:word" xmlns:w="http://schemas.openxmlformats.org/wordprocessingml/2006/main" xmlns:w14="http://schemas.microsoft.com/office/word/2010/wordml" xmlns:w15="http://schemas.microsoft.com/office/word/2012/wordml" xmlns:w16cei="http://schemas.microsoft.com/office/word/2026/wordml/cei" xmlns:w16cex="http://schemas.microsoft.com/office/word/2018/wordml/cex" xmlns:w16cid="http://schemas.microsoft.com/office/word/2016/wordml/cid" xmlns:w16="http://schemas.microsoft.com/office/word/2018/wordml" xmlns:w16du="http://schemas.microsoft.com/office/word/2023/wordml/word16du" xmlns:w16sdtdh="http://schemas.microsoft.com/office/word/2020/wordml/sdtdatahash" xmlns:w16sdtfl="http://schemas.microsoft.com/office/word/2024/wordml/sdtformatlock" xmlns:w16se="http://schemas.microsoft.com/office/word/2015/wordml/symex" xmlns:wpg="http://schemas.microsoft.com/office/word/2010/wordprocessingGroup" xmlns:wpi="http://schemas.microsoft.com/office/word/2010/wordprocessingInk" xmlns:wne="http://schemas.microsoft.com/office/word/2006/wordml" xmlns:wps="http://schemas.microsoft.com/office/word/2010/wordprocessingShape" mc:Ignorable="w14 w15 w16se w16cid w16 w16cex w16sdtdh w16sdtfl w16du wp14">
   <w:body>
     <w:p>
       <w:pPr>
@@ -247,7 +247,27 @@
           <w:sz w:val="14"/>
           <w:szCs w:val="14"/>
         </w:rPr>
-        <w:t xml:space="preserve">{hospitalCheckBox}Hospitalization Expenses </w:t>
+        <w:t>{</w:t>
+      </w:r>
+      <w:proofErr w:type="spellStart"/>
+      <w:r>
+        <w:rPr>
+          <w:rFonts w:ascii="MS Gothic" w:eastAsia="MS Gothic" w:hAnsi="MS Gothic"/>
+          <w:kern w:val="0"/>
+          <w:sz w:val="14"/>
+          <w:szCs w:val="14"/>
+        </w:rPr>
+        <w:t>hospitalCheckBox</w:t>
+      </w:r>
+      <w:proofErr w:type="spellEnd"/>
+      <w:r>
+        <w:rPr>
+          <w:rFonts w:ascii="MS Gothic" w:eastAsia="MS Gothic" w:hAnsi="MS Gothic"/>
+          <w:kern w:val="0"/>
+          <w:sz w:val="14"/>
+          <w:szCs w:val="14"/>
+        </w:rPr>
+        <w:t xml:space="preserve">}Hospitalization Expenses </w:t>
       </w:r>
       <w:proofErr w:type="gramStart"/>
       <w:r>
@@ -1833,23 +1853,13 @@
                 <w:szCs w:val="20"/>
               </w:rPr>
             </w:pPr>
-            <w:proofErr w:type="gramStart"/>
             <w:r>
               <w:rPr>
                 <w:rFonts w:ascii="Georgia" w:hAnsi="Georgia" w:cs="Arial"/>
                 <w:sz w:val="20"/>
                 <w:szCs w:val="20"/>
               </w:rPr>
-              <w:t>{occupation}{/</w:t>
-            </w:r>
-            <w:proofErr w:type="gramEnd"/>
-            <w:r>
-              <w:rPr>
-                <w:rFonts w:ascii="Georgia" w:hAnsi="Georgia" w:cs="Arial"/>
-                <w:sz w:val="20"/>
-                <w:szCs w:val="20"/>
-              </w:rPr>
-              <w:t>familyComposition}</w:t>
+              <w:t>{occupation}{/familyComposition}</w:t>
             </w:r>
           </w:p>
         </w:tc>
@@ -4356,40 +4366,6 @@
           <w:szCs w:val="20"/>
         </w:rPr>
       </w:pPr>
-      <w:r>
-        <w:rPr>
-          <w:rFonts w:ascii="Georgia" w:hAnsi="Georgia"/>
-          <w:i/>
-          <w:iCs/>
-          <w:kern w:val="0"/>
-          <w:sz w:val="20"/>
-          <w:szCs w:val="20"/>
-        </w:rPr>
-        <w:t>This is the beneficiary's  {firstAvailmentCheckBox} first {subsequentAvailmentCheckBox} subsequent availment within a three-month period.</w:t>
-      </w:r>
-      <w:r>
-        <w:rPr>
-          <w:rFonts w:ascii="Georgia" w:eastAsia="Georgia" w:hAnsi="Georgia" w:cs="Georgia"/>
-          <w:i/>
-          <w:iCs/>
-          <w:kern w:val="0"/>
-          <w:sz w:val="20"/>
-          <w:szCs w:val="20"/>
-        </w:rPr>
-        <w:tab/>
-      </w:r>
-    </w:p>
-    <w:p>
-      <w:pPr>
-        <w:pStyle w:val="Body"/>
-        <w:widowControl w:val="0"/>
-        <w:rPr>
-          <w:rFonts w:ascii="Georgia" w:eastAsia="Georgia" w:hAnsi="Georgia" w:cs="Georgia"/>
-          <w:kern w:val="0"/>
-          <w:sz w:val="20"/>
-          <w:szCs w:val="20"/>
-        </w:rPr>
-      </w:pPr>
     </w:p>
     <w:p>
       <w:pPr>
@@ -4441,6 +4417,29 @@
           <w:kern w:val="0"/>
           <w:sz w:val="20"/>
           <w:szCs w:val="20"/>
+        </w:rPr>
+      </w:pPr>
+    </w:p>
+    <w:p>
+      <w:pPr>
+        <w:pStyle w:val="Body"/>
+        <w:widowControl w:val="0"/>
+        <w:rPr>
+          <w:rFonts w:ascii="Georgia" w:eastAsia="Georgia" w:hAnsi="Georgia" w:cs="Georgia"/>
+          <w:b/>
+          <w:bCs/>
+          <w:kern w:val="0"/>
+          <w:sz w:val="20"/>
+          <w:szCs w:val="20"/>
+        </w:rPr>
+      </w:pPr>
+    </w:p>
+    <w:p>
+      <w:pPr>
+        <w:pStyle w:val="NoSpacing"/>
+        <w:rPr>
+          <w:rFonts w:ascii="Arial" w:hAnsi="Arial" w:cs="Arial"/>
+          <w:b/>
         </w:rPr>
       </w:pPr>
       <w:r>
@@ -4451,47 +4450,137 @@
           <w:sz w:val="23"/>
           <w:szCs w:val="23"/>
         </w:rPr>
-        <w:pict w14:anchorId="1876EF07">
-          <v:shapetype id="_x0000_t202" coordsize="21600,21600" o:spt="202" path="m,l,21600r21600,l21600,xe">
-            <v:stroke joinstyle="miter"/>
-            <v:path gradientshapeok="t" o:connecttype="rect"/>
-          </v:shapetype>
-          <v:shape id="Text Box 2" o:spid="_x0000_s1026" type="#_x0000_t202" style="position:absolute;left:0;text-align:left;margin-left:3.3pt;margin-top:6.55pt;width:120.1pt;height:110.6pt;z-index:-251657216;visibility:visible;mso-wrap-style:square;mso-width-percent:0;mso-height-percent:200;mso-wrap-distance-left:9pt;mso-wrap-distance-top:3.6pt;mso-wrap-distance-right:9pt;mso-wrap-distance-bottom:3.6pt;mso-position-horizontal:absolute;mso-position-horizontal-relative:text;mso-position-vertical:absolute;mso-position-vertical-relative:text;mso-width-percent:0;mso-height-percent:200;mso-width-relative:margin;mso-height-relative:margin;v-text-anchor:top" o:gfxdata="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" fillcolor="white [3212]" strokecolor="white [3212]">
-            <v:textbox style="mso-fit-shape-to-text:t">
-              <w:txbxContent>
-                <w:p>
-                  <w:r>
-                    <w:t>{</w:t>
-                  </w:r>
-                  <w:proofErr w:type="spellStart"/>
-                  <w:r>
-                    <w:t>casestudyMaker</w:t>
-                  </w:r>
-                  <w:proofErr w:type="spellEnd"/>
-                  <w:r>
-                    <w:t xml:space="preserve">} </w:t>
-                  </w:r>
-                </w:p>
-                <w:p/>
-              </w:txbxContent>
-            </v:textbox>
-          </v:shape>
-        </w:pict>
-      </w:r>
-    </w:p>
-    <w:p>
-      <w:pPr>
-        <w:pStyle w:val="Body"/>
-        <w:widowControl w:val="0"/>
-        <w:rPr>
-          <w:rFonts w:ascii="Georgia" w:eastAsia="Georgia" w:hAnsi="Georgia" w:cs="Georgia"/>
+        <mc:AlternateContent>
+          <mc:Choice Requires="wps">
+            <w:drawing>
+              <wp:anchor distT="45720" distB="45720" distL="114300" distR="114300" simplePos="0" relativeHeight="251667456" behindDoc="1" locked="0" layoutInCell="1" allowOverlap="1" wp14:anchorId="0C5046F4" wp14:editId="603207ED">
+                <wp:simplePos x="0" y="0"/>
+                <wp:positionH relativeFrom="margin">
+                  <wp:align>left</wp:align>
+                </wp:positionH>
+                <wp:positionV relativeFrom="paragraph">
+                  <wp:posOffset>5080</wp:posOffset>
+                </wp:positionV>
+                <wp:extent cx="1525270" cy="1404620"/>
+                <wp:effectExtent l="0" t="0" r="17780" b="25400"/>
+                <wp:wrapNone/>
+                <wp:docPr id="1702283211" name="Text Box 2"/>
+                <wp:cNvGraphicFramePr>
+                  <a:graphicFrameLocks xmlns:a="http://schemas.openxmlformats.org/drawingml/2006/main"/>
+                </wp:cNvGraphicFramePr>
+                <a:graphic xmlns:a="http://schemas.openxmlformats.org/drawingml/2006/main">
+                  <a:graphicData uri="http://schemas.microsoft.com/office/word/2010/wordprocessingShape">
+                    <wps:wsp>
+                      <wps:cNvSpPr txBox="1">
+                        <a:spLocks noChangeArrowheads="1"/>
+                      </wps:cNvSpPr>
+                      <wps:spPr bwMode="auto">
+                        <a:xfrm>
+                          <a:off x="0" y="0"/>
+                          <a:ext cx="1525270" cy="1404620"/>
+                        </a:xfrm>
+                        <a:prstGeom prst="rect">
+                          <a:avLst/>
+                        </a:prstGeom>
+                        <a:solidFill>
+                          <a:schemeClr val="bg1"/>
+                        </a:solidFill>
+                        <a:ln w="9525">
+                          <a:solidFill>
+                            <a:schemeClr val="bg1"/>
+                          </a:solidFill>
+                          <a:miter lim="800000"/>
+                          <a:headEnd/>
+                          <a:tailEnd/>
+                        </a:ln>
+                      </wps:spPr>
+                      <wps:txbx>
+                        <w:txbxContent>
+                          <w:p>
+                            <w:r>
+                              <w:t>{</w:t>
+                            </w:r>
+                            <w:proofErr w:type="spellStart"/>
+                            <w:r>
+                              <w:t>casestudyMaker</w:t>
+                            </w:r>
+                            <w:proofErr w:type="spellEnd"/>
+                            <w:r>
+                              <w:t xml:space="preserve">} </w:t>
+                            </w:r>
+                          </w:p>
+                          <w:p/>
+                        </w:txbxContent>
+                      </wps:txbx>
+                      <wps:bodyPr rot="0" vert="horz" wrap="square" lIns="91440" tIns="45720" rIns="91440" bIns="45720" anchor="t" anchorCtr="0">
+                        <a:spAutoFit/>
+                      </wps:bodyPr>
+                    </wps:wsp>
+                  </a:graphicData>
+                </a:graphic>
+                <wp14:sizeRelH relativeFrom="margin">
+                  <wp14:pctWidth>0</wp14:pctWidth>
+                </wp14:sizeRelH>
+                <wp14:sizeRelV relativeFrom="margin">
+                  <wp14:pctHeight>20000</wp14:pctHeight>
+                </wp14:sizeRelV>
+              </wp:anchor>
+            </w:drawing>
+          </mc:Choice>
+          <mc:Fallback>
+            <w:pict>
+              <v:shapetype w14:anchorId="0C5046F4" id="_x0000_t202" coordsize="21600,21600" o:spt="202" path="m,l,21600r21600,l21600,xe">
+                <v:stroke joinstyle="miter"/>
+                <v:path gradientshapeok="t" o:connecttype="rect"/>
+              </v:shapetype>
+              <v:shape id="Text Box 2" o:spid="_x0000_s1026" type="#_x0000_t202" style="position:absolute;margin-left:0;margin-top:.4pt;width:120.1pt;height:110.6pt;z-index:-251649024;visibility:visible;mso-wrap-style:square;mso-width-percent:0;mso-height-percent:200;mso-wrap-distance-left:9pt;mso-wrap-distance-top:3.6pt;mso-wrap-distance-right:9pt;mso-wrap-distance-bottom:3.6pt;mso-position-horizontal:left;mso-position-horizontal-relative:margin;mso-position-vertical:absolute;mso-position-vertical-relative:text;mso-width-percent:0;mso-height-percent:200;mso-width-relative:margin;mso-height-relative:margin;v-text-anchor:top" o:gfxdata="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" fillcolor="white [3212]" strokecolor="white [3212]">
+                <v:textbox style="mso-fit-shape-to-text:t">
+                  <w:txbxContent>
+                    <w:p>
+                      <w:r>
+                        <w:t>{</w:t>
+                      </w:r>
+                      <w:proofErr w:type="spellStart"/>
+                      <w:r>
+                        <w:t>casestudyMaker</w:t>
+                      </w:r>
+                      <w:proofErr w:type="spellEnd"/>
+                      <w:r>
+                        <w:t xml:space="preserve">} </w:t>
+                      </w:r>
+                    </w:p>
+                    <w:p/>
+                  </w:txbxContent>
+                </v:textbox>
+                <w10:wrap anchorx="margin"/>
+              </v:shape>
+            </w:pict>
+          </mc:Fallback>
+        </mc:AlternateContent>
+      </w:r>
+      <w:r>
+        <w:rPr>
+          <w:rFonts w:ascii="Arial" w:hAnsi="Arial" w:cs="Arial"/>
           <w:b/>
-          <w:bCs/>
-          <w:kern w:val="0"/>
-          <w:sz w:val="20"/>
-          <w:szCs w:val="20"/>
-        </w:rPr>
-      </w:pPr>
+        </w:rPr>
+        <w:t>{Employee}</w:t>
+      </w:r>
+    </w:p>
+    <w:p>
+      <w:pPr>
+        <w:pStyle w:val="NoSpacing"/>
+        <w:rPr>
+          <w:rFonts w:ascii="Arial" w:hAnsi="Arial" w:cs="Arial"/>
+          <w:i/>
+        </w:rPr>
+      </w:pPr>
+      <w:r>
+        <w:rPr>
+          <w:rFonts w:ascii="Arial" w:hAnsi="Arial" w:cs="Arial"/>
+          <w:i/>
+        </w:rPr>
+        <w:t>{position}</w:t>
+      </w:r>
     </w:p>
     <w:p>
       <w:pPr>
@@ -4506,18 +4595,6 @@
           <w:szCs w:val="20"/>
         </w:rPr>
       </w:pPr>
-      <w:r>
-        <w:rPr>
-          <w:rFonts w:ascii="Georgia" w:hAnsi="Georgia"/>
-          <w:i/>
-          <w:iCs/>
-          <w:kern w:val="0"/>
-          <w:sz w:val="20"/>
-          <w:szCs w:val="20"/>
-          <w:lang w:val="pt-PT"/>
-        </w:rPr>
-        <w:t>Administrative Aide III</w:t>
-      </w:r>
     </w:p>
     <w:p>
       <w:pPr>
@@ -4635,7 +4712,31 @@
           <w:sz w:val="20"/>
           <w:szCs w:val="20"/>
         </w:rPr>
-        <w:t>ATTY. RECHILLE ANN A. MARIANO</w:t>
+        <w:t>{</w:t>
+      </w:r>
+      <w:proofErr w:type="spellStart"/>
+      <w:r>
+        <w:rPr>
+          <w:rFonts w:ascii="Georgia" w:hAnsi="Georgia"/>
+          <w:b/>
+          <w:bCs/>
+          <w:kern w:val="0"/>
+          <w:sz w:val="20"/>
+          <w:szCs w:val="20"/>
+        </w:rPr>
+        <w:t>cityAdministrator</w:t>
+      </w:r>
+      <w:proofErr w:type="spellEnd"/>
+      <w:r>
+        <w:rPr>
+          <w:rFonts w:ascii="Georgia" w:hAnsi="Georgia"/>
+          <w:b/>
+          <w:bCs/>
+          <w:kern w:val="0"/>
+          <w:sz w:val="20"/>
+          <w:szCs w:val="20"/>
+        </w:rPr>
+        <w:t>}</w:t>
       </w:r>
     </w:p>
     <w:p>
@@ -4693,6 +4794,348 @@
           <w:szCs w:val="20"/>
         </w:rPr>
       </w:pPr>
+      <w:r>
+        <w:rPr>
+          <w:rFonts w:ascii="Arial" w:hAnsi="Arial" w:cs="Arial"/>
+          <w:noProof/>
+        </w:rPr>
+        <mc:AlternateContent>
+          <mc:Choice Requires="wps">
+            <w:drawing>
+              <wp:anchor distT="45720" distB="45720" distL="114300" distR="114300" simplePos="0" relativeHeight="251669504" behindDoc="1" locked="0" layoutInCell="1" allowOverlap="1" wp14:anchorId="26597E27" wp14:editId="7C6EA0D0">
+                <wp:simplePos x="0" y="0"/>
+                <wp:positionH relativeFrom="column">
+                  <wp:posOffset>3686092</wp:posOffset>
+                </wp:positionH>
+                <wp:positionV relativeFrom="paragraph">
+                  <wp:posOffset>3810</wp:posOffset>
+                </wp:positionV>
+                <wp:extent cx="2345473" cy="2004646"/>
+                <wp:effectExtent l="0" t="0" r="17145" b="15240"/>
+                <wp:wrapNone/>
+                <wp:docPr id="908471928" name="Text Box 2"/>
+                <wp:cNvGraphicFramePr>
+                  <a:graphicFrameLocks xmlns:a="http://schemas.openxmlformats.org/drawingml/2006/main"/>
+                </wp:cNvGraphicFramePr>
+                <a:graphic xmlns:a="http://schemas.openxmlformats.org/drawingml/2006/main">
+                  <a:graphicData uri="http://schemas.microsoft.com/office/word/2010/wordprocessingShape">
+                    <wps:wsp>
+                      <wps:cNvSpPr txBox="1">
+                        <a:spLocks noChangeArrowheads="1"/>
+                      </wps:cNvSpPr>
+                      <wps:spPr bwMode="auto">
+                        <a:xfrm>
+                          <a:off x="0" y="0"/>
+                          <a:ext cx="2345473" cy="2004646"/>
+                        </a:xfrm>
+                        <a:prstGeom prst="rect">
+                          <a:avLst/>
+                        </a:prstGeom>
+                        <a:solidFill>
+                          <a:srgbClr val="FFFFFF"/>
+                        </a:solidFill>
+                        <a:ln w="9525">
+                          <a:solidFill>
+                            <a:schemeClr val="bg1"/>
+                          </a:solidFill>
+                          <a:miter lim="800000"/>
+                          <a:headEnd/>
+                          <a:tailEnd/>
+                        </a:ln>
+                      </wps:spPr>
+                      <wps:txbx>
+                        <w:txbxContent>
+                          <w:p>
+                            <w:pPr>
+                              <w:jc w:val="right"/>
+                              <w:rPr>
+                                <w:b/>
+                                <w:bCs/>
+                                <w:sz w:val="10"/>
+                                <w:szCs w:val="10"/>
+                              </w:rPr>
+                            </w:pPr>
+                            <w:r>
+                              <w:rPr>
+                                <w:sz w:val="10"/>
+                                <w:szCs w:val="10"/>
+                              </w:rPr>
+                              <w:t xml:space="preserve">   </w:t>
+                            </w:r>
+                            <w:r>
+                              <w:rPr>
+                                <w:sz w:val="10"/>
+                                <w:szCs w:val="10"/>
+                              </w:rPr>
+                              <w:t>{</w:t>
+                            </w:r>
+                            <w:proofErr w:type="spellStart"/>
+                            <w:r>
+                              <w:rPr>
+                                <w:sz w:val="10"/>
+                                <w:szCs w:val="10"/>
+                              </w:rPr>
+                              <w:t>documentQrCode</w:t>
+                            </w:r>
+                            <w:proofErr w:type="spellEnd"/>
+                            <w:r>
+                              <w:rPr>
+                                <w:sz w:val="10"/>
+                                <w:szCs w:val="10"/>
+                              </w:rPr>
+                              <w:t>}</w:t>
+                            </w:r>
+                          </w:p>
+                          <w:p>
+                            <w:pPr>
+                              <w:jc w:val="right"/>
+                              <w:rPr>
+                                <w:sz w:val="10"/>
+                                <w:szCs w:val="10"/>
+                              </w:rPr>
+                            </w:pPr>
+                            <w:r>
+                              <w:rPr>
+                                <w:b/>
+                                <w:bCs/>
+                                <w:sz w:val="10"/>
+                                <w:szCs w:val="10"/>
+                              </w:rPr>
+                              <w:t xml:space="preserve">   </w:t>
+                            </w:r>
+                            <w:r>
+                              <w:rPr>
+                                <w:b/>
+                                <w:bCs/>
+                                <w:sz w:val="10"/>
+                                <w:szCs w:val="10"/>
+                              </w:rPr>
+                              <w:t>Verification Code:</w:t>
+                            </w:r>
+                            <w:r>
+                              <w:rPr>
+                                <w:sz w:val="10"/>
+                                <w:szCs w:val="10"/>
+                              </w:rPr>
+                              <w:t xml:space="preserve"> {</w:t>
+                            </w:r>
+                            <w:proofErr w:type="spellStart"/>
+                            <w:r>
+                              <w:rPr>
+                                <w:sz w:val="10"/>
+                                <w:szCs w:val="10"/>
+                              </w:rPr>
+                              <w:t>documentVerificationCode</w:t>
+                            </w:r>
+                            <w:proofErr w:type="spellEnd"/>
+                            <w:r>
+                              <w:rPr>
+                                <w:sz w:val="10"/>
+                                <w:szCs w:val="10"/>
+                              </w:rPr>
+                              <w:t>}</w:t>
+                            </w:r>
+                          </w:p>
+                          <w:p>
+                            <w:pPr>
+                              <w:jc w:val="right"/>
+                              <w:rPr>
+                                <w:sz w:val="10"/>
+                                <w:szCs w:val="10"/>
+                              </w:rPr>
+                            </w:pPr>
+                            <w:r>
+                              <w:rPr>
+                                <w:b/>
+                                <w:bCs/>
+                                <w:sz w:val="10"/>
+                                <w:szCs w:val="10"/>
+                              </w:rPr>
+                              <w:t xml:space="preserve">   </w:t>
+                            </w:r>
+                            <w:r>
+                              <w:rPr>
+                                <w:sz w:val="10"/>
+                                <w:szCs w:val="10"/>
+                              </w:rPr>
+                              <w:t>S</w:t>
+                            </w:r>
+                            <w:r>
+                              <w:rPr>
+                                <w:sz w:val="10"/>
+                                <w:szCs w:val="10"/>
+                              </w:rPr>
+                              <w:t>can the QR code to confirm authenticity.</w:t>
+                            </w:r>
+                            <w:r>
+                              <w:rPr>
+                                <w:sz w:val="10"/>
+                                <w:szCs w:val="10"/>
+                              </w:rPr>
+                              <w:t xml:space="preserve">                                                                                                           </w:t>
+                            </w:r>
+                          </w:p>
+                          <w:p/>
+                        </w:txbxContent>
+                      </wps:txbx>
+                      <wps:bodyPr rot="0" vert="horz" wrap="square" lIns="91440" tIns="45720" rIns="91440" bIns="45720" anchor="t" anchorCtr="0">
+                        <a:noAutofit/>
+                      </wps:bodyPr>
+                    </wps:wsp>
+                  </a:graphicData>
+                </a:graphic>
+                <wp14:sizeRelH relativeFrom="margin">
+                  <wp14:pctWidth>0</wp14:pctWidth>
+                </wp14:sizeRelH>
+                <wp14:sizeRelV relativeFrom="margin">
+                  <wp14:pctHeight>0</wp14:pctHeight>
+                </wp14:sizeRelV>
+              </wp:anchor>
+            </w:drawing>
+          </mc:Choice>
+          <mc:Fallback>
+            <w:pict>
+              <v:shape w14:anchorId="26597E27" id="_x0000_s1027" type="#_x0000_t202" style="position:absolute;left:0;text-align:left;margin-left:290.25pt;margin-top:.3pt;width:184.7pt;height:157.85pt;z-index:-251646976;visibility:visible;mso-wrap-style:square;mso-width-percent:0;mso-height-percent:0;mso-wrap-distance-left:9pt;mso-wrap-distance-top:3.6pt;mso-wrap-distance-right:9pt;mso-wrap-distance-bottom:3.6pt;mso-position-horizontal:absolute;mso-position-horizontal-relative:text;mso-position-vertical:absolute;mso-position-vertical-relative:text;mso-width-percent:0;mso-height-percent:0;mso-width-relative:margin;mso-height-relative:margin;v-text-anchor:top" o:gfxdata="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" strokecolor="white [3212]">
+                <v:textbox>
+                  <w:txbxContent>
+                    <w:p>
+                      <w:pPr>
+                        <w:jc w:val="right"/>
+                        <w:rPr>
+                          <w:b/>
+                          <w:bCs/>
+                          <w:sz w:val="10"/>
+                          <w:szCs w:val="10"/>
+                        </w:rPr>
+                      </w:pPr>
+                      <w:r>
+                        <w:rPr>
+                          <w:sz w:val="10"/>
+                          <w:szCs w:val="10"/>
+                        </w:rPr>
+                        <w:t xml:space="preserve">   </w:t>
+                      </w:r>
+                      <w:r>
+                        <w:rPr>
+                          <w:sz w:val="10"/>
+                          <w:szCs w:val="10"/>
+                        </w:rPr>
+                        <w:t>{</w:t>
+                      </w:r>
+                      <w:proofErr w:type="spellStart"/>
+                      <w:r>
+                        <w:rPr>
+                          <w:sz w:val="10"/>
+                          <w:szCs w:val="10"/>
+                        </w:rPr>
+                        <w:t>documentQrCode</w:t>
+                      </w:r>
+                      <w:proofErr w:type="spellEnd"/>
+                      <w:r>
+                        <w:rPr>
+                          <w:sz w:val="10"/>
+                          <w:szCs w:val="10"/>
+                        </w:rPr>
+                        <w:t>}</w:t>
+                      </w:r>
+                    </w:p>
+                    <w:p>
+                      <w:pPr>
+                        <w:jc w:val="right"/>
+                        <w:rPr>
+                          <w:sz w:val="10"/>
+                          <w:szCs w:val="10"/>
+                        </w:rPr>
+                      </w:pPr>
+                      <w:r>
+                        <w:rPr>
+                          <w:b/>
+                          <w:bCs/>
+                          <w:sz w:val="10"/>
+                          <w:szCs w:val="10"/>
+                        </w:rPr>
+                        <w:t xml:space="preserve">   </w:t>
+                      </w:r>
+                      <w:r>
+                        <w:rPr>
+                          <w:b/>
+                          <w:bCs/>
+                          <w:sz w:val="10"/>
+                          <w:szCs w:val="10"/>
+                        </w:rPr>
+                        <w:t>Verification Code:</w:t>
+                      </w:r>
+                      <w:r>
+                        <w:rPr>
+                          <w:sz w:val="10"/>
+                          <w:szCs w:val="10"/>
+                        </w:rPr>
+                        <w:t xml:space="preserve"> {</w:t>
+                      </w:r>
+                      <w:proofErr w:type="spellStart"/>
+                      <w:r>
+                        <w:rPr>
+                          <w:sz w:val="10"/>
+                          <w:szCs w:val="10"/>
+                        </w:rPr>
+                        <w:t>documentVerificationCode</w:t>
+                      </w:r>
+                      <w:proofErr w:type="spellEnd"/>
+                      <w:r>
+                        <w:rPr>
+                          <w:sz w:val="10"/>
+                          <w:szCs w:val="10"/>
+                        </w:rPr>
+                        <w:t>}</w:t>
+                      </w:r>
+                    </w:p>
+                    <w:p>
+                      <w:pPr>
+                        <w:jc w:val="right"/>
+                        <w:rPr>
+                          <w:sz w:val="10"/>
+                          <w:szCs w:val="10"/>
+                        </w:rPr>
+                      </w:pPr>
+                      <w:r>
+                        <w:rPr>
+                          <w:b/>
+                          <w:bCs/>
+                          <w:sz w:val="10"/>
+                          <w:szCs w:val="10"/>
+                        </w:rPr>
+                        <w:t xml:space="preserve">   </w:t>
+                      </w:r>
+                      <w:r>
+                        <w:rPr>
+                          <w:sz w:val="10"/>
+                          <w:szCs w:val="10"/>
+                        </w:rPr>
+                        <w:t>S</w:t>
+                      </w:r>
+                      <w:r>
+                        <w:rPr>
+                          <w:sz w:val="10"/>
+                          <w:szCs w:val="10"/>
+                        </w:rPr>
+                        <w:t>can the QR code to confirm authenticity.</w:t>
+                      </w:r>
+                      <w:r>
+                        <w:rPr>
+                          <w:sz w:val="10"/>
+                          <w:szCs w:val="10"/>
+                        </w:rPr>
+                        <w:t xml:space="preserve">                                                                                                           </w:t>
+                      </w:r>
+                    </w:p>
+                    <w:p/>
+                  </w:txbxContent>
+                </v:textbox>
+              </v:shape>
+            </w:pict>
+          </mc:Fallback>
+        </mc:AlternateContent>
+      </w:r>
       <w:r>
         <w:rPr>
           <w:rFonts w:ascii="Georgia" w:hAnsi="Georgia"/>
@@ -4728,7 +5171,7 @@
         </w:rPr>
         <w:pict w14:anchorId="2C97A252">
           <v:shape id="_x0000_s1028" type="#_x0000_t202" style="position:absolute;left:0;text-align:left;margin-left:21pt;margin-top:3.55pt;width:156.1pt;height:110.6pt;z-index:-251653120;visibility:visible;mso-wrap-style:square;mso-width-percent:0;mso-height-percent:200;mso-wrap-distance-left:9pt;mso-wrap-distance-top:3.6pt;mso-wrap-distance-right:9pt;mso-wrap-distance-bottom:3.6pt;mso-position-horizontal:absolute;mso-position-horizontal-relative:margin;mso-position-vertical:absolute;mso-position-vertical-relative:text;mso-width-percent:0;mso-height-percent:200;mso-width-relative:margin;mso-height-relative:margin;v-text-anchor:top" o:gfxdata="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" fillcolor="white [3212]" strokecolor="white [3212]">
-            <v:textbox style="mso-fit-shape-to-text:t">
+            <v:textbox style="mso-next-textbox:#_x0000_s1028;mso-fit-shape-to-text:t">
               <w:txbxContent>
                 <w:p>
                   <w:r>
@@ -4783,7 +5226,31 @@
           <w:sz w:val="20"/>
           <w:szCs w:val="20"/>
         </w:rPr>
-        <w:t>MARIBELLE J. ARTIENDA</w:t>
+        <w:t>{</w:t>
+      </w:r>
+      <w:proofErr w:type="spellStart"/>
+      <w:r>
+        <w:rPr>
+          <w:rFonts w:ascii="Georgia" w:hAnsi="Georgia"/>
+          <w:b/>
+          <w:bCs/>
+          <w:kern w:val="0"/>
+          <w:sz w:val="20"/>
+          <w:szCs w:val="20"/>
+        </w:rPr>
+        <w:t>cityCSWDO</w:t>
+      </w:r>
+      <w:proofErr w:type="spellEnd"/>
+      <w:r>
+        <w:rPr>
+          <w:rFonts w:ascii="Georgia" w:hAnsi="Georgia"/>
+          <w:b/>
+          <w:bCs/>
+          <w:kern w:val="0"/>
+          <w:sz w:val="20"/>
+          <w:szCs w:val="20"/>
+        </w:rPr>
+        <w:t>}</w:t>
       </w:r>
     </w:p>
     <w:p>
@@ -4936,8 +5403,9 @@
           <w:szCs w:val="20"/>
           <w:lang w:val="es-ES_tradnl"/>
         </w:rPr>
-        <w:t xml:space="preserve">HON. RANDOLF </w:t>
-      </w:r>
+        <w:t>{</w:t>
+      </w:r>
+      <w:proofErr w:type="spellStart"/>
       <w:r>
         <w:rPr>
           <w:rFonts w:ascii="Georgia" w:hAnsi="Georgia"/>
@@ -4946,11 +5414,11 @@
           <w:kern w:val="0"/>
           <w:sz w:val="20"/>
           <w:szCs w:val="20"/>
-          <w:rtl/>
-          <w:lang w:val="ar-SA"/>
-        </w:rPr>
-        <w:t>“</w:t>
-      </w:r>
+          <w:lang w:val="es-ES_tradnl"/>
+        </w:rPr>
+        <w:t>cityMayor</w:t>
+      </w:r>
+      <w:proofErr w:type="spellEnd"/>
       <w:r>
         <w:rPr>
           <w:rFonts w:ascii="Georgia" w:hAnsi="Georgia"/>
@@ -4959,20 +5427,9 @@
           <w:kern w:val="0"/>
           <w:sz w:val="20"/>
           <w:szCs w:val="20"/>
-          <w:lang w:val="de-DE"/>
-        </w:rPr>
-        <w:t>RANDY</w:t>
-      </w:r>
-      <w:r>
-        <w:rPr>
-          <w:rFonts w:ascii="Georgia" w:hAnsi="Georgia"/>
-          <w:b/>
-          <w:bCs/>
-          <w:kern w:val="0"/>
-          <w:sz w:val="20"/>
-          <w:szCs w:val="20"/>
-        </w:rPr>
-        <w:t>” V. SINGSON</w:t>
+          <w:lang w:val="es-ES_tradnl"/>
+        </w:rPr>
+        <w:t>}</w:t>
       </w:r>
     </w:p>
     <w:p>
@@ -5092,7 +5549,7 @@
 </file>
 
 <file path=word/endnotes.xml><?xml version="1.0" encoding="utf-8"?>
-<w:endnotes xmlns:wpc="http://schemas.microsoft.com/office/word/2010/wordprocessingCanvas" xmlns:cx="http://schemas.microsoft.com/office/drawing/2014/chartex" xmlns:cx1="http://schemas.microsoft.com/office/drawing/2015/9/8/chartex" xmlns:cx2="http://schemas.microsoft.com/office/drawing/2015/10/21/chartex" xmlns:cx3="http://schemas.microsoft.com/office/drawing/2016/5/9/chartex" xmlns:cx4="http://schemas.microsoft.com/office/drawing/2016/5/10/chartex" xmlns:cx5="http://schemas.microsoft.com/office/drawing/2016/5/11/chartex" xmlns:cx6="http://schemas.microsoft.com/office/drawing/2016/5/12/chartex" xmlns:cx7="http://schemas.microsoft.com/office/drawing/2016/5/13/chartex" xmlns:cx8="http://schemas.microsoft.com/office/drawing/2016/5/14/chartex" xmlns:mc="http://schemas.openxmlformats.org/markup-compatibility/2006" xmlns:aink="http://schemas.microsoft.com/office/drawing/2016/ink" xmlns:am3d="http://schemas.microsoft.com/office/drawing/2017/model3d" xmlns:o="urn:schemas-microsoft-com:office:office" xmlns:oel="http://schemas.microsoft.com/office/2019/extlst" xmlns:r="http://schemas.openxmlformats.org/officeDocument/2006/relationships" xmlns:m="http://schemas.openxmlformats.org/officeDocument/2006/math" xmlns:v="urn:schemas-microsoft-com:vml" xmlns:wp14="http://schemas.microsoft.com/office/word/2010/wordprocessingDrawing" xmlns:wp="http://schemas.openxmlformats.org/drawingml/2006/wordprocessingDrawing" xmlns:w10="urn:schemas-microsoft-com:office:word" xmlns:w="http://schemas.openxmlformats.org/wordprocessingml/2006/main" xmlns:w14="http://schemas.microsoft.com/office/word/2010/wordml" xmlns:w15="http://schemas.microsoft.com/office/word/2012/wordml" xmlns:w16cex="http://schemas.microsoft.com/office/word/2018/wordml/cex" xmlns:w16cid="http://schemas.microsoft.com/office/word/2016/wordml/cid" xmlns:w16="http://schemas.microsoft.com/office/word/2018/wordml" xmlns:w16du="http://schemas.microsoft.com/office/word/2023/wordml/word16du" xmlns:w16sdtdh="http://schemas.microsoft.com/office/word/2020/wordml/sdtdatahash" xmlns:w16sdtfl="http://schemas.microsoft.com/office/word/2024/wordml/sdtformatlock" xmlns:w16se="http://schemas.microsoft.com/office/word/2015/wordml/symex" xmlns:wpg="http://schemas.microsoft.com/office/word/2010/wordprocessingGroup" xmlns:wpi="http://schemas.microsoft.com/office/word/2010/wordprocessingInk" xmlns:wne="http://schemas.microsoft.com/office/word/2006/wordml" xmlns:wps="http://schemas.microsoft.com/office/word/2010/wordprocessingShape" mc:Ignorable="w14 w15 w16se w16cid w16 w16cex w16sdtdh w16sdtfl w16du wp14">
+<w:endnotes xmlns:wpc="http://schemas.microsoft.com/office/word/2010/wordprocessingCanvas" xmlns:cx="http://schemas.microsoft.com/office/drawing/2014/chartex" xmlns:cx1="http://schemas.microsoft.com/office/drawing/2015/9/8/chartex" xmlns:cx2="http://schemas.microsoft.com/office/drawing/2015/10/21/chartex" xmlns:cx3="http://schemas.microsoft.com/office/drawing/2016/5/9/chartex" xmlns:cx4="http://schemas.microsoft.com/office/drawing/2016/5/10/chartex" xmlns:cx5="http://schemas.microsoft.com/office/drawing/2016/5/11/chartex" xmlns:cx6="http://schemas.microsoft.com/office/drawing/2016/5/12/chartex" xmlns:cx7="http://schemas.microsoft.com/office/drawing/2016/5/13/chartex" xmlns:cx8="http://schemas.microsoft.com/office/drawing/2016/5/14/chartex" xmlns:mc="http://schemas.openxmlformats.org/markup-compatibility/2006" xmlns:aink="http://schemas.microsoft.com/office/drawing/2016/ink" xmlns:am3d="http://schemas.microsoft.com/office/drawing/2017/model3d" xmlns:o="urn:schemas-microsoft-com:office:office" xmlns:oel="http://schemas.microsoft.com/office/2019/extlst" xmlns:r="http://schemas.openxmlformats.org/officeDocument/2006/relationships" xmlns:m="http://schemas.openxmlformats.org/officeDocument/2006/math" xmlns:v="urn:schemas-microsoft-com:vml" xmlns:wp14="http://schemas.microsoft.com/office/word/2010/wordprocessingDrawing" xmlns:wp="http://schemas.openxmlformats.org/drawingml/2006/wordprocessingDrawing" xmlns:w10="urn:schemas-microsoft-com:office:word" xmlns:w="http://schemas.openxmlformats.org/wordprocessingml/2006/main" xmlns:w14="http://schemas.microsoft.com/office/word/2010/wordml" xmlns:w15="http://schemas.microsoft.com/office/word/2012/wordml" xmlns:w16cei="http://schemas.microsoft.com/office/word/2026/wordml/cei" xmlns:w16cex="http://schemas.microsoft.com/office/word/2018/wordml/cex" xmlns:w16cid="http://schemas.microsoft.com/office/word/2016/wordml/cid" xmlns:w16="http://schemas.microsoft.com/office/word/2018/wordml" xmlns:w16du="http://schemas.microsoft.com/office/word/2023/wordml/word16du" xmlns:w16sdtdh="http://schemas.microsoft.com/office/word/2020/wordml/sdtdatahash" xmlns:w16sdtfl="http://schemas.microsoft.com/office/word/2024/wordml/sdtformatlock" xmlns:w16se="http://schemas.microsoft.com/office/word/2015/wordml/symex" xmlns:wpg="http://schemas.microsoft.com/office/word/2010/wordprocessingGroup" xmlns:wpi="http://schemas.microsoft.com/office/word/2010/wordprocessingInk" xmlns:wne="http://schemas.microsoft.com/office/word/2006/wordml" xmlns:wps="http://schemas.microsoft.com/office/word/2010/wordprocessingShape" mc:Ignorable="w14 w15 w16se w16cid w16 w16cex w16sdtdh w16sdtfl w16du wp14">
   <w:endnote w:type="separator" w:id="-1">
     <w:p>
       <w:r>
@@ -5111,7 +5568,7 @@
 </file>
 
 <file path=word/footer1.xml><?xml version="1.0" encoding="utf-8"?>
-<w:ftr xmlns:wpc="http://schemas.microsoft.com/office/word/2010/wordprocessingCanvas" xmlns:cx="http://schemas.microsoft.com/office/drawing/2014/chartex" xmlns:cx1="http://schemas.microsoft.com/office/drawing/2015/9/8/chartex" xmlns:cx2="http://schemas.microsoft.com/office/drawing/2015/10/21/chartex" xmlns:cx3="http://schemas.microsoft.com/office/drawing/2016/5/9/chartex" xmlns:cx4="http://schemas.microsoft.com/office/drawing/2016/5/10/chartex" xmlns:cx5="http://schemas.microsoft.com/office/drawing/2016/5/11/chartex" xmlns:cx6="http://schemas.microsoft.com/office/drawing/2016/5/12/chartex" xmlns:cx7="http://schemas.microsoft.com/office/drawing/2016/5/13/chartex" xmlns:cx8="http://schemas.microsoft.com/office/drawing/2016/5/14/chartex" xmlns:mc="http://schemas.openxmlformats.org/markup-compatibility/2006" xmlns:aink="http://schemas.microsoft.com/office/drawing/2016/ink" xmlns:am3d="http://schemas.microsoft.com/office/drawing/2017/model3d" xmlns:o="urn:schemas-microsoft-com:office:office" xmlns:oel="http://schemas.microsoft.com/office/2019/extlst" xmlns:r="http://schemas.openxmlformats.org/officeDocument/2006/relationships" xmlns:m="http://schemas.openxmlformats.org/officeDocument/2006/math" xmlns:v="urn:schemas-microsoft-com:vml" xmlns:wp14="http://schemas.microsoft.com/office/word/2010/wordprocessingDrawing" xmlns:wp="http://schemas.openxmlformats.org/drawingml/2006/wordprocessingDrawing" xmlns:w10="urn:schemas-microsoft-com:office:word" xmlns:w="http://schemas.openxmlformats.org/wordprocessingml/2006/main" xmlns:w14="http://schemas.microsoft.com/office/word/2010/wordml" xmlns:w15="http://schemas.microsoft.com/office/word/2012/wordml" xmlns:w16cex="http://schemas.microsoft.com/office/word/2018/wordml/cex" xmlns:w16cid="http://schemas.microsoft.com/office/word/2016/wordml/cid" xmlns:w16="http://schemas.microsoft.com/office/word/2018/wordml" xmlns:w16du="http://schemas.microsoft.com/office/word/2023/wordml/word16du" xmlns:w16sdtdh="http://schemas.microsoft.com/office/word/2020/wordml/sdtdatahash" xmlns:w16sdtfl="http://schemas.microsoft.com/office/word/2024/wordml/sdtformatlock" xmlns:w16se="http://schemas.microsoft.com/office/word/2015/wordml/symex" xmlns:wpg="http://schemas.microsoft.com/office/word/2010/wordprocessingGroup" xmlns:wpi="http://schemas.microsoft.com/office/word/2010/wordprocessingInk" xmlns:wne="http://schemas.microsoft.com/office/word/2006/wordml" xmlns:wps="http://schemas.microsoft.com/office/word/2010/wordprocessingShape" mc:Ignorable="w14 w15 w16se w16cid w16 w16cex w16sdtdh w16sdtfl w16du wp14">
+<w:ftr xmlns:wpc="http://schemas.microsoft.com/office/word/2010/wordprocessingCanvas" xmlns:cx="http://schemas.microsoft.com/office/drawing/2014/chartex" xmlns:cx1="http://schemas.microsoft.com/office/drawing/2015/9/8/chartex" xmlns:cx2="http://schemas.microsoft.com/office/drawing/2015/10/21/chartex" xmlns:cx3="http://schemas.microsoft.com/office/drawing/2016/5/9/chartex" xmlns:cx4="http://schemas.microsoft.com/office/drawing/2016/5/10/chartex" xmlns:cx5="http://schemas.microsoft.com/office/drawing/2016/5/11/chartex" xmlns:cx6="http://schemas.microsoft.com/office/drawing/2016/5/12/chartex" xmlns:cx7="http://schemas.microsoft.com/office/drawing/2016/5/13/chartex" xmlns:cx8="http://schemas.microsoft.com/office/drawing/2016/5/14/chartex" xmlns:mc="http://schemas.openxmlformats.org/markup-compatibility/2006" xmlns:aink="http://schemas.microsoft.com/office/drawing/2016/ink" xmlns:am3d="http://schemas.microsoft.com/office/drawing/2017/model3d" xmlns:o="urn:schemas-microsoft-com:office:office" xmlns:oel="http://schemas.microsoft.com/office/2019/extlst" xmlns:r="http://schemas.openxmlformats.org/officeDocument/2006/relationships" xmlns:m="http://schemas.openxmlformats.org/officeDocument/2006/math" xmlns:v="urn:schemas-microsoft-com:vml" xmlns:wp14="http://schemas.microsoft.com/office/word/2010/wordprocessingDrawing" xmlns:wp="http://schemas.openxmlformats.org/drawingml/2006/wordprocessingDrawing" xmlns:w10="urn:schemas-microsoft-com:office:word" xmlns:w="http://schemas.openxmlformats.org/wordprocessingml/2006/main" xmlns:w14="http://schemas.microsoft.com/office/word/2010/wordml" xmlns:w15="http://schemas.microsoft.com/office/word/2012/wordml" xmlns:w16cei="http://schemas.microsoft.com/office/word/2026/wordml/cei" xmlns:w16cex="http://schemas.microsoft.com/office/word/2018/wordml/cex" xmlns:w16cid="http://schemas.microsoft.com/office/word/2016/wordml/cid" xmlns:w16="http://schemas.microsoft.com/office/word/2018/wordml" xmlns:w16du="http://schemas.microsoft.com/office/word/2023/wordml/word16du" xmlns:w16sdtdh="http://schemas.microsoft.com/office/word/2020/wordml/sdtdatahash" xmlns:w16sdtfl="http://schemas.microsoft.com/office/word/2024/wordml/sdtformatlock" xmlns:w16se="http://schemas.microsoft.com/office/word/2015/wordml/symex" xmlns:wpg="http://schemas.microsoft.com/office/word/2010/wordprocessingGroup" xmlns:wpi="http://schemas.microsoft.com/office/word/2010/wordprocessingInk" xmlns:wne="http://schemas.microsoft.com/office/word/2006/wordml" xmlns:wps="http://schemas.microsoft.com/office/word/2010/wordprocessingShape" mc:Ignorable="w14 w15 w16se w16cid w16 w16cex w16sdtdh w16sdtfl w16du wp14">
   <w:p>
     <w:pPr>
       <w:pStyle w:val="Footer"/>
@@ -5307,7 +5764,7 @@
 </file>
 
 <file path=word/footnotes.xml><?xml version="1.0" encoding="utf-8"?>
-<w:footnotes xmlns:wpc="http://schemas.microsoft.com/office/word/2010/wordprocessingCanvas" xmlns:cx="http://schemas.microsoft.com/office/drawing/2014/chartex" xmlns:cx1="http://schemas.microsoft.com/office/drawing/2015/9/8/chartex" xmlns:cx2="http://schemas.microsoft.com/office/drawing/2015/10/21/chartex" xmlns:cx3="http://schemas.microsoft.com/office/drawing/2016/5/9/chartex" xmlns:cx4="http://schemas.microsoft.com/office/drawing/2016/5/10/chartex" xmlns:cx5="http://schemas.microsoft.com/office/drawing/2016/5/11/chartex" xmlns:cx6="http://schemas.microsoft.com/office/drawing/2016/5/12/chartex" xmlns:cx7="http://schemas.microsoft.com/office/drawing/2016/5/13/chartex" xmlns:cx8="http://schemas.microsoft.com/office/drawing/2016/5/14/chartex" xmlns:mc="http://schemas.openxmlformats.org/markup-compatibility/2006" xmlns:aink="http://schemas.microsoft.com/office/drawing/2016/ink" xmlns:am3d="http://schemas.microsoft.com/office/drawing/2017/model3d" xmlns:o="urn:schemas-microsoft-com:office:office" xmlns:oel="http://schemas.microsoft.com/office/2019/extlst" xmlns:r="http://schemas.openxmlformats.org/officeDocument/2006/relationships" xmlns:m="http://schemas.openxmlformats.org/officeDocument/2006/math" xmlns:v="urn:schemas-microsoft-com:vml" xmlns:wp14="http://schemas.microsoft.com/office/word/2010/wordprocessingDrawing" xmlns:wp="http://schemas.openxmlformats.org/drawingml/2006/wordprocessingDrawing" xmlns:w10="urn:schemas-microsoft-com:office:word" xmlns:w="http://schemas.openxmlformats.org/wordprocessingml/2006/main" xmlns:w14="http://schemas.microsoft.com/office/word/2010/wordml" xmlns:w15="http://schemas.microsoft.com/office/word/2012/wordml" xmlns:w16cex="http://schemas.microsoft.com/office/word/2018/wordml/cex" xmlns:w16cid="http://schemas.microsoft.com/office/word/2016/wordml/cid" xmlns:w16="http://schemas.microsoft.com/office/word/2018/wordml" xmlns:w16du="http://schemas.microsoft.com/office/word/2023/wordml/word16du" xmlns:w16sdtdh="http://schemas.microsoft.com/office/word/2020/wordml/sdtdatahash" xmlns:w16sdtfl="http://schemas.microsoft.com/office/word/2024/wordml/sdtformatlock" xmlns:w16se="http://schemas.microsoft.com/office/word/2015/wordml/symex" xmlns:wpg="http://schemas.microsoft.com/office/word/2010/wordprocessingGroup" xmlns:wpi="http://schemas.microsoft.com/office/word/2010/wordprocessingInk" xmlns:wne="http://schemas.microsoft.com/office/word/2006/wordml" xmlns:wps="http://schemas.microsoft.com/office/word/2010/wordprocessingShape" mc:Ignorable="w14 w15 w16se w16cid w16 w16cex w16sdtdh w16sdtfl w16du wp14">
+<w:footnotes xmlns:wpc="http://schemas.microsoft.com/office/word/2010/wordprocessingCanvas" xmlns:cx="http://schemas.microsoft.com/office/drawing/2014/chartex" xmlns:cx1="http://schemas.microsoft.com/office/drawing/2015/9/8/chartex" xmlns:cx2="http://schemas.microsoft.com/office/drawing/2015/10/21/chartex" xmlns:cx3="http://schemas.microsoft.com/office/drawing/2016/5/9/chartex" xmlns:cx4="http://schemas.microsoft.com/office/drawing/2016/5/10/chartex" xmlns:cx5="http://schemas.microsoft.com/office/drawing/2016/5/11/chartex" xmlns:cx6="http://schemas.microsoft.com/office/drawing/2016/5/12/chartex" xmlns:cx7="http://schemas.microsoft.com/office/drawing/2016/5/13/chartex" xmlns:cx8="http://schemas.microsoft.com/office/drawing/2016/5/14/chartex" xmlns:mc="http://schemas.openxmlformats.org/markup-compatibility/2006" xmlns:aink="http://schemas.microsoft.com/office/drawing/2016/ink" xmlns:am3d="http://schemas.microsoft.com/office/drawing/2017/model3d" xmlns:o="urn:schemas-microsoft-com:office:office" xmlns:oel="http://schemas.microsoft.com/office/2019/extlst" xmlns:r="http://schemas.openxmlformats.org/officeDocument/2006/relationships" xmlns:m="http://schemas.openxmlformats.org/officeDocument/2006/math" xmlns:v="urn:schemas-microsoft-com:vml" xmlns:wp14="http://schemas.microsoft.com/office/word/2010/wordprocessingDrawing" xmlns:wp="http://schemas.openxmlformats.org/drawingml/2006/wordprocessingDrawing" xmlns:w10="urn:schemas-microsoft-com:office:word" xmlns:w="http://schemas.openxmlformats.org/wordprocessingml/2006/main" xmlns:w14="http://schemas.microsoft.com/office/word/2010/wordml" xmlns:w15="http://schemas.microsoft.com/office/word/2012/wordml" xmlns:w16cei="http://schemas.microsoft.com/office/word/2026/wordml/cei" xmlns:w16cex="http://schemas.microsoft.com/office/word/2018/wordml/cex" xmlns:w16cid="http://schemas.microsoft.com/office/word/2016/wordml/cid" xmlns:w16="http://schemas.microsoft.com/office/word/2018/wordml" xmlns:w16du="http://schemas.microsoft.com/office/word/2023/wordml/word16du" xmlns:w16sdtdh="http://schemas.microsoft.com/office/word/2020/wordml/sdtdatahash" xmlns:w16sdtfl="http://schemas.microsoft.com/office/word/2024/wordml/sdtformatlock" xmlns:w16se="http://schemas.microsoft.com/office/word/2015/wordml/symex" xmlns:wpg="http://schemas.microsoft.com/office/word/2010/wordprocessingGroup" xmlns:wpi="http://schemas.microsoft.com/office/word/2010/wordprocessingInk" xmlns:wne="http://schemas.microsoft.com/office/word/2006/wordml" xmlns:wps="http://schemas.microsoft.com/office/word/2010/wordprocessingShape" mc:Ignorable="w14 w15 w16se w16cid w16 w16cex w16sdtdh w16sdtfl w16du wp14">
   <w:footnote w:type="separator" w:id="-1">
     <w:p>
       <w:r>
@@ -5326,7 +5783,7 @@
 </file>
 
 <file path=word/header1.xml><?xml version="1.0" encoding="utf-8"?>
-<w:hdr xmlns:wpc="http://schemas.microsoft.com/office/word/2010/wordprocessingCanvas" xmlns:cx="http://schemas.microsoft.com/office/drawing/2014/chartex" xmlns:cx1="http://schemas.microsoft.com/office/drawing/2015/9/8/chartex" xmlns:cx2="http://schemas.microsoft.com/office/drawing/2015/10/21/chartex" xmlns:cx3="http://schemas.microsoft.com/office/drawing/2016/5/9/chartex" xmlns:cx4="http://schemas.microsoft.com/office/drawing/2016/5/10/chartex" xmlns:cx5="http://schemas.microsoft.com/office/drawing/2016/5/11/chartex" xmlns:cx6="http://schemas.microsoft.com/office/drawing/2016/5/12/chartex" xmlns:cx7="http://schemas.microsoft.com/office/drawing/2016/5/13/chartex" xmlns:cx8="http://schemas.microsoft.com/office/drawing/2016/5/14/chartex" xmlns:mc="http://schemas.openxmlformats.org/markup-compatibility/2006" xmlns:aink="http://schemas.microsoft.com/office/drawing/2016/ink" xmlns:am3d="http://schemas.microsoft.com/office/drawing/2017/model3d" xmlns:o="urn:schemas-microsoft-com:office:office" xmlns:oel="http://schemas.microsoft.com/office/2019/extlst" xmlns:r="http://schemas.openxmlformats.org/officeDocument/2006/relationships" xmlns:m="http://schemas.openxmlformats.org/officeDocument/2006/math" xmlns:v="urn:schemas-microsoft-com:vml" xmlns:wp14="http://schemas.microsoft.com/office/word/2010/wordprocessingDrawing" xmlns:wp="http://schemas.openxmlformats.org/drawingml/2006/wordprocessingDrawing" xmlns:w10="urn:schemas-microsoft-com:office:word" xmlns:w="http://schemas.openxmlformats.org/wordprocessingml/2006/main" xmlns:w14="http://schemas.microsoft.com/office/word/2010/wordml" xmlns:w15="http://schemas.microsoft.com/office/word/2012/wordml" xmlns:w16cex="http://schemas.microsoft.com/office/word/2018/wordml/cex" xmlns:w16cid="http://schemas.microsoft.com/office/word/2016/wordml/cid" xmlns:w16="http://schemas.microsoft.com/office/word/2018/wordml" xmlns:w16du="http://schemas.microsoft.com/office/word/2023/wordml/word16du" xmlns:w16sdtdh="http://schemas.microsoft.com/office/word/2020/wordml/sdtdatahash" xmlns:w16sdtfl="http://schemas.microsoft.com/office/word/2024/wordml/sdtformatlock" xmlns:w16se="http://schemas.microsoft.com/office/word/2015/wordml/symex" xmlns:wpg="http://schemas.microsoft.com/office/word/2010/wordprocessingGroup" xmlns:wpi="http://schemas.microsoft.com/office/word/2010/wordprocessingInk" xmlns:wne="http://schemas.microsoft.com/office/word/2006/wordml" xmlns:wps="http://schemas.microsoft.com/office/word/2010/wordprocessingShape" mc:Ignorable="w14 w15 w16se w16cid w16 w16cex w16sdtdh w16sdtfl w16du wp14">
+<w:hdr xmlns:wpc="http://schemas.microsoft.com/office/word/2010/wordprocessingCanvas" xmlns:cx="http://schemas.microsoft.com/office/drawing/2014/chartex" xmlns:cx1="http://schemas.microsoft.com/office/drawing/2015/9/8/chartex" xmlns:cx2="http://schemas.microsoft.com/office/drawing/2015/10/21/chartex" xmlns:cx3="http://schemas.microsoft.com/office/drawing/2016/5/9/chartex" xmlns:cx4="http://schemas.microsoft.com/office/drawing/2016/5/10/chartex" xmlns:cx5="http://schemas.microsoft.com/office/drawing/2016/5/11/chartex" xmlns:cx6="http://schemas.microsoft.com/office/drawing/2016/5/12/chartex" xmlns:cx7="http://schemas.microsoft.com/office/drawing/2016/5/13/chartex" xmlns:cx8="http://schemas.microsoft.com/office/drawing/2016/5/14/chartex" xmlns:mc="http://schemas.openxmlformats.org/markup-compatibility/2006" xmlns:aink="http://schemas.microsoft.com/office/drawing/2016/ink" xmlns:am3d="http://schemas.microsoft.com/office/drawing/2017/model3d" xmlns:o="urn:schemas-microsoft-com:office:office" xmlns:oel="http://schemas.microsoft.com/office/2019/extlst" xmlns:r="http://schemas.openxmlformats.org/officeDocument/2006/relationships" xmlns:m="http://schemas.openxmlformats.org/officeDocument/2006/math" xmlns:v="urn:schemas-microsoft-com:vml" xmlns:wp14="http://schemas.microsoft.com/office/word/2010/wordprocessingDrawing" xmlns:wp="http://schemas.openxmlformats.org/drawingml/2006/wordprocessingDrawing" xmlns:w10="urn:schemas-microsoft-com:office:word" xmlns:w="http://schemas.openxmlformats.org/wordprocessingml/2006/main" xmlns:w14="http://schemas.microsoft.com/office/word/2010/wordml" xmlns:w15="http://schemas.microsoft.com/office/word/2012/wordml" xmlns:w16cei="http://schemas.microsoft.com/office/word/2026/wordml/cei" xmlns:w16cex="http://schemas.microsoft.com/office/word/2018/wordml/cex" xmlns:w16cid="http://schemas.microsoft.com/office/word/2016/wordml/cid" xmlns:w16="http://schemas.microsoft.com/office/word/2018/wordml" xmlns:w16du="http://schemas.microsoft.com/office/word/2023/wordml/word16du" xmlns:w16sdtdh="http://schemas.microsoft.com/office/word/2020/wordml/sdtdatahash" xmlns:w16sdtfl="http://schemas.microsoft.com/office/word/2024/wordml/sdtformatlock" xmlns:w16se="http://schemas.microsoft.com/office/word/2015/wordml/symex" xmlns:wpg="http://schemas.microsoft.com/office/word/2010/wordprocessingGroup" xmlns:wpi="http://schemas.microsoft.com/office/word/2010/wordprocessingInk" xmlns:wne="http://schemas.microsoft.com/office/word/2006/wordml" xmlns:wps="http://schemas.microsoft.com/office/word/2010/wordprocessingShape" mc:Ignorable="w14 w15 w16se w16cid w16 w16cex w16sdtdh w16sdtfl w16du wp14">
   <w:p>
     <w:pPr>
       <w:pStyle w:val="Header"/>
@@ -5514,7 +5971,7 @@
               <v:stroke joinstyle="miter"/>
               <v:path gradientshapeok="t" o:connecttype="rect"/>
             </v:shapetype>
-            <v:shape id="officeArt object" o:spid="_x0000_s1026" type="#_x0000_t202" alt="Text Box 2" style="position:absolute;left:0;text-align:left;margin-left:213.55pt;margin-top:20.5pt;width:178.7pt;height:44.8pt;z-index:-251657216;visibility:visible;mso-wrap-style:square;mso-wrap-distance-left:12pt;mso-wrap-distance-top:12pt;mso-wrap-distance-right:12pt;mso-wrap-distance-bottom:12pt;mso-position-horizontal:absolute;mso-position-horizontal-relative:page;mso-position-vertical:absolute;mso-position-vertical-relative:page;v-text-anchor:top" o:gfxdata="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" filled="f" stroked="f" strokeweight="1pt">
+            <v:shape id="officeArt object" o:spid="_x0000_s1028" type="#_x0000_t202" alt="Text Box 2" style="position:absolute;left:0;text-align:left;margin-left:213.55pt;margin-top:20.5pt;width:178.7pt;height:44.8pt;z-index:-251657216;visibility:visible;mso-wrap-style:square;mso-wrap-distance-left:12pt;mso-wrap-distance-top:12pt;mso-wrap-distance-right:12pt;mso-wrap-distance-bottom:12pt;mso-position-horizontal:absolute;mso-position-horizontal-relative:page;mso-position-vertical:absolute;mso-position-vertical-relative:page;v-text-anchor:top" o:gfxdata="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" filled="f" stroked="f" strokeweight="1pt">
               <v:stroke miterlimit="4"/>
               <v:textbox inset="1.27mm,1.27mm,1.27mm,1.27mm">
                 <w:txbxContent>

</xml_diff>

<commit_message>
Fix document mappings and responsive layouts
</commit_message>
<xml_diff>
--- a/templates/CGV AICS Template.fixed.docx
+++ b/templates/CGV AICS Template.fixed.docx
@@ -1992,7 +1992,7 @@
     </w:p>
     <w:tbl>
       <w:tblPr>
-        <w:tblW w:w="9877" w:type="dxa"/>
+        <w:tblW w:w="9337" w:type="dxa"/>
         <w:tblInd w:w="108" w:type="dxa"/>
         <w:tblBorders>
           <w:top w:val="single" w:sz="8" w:space="0" w:color="FFFFFF"/>
@@ -2007,24 +2007,26 @@
         <w:tblLook w:val="04A0" w:firstRow="1" w:lastRow="0" w:firstColumn="1" w:lastColumn="0" w:noHBand="0" w:noVBand="1"/>
       </w:tblPr>
       <w:tblGrid>
-        <w:gridCol w:w="205"/>
-        <w:gridCol w:w="1888"/>
-        <w:gridCol w:w="764"/>
-        <w:gridCol w:w="1518"/>
-        <w:gridCol w:w="732"/>
-        <w:gridCol w:w="1678"/>
-        <w:gridCol w:w="662"/>
-        <w:gridCol w:w="1529"/>
-        <w:gridCol w:w="901"/>
+        <w:gridCol w:w="180"/>
+        <w:gridCol w:w="981"/>
+        <w:gridCol w:w="709"/>
+        <w:gridCol w:w="1077"/>
+        <w:gridCol w:w="720"/>
+        <w:gridCol w:w="1170"/>
+        <w:gridCol w:w="990"/>
+        <w:gridCol w:w="1170"/>
+        <w:gridCol w:w="720"/>
+        <w:gridCol w:w="1080"/>
+        <w:gridCol w:w="540"/>
       </w:tblGrid>
       <w:tr>
         <w:trPr>
-          <w:trHeight w:val="191"/>
+          <w:trHeight w:val="196"/>
           <w:tblHeader/>
         </w:trPr>
         <w:tc>
           <w:tcPr>
-            <w:tcW w:w="205" w:type="dxa"/>
+            <w:tcW w:w="180" w:type="dxa"/>
             <w:tcBorders>
               <w:top w:val="single" w:sz="4" w:space="0" w:color="000000"/>
               <w:left w:val="single" w:sz="4" w:space="0" w:color="000000"/>
@@ -2044,7 +2046,7 @@
         </w:tc>
         <w:tc>
           <w:tcPr>
-            <w:tcW w:w="1888" w:type="dxa"/>
+            <w:tcW w:w="981" w:type="dxa"/>
             <w:tcBorders>
               <w:top w:val="single" w:sz="4" w:space="0" w:color="000000"/>
               <w:left w:val="single" w:sz="4" w:space="0" w:color="000000"/>
@@ -2064,14 +2066,18 @@
             <w:pPr>
               <w:pStyle w:val="Default"/>
               <w:jc w:val="center"/>
+              <w:rPr>
+                <w:sz w:val="14"/>
+                <w:szCs w:val="14"/>
+              </w:rPr>
             </w:pPr>
             <w:r>
               <w:rPr>
                 <w:rFonts w:ascii="Georgia" w:hAnsi="Georgia"/>
                 <w:b/>
                 <w:bCs/>
-                <w:sz w:val="16"/>
-                <w:szCs w:val="16"/>
+                <w:sz w:val="14"/>
+                <w:szCs w:val="14"/>
                 <w:u w:color="000000"/>
               </w:rPr>
               <w:t>MEDICINE</w:t>
@@ -2080,7 +2086,7 @@
         </w:tc>
         <w:tc>
           <w:tcPr>
-            <w:tcW w:w="764" w:type="dxa"/>
+            <w:tcW w:w="709" w:type="dxa"/>
             <w:tcBorders>
               <w:top w:val="single" w:sz="4" w:space="0" w:color="000000"/>
               <w:left w:val="single" w:sz="4" w:space="0" w:color="000000"/>
@@ -2102,20 +2108,42 @@
               <w:suppressAutoHyphens/>
               <w:spacing w:before="0" w:line="240" w:lineRule="auto"/>
               <w:jc w:val="center"/>
+              <w:rPr>
+                <w:sz w:val="10"/>
+                <w:szCs w:val="10"/>
+              </w:rPr>
             </w:pPr>
             <w:r>
               <w:rPr>
                 <w:rFonts w:ascii="MS Gothic" w:eastAsia="MS Gothic" w:hAnsi="MS Gothic"/>
-                <w:sz w:val="14"/>
-                <w:szCs w:val="14"/>
-              </w:rPr>
-              <w:t>{medicineCheckBox}</w:t>
+                <w:sz w:val="10"/>
+                <w:szCs w:val="10"/>
+              </w:rPr>
+              <w:t>{</w:t>
+            </w:r>
+            <w:proofErr w:type="spellStart"/>
+            <w:r>
+              <w:rPr>
+                <w:rFonts w:ascii="MS Gothic" w:eastAsia="MS Gothic" w:hAnsi="MS Gothic"/>
+                <w:sz w:val="10"/>
+                <w:szCs w:val="10"/>
+              </w:rPr>
+              <w:t>medicineCheckBox</w:t>
+            </w:r>
+            <w:proofErr w:type="spellEnd"/>
+            <w:r>
+              <w:rPr>
+                <w:rFonts w:ascii="MS Gothic" w:eastAsia="MS Gothic" w:hAnsi="MS Gothic"/>
+                <w:sz w:val="10"/>
+                <w:szCs w:val="10"/>
+              </w:rPr>
+              <w:t>}</w:t>
             </w:r>
           </w:p>
         </w:tc>
         <w:tc>
           <w:tcPr>
-            <w:tcW w:w="1518" w:type="dxa"/>
+            <w:tcW w:w="1077" w:type="dxa"/>
             <w:tcBorders>
               <w:top w:val="single" w:sz="4" w:space="0" w:color="000000"/>
               <w:left w:val="single" w:sz="4" w:space="0" w:color="000000"/>
@@ -2135,14 +2163,18 @@
             <w:pPr>
               <w:pStyle w:val="Default"/>
               <w:jc w:val="center"/>
+              <w:rPr>
+                <w:sz w:val="14"/>
+                <w:szCs w:val="14"/>
+              </w:rPr>
             </w:pPr>
             <w:r>
               <w:rPr>
                 <w:rFonts w:ascii="Georgia" w:hAnsi="Georgia"/>
                 <w:b/>
                 <w:bCs/>
-                <w:sz w:val="16"/>
-                <w:szCs w:val="16"/>
+                <w:sz w:val="14"/>
+                <w:szCs w:val="14"/>
                 <w:u w:color="000000"/>
               </w:rPr>
               <w:t>MEDICAL</w:t>
@@ -2151,7 +2183,7 @@
         </w:tc>
         <w:tc>
           <w:tcPr>
-            <w:tcW w:w="732" w:type="dxa"/>
+            <w:tcW w:w="720" w:type="dxa"/>
             <w:tcBorders>
               <w:top w:val="single" w:sz="4" w:space="0" w:color="000000"/>
               <w:left w:val="single" w:sz="4" w:space="0" w:color="000000"/>
@@ -2173,20 +2205,42 @@
               <w:suppressAutoHyphens/>
               <w:spacing w:before="0" w:line="240" w:lineRule="auto"/>
               <w:jc w:val="center"/>
+              <w:rPr>
+                <w:sz w:val="10"/>
+                <w:szCs w:val="10"/>
+              </w:rPr>
             </w:pPr>
             <w:r>
               <w:rPr>
                 <w:rFonts w:ascii="MS Gothic" w:eastAsia="MS Gothic" w:hAnsi="MS Gothic"/>
-                <w:sz w:val="14"/>
-                <w:szCs w:val="14"/>
-              </w:rPr>
-              <w:t>{medicalCheckBox}</w:t>
+                <w:sz w:val="10"/>
+                <w:szCs w:val="10"/>
+              </w:rPr>
+              <w:t>{</w:t>
+            </w:r>
+            <w:proofErr w:type="spellStart"/>
+            <w:r>
+              <w:rPr>
+                <w:rFonts w:ascii="MS Gothic" w:eastAsia="MS Gothic" w:hAnsi="MS Gothic"/>
+                <w:sz w:val="10"/>
+                <w:szCs w:val="10"/>
+              </w:rPr>
+              <w:t>medicalCheckBox</w:t>
+            </w:r>
+            <w:proofErr w:type="spellEnd"/>
+            <w:r>
+              <w:rPr>
+                <w:rFonts w:ascii="MS Gothic" w:eastAsia="MS Gothic" w:hAnsi="MS Gothic"/>
+                <w:sz w:val="10"/>
+                <w:szCs w:val="10"/>
+              </w:rPr>
+              <w:t>}</w:t>
             </w:r>
           </w:p>
         </w:tc>
         <w:tc>
           <w:tcPr>
-            <w:tcW w:w="1678" w:type="dxa"/>
+            <w:tcW w:w="1170" w:type="dxa"/>
             <w:tcBorders>
               <w:top w:val="single" w:sz="4" w:space="0" w:color="000000"/>
               <w:left w:val="single" w:sz="4" w:space="0" w:color="000000"/>
@@ -2206,23 +2260,27 @@
             <w:pPr>
               <w:pStyle w:val="Default"/>
               <w:jc w:val="center"/>
+              <w:rPr>
+                <w:sz w:val="14"/>
+                <w:szCs w:val="14"/>
+              </w:rPr>
             </w:pPr>
             <w:r>
               <w:rPr>
                 <w:rFonts w:ascii="Georgia" w:hAnsi="Georgia"/>
                 <w:b/>
                 <w:bCs/>
-                <w:sz w:val="16"/>
-                <w:szCs w:val="16"/>
+                <w:sz w:val="14"/>
+                <w:szCs w:val="14"/>
                 <w:u w:color="000000"/>
               </w:rPr>
-              <w:t>BURIAL</w:t>
+              <w:t>HOSPITAL</w:t>
             </w:r>
           </w:p>
         </w:tc>
         <w:tc>
           <w:tcPr>
-            <w:tcW w:w="662" w:type="dxa"/>
+            <w:tcW w:w="990" w:type="dxa"/>
             <w:tcBorders>
               <w:top w:val="single" w:sz="4" w:space="0" w:color="000000"/>
               <w:left w:val="single" w:sz="4" w:space="0" w:color="000000"/>
@@ -2244,20 +2302,42 @@
               <w:suppressAutoHyphens/>
               <w:spacing w:before="0" w:line="240" w:lineRule="auto"/>
               <w:jc w:val="center"/>
+              <w:rPr>
+                <w:sz w:val="10"/>
+                <w:szCs w:val="10"/>
+              </w:rPr>
             </w:pPr>
             <w:r>
               <w:rPr>
                 <w:rFonts w:ascii="MS Gothic" w:eastAsia="MS Gothic" w:hAnsi="MS Gothic"/>
-                <w:sz w:val="14"/>
-                <w:szCs w:val="14"/>
-              </w:rPr>
-              <w:t>{burialCheckBox}</w:t>
+                <w:sz w:val="10"/>
+                <w:szCs w:val="10"/>
+              </w:rPr>
+              <w:t>{</w:t>
+            </w:r>
+            <w:proofErr w:type="spellStart"/>
+            <w:r>
+              <w:rPr>
+                <w:rFonts w:ascii="MS Gothic" w:eastAsia="MS Gothic" w:hAnsi="MS Gothic"/>
+                <w:sz w:val="10"/>
+                <w:szCs w:val="10"/>
+              </w:rPr>
+              <w:t>burialCheckBox</w:t>
+            </w:r>
+            <w:proofErr w:type="spellEnd"/>
+            <w:r>
+              <w:rPr>
+                <w:rFonts w:ascii="MS Gothic" w:eastAsia="MS Gothic" w:hAnsi="MS Gothic"/>
+                <w:sz w:val="10"/>
+                <w:szCs w:val="10"/>
+              </w:rPr>
+              <w:t>}</w:t>
             </w:r>
           </w:p>
         </w:tc>
         <w:tc>
           <w:tcPr>
-            <w:tcW w:w="1529" w:type="dxa"/>
+            <w:tcW w:w="1170" w:type="dxa"/>
             <w:tcBorders>
               <w:top w:val="single" w:sz="4" w:space="0" w:color="000000"/>
               <w:left w:val="single" w:sz="4" w:space="0" w:color="000000"/>
@@ -2277,23 +2357,29 @@
             <w:pPr>
               <w:pStyle w:val="Default"/>
               <w:jc w:val="center"/>
-            </w:pPr>
-            <w:r>
               <w:rPr>
                 <w:rFonts w:ascii="Georgia" w:hAnsi="Georgia"/>
                 <w:b/>
                 <w:bCs/>
-                <w:sz w:val="16"/>
-                <w:szCs w:val="16"/>
-                <w:u w:color="000000"/>
-              </w:rPr>
-              <w:t>HOSPITAL</w:t>
+                <w:sz w:val="14"/>
+                <w:szCs w:val="14"/>
+              </w:rPr>
+            </w:pPr>
+            <w:r>
+              <w:rPr>
+                <w:rFonts w:ascii="Georgia" w:hAnsi="Georgia"/>
+                <w:b/>
+                <w:bCs/>
+                <w:sz w:val="14"/>
+                <w:szCs w:val="14"/>
+              </w:rPr>
+              <w:t>BURIAL</w:t>
             </w:r>
           </w:p>
         </w:tc>
         <w:tc>
           <w:tcPr>
-            <w:tcW w:w="901" w:type="dxa"/>
+            <w:tcW w:w="720" w:type="dxa"/>
             <w:tcBorders>
               <w:top w:val="single" w:sz="4" w:space="0" w:color="000000"/>
               <w:left w:val="single" w:sz="4" w:space="0" w:color="000000"/>
@@ -2315,14 +2401,144 @@
               <w:suppressAutoHyphens/>
               <w:spacing w:before="0" w:line="240" w:lineRule="auto"/>
               <w:jc w:val="center"/>
+              <w:rPr>
+                <w:sz w:val="10"/>
+                <w:szCs w:val="10"/>
+              </w:rPr>
             </w:pPr>
             <w:r>
+              <w:rPr>
+                <w:rFonts w:ascii="MS Gothic" w:eastAsia="MS Gothic" w:hAnsi="MS Gothic"/>
+                <w:sz w:val="10"/>
+                <w:szCs w:val="10"/>
+              </w:rPr>
+              <w:t>{</w:t>
+            </w:r>
+            <w:proofErr w:type="spellStart"/>
+            <w:r>
+              <w:rPr>
+                <w:rFonts w:ascii="MS Gothic" w:eastAsia="MS Gothic" w:hAnsi="MS Gothic"/>
+                <w:sz w:val="10"/>
+                <w:szCs w:val="10"/>
+              </w:rPr>
+              <w:t>hospitalCheckBox</w:t>
+            </w:r>
+            <w:proofErr w:type="spellEnd"/>
+            <w:r>
+              <w:rPr>
+                <w:rFonts w:ascii="MS Gothic" w:eastAsia="MS Gothic" w:hAnsi="MS Gothic"/>
+                <w:sz w:val="10"/>
+                <w:szCs w:val="10"/>
+              </w:rPr>
+              <w:t>}</w:t>
+            </w:r>
+          </w:p>
+        </w:tc>
+        <w:tc>
+          <w:tcPr>
+            <w:tcW w:w="1080" w:type="dxa"/>
+            <w:tcBorders>
+              <w:top w:val="single" w:sz="4" w:space="0" w:color="000000"/>
+              <w:left w:val="single" w:sz="4" w:space="0" w:color="000000"/>
+              <w:bottom w:val="single" w:sz="4" w:space="0" w:color="000000"/>
+              <w:right w:val="single" w:sz="4" w:space="0" w:color="000000"/>
+            </w:tcBorders>
+            <w:shd w:val="clear" w:color="auto" w:fill="D9D9D9"/>
+          </w:tcPr>
+          <w:p>
+            <w:pPr>
+              <w:pStyle w:val="Default"/>
+              <w:suppressAutoHyphens/>
+              <w:spacing w:before="0" w:line="240" w:lineRule="auto"/>
+              <w:jc w:val="center"/>
               <w:rPr>
                 <w:rFonts w:ascii="MS Gothic" w:eastAsia="MS Gothic" w:hAnsi="MS Gothic"/>
                 <w:sz w:val="14"/>
                 <w:szCs w:val="14"/>
               </w:rPr>
-              <w:t>{hospitalCheckBox}</w:t>
+            </w:pPr>
+          </w:p>
+          <w:p>
+            <w:pPr>
+              <w:pStyle w:val="Default"/>
+              <w:suppressAutoHyphens/>
+              <w:spacing w:before="0" w:line="240" w:lineRule="auto"/>
+              <w:jc w:val="center"/>
+              <w:rPr>
+                <w:rFonts w:ascii="MS Gothic" w:eastAsia="MS Gothic" w:hAnsi="MS Gothic"/>
+                <w:sz w:val="14"/>
+                <w:szCs w:val="14"/>
+              </w:rPr>
+            </w:pPr>
+            <w:r>
+              <w:rPr>
+                <w:rFonts w:ascii="Georgia" w:hAnsi="Georgia"/>
+                <w:b/>
+                <w:bCs/>
+                <w:sz w:val="14"/>
+                <w:szCs w:val="14"/>
+              </w:rPr>
+              <w:t>EYEGLASS</w:t>
+            </w:r>
+          </w:p>
+        </w:tc>
+        <w:tc>
+          <w:tcPr>
+            <w:tcW w:w="540" w:type="dxa"/>
+            <w:tcBorders>
+              <w:top w:val="single" w:sz="4" w:space="0" w:color="000000"/>
+              <w:left w:val="single" w:sz="4" w:space="0" w:color="000000"/>
+              <w:bottom w:val="single" w:sz="4" w:space="0" w:color="000000"/>
+              <w:right w:val="single" w:sz="4" w:space="0" w:color="000000"/>
+            </w:tcBorders>
+            <w:shd w:val="clear" w:color="auto" w:fill="D9D9D9"/>
+            <w:vAlign w:val="center"/>
+          </w:tcPr>
+          <w:p>
+            <w:pPr>
+              <w:pStyle w:val="Default"/>
+              <w:suppressAutoHyphens/>
+              <w:spacing w:before="0" w:line="240" w:lineRule="auto"/>
+              <w:jc w:val="center"/>
+              <w:rPr>
+                <w:rFonts w:ascii="MS Gothic" w:eastAsia="MS Gothic" w:hAnsi="MS Gothic"/>
+                <w:sz w:val="14"/>
+                <w:szCs w:val="14"/>
+              </w:rPr>
+            </w:pPr>
+            <w:r>
+              <w:rPr>
+                <w:rFonts w:ascii="MS Gothic" w:eastAsia="MS Gothic" w:hAnsi="MS Gothic"/>
+                <w:sz w:val="10"/>
+                <w:szCs w:val="10"/>
+              </w:rPr>
+              <w:t>{</w:t>
+            </w:r>
+            <w:proofErr w:type="spellStart"/>
+            <w:r>
+              <w:rPr>
+                <w:rFonts w:ascii="MS Gothic" w:eastAsia="MS Gothic" w:hAnsi="MS Gothic"/>
+                <w:sz w:val="10"/>
+                <w:szCs w:val="10"/>
+              </w:rPr>
+              <w:t>eyeglass</w:t>
+            </w:r>
+            <w:r>
+              <w:rPr>
+                <w:rFonts w:ascii="MS Gothic" w:eastAsia="MS Gothic" w:hAnsi="MS Gothic"/>
+                <w:sz w:val="10"/>
+                <w:szCs w:val="10"/>
+              </w:rPr>
+              <w:t>CheckBox</w:t>
+            </w:r>
+            <w:proofErr w:type="spellEnd"/>
+            <w:r>
+              <w:rPr>
+                <w:rFonts w:ascii="MS Gothic" w:eastAsia="MS Gothic" w:hAnsi="MS Gothic"/>
+                <w:sz w:val="10"/>
+                <w:szCs w:val="10"/>
+              </w:rPr>
+              <w:t>}</w:t>
             </w:r>
           </w:p>
         </w:tc>
@@ -2332,11 +2548,11 @@
           <w:shd w:val="clear" w:color="auto" w:fill="CED7E7"/>
         </w:tblPrEx>
         <w:trPr>
-          <w:trHeight w:val="406"/>
+          <w:trHeight w:val="416"/>
         </w:trPr>
         <w:tc>
           <w:tcPr>
-            <w:tcW w:w="205" w:type="dxa"/>
+            <w:tcW w:w="180" w:type="dxa"/>
             <w:tcBorders>
               <w:top w:val="single" w:sz="4" w:space="0" w:color="000000"/>
               <w:left w:val="single" w:sz="4" w:space="0" w:color="000000"/>
@@ -2368,7 +2584,7 @@
         </w:tc>
         <w:tc>
           <w:tcPr>
-            <w:tcW w:w="1888" w:type="dxa"/>
+            <w:tcW w:w="981" w:type="dxa"/>
             <w:tcBorders>
               <w:top w:val="single" w:sz="4" w:space="0" w:color="000000"/>
               <w:left w:val="single" w:sz="4" w:space="0" w:color="000000"/>
@@ -2400,7 +2616,7 @@
         </w:tc>
         <w:tc>
           <w:tcPr>
-            <w:tcW w:w="764" w:type="dxa"/>
+            <w:tcW w:w="709" w:type="dxa"/>
             <w:tcBorders>
               <w:top w:val="single" w:sz="4" w:space="0" w:color="000000"/>
               <w:left w:val="single" w:sz="4" w:space="0" w:color="000000"/>
@@ -2416,19 +2632,43 @@
             <w:vAlign w:val="center"/>
           </w:tcPr>
           <w:p>
+            <w:pPr>
+              <w:rPr>
+                <w:sz w:val="10"/>
+                <w:szCs w:val="10"/>
+              </w:rPr>
+            </w:pPr>
             <w:r>
               <w:rPr>
                 <w:rFonts w:ascii="MS Gothic" w:eastAsia="MS Gothic" w:hAnsi="MS Gothic"/>
-                <w:sz w:val="14"/>
-                <w:szCs w:val="14"/>
-              </w:rPr>
-              <w:t>{reqMedicineLetterRequest}</w:t>
+                <w:sz w:val="10"/>
+                <w:szCs w:val="10"/>
+              </w:rPr>
+              <w:t>{</w:t>
+            </w:r>
+            <w:proofErr w:type="spellStart"/>
+            <w:r>
+              <w:rPr>
+                <w:rFonts w:ascii="MS Gothic" w:eastAsia="MS Gothic" w:hAnsi="MS Gothic"/>
+                <w:sz w:val="10"/>
+                <w:szCs w:val="10"/>
+              </w:rPr>
+              <w:t>reqMedicineLetterRequest</w:t>
+            </w:r>
+            <w:proofErr w:type="spellEnd"/>
+            <w:r>
+              <w:rPr>
+                <w:rFonts w:ascii="MS Gothic" w:eastAsia="MS Gothic" w:hAnsi="MS Gothic"/>
+                <w:sz w:val="10"/>
+                <w:szCs w:val="10"/>
+              </w:rPr>
+              <w:t>}</w:t>
             </w:r>
           </w:p>
         </w:tc>
         <w:tc>
           <w:tcPr>
-            <w:tcW w:w="1518" w:type="dxa"/>
+            <w:tcW w:w="1077" w:type="dxa"/>
             <w:tcBorders>
               <w:top w:val="single" w:sz="4" w:space="0" w:color="000000"/>
               <w:left w:val="single" w:sz="4" w:space="0" w:color="000000"/>
@@ -2466,7 +2706,7 @@
         </w:tc>
         <w:tc>
           <w:tcPr>
-            <w:tcW w:w="732" w:type="dxa"/>
+            <w:tcW w:w="720" w:type="dxa"/>
             <w:tcBorders>
               <w:top w:val="single" w:sz="4" w:space="0" w:color="000000"/>
               <w:left w:val="single" w:sz="4" w:space="0" w:color="000000"/>
@@ -2482,19 +2722,43 @@
             <w:vAlign w:val="center"/>
           </w:tcPr>
           <w:p>
+            <w:pPr>
+              <w:rPr>
+                <w:sz w:val="10"/>
+                <w:szCs w:val="10"/>
+              </w:rPr>
+            </w:pPr>
             <w:r>
               <w:rPr>
                 <w:rFonts w:ascii="MS Gothic" w:eastAsia="MS Gothic" w:hAnsi="MS Gothic"/>
-                <w:sz w:val="14"/>
-                <w:szCs w:val="14"/>
-              </w:rPr>
-              <w:t>{reqMedicalRequestForm}</w:t>
+                <w:sz w:val="10"/>
+                <w:szCs w:val="10"/>
+              </w:rPr>
+              <w:t>{</w:t>
+            </w:r>
+            <w:proofErr w:type="spellStart"/>
+            <w:r>
+              <w:rPr>
+                <w:rFonts w:ascii="MS Gothic" w:eastAsia="MS Gothic" w:hAnsi="MS Gothic"/>
+                <w:sz w:val="10"/>
+                <w:szCs w:val="10"/>
+              </w:rPr>
+              <w:t>reqMedicalRequestForm</w:t>
+            </w:r>
+            <w:proofErr w:type="spellEnd"/>
+            <w:r>
+              <w:rPr>
+                <w:rFonts w:ascii="MS Gothic" w:eastAsia="MS Gothic" w:hAnsi="MS Gothic"/>
+                <w:sz w:val="10"/>
+                <w:szCs w:val="10"/>
+              </w:rPr>
+              <w:t>}</w:t>
             </w:r>
           </w:p>
         </w:tc>
         <w:tc>
           <w:tcPr>
-            <w:tcW w:w="1678" w:type="dxa"/>
+            <w:tcW w:w="1170" w:type="dxa"/>
             <w:tcBorders>
               <w:top w:val="single" w:sz="4" w:space="0" w:color="000000"/>
               <w:left w:val="single" w:sz="4" w:space="0" w:color="000000"/>
@@ -2532,7 +2796,7 @@
         </w:tc>
         <w:tc>
           <w:tcPr>
-            <w:tcW w:w="662" w:type="dxa"/>
+            <w:tcW w:w="990" w:type="dxa"/>
             <w:tcBorders>
               <w:top w:val="single" w:sz="4" w:space="0" w:color="000000"/>
               <w:left w:val="single" w:sz="4" w:space="0" w:color="000000"/>
@@ -2548,19 +2812,43 @@
             <w:vAlign w:val="center"/>
           </w:tcPr>
           <w:p>
+            <w:pPr>
+              <w:rPr>
+                <w:sz w:val="10"/>
+                <w:szCs w:val="10"/>
+              </w:rPr>
+            </w:pPr>
             <w:r>
               <w:rPr>
                 <w:rFonts w:ascii="MS Gothic" w:eastAsia="MS Gothic" w:hAnsi="MS Gothic"/>
-                <w:sz w:val="14"/>
-                <w:szCs w:val="14"/>
-              </w:rPr>
-              <w:t>{reqBurialClinicalAbstract}</w:t>
+                <w:sz w:val="10"/>
+                <w:szCs w:val="10"/>
+              </w:rPr>
+              <w:t>{</w:t>
+            </w:r>
+            <w:proofErr w:type="spellStart"/>
+            <w:r>
+              <w:rPr>
+                <w:rFonts w:ascii="MS Gothic" w:eastAsia="MS Gothic" w:hAnsi="MS Gothic"/>
+                <w:sz w:val="10"/>
+                <w:szCs w:val="10"/>
+              </w:rPr>
+              <w:t>reqBurialClinicalAbstract</w:t>
+            </w:r>
+            <w:proofErr w:type="spellEnd"/>
+            <w:r>
+              <w:rPr>
+                <w:rFonts w:ascii="MS Gothic" w:eastAsia="MS Gothic" w:hAnsi="MS Gothic"/>
+                <w:sz w:val="10"/>
+                <w:szCs w:val="10"/>
+              </w:rPr>
+              <w:t>}</w:t>
             </w:r>
           </w:p>
         </w:tc>
         <w:tc>
           <w:tcPr>
-            <w:tcW w:w="1529" w:type="dxa"/>
+            <w:tcW w:w="1170" w:type="dxa"/>
             <w:tcBorders>
               <w:top w:val="single" w:sz="4" w:space="0" w:color="000000"/>
               <w:left w:val="single" w:sz="4" w:space="0" w:color="000000"/>
@@ -2598,7 +2886,7 @@
         </w:tc>
         <w:tc>
           <w:tcPr>
-            <w:tcW w:w="901" w:type="dxa"/>
+            <w:tcW w:w="720" w:type="dxa"/>
             <w:tcBorders>
               <w:top w:val="single" w:sz="4" w:space="0" w:color="000000"/>
               <w:left w:val="single" w:sz="4" w:space="0" w:color="000000"/>
@@ -2614,13 +2902,137 @@
             <w:vAlign w:val="center"/>
           </w:tcPr>
           <w:p>
-            <w:r>
+            <w:pPr>
+              <w:rPr>
+                <w:sz w:val="10"/>
+                <w:szCs w:val="10"/>
+              </w:rPr>
+            </w:pPr>
+            <w:r>
+              <w:rPr>
+                <w:rFonts w:ascii="MS Gothic" w:eastAsia="MS Gothic" w:hAnsi="MS Gothic"/>
+                <w:sz w:val="10"/>
+                <w:szCs w:val="10"/>
+              </w:rPr>
+              <w:t>{</w:t>
+            </w:r>
+            <w:proofErr w:type="spellStart"/>
+            <w:r>
+              <w:rPr>
+                <w:rFonts w:ascii="MS Gothic" w:eastAsia="MS Gothic" w:hAnsi="MS Gothic"/>
+                <w:sz w:val="10"/>
+                <w:szCs w:val="10"/>
+              </w:rPr>
+              <w:t>reqHospitalDeathCertificate</w:t>
+            </w:r>
+            <w:proofErr w:type="spellEnd"/>
+            <w:r>
+              <w:rPr>
+                <w:rFonts w:ascii="MS Gothic" w:eastAsia="MS Gothic" w:hAnsi="MS Gothic"/>
+                <w:sz w:val="10"/>
+                <w:szCs w:val="10"/>
+              </w:rPr>
+              <w:t>}</w:t>
+            </w:r>
+          </w:p>
+        </w:tc>
+        <w:tc>
+          <w:tcPr>
+            <w:tcW w:w="1080" w:type="dxa"/>
+            <w:tcBorders>
+              <w:top w:val="single" w:sz="4" w:space="0" w:color="000000"/>
+              <w:left w:val="single" w:sz="4" w:space="0" w:color="000000"/>
+              <w:bottom w:val="single" w:sz="4" w:space="0" w:color="000000"/>
+              <w:right w:val="single" w:sz="4" w:space="0" w:color="000000"/>
+            </w:tcBorders>
+          </w:tcPr>
+          <w:p>
+            <w:pPr>
               <w:rPr>
                 <w:rFonts w:ascii="MS Gothic" w:eastAsia="MS Gothic" w:hAnsi="MS Gothic"/>
                 <w:sz w:val="14"/>
                 <w:szCs w:val="14"/>
               </w:rPr>
-              <w:t>{reqHospitalDeathCertificate}</w:t>
+            </w:pPr>
+          </w:p>
+          <w:p>
+            <w:pPr>
+              <w:rPr>
+                <w:rFonts w:ascii="MS Gothic" w:eastAsia="MS Gothic" w:hAnsi="MS Gothic"/>
+                <w:sz w:val="14"/>
+                <w:szCs w:val="14"/>
+              </w:rPr>
+            </w:pPr>
+            <w:r>
+              <w:rPr>
+                <w:rFonts w:ascii="Georgia" w:hAnsi="Georgia"/>
+                <w:sz w:val="16"/>
+                <w:szCs w:val="16"/>
+              </w:rPr>
+              <w:t>Medical Certificate</w:t>
+            </w:r>
+          </w:p>
+        </w:tc>
+        <w:tc>
+          <w:tcPr>
+            <w:tcW w:w="540" w:type="dxa"/>
+            <w:tcBorders>
+              <w:top w:val="single" w:sz="4" w:space="0" w:color="000000"/>
+              <w:left w:val="single" w:sz="4" w:space="0" w:color="000000"/>
+              <w:bottom w:val="single" w:sz="4" w:space="0" w:color="000000"/>
+              <w:right w:val="single" w:sz="4" w:space="0" w:color="000000"/>
+            </w:tcBorders>
+            <w:vAlign w:val="center"/>
+          </w:tcPr>
+          <w:p>
+            <w:pPr>
+              <w:rPr>
+                <w:rFonts w:ascii="MS Gothic" w:eastAsia="MS Gothic" w:hAnsi="MS Gothic"/>
+                <w:sz w:val="14"/>
+                <w:szCs w:val="14"/>
+              </w:rPr>
+            </w:pPr>
+            <w:r>
+              <w:rPr>
+                <w:rFonts w:ascii="MS Gothic" w:eastAsia="MS Gothic" w:hAnsi="MS Gothic"/>
+                <w:sz w:val="10"/>
+                <w:szCs w:val="10"/>
+              </w:rPr>
+              <w:t>{</w:t>
+            </w:r>
+            <w:proofErr w:type="spellStart"/>
+            <w:r>
+              <w:rPr>
+                <w:rFonts w:ascii="MS Gothic" w:eastAsia="MS Gothic" w:hAnsi="MS Gothic"/>
+                <w:sz w:val="10"/>
+                <w:szCs w:val="10"/>
+              </w:rPr>
+              <w:t>reqMedicine</w:t>
+            </w:r>
+            <w:r>
+              <w:rPr>
+                <w:rFonts w:ascii="MS Gothic" w:eastAsia="MS Gothic" w:hAnsi="MS Gothic"/>
+                <w:sz w:val="10"/>
+                <w:szCs w:val="10"/>
+              </w:rPr>
+              <w:t>Eyeglass</w:t>
+            </w:r>
+            <w:r>
+              <w:rPr>
+                <w:rFonts w:ascii="MS Gothic" w:eastAsia="MS Gothic" w:hAnsi="MS Gothic"/>
+                <w:sz w:val="10"/>
+                <w:szCs w:val="10"/>
+              </w:rPr>
+              <w:t>Certificate</w:t>
+            </w:r>
+            <w:proofErr w:type="spellEnd"/>
+            <w:r>
+              <w:rPr>
+                <w:rFonts w:ascii="MS Gothic" w:eastAsia="MS Gothic" w:hAnsi="MS Gothic"/>
+                <w:sz w:val="10"/>
+                <w:szCs w:val="10"/>
+              </w:rPr>
+              <w:t>}</w:t>
             </w:r>
           </w:p>
         </w:tc>
@@ -2630,11 +3042,11 @@
           <w:shd w:val="clear" w:color="auto" w:fill="CED7E7"/>
         </w:tblPrEx>
         <w:trPr>
-          <w:trHeight w:val="406"/>
+          <w:trHeight w:val="416"/>
         </w:trPr>
         <w:tc>
           <w:tcPr>
-            <w:tcW w:w="205" w:type="dxa"/>
+            <w:tcW w:w="180" w:type="dxa"/>
             <w:tcBorders>
               <w:top w:val="single" w:sz="4" w:space="0" w:color="000000"/>
               <w:left w:val="single" w:sz="4" w:space="0" w:color="000000"/>
@@ -2666,7 +3078,7 @@
         </w:tc>
         <w:tc>
           <w:tcPr>
-            <w:tcW w:w="1888" w:type="dxa"/>
+            <w:tcW w:w="981" w:type="dxa"/>
             <w:tcBorders>
               <w:top w:val="single" w:sz="4" w:space="0" w:color="000000"/>
               <w:left w:val="single" w:sz="4" w:space="0" w:color="000000"/>
@@ -2698,7 +3110,7 @@
         </w:tc>
         <w:tc>
           <w:tcPr>
-            <w:tcW w:w="764" w:type="dxa"/>
+            <w:tcW w:w="709" w:type="dxa"/>
             <w:tcBorders>
               <w:top w:val="single" w:sz="4" w:space="0" w:color="000000"/>
               <w:left w:val="single" w:sz="4" w:space="0" w:color="000000"/>
@@ -2714,19 +3126,43 @@
             <w:vAlign w:val="center"/>
           </w:tcPr>
           <w:p>
+            <w:pPr>
+              <w:rPr>
+                <w:sz w:val="10"/>
+                <w:szCs w:val="10"/>
+              </w:rPr>
+            </w:pPr>
             <w:r>
               <w:rPr>
                 <w:rFonts w:ascii="MS Gothic" w:eastAsia="MS Gothic" w:hAnsi="MS Gothic"/>
-                <w:sz w:val="14"/>
-                <w:szCs w:val="14"/>
-              </w:rPr>
-              <w:t>{reqMedicineMedicalCertificate}</w:t>
+                <w:sz w:val="10"/>
+                <w:szCs w:val="10"/>
+              </w:rPr>
+              <w:t>{</w:t>
+            </w:r>
+            <w:proofErr w:type="spellStart"/>
+            <w:r>
+              <w:rPr>
+                <w:rFonts w:ascii="MS Gothic" w:eastAsia="MS Gothic" w:hAnsi="MS Gothic"/>
+                <w:sz w:val="10"/>
+                <w:szCs w:val="10"/>
+              </w:rPr>
+              <w:t>reqMedicineMedicalCertificate</w:t>
+            </w:r>
+            <w:proofErr w:type="spellEnd"/>
+            <w:r>
+              <w:rPr>
+                <w:rFonts w:ascii="MS Gothic" w:eastAsia="MS Gothic" w:hAnsi="MS Gothic"/>
+                <w:sz w:val="10"/>
+                <w:szCs w:val="10"/>
+              </w:rPr>
+              <w:t>}</w:t>
             </w:r>
           </w:p>
         </w:tc>
         <w:tc>
           <w:tcPr>
-            <w:tcW w:w="1518" w:type="dxa"/>
+            <w:tcW w:w="1077" w:type="dxa"/>
             <w:tcBorders>
               <w:top w:val="single" w:sz="4" w:space="0" w:color="000000"/>
               <w:left w:val="single" w:sz="4" w:space="0" w:color="000000"/>
@@ -2764,7 +3200,7 @@
         </w:tc>
         <w:tc>
           <w:tcPr>
-            <w:tcW w:w="732" w:type="dxa"/>
+            <w:tcW w:w="720" w:type="dxa"/>
             <w:tcBorders>
               <w:top w:val="single" w:sz="4" w:space="0" w:color="000000"/>
               <w:left w:val="single" w:sz="4" w:space="0" w:color="000000"/>
@@ -2780,19 +3216,43 @@
             <w:vAlign w:val="center"/>
           </w:tcPr>
           <w:p>
+            <w:pPr>
+              <w:rPr>
+                <w:sz w:val="10"/>
+                <w:szCs w:val="10"/>
+              </w:rPr>
+            </w:pPr>
             <w:r>
               <w:rPr>
                 <w:rFonts w:ascii="MS Gothic" w:eastAsia="MS Gothic" w:hAnsi="MS Gothic"/>
-                <w:sz w:val="14"/>
-                <w:szCs w:val="14"/>
-              </w:rPr>
-              <w:t>{reqMedicalMedicalCertificate}</w:t>
+                <w:sz w:val="10"/>
+                <w:szCs w:val="10"/>
+              </w:rPr>
+              <w:t>{</w:t>
+            </w:r>
+            <w:proofErr w:type="spellStart"/>
+            <w:r>
+              <w:rPr>
+                <w:rFonts w:ascii="MS Gothic" w:eastAsia="MS Gothic" w:hAnsi="MS Gothic"/>
+                <w:sz w:val="10"/>
+                <w:szCs w:val="10"/>
+              </w:rPr>
+              <w:t>reqMedicalMedicalCertificate</w:t>
+            </w:r>
+            <w:proofErr w:type="spellEnd"/>
+            <w:r>
+              <w:rPr>
+                <w:rFonts w:ascii="MS Gothic" w:eastAsia="MS Gothic" w:hAnsi="MS Gothic"/>
+                <w:sz w:val="10"/>
+                <w:szCs w:val="10"/>
+              </w:rPr>
+              <w:t>}</w:t>
             </w:r>
           </w:p>
         </w:tc>
         <w:tc>
           <w:tcPr>
-            <w:tcW w:w="1678" w:type="dxa"/>
+            <w:tcW w:w="1170" w:type="dxa"/>
             <w:tcBorders>
               <w:top w:val="single" w:sz="4" w:space="0" w:color="000000"/>
               <w:left w:val="single" w:sz="4" w:space="0" w:color="000000"/>
@@ -2830,7 +3290,7 @@
         </w:tc>
         <w:tc>
           <w:tcPr>
-            <w:tcW w:w="662" w:type="dxa"/>
+            <w:tcW w:w="990" w:type="dxa"/>
             <w:tcBorders>
               <w:top w:val="single" w:sz="4" w:space="0" w:color="000000"/>
               <w:left w:val="single" w:sz="4" w:space="0" w:color="000000"/>
@@ -2846,19 +3306,43 @@
             <w:vAlign w:val="center"/>
           </w:tcPr>
           <w:p>
+            <w:pPr>
+              <w:rPr>
+                <w:sz w:val="10"/>
+                <w:szCs w:val="10"/>
+              </w:rPr>
+            </w:pPr>
             <w:r>
               <w:rPr>
                 <w:rFonts w:ascii="MS Gothic" w:eastAsia="MS Gothic" w:hAnsi="MS Gothic"/>
-                <w:sz w:val="14"/>
-                <w:szCs w:val="14"/>
-              </w:rPr>
-              <w:t>{reqBurialFinalBill}</w:t>
+                <w:sz w:val="10"/>
+                <w:szCs w:val="10"/>
+              </w:rPr>
+              <w:t>{</w:t>
+            </w:r>
+            <w:proofErr w:type="spellStart"/>
+            <w:r>
+              <w:rPr>
+                <w:rFonts w:ascii="MS Gothic" w:eastAsia="MS Gothic" w:hAnsi="MS Gothic"/>
+                <w:sz w:val="10"/>
+                <w:szCs w:val="10"/>
+              </w:rPr>
+              <w:t>reqBurialFinalBill</w:t>
+            </w:r>
+            <w:proofErr w:type="spellEnd"/>
+            <w:r>
+              <w:rPr>
+                <w:rFonts w:ascii="MS Gothic" w:eastAsia="MS Gothic" w:hAnsi="MS Gothic"/>
+                <w:sz w:val="10"/>
+                <w:szCs w:val="10"/>
+              </w:rPr>
+              <w:t>}</w:t>
             </w:r>
           </w:p>
         </w:tc>
         <w:tc>
           <w:tcPr>
-            <w:tcW w:w="1529" w:type="dxa"/>
+            <w:tcW w:w="1170" w:type="dxa"/>
             <w:tcBorders>
               <w:top w:val="single" w:sz="4" w:space="0" w:color="000000"/>
               <w:left w:val="single" w:sz="4" w:space="0" w:color="000000"/>
@@ -2896,7 +3380,7 @@
         </w:tc>
         <w:tc>
           <w:tcPr>
-            <w:tcW w:w="901" w:type="dxa"/>
+            <w:tcW w:w="720" w:type="dxa"/>
             <w:tcBorders>
               <w:top w:val="single" w:sz="4" w:space="0" w:color="000000"/>
               <w:left w:val="single" w:sz="4" w:space="0" w:color="000000"/>
@@ -2912,13 +3396,128 @@
             <w:vAlign w:val="center"/>
           </w:tcPr>
           <w:p>
-            <w:r>
+            <w:pPr>
+              <w:rPr>
+                <w:sz w:val="10"/>
+                <w:szCs w:val="10"/>
+              </w:rPr>
+            </w:pPr>
+            <w:r>
+              <w:rPr>
+                <w:rFonts w:ascii="MS Gothic" w:eastAsia="MS Gothic" w:hAnsi="MS Gothic"/>
+                <w:sz w:val="10"/>
+                <w:szCs w:val="10"/>
+              </w:rPr>
+              <w:t>{</w:t>
+            </w:r>
+            <w:proofErr w:type="spellStart"/>
+            <w:r>
+              <w:rPr>
+                <w:rFonts w:ascii="MS Gothic" w:eastAsia="MS Gothic" w:hAnsi="MS Gothic"/>
+                <w:sz w:val="10"/>
+                <w:szCs w:val="10"/>
+              </w:rPr>
+              <w:t>reqHospitalBillingStatement</w:t>
+            </w:r>
+            <w:proofErr w:type="spellEnd"/>
+            <w:r>
+              <w:rPr>
+                <w:rFonts w:ascii="MS Gothic" w:eastAsia="MS Gothic" w:hAnsi="MS Gothic"/>
+                <w:sz w:val="10"/>
+                <w:szCs w:val="10"/>
+              </w:rPr>
+              <w:t>}</w:t>
+            </w:r>
+          </w:p>
+        </w:tc>
+        <w:tc>
+          <w:tcPr>
+            <w:tcW w:w="1080" w:type="dxa"/>
+            <w:tcBorders>
+              <w:top w:val="single" w:sz="4" w:space="0" w:color="000000"/>
+              <w:left w:val="single" w:sz="4" w:space="0" w:color="000000"/>
+              <w:bottom w:val="single" w:sz="4" w:space="0" w:color="000000"/>
+              <w:right w:val="single" w:sz="4" w:space="0" w:color="000000"/>
+            </w:tcBorders>
+          </w:tcPr>
+          <w:p>
+            <w:pPr>
               <w:rPr>
                 <w:rFonts w:ascii="MS Gothic" w:eastAsia="MS Gothic" w:hAnsi="MS Gothic"/>
                 <w:sz w:val="14"/>
                 <w:szCs w:val="14"/>
               </w:rPr>
-              <w:t>{reqHospitalBillingStatement}</w:t>
+            </w:pPr>
+            <w:r>
+              <w:rPr>
+                <w:rFonts w:ascii="Georgia" w:hAnsi="Georgia"/>
+                <w:sz w:val="16"/>
+                <w:szCs w:val="16"/>
+              </w:rPr>
+              <w:t>Certificate of Indigency</w:t>
+            </w:r>
+          </w:p>
+        </w:tc>
+        <w:tc>
+          <w:tcPr>
+            <w:tcW w:w="540" w:type="dxa"/>
+            <w:tcBorders>
+              <w:top w:val="single" w:sz="4" w:space="0" w:color="000000"/>
+              <w:left w:val="single" w:sz="4" w:space="0" w:color="000000"/>
+              <w:bottom w:val="single" w:sz="4" w:space="0" w:color="000000"/>
+              <w:right w:val="single" w:sz="4" w:space="0" w:color="000000"/>
+            </w:tcBorders>
+            <w:vAlign w:val="center"/>
+          </w:tcPr>
+          <w:p>
+            <w:pPr>
+              <w:rPr>
+                <w:rFonts w:ascii="MS Gothic" w:eastAsia="MS Gothic" w:hAnsi="MS Gothic"/>
+                <w:sz w:val="14"/>
+                <w:szCs w:val="14"/>
+              </w:rPr>
+            </w:pPr>
+            <w:r>
+              <w:rPr>
+                <w:rFonts w:ascii="MS Gothic" w:eastAsia="MS Gothic" w:hAnsi="MS Gothic"/>
+                <w:sz w:val="10"/>
+                <w:szCs w:val="10"/>
+              </w:rPr>
+              <w:t>{</w:t>
+            </w:r>
+            <w:proofErr w:type="spellStart"/>
+            <w:r>
+              <w:rPr>
+                <w:rFonts w:ascii="MS Gothic" w:eastAsia="MS Gothic" w:hAnsi="MS Gothic"/>
+                <w:sz w:val="10"/>
+                <w:szCs w:val="10"/>
+              </w:rPr>
+              <w:t>req</w:t>
+            </w:r>
+            <w:r>
+              <w:rPr>
+                <w:rFonts w:ascii="MS Gothic" w:eastAsia="MS Gothic" w:hAnsi="MS Gothic"/>
+                <w:sz w:val="10"/>
+                <w:szCs w:val="10"/>
+              </w:rPr>
+              <w:t>Eyeglass</w:t>
+            </w:r>
+            <w:r>
+              <w:rPr>
+                <w:rFonts w:ascii="MS Gothic" w:eastAsia="MS Gothic" w:hAnsi="MS Gothic"/>
+                <w:sz w:val="10"/>
+                <w:szCs w:val="10"/>
+              </w:rPr>
+              <w:t>CertificateIndigency</w:t>
+            </w:r>
+            <w:proofErr w:type="spellEnd"/>
+            <w:r>
+              <w:rPr>
+                <w:rFonts w:ascii="MS Gothic" w:eastAsia="MS Gothic" w:hAnsi="MS Gothic"/>
+                <w:sz w:val="10"/>
+                <w:szCs w:val="10"/>
+              </w:rPr>
+              <w:t>}</w:t>
             </w:r>
           </w:p>
         </w:tc>
@@ -2928,11 +3527,11 @@
           <w:shd w:val="clear" w:color="auto" w:fill="CED7E7"/>
         </w:tblPrEx>
         <w:trPr>
-          <w:trHeight w:val="406"/>
+          <w:trHeight w:val="416"/>
         </w:trPr>
         <w:tc>
           <w:tcPr>
-            <w:tcW w:w="205" w:type="dxa"/>
+            <w:tcW w:w="180" w:type="dxa"/>
             <w:tcBorders>
               <w:top w:val="single" w:sz="4" w:space="0" w:color="000000"/>
               <w:left w:val="single" w:sz="4" w:space="0" w:color="000000"/>
@@ -2964,7 +3563,7 @@
         </w:tc>
         <w:tc>
           <w:tcPr>
-            <w:tcW w:w="1888" w:type="dxa"/>
+            <w:tcW w:w="981" w:type="dxa"/>
             <w:tcBorders>
               <w:top w:val="single" w:sz="4" w:space="0" w:color="000000"/>
               <w:left w:val="single" w:sz="4" w:space="0" w:color="000000"/>
@@ -2996,7 +3595,7 @@
         </w:tc>
         <w:tc>
           <w:tcPr>
-            <w:tcW w:w="764" w:type="dxa"/>
+            <w:tcW w:w="709" w:type="dxa"/>
             <w:tcBorders>
               <w:top w:val="single" w:sz="4" w:space="0" w:color="000000"/>
               <w:left w:val="single" w:sz="4" w:space="0" w:color="000000"/>
@@ -3012,19 +3611,43 @@
             <w:vAlign w:val="center"/>
           </w:tcPr>
           <w:p>
+            <w:pPr>
+              <w:rPr>
+                <w:sz w:val="10"/>
+                <w:szCs w:val="10"/>
+              </w:rPr>
+            </w:pPr>
             <w:r>
               <w:rPr>
                 <w:rFonts w:ascii="MS Gothic" w:eastAsia="MS Gothic" w:hAnsi="MS Gothic"/>
-                <w:sz w:val="14"/>
-                <w:szCs w:val="14"/>
-              </w:rPr>
-              <w:t>{reqMedicinePrescription}</w:t>
+                <w:sz w:val="10"/>
+                <w:szCs w:val="10"/>
+              </w:rPr>
+              <w:t>{</w:t>
+            </w:r>
+            <w:proofErr w:type="spellStart"/>
+            <w:r>
+              <w:rPr>
+                <w:rFonts w:ascii="MS Gothic" w:eastAsia="MS Gothic" w:hAnsi="MS Gothic"/>
+                <w:sz w:val="10"/>
+                <w:szCs w:val="10"/>
+              </w:rPr>
+              <w:t>reqMedicinePrescription</w:t>
+            </w:r>
+            <w:proofErr w:type="spellEnd"/>
+            <w:r>
+              <w:rPr>
+                <w:rFonts w:ascii="MS Gothic" w:eastAsia="MS Gothic" w:hAnsi="MS Gothic"/>
+                <w:sz w:val="10"/>
+                <w:szCs w:val="10"/>
+              </w:rPr>
+              <w:t>}</w:t>
             </w:r>
           </w:p>
         </w:tc>
         <w:tc>
           <w:tcPr>
-            <w:tcW w:w="1518" w:type="dxa"/>
+            <w:tcW w:w="1077" w:type="dxa"/>
             <w:tcBorders>
               <w:top w:val="single" w:sz="4" w:space="0" w:color="000000"/>
               <w:left w:val="single" w:sz="4" w:space="0" w:color="000000"/>
@@ -3062,7 +3685,7 @@
         </w:tc>
         <w:tc>
           <w:tcPr>
-            <w:tcW w:w="732" w:type="dxa"/>
+            <w:tcW w:w="720" w:type="dxa"/>
             <w:tcBorders>
               <w:top w:val="single" w:sz="4" w:space="0" w:color="000000"/>
               <w:left w:val="single" w:sz="4" w:space="0" w:color="000000"/>
@@ -3078,19 +3701,43 @@
             <w:vAlign w:val="center"/>
           </w:tcPr>
           <w:p>
+            <w:pPr>
+              <w:rPr>
+                <w:sz w:val="10"/>
+                <w:szCs w:val="10"/>
+              </w:rPr>
+            </w:pPr>
             <w:r>
               <w:rPr>
                 <w:rFonts w:ascii="MS Gothic" w:eastAsia="MS Gothic" w:hAnsi="MS Gothic"/>
-                <w:sz w:val="14"/>
-                <w:szCs w:val="14"/>
-              </w:rPr>
-              <w:t>{reqMedicalPriceQuotation}</w:t>
+                <w:sz w:val="10"/>
+                <w:szCs w:val="10"/>
+              </w:rPr>
+              <w:t>{</w:t>
+            </w:r>
+            <w:proofErr w:type="spellStart"/>
+            <w:r>
+              <w:rPr>
+                <w:rFonts w:ascii="MS Gothic" w:eastAsia="MS Gothic" w:hAnsi="MS Gothic"/>
+                <w:sz w:val="10"/>
+                <w:szCs w:val="10"/>
+              </w:rPr>
+              <w:t>reqMedicalPriceQuotation</w:t>
+            </w:r>
+            <w:proofErr w:type="spellEnd"/>
+            <w:r>
+              <w:rPr>
+                <w:rFonts w:ascii="MS Gothic" w:eastAsia="MS Gothic" w:hAnsi="MS Gothic"/>
+                <w:sz w:val="10"/>
+                <w:szCs w:val="10"/>
+              </w:rPr>
+              <w:t>}</w:t>
             </w:r>
           </w:p>
         </w:tc>
         <w:tc>
           <w:tcPr>
-            <w:tcW w:w="1678" w:type="dxa"/>
+            <w:tcW w:w="1170" w:type="dxa"/>
             <w:tcBorders>
               <w:top w:val="single" w:sz="4" w:space="0" w:color="000000"/>
               <w:left w:val="single" w:sz="4" w:space="0" w:color="000000"/>
@@ -3128,7 +3775,7 @@
         </w:tc>
         <w:tc>
           <w:tcPr>
-            <w:tcW w:w="662" w:type="dxa"/>
+            <w:tcW w:w="990" w:type="dxa"/>
             <w:tcBorders>
               <w:top w:val="single" w:sz="4" w:space="0" w:color="000000"/>
               <w:left w:val="single" w:sz="4" w:space="0" w:color="000000"/>
@@ -3144,19 +3791,43 @@
             <w:vAlign w:val="center"/>
           </w:tcPr>
           <w:p>
+            <w:pPr>
+              <w:rPr>
+                <w:sz w:val="10"/>
+                <w:szCs w:val="10"/>
+              </w:rPr>
+            </w:pPr>
             <w:r>
               <w:rPr>
                 <w:rFonts w:ascii="MS Gothic" w:eastAsia="MS Gothic" w:hAnsi="MS Gothic"/>
-                <w:sz w:val="14"/>
-                <w:szCs w:val="14"/>
-              </w:rPr>
-              <w:t>{reqBurialPromissoryNote}</w:t>
+                <w:sz w:val="10"/>
+                <w:szCs w:val="10"/>
+              </w:rPr>
+              <w:t>{</w:t>
+            </w:r>
+            <w:proofErr w:type="spellStart"/>
+            <w:r>
+              <w:rPr>
+                <w:rFonts w:ascii="MS Gothic" w:eastAsia="MS Gothic" w:hAnsi="MS Gothic"/>
+                <w:sz w:val="10"/>
+                <w:szCs w:val="10"/>
+              </w:rPr>
+              <w:t>reqBurialPromissoryNote</w:t>
+            </w:r>
+            <w:proofErr w:type="spellEnd"/>
+            <w:r>
+              <w:rPr>
+                <w:rFonts w:ascii="MS Gothic" w:eastAsia="MS Gothic" w:hAnsi="MS Gothic"/>
+                <w:sz w:val="10"/>
+                <w:szCs w:val="10"/>
+              </w:rPr>
+              <w:t>}</w:t>
             </w:r>
           </w:p>
         </w:tc>
         <w:tc>
           <w:tcPr>
-            <w:tcW w:w="1529" w:type="dxa"/>
+            <w:tcW w:w="1170" w:type="dxa"/>
             <w:tcBorders>
               <w:top w:val="single" w:sz="4" w:space="0" w:color="000000"/>
               <w:left w:val="single" w:sz="4" w:space="0" w:color="000000"/>
@@ -3194,7 +3865,7 @@
         </w:tc>
         <w:tc>
           <w:tcPr>
-            <w:tcW w:w="901" w:type="dxa"/>
+            <w:tcW w:w="720" w:type="dxa"/>
             <w:tcBorders>
               <w:top w:val="single" w:sz="4" w:space="0" w:color="000000"/>
               <w:left w:val="single" w:sz="4" w:space="0" w:color="000000"/>
@@ -3210,13 +3881,128 @@
             <w:vAlign w:val="center"/>
           </w:tcPr>
           <w:p>
-            <w:r>
+            <w:pPr>
+              <w:rPr>
+                <w:sz w:val="10"/>
+                <w:szCs w:val="10"/>
+              </w:rPr>
+            </w:pPr>
+            <w:r>
+              <w:rPr>
+                <w:rFonts w:ascii="MS Gothic" w:eastAsia="MS Gothic" w:hAnsi="MS Gothic"/>
+                <w:sz w:val="10"/>
+                <w:szCs w:val="10"/>
+              </w:rPr>
+              <w:t>{</w:t>
+            </w:r>
+            <w:proofErr w:type="spellStart"/>
+            <w:r>
+              <w:rPr>
+                <w:rFonts w:ascii="MS Gothic" w:eastAsia="MS Gothic" w:hAnsi="MS Gothic"/>
+                <w:sz w:val="10"/>
+                <w:szCs w:val="10"/>
+              </w:rPr>
+              <w:t>reqHospitalCertificateIndigency</w:t>
+            </w:r>
+            <w:proofErr w:type="spellEnd"/>
+            <w:r>
+              <w:rPr>
+                <w:rFonts w:ascii="MS Gothic" w:eastAsia="MS Gothic" w:hAnsi="MS Gothic"/>
+                <w:sz w:val="10"/>
+                <w:szCs w:val="10"/>
+              </w:rPr>
+              <w:t>}</w:t>
+            </w:r>
+          </w:p>
+        </w:tc>
+        <w:tc>
+          <w:tcPr>
+            <w:tcW w:w="1080" w:type="dxa"/>
+            <w:tcBorders>
+              <w:top w:val="single" w:sz="4" w:space="0" w:color="000000"/>
+              <w:left w:val="single" w:sz="4" w:space="0" w:color="000000"/>
+              <w:bottom w:val="single" w:sz="4" w:space="0" w:color="000000"/>
+              <w:right w:val="single" w:sz="4" w:space="0" w:color="000000"/>
+            </w:tcBorders>
+          </w:tcPr>
+          <w:p>
+            <w:pPr>
               <w:rPr>
                 <w:rFonts w:ascii="MS Gothic" w:eastAsia="MS Gothic" w:hAnsi="MS Gothic"/>
                 <w:sz w:val="14"/>
                 <w:szCs w:val="14"/>
               </w:rPr>
-              <w:t>{reqHospitalCertificateIndigency}</w:t>
+            </w:pPr>
+            <w:r>
+              <w:rPr>
+                <w:rFonts w:ascii="Georgia" w:hAnsi="Georgia"/>
+                <w:sz w:val="16"/>
+                <w:szCs w:val="16"/>
+              </w:rPr>
+              <w:t>Photocopy of ID</w:t>
+            </w:r>
+          </w:p>
+        </w:tc>
+        <w:tc>
+          <w:tcPr>
+            <w:tcW w:w="540" w:type="dxa"/>
+            <w:tcBorders>
+              <w:top w:val="single" w:sz="4" w:space="0" w:color="000000"/>
+              <w:left w:val="single" w:sz="4" w:space="0" w:color="000000"/>
+              <w:bottom w:val="single" w:sz="4" w:space="0" w:color="000000"/>
+              <w:right w:val="single" w:sz="4" w:space="0" w:color="000000"/>
+            </w:tcBorders>
+            <w:vAlign w:val="center"/>
+          </w:tcPr>
+          <w:p>
+            <w:pPr>
+              <w:rPr>
+                <w:rFonts w:ascii="MS Gothic" w:eastAsia="MS Gothic" w:hAnsi="MS Gothic"/>
+                <w:sz w:val="14"/>
+                <w:szCs w:val="14"/>
+              </w:rPr>
+            </w:pPr>
+            <w:r>
+              <w:rPr>
+                <w:rFonts w:ascii="MS Gothic" w:eastAsia="MS Gothic" w:hAnsi="MS Gothic"/>
+                <w:sz w:val="10"/>
+                <w:szCs w:val="10"/>
+              </w:rPr>
+              <w:t>{</w:t>
+            </w:r>
+            <w:proofErr w:type="spellStart"/>
+            <w:r>
+              <w:rPr>
+                <w:rFonts w:ascii="MS Gothic" w:eastAsia="MS Gothic" w:hAnsi="MS Gothic"/>
+                <w:sz w:val="10"/>
+                <w:szCs w:val="10"/>
+              </w:rPr>
+              <w:t>req</w:t>
+            </w:r>
+            <w:r>
+              <w:rPr>
+                <w:rFonts w:ascii="MS Gothic" w:eastAsia="MS Gothic" w:hAnsi="MS Gothic"/>
+                <w:sz w:val="10"/>
+                <w:szCs w:val="10"/>
+              </w:rPr>
+              <w:t>Eyeglass</w:t>
+            </w:r>
+            <w:r>
+              <w:rPr>
+                <w:rFonts w:ascii="MS Gothic" w:eastAsia="MS Gothic" w:hAnsi="MS Gothic"/>
+                <w:sz w:val="10"/>
+                <w:szCs w:val="10"/>
+              </w:rPr>
+              <w:t>PhotocopyId</w:t>
+            </w:r>
+            <w:proofErr w:type="spellEnd"/>
+            <w:r>
+              <w:rPr>
+                <w:rFonts w:ascii="MS Gothic" w:eastAsia="MS Gothic" w:hAnsi="MS Gothic"/>
+                <w:sz w:val="10"/>
+                <w:szCs w:val="10"/>
+              </w:rPr>
+              <w:t>}</w:t>
             </w:r>
           </w:p>
         </w:tc>
@@ -3226,11 +4012,11 @@
           <w:shd w:val="clear" w:color="auto" w:fill="CED7E7"/>
         </w:tblPrEx>
         <w:trPr>
-          <w:trHeight w:val="209"/>
+          <w:trHeight w:val="214"/>
         </w:trPr>
         <w:tc>
           <w:tcPr>
-            <w:tcW w:w="205" w:type="dxa"/>
+            <w:tcW w:w="180" w:type="dxa"/>
             <w:tcBorders>
               <w:top w:val="single" w:sz="4" w:space="0" w:color="000000"/>
               <w:left w:val="single" w:sz="4" w:space="0" w:color="000000"/>
@@ -3262,7 +4048,7 @@
         </w:tc>
         <w:tc>
           <w:tcPr>
-            <w:tcW w:w="1888" w:type="dxa"/>
+            <w:tcW w:w="981" w:type="dxa"/>
             <w:tcBorders>
               <w:top w:val="single" w:sz="4" w:space="0" w:color="000000"/>
               <w:left w:val="single" w:sz="4" w:space="0" w:color="000000"/>
@@ -3294,7 +4080,7 @@
         </w:tc>
         <w:tc>
           <w:tcPr>
-            <w:tcW w:w="764" w:type="dxa"/>
+            <w:tcW w:w="709" w:type="dxa"/>
             <w:tcBorders>
               <w:top w:val="single" w:sz="4" w:space="0" w:color="000000"/>
               <w:left w:val="single" w:sz="4" w:space="0" w:color="000000"/>
@@ -3310,11 +4096,17 @@
             <w:vAlign w:val="center"/>
           </w:tcPr>
           <w:p>
+            <w:pPr>
+              <w:rPr>
+                <w:sz w:val="10"/>
+                <w:szCs w:val="10"/>
+              </w:rPr>
+            </w:pPr>
             <w:r>
               <w:rPr>
                 <w:rFonts w:ascii="MS Gothic" w:eastAsia="MS Gothic" w:hAnsi="MS Gothic"/>
-                <w:sz w:val="14"/>
-                <w:szCs w:val="14"/>
+                <w:sz w:val="10"/>
+                <w:szCs w:val="10"/>
               </w:rPr>
               <w:t>{reqMedicineCertificateIndigency}</w:t>
             </w:r>
@@ -3322,7 +4114,7 @@
         </w:tc>
         <w:tc>
           <w:tcPr>
-            <w:tcW w:w="1518" w:type="dxa"/>
+            <w:tcW w:w="1077" w:type="dxa"/>
             <w:tcBorders>
               <w:top w:val="single" w:sz="4" w:space="0" w:color="000000"/>
               <w:left w:val="single" w:sz="4" w:space="0" w:color="000000"/>
@@ -3360,7 +4152,7 @@
         </w:tc>
         <w:tc>
           <w:tcPr>
-            <w:tcW w:w="732" w:type="dxa"/>
+            <w:tcW w:w="720" w:type="dxa"/>
             <w:tcBorders>
               <w:top w:val="single" w:sz="4" w:space="0" w:color="000000"/>
               <w:left w:val="single" w:sz="4" w:space="0" w:color="000000"/>
@@ -3376,11 +4168,17 @@
             <w:vAlign w:val="center"/>
           </w:tcPr>
           <w:p>
+            <w:pPr>
+              <w:rPr>
+                <w:sz w:val="10"/>
+                <w:szCs w:val="10"/>
+              </w:rPr>
+            </w:pPr>
             <w:r>
               <w:rPr>
                 <w:rFonts w:ascii="MS Gothic" w:eastAsia="MS Gothic" w:hAnsi="MS Gothic"/>
-                <w:sz w:val="14"/>
-                <w:szCs w:val="14"/>
+                <w:sz w:val="10"/>
+                <w:szCs w:val="10"/>
               </w:rPr>
               <w:t>{reqMedicalCertificateIndigency}</w:t>
             </w:r>
@@ -3388,7 +4186,7 @@
         </w:tc>
         <w:tc>
           <w:tcPr>
-            <w:tcW w:w="1678" w:type="dxa"/>
+            <w:tcW w:w="1170" w:type="dxa"/>
             <w:tcBorders>
               <w:top w:val="single" w:sz="4" w:space="0" w:color="000000"/>
               <w:left w:val="single" w:sz="4" w:space="0" w:color="000000"/>
@@ -3426,7 +4224,7 @@
         </w:tc>
         <w:tc>
           <w:tcPr>
-            <w:tcW w:w="662" w:type="dxa"/>
+            <w:tcW w:w="990" w:type="dxa"/>
             <w:tcBorders>
               <w:top w:val="single" w:sz="4" w:space="0" w:color="000000"/>
               <w:left w:val="single" w:sz="4" w:space="0" w:color="000000"/>
@@ -3442,11 +4240,17 @@
             <w:vAlign w:val="center"/>
           </w:tcPr>
           <w:p>
+            <w:pPr>
+              <w:rPr>
+                <w:sz w:val="10"/>
+                <w:szCs w:val="10"/>
+              </w:rPr>
+            </w:pPr>
             <w:r>
               <w:rPr>
                 <w:rFonts w:ascii="MS Gothic" w:eastAsia="MS Gothic" w:hAnsi="MS Gothic"/>
-                <w:sz w:val="14"/>
-                <w:szCs w:val="14"/>
+                <w:sz w:val="10"/>
+                <w:szCs w:val="10"/>
               </w:rPr>
               <w:t>{reqBurialCertificateIndigency}</w:t>
             </w:r>
@@ -3454,7 +4258,7 @@
         </w:tc>
         <w:tc>
           <w:tcPr>
-            <w:tcW w:w="1529" w:type="dxa"/>
+            <w:tcW w:w="1170" w:type="dxa"/>
             <w:tcBorders>
               <w:top w:val="single" w:sz="4" w:space="0" w:color="000000"/>
               <w:left w:val="single" w:sz="4" w:space="0" w:color="000000"/>
@@ -3492,7 +4296,7 @@
         </w:tc>
         <w:tc>
           <w:tcPr>
-            <w:tcW w:w="901" w:type="dxa"/>
+            <w:tcW w:w="720" w:type="dxa"/>
             <w:tcBorders>
               <w:top w:val="single" w:sz="4" w:space="0" w:color="000000"/>
               <w:left w:val="single" w:sz="4" w:space="0" w:color="000000"/>
@@ -3508,14 +4312,61 @@
             <w:vAlign w:val="center"/>
           </w:tcPr>
           <w:p>
-            <w:r>
+            <w:pPr>
+              <w:rPr>
+                <w:sz w:val="10"/>
+                <w:szCs w:val="10"/>
+              </w:rPr>
+            </w:pPr>
+            <w:r>
+              <w:rPr>
+                <w:rFonts w:ascii="MS Gothic" w:eastAsia="MS Gothic" w:hAnsi="MS Gothic"/>
+                <w:sz w:val="10"/>
+                <w:szCs w:val="10"/>
+              </w:rPr>
+              <w:t>{reqHospitalPhotocopyId}</w:t>
+            </w:r>
+          </w:p>
+        </w:tc>
+        <w:tc>
+          <w:tcPr>
+            <w:tcW w:w="1080" w:type="dxa"/>
+            <w:tcBorders>
+              <w:top w:val="single" w:sz="4" w:space="0" w:color="000000"/>
+              <w:left w:val="single" w:sz="4" w:space="0" w:color="000000"/>
+              <w:bottom w:val="single" w:sz="4" w:space="0" w:color="000000"/>
+              <w:right w:val="single" w:sz="4" w:space="0" w:color="000000"/>
+            </w:tcBorders>
+          </w:tcPr>
+          <w:p>
+            <w:pPr>
               <w:rPr>
                 <w:rFonts w:ascii="MS Gothic" w:eastAsia="MS Gothic" w:hAnsi="MS Gothic"/>
                 <w:sz w:val="14"/>
                 <w:szCs w:val="14"/>
               </w:rPr>
-              <w:t>{reqHospitalPhotocopyId}</w:t>
-            </w:r>
+            </w:pPr>
+          </w:p>
+        </w:tc>
+        <w:tc>
+          <w:tcPr>
+            <w:tcW w:w="540" w:type="dxa"/>
+            <w:tcBorders>
+              <w:top w:val="single" w:sz="4" w:space="0" w:color="000000"/>
+              <w:left w:val="single" w:sz="4" w:space="0" w:color="000000"/>
+              <w:bottom w:val="single" w:sz="4" w:space="0" w:color="000000"/>
+              <w:right w:val="single" w:sz="4" w:space="0" w:color="000000"/>
+            </w:tcBorders>
+            <w:vAlign w:val="center"/>
+          </w:tcPr>
+          <w:p>
+            <w:pPr>
+              <w:rPr>
+                <w:rFonts w:ascii="MS Gothic" w:eastAsia="MS Gothic" w:hAnsi="MS Gothic"/>
+                <w:sz w:val="14"/>
+                <w:szCs w:val="14"/>
+              </w:rPr>
+            </w:pPr>
           </w:p>
         </w:tc>
       </w:tr>
@@ -3524,11 +4375,11 @@
           <w:shd w:val="clear" w:color="auto" w:fill="CED7E7"/>
         </w:tblPrEx>
         <w:trPr>
-          <w:trHeight w:val="209"/>
+          <w:trHeight w:val="214"/>
         </w:trPr>
         <w:tc>
           <w:tcPr>
-            <w:tcW w:w="205" w:type="dxa"/>
+            <w:tcW w:w="180" w:type="dxa"/>
             <w:tcBorders>
               <w:top w:val="single" w:sz="4" w:space="0" w:color="000000"/>
               <w:left w:val="single" w:sz="4" w:space="0" w:color="000000"/>
@@ -3560,7 +4411,7 @@
         </w:tc>
         <w:tc>
           <w:tcPr>
-            <w:tcW w:w="1888" w:type="dxa"/>
+            <w:tcW w:w="981" w:type="dxa"/>
             <w:tcBorders>
               <w:top w:val="single" w:sz="4" w:space="0" w:color="000000"/>
               <w:left w:val="single" w:sz="4" w:space="0" w:color="000000"/>
@@ -3592,7 +4443,7 @@
         </w:tc>
         <w:tc>
           <w:tcPr>
-            <w:tcW w:w="764" w:type="dxa"/>
+            <w:tcW w:w="709" w:type="dxa"/>
             <w:tcBorders>
               <w:top w:val="single" w:sz="4" w:space="0" w:color="000000"/>
               <w:left w:val="single" w:sz="4" w:space="0" w:color="000000"/>
@@ -3608,11 +4459,17 @@
             <w:vAlign w:val="center"/>
           </w:tcPr>
           <w:p>
+            <w:pPr>
+              <w:rPr>
+                <w:sz w:val="10"/>
+                <w:szCs w:val="10"/>
+              </w:rPr>
+            </w:pPr>
             <w:r>
               <w:rPr>
                 <w:rFonts w:ascii="MS Gothic" w:eastAsia="MS Gothic" w:hAnsi="MS Gothic"/>
-                <w:sz w:val="14"/>
-                <w:szCs w:val="14"/>
+                <w:sz w:val="10"/>
+                <w:szCs w:val="10"/>
               </w:rPr>
               <w:t>{reqMedicinePhotocopyId}</w:t>
             </w:r>
@@ -3620,7 +4477,7 @@
         </w:tc>
         <w:tc>
           <w:tcPr>
-            <w:tcW w:w="1518" w:type="dxa"/>
+            <w:tcW w:w="1077" w:type="dxa"/>
             <w:tcBorders>
               <w:top w:val="single" w:sz="4" w:space="0" w:color="000000"/>
               <w:left w:val="single" w:sz="4" w:space="0" w:color="000000"/>
@@ -3658,7 +4515,7 @@
         </w:tc>
         <w:tc>
           <w:tcPr>
-            <w:tcW w:w="732" w:type="dxa"/>
+            <w:tcW w:w="720" w:type="dxa"/>
             <w:tcBorders>
               <w:top w:val="single" w:sz="4" w:space="0" w:color="000000"/>
               <w:left w:val="single" w:sz="4" w:space="0" w:color="000000"/>
@@ -3674,11 +4531,17 @@
             <w:vAlign w:val="center"/>
           </w:tcPr>
           <w:p>
+            <w:pPr>
+              <w:rPr>
+                <w:sz w:val="10"/>
+                <w:szCs w:val="10"/>
+              </w:rPr>
+            </w:pPr>
             <w:r>
               <w:rPr>
                 <w:rFonts w:ascii="MS Gothic" w:eastAsia="MS Gothic" w:hAnsi="MS Gothic"/>
-                <w:sz w:val="14"/>
-                <w:szCs w:val="14"/>
+                <w:sz w:val="10"/>
+                <w:szCs w:val="10"/>
               </w:rPr>
               <w:t>{reqMedicalPhotocopyId}</w:t>
             </w:r>
@@ -3686,7 +4549,7 @@
         </w:tc>
         <w:tc>
           <w:tcPr>
-            <w:tcW w:w="1678" w:type="dxa"/>
+            <w:tcW w:w="1170" w:type="dxa"/>
             <w:tcBorders>
               <w:top w:val="single" w:sz="4" w:space="0" w:color="000000"/>
               <w:left w:val="single" w:sz="4" w:space="0" w:color="000000"/>
@@ -3724,7 +4587,7 @@
         </w:tc>
         <w:tc>
           <w:tcPr>
-            <w:tcW w:w="662" w:type="dxa"/>
+            <w:tcW w:w="990" w:type="dxa"/>
             <w:tcBorders>
               <w:top w:val="single" w:sz="4" w:space="0" w:color="000000"/>
               <w:left w:val="single" w:sz="4" w:space="0" w:color="000000"/>
@@ -3740,11 +4603,17 @@
             <w:vAlign w:val="center"/>
           </w:tcPr>
           <w:p>
+            <w:pPr>
+              <w:rPr>
+                <w:sz w:val="10"/>
+                <w:szCs w:val="10"/>
+              </w:rPr>
+            </w:pPr>
             <w:r>
               <w:rPr>
                 <w:rFonts w:ascii="MS Gothic" w:eastAsia="MS Gothic" w:hAnsi="MS Gothic"/>
-                <w:sz w:val="14"/>
-                <w:szCs w:val="14"/>
+                <w:sz w:val="10"/>
+                <w:szCs w:val="10"/>
               </w:rPr>
               <w:t>{reqBurialPhotocopyId}</w:t>
             </w:r>
@@ -3752,7 +4621,7 @@
         </w:tc>
         <w:tc>
           <w:tcPr>
-            <w:tcW w:w="1529" w:type="dxa"/>
+            <w:tcW w:w="1170" w:type="dxa"/>
             <w:tcBorders>
               <w:top w:val="single" w:sz="4" w:space="0" w:color="000000"/>
               <w:left w:val="single" w:sz="4" w:space="0" w:color="000000"/>
@@ -3771,7 +4640,7 @@
         </w:tc>
         <w:tc>
           <w:tcPr>
-            <w:tcW w:w="901" w:type="dxa"/>
+            <w:tcW w:w="720" w:type="dxa"/>
             <w:tcBorders>
               <w:top w:val="single" w:sz="4" w:space="0" w:color="000000"/>
               <w:left w:val="single" w:sz="4" w:space="0" w:color="000000"/>
@@ -3788,17 +4657,41 @@
           </w:tcPr>
           <w:p/>
         </w:tc>
+        <w:tc>
+          <w:tcPr>
+            <w:tcW w:w="1080" w:type="dxa"/>
+            <w:tcBorders>
+              <w:top w:val="single" w:sz="4" w:space="0" w:color="000000"/>
+              <w:left w:val="single" w:sz="4" w:space="0" w:color="000000"/>
+              <w:bottom w:val="single" w:sz="4" w:space="0" w:color="000000"/>
+              <w:right w:val="single" w:sz="4" w:space="0" w:color="000000"/>
+            </w:tcBorders>
+          </w:tcPr>
+          <w:p/>
+        </w:tc>
+        <w:tc>
+          <w:tcPr>
+            <w:tcW w:w="540" w:type="dxa"/>
+            <w:tcBorders>
+              <w:top w:val="single" w:sz="4" w:space="0" w:color="000000"/>
+              <w:left w:val="single" w:sz="4" w:space="0" w:color="000000"/>
+              <w:bottom w:val="single" w:sz="4" w:space="0" w:color="000000"/>
+              <w:right w:val="single" w:sz="4" w:space="0" w:color="000000"/>
+            </w:tcBorders>
+          </w:tcPr>
+          <w:p/>
+        </w:tc>
       </w:tr>
       <w:tr>
         <w:tblPrEx>
           <w:shd w:val="clear" w:color="auto" w:fill="CED7E7"/>
         </w:tblPrEx>
         <w:trPr>
-          <w:trHeight w:val="622"/>
+          <w:trHeight w:val="638"/>
         </w:trPr>
         <w:tc>
           <w:tcPr>
-            <w:tcW w:w="205" w:type="dxa"/>
+            <w:tcW w:w="180" w:type="dxa"/>
             <w:tcBorders>
               <w:top w:val="single" w:sz="4" w:space="0" w:color="000000"/>
               <w:left w:val="single" w:sz="4" w:space="0" w:color="000000"/>
@@ -3824,14 +4717,13 @@
                 <w:sz w:val="16"/>
                 <w:szCs w:val="16"/>
               </w:rPr>
-              <w:lastRenderedPageBreak/>
               <w:t>6</w:t>
             </w:r>
           </w:p>
         </w:tc>
         <w:tc>
           <w:tcPr>
-            <w:tcW w:w="1888" w:type="dxa"/>
+            <w:tcW w:w="981" w:type="dxa"/>
             <w:tcBorders>
               <w:top w:val="single" w:sz="4" w:space="0" w:color="000000"/>
               <w:left w:val="single" w:sz="4" w:space="0" w:color="000000"/>
@@ -3857,13 +4749,22 @@
                 <w:sz w:val="16"/>
                 <w:szCs w:val="16"/>
               </w:rPr>
-              <w:t>Certificate of No Available Medicine as Prescribed</w:t>
+              <w:t xml:space="preserve">Certificate of No Available Medicine </w:t>
+            </w:r>
+            <w:r>
+              <w:rPr>
+                <w:rFonts w:ascii="Georgia" w:hAnsi="Georgia"/>
+                <w:sz w:val="16"/>
+                <w:szCs w:val="16"/>
+              </w:rPr>
+              <w:lastRenderedPageBreak/>
+              <w:t>as Prescribed</w:t>
             </w:r>
           </w:p>
         </w:tc>
         <w:tc>
           <w:tcPr>
-            <w:tcW w:w="764" w:type="dxa"/>
+            <w:tcW w:w="709" w:type="dxa"/>
             <w:tcBorders>
               <w:top w:val="single" w:sz="4" w:space="0" w:color="000000"/>
               <w:left w:val="single" w:sz="4" w:space="0" w:color="000000"/>
@@ -3879,19 +4780,26 @@
             <w:vAlign w:val="center"/>
           </w:tcPr>
           <w:p>
+            <w:pPr>
+              <w:rPr>
+                <w:sz w:val="10"/>
+                <w:szCs w:val="10"/>
+              </w:rPr>
+            </w:pPr>
             <w:r>
               <w:rPr>
                 <w:rFonts w:ascii="MS Gothic" w:eastAsia="MS Gothic" w:hAnsi="MS Gothic"/>
-                <w:sz w:val="14"/>
-                <w:szCs w:val="14"/>
-              </w:rPr>
+                <w:sz w:val="10"/>
+                <w:szCs w:val="10"/>
+              </w:rPr>
+              <w:lastRenderedPageBreak/>
               <w:t>{reqMedicineCertificateNoAvailableMedicine}</w:t>
             </w:r>
           </w:p>
         </w:tc>
         <w:tc>
           <w:tcPr>
-            <w:tcW w:w="1518" w:type="dxa"/>
+            <w:tcW w:w="1077" w:type="dxa"/>
             <w:tcBorders>
               <w:top w:val="single" w:sz="4" w:space="0" w:color="000000"/>
               <w:left w:val="single" w:sz="4" w:space="0" w:color="000000"/>
@@ -3910,7 +4818,7 @@
         </w:tc>
         <w:tc>
           <w:tcPr>
-            <w:tcW w:w="732" w:type="dxa"/>
+            <w:tcW w:w="720" w:type="dxa"/>
             <w:tcBorders>
               <w:top w:val="single" w:sz="4" w:space="0" w:color="000000"/>
               <w:left w:val="single" w:sz="4" w:space="0" w:color="000000"/>
@@ -3929,7 +4837,7 @@
         </w:tc>
         <w:tc>
           <w:tcPr>
-            <w:tcW w:w="1678" w:type="dxa"/>
+            <w:tcW w:w="1170" w:type="dxa"/>
             <w:tcBorders>
               <w:top w:val="single" w:sz="4" w:space="0" w:color="000000"/>
               <w:left w:val="single" w:sz="4" w:space="0" w:color="000000"/>
@@ -3948,7 +4856,7 @@
         </w:tc>
         <w:tc>
           <w:tcPr>
-            <w:tcW w:w="662" w:type="dxa"/>
+            <w:tcW w:w="990" w:type="dxa"/>
             <w:tcBorders>
               <w:top w:val="single" w:sz="4" w:space="0" w:color="000000"/>
               <w:left w:val="single" w:sz="4" w:space="0" w:color="000000"/>
@@ -3967,7 +4875,7 @@
         </w:tc>
         <w:tc>
           <w:tcPr>
-            <w:tcW w:w="1529" w:type="dxa"/>
+            <w:tcW w:w="1170" w:type="dxa"/>
             <w:tcBorders>
               <w:top w:val="single" w:sz="4" w:space="0" w:color="000000"/>
               <w:left w:val="single" w:sz="4" w:space="0" w:color="000000"/>
@@ -3986,7 +4894,7 @@
         </w:tc>
         <w:tc>
           <w:tcPr>
-            <w:tcW w:w="901" w:type="dxa"/>
+            <w:tcW w:w="720" w:type="dxa"/>
             <w:tcBorders>
               <w:top w:val="single" w:sz="4" w:space="0" w:color="000000"/>
               <w:left w:val="single" w:sz="4" w:space="0" w:color="000000"/>
@@ -4000,6 +4908,30 @@
               <w:right w:w="80" w:type="dxa"/>
             </w:tcMar>
             <w:vAlign w:val="center"/>
+          </w:tcPr>
+          <w:p/>
+        </w:tc>
+        <w:tc>
+          <w:tcPr>
+            <w:tcW w:w="1080" w:type="dxa"/>
+            <w:tcBorders>
+              <w:top w:val="single" w:sz="4" w:space="0" w:color="000000"/>
+              <w:left w:val="single" w:sz="4" w:space="0" w:color="000000"/>
+              <w:bottom w:val="single" w:sz="4" w:space="0" w:color="000000"/>
+              <w:right w:val="single" w:sz="4" w:space="0" w:color="000000"/>
+            </w:tcBorders>
+          </w:tcPr>
+          <w:p/>
+        </w:tc>
+        <w:tc>
+          <w:tcPr>
+            <w:tcW w:w="540" w:type="dxa"/>
+            <w:tcBorders>
+              <w:top w:val="single" w:sz="4" w:space="0" w:color="000000"/>
+              <w:left w:val="single" w:sz="4" w:space="0" w:color="000000"/>
+              <w:bottom w:val="single" w:sz="4" w:space="0" w:color="000000"/>
+              <w:right w:val="single" w:sz="4" w:space="0" w:color="000000"/>
+            </w:tcBorders>
           </w:tcPr>
           <w:p/>
         </w:tc>
@@ -4657,6 +5589,10 @@
           <w:szCs w:val="18"/>
         </w:rPr>
         <w:pict w14:anchorId="0F9DA61A">
+          <v:shapetype id="_x0000_t202" coordsize="21600,21600" o:spt="202" path="m,l,21600r21600,l21600,xe">
+            <v:stroke joinstyle="miter"/>
+            <v:path gradientshapeok="t" o:connecttype="rect"/>
+          </v:shapetype>
           <v:shape id="_x0000_s1027" type="#_x0000_t202" style="position:absolute;left:0;text-align:left;margin-left:20.4pt;margin-top:6.2pt;width:120.1pt;height:110.6pt;z-index:-251655168;visibility:visible;mso-wrap-style:square;mso-width-percent:0;mso-height-percent:200;mso-wrap-distance-left:9pt;mso-wrap-distance-top:3.6pt;mso-wrap-distance-right:9pt;mso-wrap-distance-bottom:3.6pt;mso-position-horizontal:absolute;mso-position-horizontal-relative:text;mso-position-vertical:absolute;mso-position-vertical-relative:text;mso-width-percent:0;mso-height-percent:200;mso-width-relative:margin;mso-height-relative:margin;v-text-anchor:top" o:gfxdata="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" fillcolor="white [3212]" strokecolor="white [3212]">
             <v:textbox style="mso-fit-shape-to-text:t">
               <w:txbxContent>

</xml_diff>

<commit_message>
Map updated hospital burial CGV parameters
</commit_message>
<xml_diff>
--- a/templates/CGV AICS Template.fixed.docx
+++ b/templates/CGV AICS Template.fixed.docx
@@ -2016,8 +2016,8 @@
         <w:gridCol w:w="990"/>
         <w:gridCol w:w="1170"/>
         <w:gridCol w:w="720"/>
-        <w:gridCol w:w="1080"/>
-        <w:gridCol w:w="540"/>
+        <w:gridCol w:w="990"/>
+        <w:gridCol w:w="630"/>
       </w:tblGrid>
       <w:tr>
         <w:trPr>
@@ -2322,7 +2322,15 @@
                 <w:sz w:val="10"/>
                 <w:szCs w:val="10"/>
               </w:rPr>
-              <w:t>burialCheckBox</w:t>
+              <w:t>hospital</w:t>
+            </w:r>
+            <w:r>
+              <w:rPr>
+                <w:rFonts w:ascii="MS Gothic" w:eastAsia="MS Gothic" w:hAnsi="MS Gothic"/>
+                <w:sz w:val="10"/>
+                <w:szCs w:val="10"/>
+              </w:rPr>
+              <w:t>CheckBox</w:t>
             </w:r>
             <w:proofErr w:type="spellEnd"/>
             <w:r>
@@ -2421,7 +2429,15 @@
                 <w:sz w:val="10"/>
                 <w:szCs w:val="10"/>
               </w:rPr>
-              <w:t>hospitalCheckBox</w:t>
+              <w:t>burial</w:t>
+            </w:r>
+            <w:r>
+              <w:rPr>
+                <w:rFonts w:ascii="MS Gothic" w:eastAsia="MS Gothic" w:hAnsi="MS Gothic"/>
+                <w:sz w:val="10"/>
+                <w:szCs w:val="10"/>
+              </w:rPr>
+              <w:t>CheckBox</w:t>
             </w:r>
             <w:proofErr w:type="spellEnd"/>
             <w:r>
@@ -2436,7 +2452,7 @@
         </w:tc>
         <w:tc>
           <w:tcPr>
-            <w:tcW w:w="1080" w:type="dxa"/>
+            <w:tcW w:w="990" w:type="dxa"/>
             <w:tcBorders>
               <w:top w:val="single" w:sz="4" w:space="0" w:color="000000"/>
               <w:left w:val="single" w:sz="4" w:space="0" w:color="000000"/>
@@ -2484,7 +2500,7 @@
         </w:tc>
         <w:tc>
           <w:tcPr>
-            <w:tcW w:w="540" w:type="dxa"/>
+            <w:tcW w:w="630" w:type="dxa"/>
             <w:tcBorders>
               <w:top w:val="single" w:sz="4" w:space="0" w:color="000000"/>
               <w:left w:val="single" w:sz="4" w:space="0" w:color="000000"/>
@@ -2833,7 +2849,23 @@
                 <w:sz w:val="10"/>
                 <w:szCs w:val="10"/>
               </w:rPr>
-              <w:t>reqBurialClinicalAbstract</w:t>
+              <w:t>req</w:t>
+            </w:r>
+            <w:r>
+              <w:rPr>
+                <w:rFonts w:ascii="MS Gothic" w:eastAsia="MS Gothic" w:hAnsi="MS Gothic"/>
+                <w:sz w:val="10"/>
+                <w:szCs w:val="10"/>
+              </w:rPr>
+              <w:t>hospital</w:t>
+            </w:r>
+            <w:r>
+              <w:rPr>
+                <w:rFonts w:ascii="MS Gothic" w:eastAsia="MS Gothic" w:hAnsi="MS Gothic"/>
+                <w:sz w:val="10"/>
+                <w:szCs w:val="10"/>
+              </w:rPr>
+              <w:t>ClinicalAbstract</w:t>
             </w:r>
             <w:proofErr w:type="spellEnd"/>
             <w:r>
@@ -2923,7 +2955,23 @@
                 <w:sz w:val="10"/>
                 <w:szCs w:val="10"/>
               </w:rPr>
-              <w:t>reqHospitalDeathCertificate</w:t>
+              <w:t>req</w:t>
+            </w:r>
+            <w:r>
+              <w:rPr>
+                <w:rFonts w:ascii="MS Gothic" w:eastAsia="MS Gothic" w:hAnsi="MS Gothic"/>
+                <w:sz w:val="10"/>
+                <w:szCs w:val="10"/>
+              </w:rPr>
+              <w:t>Burial</w:t>
+            </w:r>
+            <w:r>
+              <w:rPr>
+                <w:rFonts w:ascii="MS Gothic" w:eastAsia="MS Gothic" w:hAnsi="MS Gothic"/>
+                <w:sz w:val="10"/>
+                <w:szCs w:val="10"/>
+              </w:rPr>
+              <w:t>DeathCertificate</w:t>
             </w:r>
             <w:proofErr w:type="spellEnd"/>
             <w:r>
@@ -2938,7 +2986,7 @@
         </w:tc>
         <w:tc>
           <w:tcPr>
-            <w:tcW w:w="1080" w:type="dxa"/>
+            <w:tcW w:w="990" w:type="dxa"/>
             <w:tcBorders>
               <w:top w:val="single" w:sz="4" w:space="0" w:color="000000"/>
               <w:left w:val="single" w:sz="4" w:space="0" w:color="000000"/>
@@ -2975,7 +3023,7 @@
         </w:tc>
         <w:tc>
           <w:tcPr>
-            <w:tcW w:w="540" w:type="dxa"/>
+            <w:tcW w:w="630" w:type="dxa"/>
             <w:tcBorders>
               <w:top w:val="single" w:sz="4" w:space="0" w:color="000000"/>
               <w:left w:val="single" w:sz="4" w:space="0" w:color="000000"/>
@@ -3327,7 +3375,23 @@
                 <w:sz w:val="10"/>
                 <w:szCs w:val="10"/>
               </w:rPr>
-              <w:t>reqBurialFinalBill</w:t>
+              <w:t>req</w:t>
+            </w:r>
+            <w:r>
+              <w:rPr>
+                <w:rFonts w:ascii="MS Gothic" w:eastAsia="MS Gothic" w:hAnsi="MS Gothic"/>
+                <w:sz w:val="10"/>
+                <w:szCs w:val="10"/>
+              </w:rPr>
+              <w:t>Hospital</w:t>
+            </w:r>
+            <w:r>
+              <w:rPr>
+                <w:rFonts w:ascii="MS Gothic" w:eastAsia="MS Gothic" w:hAnsi="MS Gothic"/>
+                <w:sz w:val="10"/>
+                <w:szCs w:val="10"/>
+              </w:rPr>
+              <w:t>FinalBill</w:t>
             </w:r>
             <w:proofErr w:type="spellEnd"/>
             <w:r>
@@ -3417,7 +3481,23 @@
                 <w:sz w:val="10"/>
                 <w:szCs w:val="10"/>
               </w:rPr>
-              <w:t>reqHospitalBillingStatement</w:t>
+              <w:t>req</w:t>
+            </w:r>
+            <w:r>
+              <w:rPr>
+                <w:rFonts w:ascii="MS Gothic" w:eastAsia="MS Gothic" w:hAnsi="MS Gothic"/>
+                <w:sz w:val="10"/>
+                <w:szCs w:val="10"/>
+              </w:rPr>
+              <w:t>Burial</w:t>
+            </w:r>
+            <w:r>
+              <w:rPr>
+                <w:rFonts w:ascii="MS Gothic" w:eastAsia="MS Gothic" w:hAnsi="MS Gothic"/>
+                <w:sz w:val="10"/>
+                <w:szCs w:val="10"/>
+              </w:rPr>
+              <w:t>BillingStatement</w:t>
             </w:r>
             <w:proofErr w:type="spellEnd"/>
             <w:r>
@@ -3432,7 +3512,7 @@
         </w:tc>
         <w:tc>
           <w:tcPr>
-            <w:tcW w:w="1080" w:type="dxa"/>
+            <w:tcW w:w="990" w:type="dxa"/>
             <w:tcBorders>
               <w:top w:val="single" w:sz="4" w:space="0" w:color="000000"/>
               <w:left w:val="single" w:sz="4" w:space="0" w:color="000000"/>
@@ -3460,7 +3540,7 @@
         </w:tc>
         <w:tc>
           <w:tcPr>
-            <w:tcW w:w="540" w:type="dxa"/>
+            <w:tcW w:w="630" w:type="dxa"/>
             <w:tcBorders>
               <w:top w:val="single" w:sz="4" w:space="0" w:color="000000"/>
               <w:left w:val="single" w:sz="4" w:space="0" w:color="000000"/>
@@ -3812,7 +3892,23 @@
                 <w:sz w:val="10"/>
                 <w:szCs w:val="10"/>
               </w:rPr>
-              <w:t>reqBurialPromissoryNote</w:t>
+              <w:t>req</w:t>
+            </w:r>
+            <w:r>
+              <w:rPr>
+                <w:rFonts w:ascii="MS Gothic" w:eastAsia="MS Gothic" w:hAnsi="MS Gothic"/>
+                <w:sz w:val="10"/>
+                <w:szCs w:val="10"/>
+              </w:rPr>
+              <w:t>Hospital</w:t>
+            </w:r>
+            <w:r>
+              <w:rPr>
+                <w:rFonts w:ascii="MS Gothic" w:eastAsia="MS Gothic" w:hAnsi="MS Gothic"/>
+                <w:sz w:val="10"/>
+                <w:szCs w:val="10"/>
+              </w:rPr>
+              <w:t>PromissoryNote</w:t>
             </w:r>
             <w:proofErr w:type="spellEnd"/>
             <w:r>
@@ -3902,7 +3998,23 @@
                 <w:sz w:val="10"/>
                 <w:szCs w:val="10"/>
               </w:rPr>
-              <w:t>reqHospitalCertificateIndigency</w:t>
+              <w:t>req</w:t>
+            </w:r>
+            <w:r>
+              <w:rPr>
+                <w:rFonts w:ascii="MS Gothic" w:eastAsia="MS Gothic" w:hAnsi="MS Gothic"/>
+                <w:sz w:val="10"/>
+                <w:szCs w:val="10"/>
+              </w:rPr>
+              <w:t>Burial</w:t>
+            </w:r>
+            <w:r>
+              <w:rPr>
+                <w:rFonts w:ascii="MS Gothic" w:eastAsia="MS Gothic" w:hAnsi="MS Gothic"/>
+                <w:sz w:val="10"/>
+                <w:szCs w:val="10"/>
+              </w:rPr>
+              <w:t>CertificateIndigency</w:t>
             </w:r>
             <w:proofErr w:type="spellEnd"/>
             <w:r>
@@ -3917,7 +4029,7 @@
         </w:tc>
         <w:tc>
           <w:tcPr>
-            <w:tcW w:w="1080" w:type="dxa"/>
+            <w:tcW w:w="990" w:type="dxa"/>
             <w:tcBorders>
               <w:top w:val="single" w:sz="4" w:space="0" w:color="000000"/>
               <w:left w:val="single" w:sz="4" w:space="0" w:color="000000"/>
@@ -3945,7 +4057,7 @@
         </w:tc>
         <w:tc>
           <w:tcPr>
-            <w:tcW w:w="540" w:type="dxa"/>
+            <w:tcW w:w="630" w:type="dxa"/>
             <w:tcBorders>
               <w:top w:val="single" w:sz="4" w:space="0" w:color="000000"/>
               <w:left w:val="single" w:sz="4" w:space="0" w:color="000000"/>
@@ -4108,7 +4220,25 @@
                 <w:sz w:val="10"/>
                 <w:szCs w:val="10"/>
               </w:rPr>
-              <w:t>{reqMedicineCertificateIndigency}</w:t>
+              <w:t>{</w:t>
+            </w:r>
+            <w:proofErr w:type="spellStart"/>
+            <w:r>
+              <w:rPr>
+                <w:rFonts w:ascii="MS Gothic" w:eastAsia="MS Gothic" w:hAnsi="MS Gothic"/>
+                <w:sz w:val="10"/>
+                <w:szCs w:val="10"/>
+              </w:rPr>
+              <w:t>reqMedicineCertificateIndigency</w:t>
+            </w:r>
+            <w:proofErr w:type="spellEnd"/>
+            <w:r>
+              <w:rPr>
+                <w:rFonts w:ascii="MS Gothic" w:eastAsia="MS Gothic" w:hAnsi="MS Gothic"/>
+                <w:sz w:val="10"/>
+                <w:szCs w:val="10"/>
+              </w:rPr>
+              <w:t>}</w:t>
             </w:r>
           </w:p>
         </w:tc>
@@ -4180,7 +4310,25 @@
                 <w:sz w:val="10"/>
                 <w:szCs w:val="10"/>
               </w:rPr>
-              <w:t>{reqMedicalCertificateIndigency}</w:t>
+              <w:t>{</w:t>
+            </w:r>
+            <w:proofErr w:type="spellStart"/>
+            <w:r>
+              <w:rPr>
+                <w:rFonts w:ascii="MS Gothic" w:eastAsia="MS Gothic" w:hAnsi="MS Gothic"/>
+                <w:sz w:val="10"/>
+                <w:szCs w:val="10"/>
+              </w:rPr>
+              <w:t>reqMedicalCertificateIndigency</w:t>
+            </w:r>
+            <w:proofErr w:type="spellEnd"/>
+            <w:r>
+              <w:rPr>
+                <w:rFonts w:ascii="MS Gothic" w:eastAsia="MS Gothic" w:hAnsi="MS Gothic"/>
+                <w:sz w:val="10"/>
+                <w:szCs w:val="10"/>
+              </w:rPr>
+              <w:t>}</w:t>
             </w:r>
           </w:p>
         </w:tc>
@@ -4252,7 +4400,41 @@
                 <w:sz w:val="10"/>
                 <w:szCs w:val="10"/>
               </w:rPr>
-              <w:t>{reqBurialCertificateIndigency}</w:t>
+              <w:t>{</w:t>
+            </w:r>
+            <w:proofErr w:type="spellStart"/>
+            <w:r>
+              <w:rPr>
+                <w:rFonts w:ascii="MS Gothic" w:eastAsia="MS Gothic" w:hAnsi="MS Gothic"/>
+                <w:sz w:val="10"/>
+                <w:szCs w:val="10"/>
+              </w:rPr>
+              <w:t>req</w:t>
+            </w:r>
+            <w:r>
+              <w:rPr>
+                <w:rFonts w:ascii="MS Gothic" w:eastAsia="MS Gothic" w:hAnsi="MS Gothic"/>
+                <w:sz w:val="10"/>
+                <w:szCs w:val="10"/>
+              </w:rPr>
+              <w:t>Hospital</w:t>
+            </w:r>
+            <w:r>
+              <w:rPr>
+                <w:rFonts w:ascii="MS Gothic" w:eastAsia="MS Gothic" w:hAnsi="MS Gothic"/>
+                <w:sz w:val="10"/>
+                <w:szCs w:val="10"/>
+              </w:rPr>
+              <w:t>CertificateIndigency</w:t>
+            </w:r>
+            <w:proofErr w:type="spellEnd"/>
+            <w:r>
+              <w:rPr>
+                <w:rFonts w:ascii="MS Gothic" w:eastAsia="MS Gothic" w:hAnsi="MS Gothic"/>
+                <w:sz w:val="10"/>
+                <w:szCs w:val="10"/>
+              </w:rPr>
+              <w:t>}</w:t>
             </w:r>
           </w:p>
         </w:tc>
@@ -4324,13 +4506,47 @@
                 <w:sz w:val="10"/>
                 <w:szCs w:val="10"/>
               </w:rPr>
-              <w:t>{reqHospitalPhotocopyId}</w:t>
+              <w:t>{</w:t>
+            </w:r>
+            <w:proofErr w:type="spellStart"/>
+            <w:r>
+              <w:rPr>
+                <w:rFonts w:ascii="MS Gothic" w:eastAsia="MS Gothic" w:hAnsi="MS Gothic"/>
+                <w:sz w:val="10"/>
+                <w:szCs w:val="10"/>
+              </w:rPr>
+              <w:t>req</w:t>
+            </w:r>
+            <w:r>
+              <w:rPr>
+                <w:rFonts w:ascii="MS Gothic" w:eastAsia="MS Gothic" w:hAnsi="MS Gothic"/>
+                <w:sz w:val="10"/>
+                <w:szCs w:val="10"/>
+              </w:rPr>
+              <w:t>Burial</w:t>
+            </w:r>
+            <w:r>
+              <w:rPr>
+                <w:rFonts w:ascii="MS Gothic" w:eastAsia="MS Gothic" w:hAnsi="MS Gothic"/>
+                <w:sz w:val="10"/>
+                <w:szCs w:val="10"/>
+              </w:rPr>
+              <w:t>PhotocopyId</w:t>
+            </w:r>
+            <w:proofErr w:type="spellEnd"/>
+            <w:r>
+              <w:rPr>
+                <w:rFonts w:ascii="MS Gothic" w:eastAsia="MS Gothic" w:hAnsi="MS Gothic"/>
+                <w:sz w:val="10"/>
+                <w:szCs w:val="10"/>
+              </w:rPr>
+              <w:t>}</w:t>
             </w:r>
           </w:p>
         </w:tc>
         <w:tc>
           <w:tcPr>
-            <w:tcW w:w="1080" w:type="dxa"/>
+            <w:tcW w:w="990" w:type="dxa"/>
             <w:tcBorders>
               <w:top w:val="single" w:sz="4" w:space="0" w:color="000000"/>
               <w:left w:val="single" w:sz="4" w:space="0" w:color="000000"/>
@@ -4350,7 +4566,7 @@
         </w:tc>
         <w:tc>
           <w:tcPr>
-            <w:tcW w:w="540" w:type="dxa"/>
+            <w:tcW w:w="630" w:type="dxa"/>
             <w:tcBorders>
               <w:top w:val="single" w:sz="4" w:space="0" w:color="000000"/>
               <w:left w:val="single" w:sz="4" w:space="0" w:color="000000"/>
@@ -4471,7 +4687,25 @@
                 <w:sz w:val="10"/>
                 <w:szCs w:val="10"/>
               </w:rPr>
-              <w:t>{reqMedicinePhotocopyId}</w:t>
+              <w:t>{</w:t>
+            </w:r>
+            <w:proofErr w:type="spellStart"/>
+            <w:r>
+              <w:rPr>
+                <w:rFonts w:ascii="MS Gothic" w:eastAsia="MS Gothic" w:hAnsi="MS Gothic"/>
+                <w:sz w:val="10"/>
+                <w:szCs w:val="10"/>
+              </w:rPr>
+              <w:t>reqMedicinePhotocopyId</w:t>
+            </w:r>
+            <w:proofErr w:type="spellEnd"/>
+            <w:r>
+              <w:rPr>
+                <w:rFonts w:ascii="MS Gothic" w:eastAsia="MS Gothic" w:hAnsi="MS Gothic"/>
+                <w:sz w:val="10"/>
+                <w:szCs w:val="10"/>
+              </w:rPr>
+              <w:t>}</w:t>
             </w:r>
           </w:p>
         </w:tc>
@@ -4543,7 +4777,25 @@
                 <w:sz w:val="10"/>
                 <w:szCs w:val="10"/>
               </w:rPr>
-              <w:t>{reqMedicalPhotocopyId}</w:t>
+              <w:t>{</w:t>
+            </w:r>
+            <w:proofErr w:type="spellStart"/>
+            <w:r>
+              <w:rPr>
+                <w:rFonts w:ascii="MS Gothic" w:eastAsia="MS Gothic" w:hAnsi="MS Gothic"/>
+                <w:sz w:val="10"/>
+                <w:szCs w:val="10"/>
+              </w:rPr>
+              <w:t>reqMedicalPhotocopyId</w:t>
+            </w:r>
+            <w:proofErr w:type="spellEnd"/>
+            <w:r>
+              <w:rPr>
+                <w:rFonts w:ascii="MS Gothic" w:eastAsia="MS Gothic" w:hAnsi="MS Gothic"/>
+                <w:sz w:val="10"/>
+                <w:szCs w:val="10"/>
+              </w:rPr>
+              <w:t>}</w:t>
             </w:r>
           </w:p>
         </w:tc>
@@ -4615,7 +4867,41 @@
                 <w:sz w:val="10"/>
                 <w:szCs w:val="10"/>
               </w:rPr>
-              <w:t>{reqBurialPhotocopyId}</w:t>
+              <w:t>{</w:t>
+            </w:r>
+            <w:proofErr w:type="spellStart"/>
+            <w:r>
+              <w:rPr>
+                <w:rFonts w:ascii="MS Gothic" w:eastAsia="MS Gothic" w:hAnsi="MS Gothic"/>
+                <w:sz w:val="10"/>
+                <w:szCs w:val="10"/>
+              </w:rPr>
+              <w:t>req</w:t>
+            </w:r>
+            <w:r>
+              <w:rPr>
+                <w:rFonts w:ascii="MS Gothic" w:eastAsia="MS Gothic" w:hAnsi="MS Gothic"/>
+                <w:sz w:val="10"/>
+                <w:szCs w:val="10"/>
+              </w:rPr>
+              <w:t>Hospital</w:t>
+            </w:r>
+            <w:r>
+              <w:rPr>
+                <w:rFonts w:ascii="MS Gothic" w:eastAsia="MS Gothic" w:hAnsi="MS Gothic"/>
+                <w:sz w:val="10"/>
+                <w:szCs w:val="10"/>
+              </w:rPr>
+              <w:t>PhotocopyId</w:t>
+            </w:r>
+            <w:proofErr w:type="spellEnd"/>
+            <w:r>
+              <w:rPr>
+                <w:rFonts w:ascii="MS Gothic" w:eastAsia="MS Gothic" w:hAnsi="MS Gothic"/>
+                <w:sz w:val="10"/>
+                <w:szCs w:val="10"/>
+              </w:rPr>
+              <w:t>}</w:t>
             </w:r>
           </w:p>
         </w:tc>
@@ -4659,7 +4945,7 @@
         </w:tc>
         <w:tc>
           <w:tcPr>
-            <w:tcW w:w="1080" w:type="dxa"/>
+            <w:tcW w:w="990" w:type="dxa"/>
             <w:tcBorders>
               <w:top w:val="single" w:sz="4" w:space="0" w:color="000000"/>
               <w:left w:val="single" w:sz="4" w:space="0" w:color="000000"/>
@@ -4671,7 +4957,7 @@
         </w:tc>
         <w:tc>
           <w:tcPr>
-            <w:tcW w:w="540" w:type="dxa"/>
+            <w:tcW w:w="630" w:type="dxa"/>
             <w:tcBorders>
               <w:top w:val="single" w:sz="4" w:space="0" w:color="000000"/>
               <w:left w:val="single" w:sz="4" w:space="0" w:color="000000"/>
@@ -4749,7 +5035,7 @@
                 <w:sz w:val="16"/>
                 <w:szCs w:val="16"/>
               </w:rPr>
-              <w:t xml:space="preserve">Certificate of No Available Medicine </w:t>
+              <w:t xml:space="preserve">Certificate of No Available </w:t>
             </w:r>
             <w:r>
               <w:rPr>
@@ -4758,7 +5044,7 @@
                 <w:szCs w:val="16"/>
               </w:rPr>
               <w:lastRenderedPageBreak/>
-              <w:t>as Prescribed</w:t>
+              <w:t>Medicine as Prescribed</w:t>
             </w:r>
           </w:p>
         </w:tc>
@@ -4793,7 +5079,25 @@
                 <w:szCs w:val="10"/>
               </w:rPr>
               <w:lastRenderedPageBreak/>
-              <w:t>{reqMedicineCertificateNoAvailableMedicine}</w:t>
+              <w:t>{</w:t>
+            </w:r>
+            <w:proofErr w:type="spellStart"/>
+            <w:r>
+              <w:rPr>
+                <w:rFonts w:ascii="MS Gothic" w:eastAsia="MS Gothic" w:hAnsi="MS Gothic"/>
+                <w:sz w:val="10"/>
+                <w:szCs w:val="10"/>
+              </w:rPr>
+              <w:t>reqMedicineCertificateNoAvailableMedicine</w:t>
+            </w:r>
+            <w:proofErr w:type="spellEnd"/>
+            <w:r>
+              <w:rPr>
+                <w:rFonts w:ascii="MS Gothic" w:eastAsia="MS Gothic" w:hAnsi="MS Gothic"/>
+                <w:sz w:val="10"/>
+                <w:szCs w:val="10"/>
+              </w:rPr>
+              <w:t>}</w:t>
             </w:r>
           </w:p>
         </w:tc>
@@ -4913,7 +5217,7 @@
         </w:tc>
         <w:tc>
           <w:tcPr>
-            <w:tcW w:w="1080" w:type="dxa"/>
+            <w:tcW w:w="990" w:type="dxa"/>
             <w:tcBorders>
               <w:top w:val="single" w:sz="4" w:space="0" w:color="000000"/>
               <w:left w:val="single" w:sz="4" w:space="0" w:color="000000"/>
@@ -4925,7 +5229,7 @@
         </w:tc>
         <w:tc>
           <w:tcPr>
-            <w:tcW w:w="540" w:type="dxa"/>
+            <w:tcW w:w="630" w:type="dxa"/>
             <w:tcBorders>
               <w:top w:val="single" w:sz="4" w:space="0" w:color="000000"/>
               <w:left w:val="single" w:sz="4" w:space="0" w:color="000000"/>
@@ -5041,7 +5345,35 @@
           <w:sz w:val="20"/>
           <w:szCs w:val="20"/>
         </w:rPr>
-        <w:t>{requestingPartyPhrase} personally came to this Office to seek emergency assistance for {</w:t>
+        <w:t>{</w:t>
+      </w:r>
+      <w:proofErr w:type="spellStart"/>
+      <w:r>
+        <w:rPr>
+          <w:rFonts w:ascii="Georgia" w:hAnsi="Georgia"/>
+          <w:b/>
+          <w:bCs/>
+          <w:i/>
+          <w:iCs/>
+          <w:kern w:val="0"/>
+          <w:sz w:val="20"/>
+          <w:szCs w:val="20"/>
+        </w:rPr>
+        <w:t>requestingPartyPhrase</w:t>
+      </w:r>
+      <w:proofErr w:type="spellEnd"/>
+      <w:r>
+        <w:rPr>
+          <w:rFonts w:ascii="Georgia" w:hAnsi="Georgia"/>
+          <w:b/>
+          <w:bCs/>
+          <w:i/>
+          <w:iCs/>
+          <w:kern w:val="0"/>
+          <w:sz w:val="20"/>
+          <w:szCs w:val="20"/>
+        </w:rPr>
+        <w:t>} personally came to this Office to seek emergency assistance for {</w:t>
       </w:r>
       <w:proofErr w:type="spellStart"/>
       <w:r>

</xml_diff>

<commit_message>
fix: family relationship 'Other' input field and docker compose container names
</commit_message>
<xml_diff>
--- a/templates/CGV AICS Template.fixed.docx
+++ b/templates/CGV AICS Template.fixed.docx
@@ -267,9 +267,9 @@
           <w:sz w:val="14"/>
           <w:szCs w:val="14"/>
         </w:rPr>
-        <w:t xml:space="preserve">}Hospitalization Expenses </w:t>
-      </w:r>
-      <w:proofErr w:type="gramStart"/>
+        <w:t>}Hospitalization Expenses    {</w:t>
+      </w:r>
+      <w:proofErr w:type="spellStart"/>
       <w:r>
         <w:rPr>
           <w:rFonts w:ascii="MS Gothic" w:eastAsia="MS Gothic" w:hAnsi="MS Gothic"/>
@@ -277,10 +277,9 @@
           <w:sz w:val="14"/>
           <w:szCs w:val="14"/>
         </w:rPr>
-        <w:t xml:space="preserve">   {</w:t>
-      </w:r>
-      <w:proofErr w:type="spellStart"/>
-      <w:proofErr w:type="gramEnd"/>
+        <w:t>medicalCheckBox</w:t>
+      </w:r>
+      <w:proofErr w:type="spellEnd"/>
       <w:r>
         <w:rPr>
           <w:rFonts w:ascii="MS Gothic" w:eastAsia="MS Gothic" w:hAnsi="MS Gothic"/>
@@ -288,30 +287,9 @@
           <w:sz w:val="14"/>
           <w:szCs w:val="14"/>
         </w:rPr>
-        <w:t>medicalCheckBox</w:t>
-      </w:r>
-      <w:proofErr w:type="spellEnd"/>
-      <w:r>
-        <w:rPr>
-          <w:rFonts w:ascii="MS Gothic" w:eastAsia="MS Gothic" w:hAnsi="MS Gothic"/>
-          <w:kern w:val="0"/>
-          <w:sz w:val="14"/>
-          <w:szCs w:val="14"/>
-        </w:rPr>
-        <w:t>}Medical Procedure/</w:t>
-      </w:r>
-      <w:proofErr w:type="gramStart"/>
-      <w:r>
-        <w:rPr>
-          <w:rFonts w:ascii="MS Gothic" w:eastAsia="MS Gothic" w:hAnsi="MS Gothic"/>
-          <w:kern w:val="0"/>
-          <w:sz w:val="14"/>
-          <w:szCs w:val="14"/>
-        </w:rPr>
-        <w:t>Examination  {</w:t>
+        <w:t>}Medical Procedure/Examination  {</w:t>
       </w:r>
       <w:proofErr w:type="spellStart"/>
-      <w:proofErr w:type="gramEnd"/>
       <w:r>
         <w:rPr>
           <w:rFonts w:ascii="MS Gothic" w:eastAsia="MS Gothic" w:hAnsi="MS Gothic"/>
@@ -414,87 +392,7 @@
           <w:sz w:val="14"/>
           <w:szCs w:val="14"/>
         </w:rPr>
-        <w:t>{fourPsCheckBox}4</w:t>
-      </w:r>
-      <w:proofErr w:type="gramStart"/>
-      <w:r>
-        <w:rPr>
-          <w:rFonts w:ascii="MS Gothic" w:eastAsia="MS Gothic" w:hAnsi="MS Gothic"/>
-          <w:kern w:val="0"/>
-          <w:sz w:val="14"/>
-          <w:szCs w:val="14"/>
-        </w:rPr>
-        <w:t>Ps  {</w:t>
-      </w:r>
-      <w:proofErr w:type="gramEnd"/>
-      <w:r>
-        <w:rPr>
-          <w:rFonts w:ascii="MS Gothic" w:eastAsia="MS Gothic" w:hAnsi="MS Gothic"/>
-          <w:kern w:val="0"/>
-          <w:sz w:val="14"/>
-          <w:szCs w:val="14"/>
-        </w:rPr>
-        <w:t>soloParentCheckBox}Solo Parent</w:t>
-      </w:r>
-      <w:proofErr w:type="gramStart"/>
-      <w:r>
-        <w:rPr>
-          <w:rFonts w:ascii="MS Gothic" w:eastAsia="MS Gothic" w:hAnsi="MS Gothic"/>
-          <w:kern w:val="0"/>
-          <w:sz w:val="14"/>
-          <w:szCs w:val="14"/>
-        </w:rPr>
-        <w:t xml:space="preserve">   {</w:t>
-      </w:r>
-      <w:proofErr w:type="gramEnd"/>
-      <w:r>
-        <w:rPr>
-          <w:rFonts w:ascii="MS Gothic" w:eastAsia="MS Gothic" w:hAnsi="MS Gothic"/>
-          <w:kern w:val="0"/>
-          <w:sz w:val="14"/>
-          <w:szCs w:val="14"/>
-        </w:rPr>
-        <w:t xml:space="preserve">seniorCitizenCheckBox}Senior </w:t>
-      </w:r>
-      <w:proofErr w:type="gramStart"/>
-      <w:r>
-        <w:rPr>
-          <w:rFonts w:ascii="MS Gothic" w:eastAsia="MS Gothic" w:hAnsi="MS Gothic"/>
-          <w:kern w:val="0"/>
-          <w:sz w:val="14"/>
-          <w:szCs w:val="14"/>
-        </w:rPr>
-        <w:t>Citizen  {</w:t>
-      </w:r>
-      <w:proofErr w:type="gramEnd"/>
-      <w:r>
-        <w:rPr>
-          <w:rFonts w:ascii="MS Gothic" w:eastAsia="MS Gothic" w:hAnsi="MS Gothic"/>
-          <w:kern w:val="0"/>
-          <w:sz w:val="14"/>
-          <w:szCs w:val="14"/>
-        </w:rPr>
-        <w:t>pwdCheckBox}</w:t>
-      </w:r>
-      <w:proofErr w:type="gramStart"/>
-      <w:r>
-        <w:rPr>
-          <w:rFonts w:ascii="MS Gothic" w:eastAsia="MS Gothic" w:hAnsi="MS Gothic"/>
-          <w:kern w:val="0"/>
-          <w:sz w:val="14"/>
-          <w:szCs w:val="14"/>
-        </w:rPr>
-        <w:t>PWD  {</w:t>
-      </w:r>
-      <w:proofErr w:type="gramEnd"/>
-      <w:r>
-        <w:rPr>
-          <w:rFonts w:ascii="MS Gothic" w:eastAsia="MS Gothic" w:hAnsi="MS Gothic"/>
-          <w:kern w:val="0"/>
-          <w:sz w:val="14"/>
-          <w:szCs w:val="14"/>
-        </w:rPr>
-        <w:t>otherCategoryCheckBox}Others: {otherAssistanceText}</w:t>
+        <w:t>{fourPsCheckBox}4Ps  {soloParentCheckBox}Solo Parent   {seniorCitizenCheckBox}Senior Citizen  {pwdCheckBox}PWD  {otherCategoryCheckBox}Others: {otherAssistanceText}</w:t>
       </w:r>
     </w:p>
     <w:p>
@@ -1733,25 +1631,7 @@
                 <w:sz w:val="20"/>
                 <w:szCs w:val="20"/>
               </w:rPr>
-              <w:t>{#</w:t>
-            </w:r>
-            <w:proofErr w:type="gramStart"/>
-            <w:r>
-              <w:rPr>
-                <w:rFonts w:ascii="Georgia" w:hAnsi="Georgia" w:cs="Arial"/>
-                <w:sz w:val="20"/>
-                <w:szCs w:val="20"/>
-              </w:rPr>
-              <w:t>familyComposition}{</w:t>
-            </w:r>
-            <w:proofErr w:type="gramEnd"/>
-            <w:r>
-              <w:rPr>
-                <w:rFonts w:ascii="Georgia" w:hAnsi="Georgia" w:cs="Arial"/>
-                <w:sz w:val="20"/>
-                <w:szCs w:val="20"/>
-              </w:rPr>
-              <w:t>name}</w:t>
+              <w:t>{#familyComposition}{name}</w:t>
             </w:r>
           </w:p>
         </w:tc>
@@ -5401,7 +5281,7 @@
           <w:sz w:val="20"/>
           <w:szCs w:val="20"/>
         </w:rPr>
-        <w:t>}, as {</w:t>
+        <w:t>}, {</w:t>
       </w:r>
       <w:proofErr w:type="spellStart"/>
       <w:r>

</xml_diff>

<commit_message>
fix(vehicle-requests): fix mayor signature docx rendering and add unapproved request warning notifications
</commit_message>
<xml_diff>
--- a/templates/CGV AICS Template.fixed.docx
+++ b/templates/CGV AICS Template.fixed.docx
@@ -182,17 +182,6 @@
     <w:p>
       <w:pPr>
         <w:pStyle w:val="Body"/>
-        <w:rPr>
-          <w:rFonts w:ascii="Georgia" w:eastAsia="Georgia" w:hAnsi="Georgia" w:cs="Georgia"/>
-          <w:kern w:val="0"/>
-          <w:sz w:val="20"/>
-          <w:szCs w:val="20"/>
-        </w:rPr>
-      </w:pPr>
-    </w:p>
-    <w:p>
-      <w:pPr>
-        <w:pStyle w:val="Body"/>
         <w:widowControl w:val="0"/>
         <w:rPr>
           <w:rFonts w:ascii="Georgia" w:eastAsia="Georgia" w:hAnsi="Georgia" w:cs="Georgia"/>
@@ -332,19 +321,6 @@
         </w:rPr>
         <w:t>{medicineCheckBox}Medicine {burialCheckBox}Burial {otherAssistanceCheckBox}Other (see note below): {otherAssistanceText}</w:t>
       </w:r>
-    </w:p>
-    <w:p>
-      <w:pPr>
-        <w:pStyle w:val="Body"/>
-        <w:widowControl w:val="0"/>
-        <w:jc w:val="center"/>
-        <w:rPr>
-          <w:rFonts w:ascii="Georgia" w:eastAsia="Georgia" w:hAnsi="Georgia" w:cs="Georgia"/>
-          <w:kern w:val="0"/>
-          <w:sz w:val="20"/>
-          <w:szCs w:val="20"/>
-        </w:rPr>
-      </w:pPr>
     </w:p>
     <w:p>
       <w:pPr>
@@ -1901,7 +1877,7 @@
       </w:tblGrid>
       <w:tr>
         <w:trPr>
-          <w:trHeight w:val="196"/>
+          <w:trHeight w:val="326"/>
           <w:tblHeader/>
         </w:trPr>
         <w:tc>
@@ -1947,8 +1923,8 @@
               <w:pStyle w:val="Default"/>
               <w:jc w:val="center"/>
               <w:rPr>
-                <w:sz w:val="14"/>
-                <w:szCs w:val="14"/>
+                <w:sz w:val="12"/>
+                <w:szCs w:val="12"/>
               </w:rPr>
             </w:pPr>
             <w:r>
@@ -1956,8 +1932,8 @@
                 <w:rFonts w:ascii="Georgia" w:hAnsi="Georgia"/>
                 <w:b/>
                 <w:bCs/>
-                <w:sz w:val="14"/>
-                <w:szCs w:val="14"/>
+                <w:sz w:val="12"/>
+                <w:szCs w:val="12"/>
                 <w:u w:color="000000"/>
               </w:rPr>
               <w:t>MEDICINE</w:t>
@@ -2044,8 +2020,8 @@
               <w:pStyle w:val="Default"/>
               <w:jc w:val="center"/>
               <w:rPr>
-                <w:sz w:val="14"/>
-                <w:szCs w:val="14"/>
+                <w:sz w:val="12"/>
+                <w:szCs w:val="12"/>
               </w:rPr>
             </w:pPr>
             <w:r>
@@ -2053,8 +2029,8 @@
                 <w:rFonts w:ascii="Georgia" w:hAnsi="Georgia"/>
                 <w:b/>
                 <w:bCs/>
-                <w:sz w:val="14"/>
-                <w:szCs w:val="14"/>
+                <w:sz w:val="12"/>
+                <w:szCs w:val="12"/>
                 <w:u w:color="000000"/>
               </w:rPr>
               <w:t>MEDICAL</w:t>
@@ -2141,8 +2117,8 @@
               <w:pStyle w:val="Default"/>
               <w:jc w:val="center"/>
               <w:rPr>
-                <w:sz w:val="14"/>
-                <w:szCs w:val="14"/>
+                <w:sz w:val="12"/>
+                <w:szCs w:val="12"/>
               </w:rPr>
             </w:pPr>
             <w:r>
@@ -2150,8 +2126,8 @@
                 <w:rFonts w:ascii="Georgia" w:hAnsi="Georgia"/>
                 <w:b/>
                 <w:bCs/>
-                <w:sz w:val="14"/>
-                <w:szCs w:val="14"/>
+                <w:sz w:val="12"/>
+                <w:szCs w:val="12"/>
                 <w:u w:color="000000"/>
               </w:rPr>
               <w:t>HOSPITAL</w:t>
@@ -2249,8 +2225,8 @@
                 <w:rFonts w:ascii="Georgia" w:hAnsi="Georgia"/>
                 <w:b/>
                 <w:bCs/>
-                <w:sz w:val="14"/>
-                <w:szCs w:val="14"/>
+                <w:sz w:val="12"/>
+                <w:szCs w:val="12"/>
               </w:rPr>
             </w:pPr>
             <w:r>
@@ -2258,8 +2234,8 @@
                 <w:rFonts w:ascii="Georgia" w:hAnsi="Georgia"/>
                 <w:b/>
                 <w:bCs/>
-                <w:sz w:val="14"/>
-                <w:szCs w:val="14"/>
+                <w:sz w:val="12"/>
+                <w:szCs w:val="12"/>
               </w:rPr>
               <w:t>BURIAL</w:t>
             </w:r>
@@ -2362,8 +2338,8 @@
               <w:jc w:val="center"/>
               <w:rPr>
                 <w:rFonts w:ascii="MS Gothic" w:eastAsia="MS Gothic" w:hAnsi="MS Gothic"/>
-                <w:sz w:val="14"/>
-                <w:szCs w:val="14"/>
+                <w:sz w:val="12"/>
+                <w:szCs w:val="12"/>
               </w:rPr>
             </w:pPr>
             <w:r>
@@ -2371,8 +2347,8 @@
                 <w:rFonts w:ascii="Georgia" w:hAnsi="Georgia"/>
                 <w:b/>
                 <w:bCs/>
-                <w:sz w:val="14"/>
-                <w:szCs w:val="14"/>
+                <w:sz w:val="12"/>
+                <w:szCs w:val="12"/>
               </w:rPr>
               <w:t>EYEGLASS</w:t>
             </w:r>
@@ -2426,6 +2402,1081 @@
                 <w:szCs w:val="10"/>
               </w:rPr>
               <w:t>CheckBox</w:t>
+            </w:r>
+            <w:proofErr w:type="spellEnd"/>
+            <w:r>
+              <w:rPr>
+                <w:rFonts w:ascii="MS Gothic" w:eastAsia="MS Gothic" w:hAnsi="MS Gothic"/>
+                <w:sz w:val="10"/>
+                <w:szCs w:val="10"/>
+              </w:rPr>
+              <w:t>}</w:t>
+            </w:r>
+          </w:p>
+        </w:tc>
+      </w:tr>
+      <w:tr>
+        <w:tblPrEx>
+          <w:shd w:val="clear" w:color="auto" w:fill="CED7E7"/>
+        </w:tblPrEx>
+        <w:trPr>
+          <w:trHeight w:val="334"/>
+        </w:trPr>
+        <w:tc>
+          <w:tcPr>
+            <w:tcW w:w="180" w:type="dxa"/>
+            <w:tcBorders>
+              <w:top w:val="single" w:sz="4" w:space="0" w:color="000000"/>
+              <w:left w:val="single" w:sz="4" w:space="0" w:color="000000"/>
+              <w:bottom w:val="single" w:sz="4" w:space="0" w:color="000000"/>
+              <w:right w:val="single" w:sz="4" w:space="0" w:color="000000"/>
+            </w:tcBorders>
+            <w:tcMar>
+              <w:top w:w="80" w:type="dxa"/>
+              <w:left w:w="80" w:type="dxa"/>
+              <w:bottom w:w="80" w:type="dxa"/>
+              <w:right w:w="80" w:type="dxa"/>
+            </w:tcMar>
+            <w:vAlign w:val="center"/>
+          </w:tcPr>
+          <w:p>
+            <w:pPr>
+              <w:pStyle w:val="Default"/>
+              <w:jc w:val="center"/>
+            </w:pPr>
+            <w:r>
+              <w:rPr>
+                <w:rFonts w:ascii="Georgia" w:hAnsi="Georgia"/>
+                <w:sz w:val="16"/>
+                <w:szCs w:val="16"/>
+              </w:rPr>
+              <w:t>1</w:t>
+            </w:r>
+          </w:p>
+        </w:tc>
+        <w:tc>
+          <w:tcPr>
+            <w:tcW w:w="981" w:type="dxa"/>
+            <w:tcBorders>
+              <w:top w:val="single" w:sz="4" w:space="0" w:color="000000"/>
+              <w:left w:val="single" w:sz="4" w:space="0" w:color="000000"/>
+              <w:bottom w:val="single" w:sz="4" w:space="0" w:color="000000"/>
+              <w:right w:val="single" w:sz="4" w:space="0" w:color="000000"/>
+            </w:tcBorders>
+            <w:tcMar>
+              <w:top w:w="80" w:type="dxa"/>
+              <w:left w:w="80" w:type="dxa"/>
+              <w:bottom w:w="80" w:type="dxa"/>
+              <w:right w:w="80" w:type="dxa"/>
+            </w:tcMar>
+            <w:vAlign w:val="center"/>
+          </w:tcPr>
+          <w:p>
+            <w:pPr>
+              <w:pStyle w:val="Default"/>
+              <w:jc w:val="center"/>
+              <w:rPr>
+                <w:sz w:val="14"/>
+                <w:szCs w:val="14"/>
+              </w:rPr>
+            </w:pPr>
+            <w:r>
+              <w:rPr>
+                <w:rFonts w:ascii="Georgia" w:hAnsi="Georgia"/>
+                <w:sz w:val="14"/>
+                <w:szCs w:val="14"/>
+              </w:rPr>
+              <w:t>Letter Request</w:t>
+            </w:r>
+          </w:p>
+        </w:tc>
+        <w:tc>
+          <w:tcPr>
+            <w:tcW w:w="709" w:type="dxa"/>
+            <w:tcBorders>
+              <w:top w:val="single" w:sz="4" w:space="0" w:color="000000"/>
+              <w:left w:val="single" w:sz="4" w:space="0" w:color="000000"/>
+              <w:bottom w:val="single" w:sz="4" w:space="0" w:color="000000"/>
+              <w:right w:val="single" w:sz="4" w:space="0" w:color="000000"/>
+            </w:tcBorders>
+            <w:tcMar>
+              <w:top w:w="80" w:type="dxa"/>
+              <w:left w:w="80" w:type="dxa"/>
+              <w:bottom w:w="80" w:type="dxa"/>
+              <w:right w:w="80" w:type="dxa"/>
+            </w:tcMar>
+            <w:vAlign w:val="center"/>
+          </w:tcPr>
+          <w:p>
+            <w:pPr>
+              <w:rPr>
+                <w:sz w:val="10"/>
+                <w:szCs w:val="10"/>
+              </w:rPr>
+            </w:pPr>
+            <w:r>
+              <w:rPr>
+                <w:rFonts w:ascii="MS Gothic" w:eastAsia="MS Gothic" w:hAnsi="MS Gothic"/>
+                <w:sz w:val="10"/>
+                <w:szCs w:val="10"/>
+              </w:rPr>
+              <w:t>{</w:t>
+            </w:r>
+            <w:proofErr w:type="spellStart"/>
+            <w:r>
+              <w:rPr>
+                <w:rFonts w:ascii="MS Gothic" w:eastAsia="MS Gothic" w:hAnsi="MS Gothic"/>
+                <w:sz w:val="10"/>
+                <w:szCs w:val="10"/>
+              </w:rPr>
+              <w:t>reqMedicineLetterRequest</w:t>
+            </w:r>
+            <w:proofErr w:type="spellEnd"/>
+            <w:r>
+              <w:rPr>
+                <w:rFonts w:ascii="MS Gothic" w:eastAsia="MS Gothic" w:hAnsi="MS Gothic"/>
+                <w:sz w:val="10"/>
+                <w:szCs w:val="10"/>
+              </w:rPr>
+              <w:t>}</w:t>
+            </w:r>
+          </w:p>
+        </w:tc>
+        <w:tc>
+          <w:tcPr>
+            <w:tcW w:w="1077" w:type="dxa"/>
+            <w:tcBorders>
+              <w:top w:val="single" w:sz="4" w:space="0" w:color="000000"/>
+              <w:left w:val="single" w:sz="4" w:space="0" w:color="000000"/>
+              <w:bottom w:val="single" w:sz="4" w:space="0" w:color="000000"/>
+              <w:right w:val="single" w:sz="4" w:space="0" w:color="000000"/>
+            </w:tcBorders>
+            <w:tcMar>
+              <w:top w:w="80" w:type="dxa"/>
+              <w:left w:w="80" w:type="dxa"/>
+              <w:bottom w:w="80" w:type="dxa"/>
+              <w:right w:w="80" w:type="dxa"/>
+            </w:tcMar>
+            <w:vAlign w:val="center"/>
+          </w:tcPr>
+          <w:p>
+            <w:pPr>
+              <w:spacing w:before="160" w:line="288" w:lineRule="auto"/>
+              <w:jc w:val="center"/>
+              <w:rPr>
+                <w:sz w:val="14"/>
+                <w:szCs w:val="14"/>
+              </w:rPr>
+            </w:pPr>
+            <w:r>
+              <w:rPr>
+                <w:rFonts w:ascii="Georgia" w:hAnsi="Georgia" w:cs="Arial Unicode MS"/>
+                <w:color w:val="000000"/>
+                <w:sz w:val="14"/>
+                <w:szCs w:val="14"/>
+                <w14:textOutline w14:w="0" w14:cap="flat" w14:cmpd="sng" w14:algn="ctr">
+                  <w14:noFill/>
+                  <w14:prstDash w14:val="solid"/>
+                  <w14:bevel/>
+                </w14:textOutline>
+              </w:rPr>
+              <w:t>Request Form</w:t>
+            </w:r>
+          </w:p>
+        </w:tc>
+        <w:tc>
+          <w:tcPr>
+            <w:tcW w:w="720" w:type="dxa"/>
+            <w:tcBorders>
+              <w:top w:val="single" w:sz="4" w:space="0" w:color="000000"/>
+              <w:left w:val="single" w:sz="4" w:space="0" w:color="000000"/>
+              <w:bottom w:val="single" w:sz="4" w:space="0" w:color="000000"/>
+              <w:right w:val="single" w:sz="4" w:space="0" w:color="000000"/>
+            </w:tcBorders>
+            <w:tcMar>
+              <w:top w:w="80" w:type="dxa"/>
+              <w:left w:w="80" w:type="dxa"/>
+              <w:bottom w:w="80" w:type="dxa"/>
+              <w:right w:w="80" w:type="dxa"/>
+            </w:tcMar>
+            <w:vAlign w:val="center"/>
+          </w:tcPr>
+          <w:p>
+            <w:pPr>
+              <w:rPr>
+                <w:sz w:val="10"/>
+                <w:szCs w:val="10"/>
+              </w:rPr>
+            </w:pPr>
+            <w:r>
+              <w:rPr>
+                <w:rFonts w:ascii="MS Gothic" w:eastAsia="MS Gothic" w:hAnsi="MS Gothic"/>
+                <w:sz w:val="10"/>
+                <w:szCs w:val="10"/>
+              </w:rPr>
+              <w:t>{</w:t>
+            </w:r>
+            <w:proofErr w:type="spellStart"/>
+            <w:r>
+              <w:rPr>
+                <w:rFonts w:ascii="MS Gothic" w:eastAsia="MS Gothic" w:hAnsi="MS Gothic"/>
+                <w:sz w:val="10"/>
+                <w:szCs w:val="10"/>
+              </w:rPr>
+              <w:t>reqMedicalRequestForm</w:t>
+            </w:r>
+            <w:proofErr w:type="spellEnd"/>
+            <w:r>
+              <w:rPr>
+                <w:rFonts w:ascii="MS Gothic" w:eastAsia="MS Gothic" w:hAnsi="MS Gothic"/>
+                <w:sz w:val="10"/>
+                <w:szCs w:val="10"/>
+              </w:rPr>
+              <w:t>}</w:t>
+            </w:r>
+          </w:p>
+        </w:tc>
+        <w:tc>
+          <w:tcPr>
+            <w:tcW w:w="1170" w:type="dxa"/>
+            <w:tcBorders>
+              <w:top w:val="single" w:sz="4" w:space="0" w:color="000000"/>
+              <w:left w:val="single" w:sz="4" w:space="0" w:color="000000"/>
+              <w:bottom w:val="single" w:sz="4" w:space="0" w:color="000000"/>
+              <w:right w:val="single" w:sz="4" w:space="0" w:color="000000"/>
+            </w:tcBorders>
+            <w:tcMar>
+              <w:top w:w="80" w:type="dxa"/>
+              <w:left w:w="80" w:type="dxa"/>
+              <w:bottom w:w="80" w:type="dxa"/>
+              <w:right w:w="80" w:type="dxa"/>
+            </w:tcMar>
+            <w:vAlign w:val="center"/>
+          </w:tcPr>
+          <w:p>
+            <w:pPr>
+              <w:spacing w:before="160" w:line="288" w:lineRule="auto"/>
+              <w:jc w:val="center"/>
+              <w:rPr>
+                <w:sz w:val="14"/>
+                <w:szCs w:val="14"/>
+              </w:rPr>
+            </w:pPr>
+            <w:r>
+              <w:rPr>
+                <w:rFonts w:ascii="Georgia" w:hAnsi="Georgia" w:cs="Arial Unicode MS"/>
+                <w:color w:val="000000"/>
+                <w:sz w:val="14"/>
+                <w:szCs w:val="14"/>
+                <w14:textOutline w14:w="0" w14:cap="flat" w14:cmpd="sng" w14:algn="ctr">
+                  <w14:noFill/>
+                  <w14:prstDash w14:val="solid"/>
+                  <w14:bevel/>
+                </w14:textOutline>
+              </w:rPr>
+              <w:t>Clinical Abstract</w:t>
+            </w:r>
+          </w:p>
+        </w:tc>
+        <w:tc>
+          <w:tcPr>
+            <w:tcW w:w="990" w:type="dxa"/>
+            <w:tcBorders>
+              <w:top w:val="single" w:sz="4" w:space="0" w:color="000000"/>
+              <w:left w:val="single" w:sz="4" w:space="0" w:color="000000"/>
+              <w:bottom w:val="single" w:sz="4" w:space="0" w:color="000000"/>
+              <w:right w:val="single" w:sz="4" w:space="0" w:color="000000"/>
+            </w:tcBorders>
+            <w:tcMar>
+              <w:top w:w="80" w:type="dxa"/>
+              <w:left w:w="80" w:type="dxa"/>
+              <w:bottom w:w="80" w:type="dxa"/>
+              <w:right w:w="80" w:type="dxa"/>
+            </w:tcMar>
+            <w:vAlign w:val="center"/>
+          </w:tcPr>
+          <w:p>
+            <w:pPr>
+              <w:rPr>
+                <w:sz w:val="10"/>
+                <w:szCs w:val="10"/>
+              </w:rPr>
+            </w:pPr>
+            <w:r>
+              <w:rPr>
+                <w:rFonts w:ascii="MS Gothic" w:eastAsia="MS Gothic" w:hAnsi="MS Gothic"/>
+                <w:sz w:val="10"/>
+                <w:szCs w:val="10"/>
+              </w:rPr>
+              <w:t>{</w:t>
+            </w:r>
+            <w:proofErr w:type="spellStart"/>
+            <w:r>
+              <w:rPr>
+                <w:rFonts w:ascii="MS Gothic" w:eastAsia="MS Gothic" w:hAnsi="MS Gothic"/>
+                <w:sz w:val="10"/>
+                <w:szCs w:val="10"/>
+              </w:rPr>
+              <w:t>req</w:t>
+            </w:r>
+            <w:r>
+              <w:rPr>
+                <w:rFonts w:ascii="MS Gothic" w:eastAsia="MS Gothic" w:hAnsi="MS Gothic"/>
+                <w:sz w:val="10"/>
+                <w:szCs w:val="10"/>
+              </w:rPr>
+              <w:t>hospital</w:t>
+            </w:r>
+            <w:r>
+              <w:rPr>
+                <w:rFonts w:ascii="MS Gothic" w:eastAsia="MS Gothic" w:hAnsi="MS Gothic"/>
+                <w:sz w:val="10"/>
+                <w:szCs w:val="10"/>
+              </w:rPr>
+              <w:t>ClinicalAbstract</w:t>
+            </w:r>
+            <w:proofErr w:type="spellEnd"/>
+            <w:r>
+              <w:rPr>
+                <w:rFonts w:ascii="MS Gothic" w:eastAsia="MS Gothic" w:hAnsi="MS Gothic"/>
+                <w:sz w:val="10"/>
+                <w:szCs w:val="10"/>
+              </w:rPr>
+              <w:t>}</w:t>
+            </w:r>
+          </w:p>
+        </w:tc>
+        <w:tc>
+          <w:tcPr>
+            <w:tcW w:w="1170" w:type="dxa"/>
+            <w:tcBorders>
+              <w:top w:val="single" w:sz="4" w:space="0" w:color="000000"/>
+              <w:left w:val="single" w:sz="4" w:space="0" w:color="000000"/>
+              <w:bottom w:val="single" w:sz="4" w:space="0" w:color="000000"/>
+              <w:right w:val="single" w:sz="4" w:space="0" w:color="000000"/>
+            </w:tcBorders>
+            <w:tcMar>
+              <w:top w:w="80" w:type="dxa"/>
+              <w:left w:w="80" w:type="dxa"/>
+              <w:bottom w:w="80" w:type="dxa"/>
+              <w:right w:w="80" w:type="dxa"/>
+            </w:tcMar>
+            <w:vAlign w:val="center"/>
+          </w:tcPr>
+          <w:p>
+            <w:pPr>
+              <w:spacing w:before="160" w:line="288" w:lineRule="auto"/>
+              <w:jc w:val="center"/>
+              <w:rPr>
+                <w:sz w:val="14"/>
+                <w:szCs w:val="14"/>
+              </w:rPr>
+            </w:pPr>
+            <w:r>
+              <w:rPr>
+                <w:rFonts w:ascii="Georgia" w:hAnsi="Georgia" w:cs="Arial Unicode MS"/>
+                <w:color w:val="000000"/>
+                <w:sz w:val="14"/>
+                <w:szCs w:val="14"/>
+                <w14:textOutline w14:w="0" w14:cap="flat" w14:cmpd="sng" w14:algn="ctr">
+                  <w14:noFill/>
+                  <w14:prstDash w14:val="solid"/>
+                  <w14:bevel/>
+                </w14:textOutline>
+              </w:rPr>
+              <w:t>Certified True Copy of Death Certificate</w:t>
+            </w:r>
+          </w:p>
+        </w:tc>
+        <w:tc>
+          <w:tcPr>
+            <w:tcW w:w="720" w:type="dxa"/>
+            <w:tcBorders>
+              <w:top w:val="single" w:sz="4" w:space="0" w:color="000000"/>
+              <w:left w:val="single" w:sz="4" w:space="0" w:color="000000"/>
+              <w:bottom w:val="single" w:sz="4" w:space="0" w:color="000000"/>
+              <w:right w:val="single" w:sz="4" w:space="0" w:color="000000"/>
+            </w:tcBorders>
+            <w:tcMar>
+              <w:top w:w="80" w:type="dxa"/>
+              <w:left w:w="80" w:type="dxa"/>
+              <w:bottom w:w="80" w:type="dxa"/>
+              <w:right w:w="80" w:type="dxa"/>
+            </w:tcMar>
+            <w:vAlign w:val="center"/>
+          </w:tcPr>
+          <w:p>
+            <w:pPr>
+              <w:rPr>
+                <w:sz w:val="10"/>
+                <w:szCs w:val="10"/>
+              </w:rPr>
+            </w:pPr>
+            <w:r>
+              <w:rPr>
+                <w:rFonts w:ascii="MS Gothic" w:eastAsia="MS Gothic" w:hAnsi="MS Gothic"/>
+                <w:sz w:val="10"/>
+                <w:szCs w:val="10"/>
+              </w:rPr>
+              <w:t>{</w:t>
+            </w:r>
+            <w:proofErr w:type="spellStart"/>
+            <w:r>
+              <w:rPr>
+                <w:rFonts w:ascii="MS Gothic" w:eastAsia="MS Gothic" w:hAnsi="MS Gothic"/>
+                <w:sz w:val="10"/>
+                <w:szCs w:val="10"/>
+              </w:rPr>
+              <w:t>req</w:t>
+            </w:r>
+            <w:r>
+              <w:rPr>
+                <w:rFonts w:ascii="MS Gothic" w:eastAsia="MS Gothic" w:hAnsi="MS Gothic"/>
+                <w:sz w:val="10"/>
+                <w:szCs w:val="10"/>
+              </w:rPr>
+              <w:t>Burial</w:t>
+            </w:r>
+            <w:r>
+              <w:rPr>
+                <w:rFonts w:ascii="MS Gothic" w:eastAsia="MS Gothic" w:hAnsi="MS Gothic"/>
+                <w:sz w:val="10"/>
+                <w:szCs w:val="10"/>
+              </w:rPr>
+              <w:t>DeathCertificate</w:t>
+            </w:r>
+            <w:proofErr w:type="spellEnd"/>
+            <w:r>
+              <w:rPr>
+                <w:rFonts w:ascii="MS Gothic" w:eastAsia="MS Gothic" w:hAnsi="MS Gothic"/>
+                <w:sz w:val="10"/>
+                <w:szCs w:val="10"/>
+              </w:rPr>
+              <w:t>}</w:t>
+            </w:r>
+          </w:p>
+        </w:tc>
+        <w:tc>
+          <w:tcPr>
+            <w:tcW w:w="990" w:type="dxa"/>
+            <w:tcBorders>
+              <w:top w:val="single" w:sz="4" w:space="0" w:color="000000"/>
+              <w:left w:val="single" w:sz="4" w:space="0" w:color="000000"/>
+              <w:bottom w:val="single" w:sz="4" w:space="0" w:color="000000"/>
+              <w:right w:val="single" w:sz="4" w:space="0" w:color="000000"/>
+            </w:tcBorders>
+          </w:tcPr>
+          <w:p>
+            <w:pPr>
+              <w:rPr>
+                <w:rFonts w:ascii="MS Gothic" w:eastAsia="MS Gothic" w:hAnsi="MS Gothic"/>
+                <w:sz w:val="14"/>
+                <w:szCs w:val="14"/>
+              </w:rPr>
+            </w:pPr>
+          </w:p>
+          <w:p>
+            <w:pPr>
+              <w:rPr>
+                <w:rFonts w:ascii="MS Gothic" w:eastAsia="MS Gothic" w:hAnsi="MS Gothic"/>
+                <w:sz w:val="14"/>
+                <w:szCs w:val="14"/>
+              </w:rPr>
+            </w:pPr>
+            <w:r>
+              <w:rPr>
+                <w:rFonts w:ascii="Georgia" w:hAnsi="Georgia"/>
+                <w:sz w:val="14"/>
+                <w:szCs w:val="14"/>
+              </w:rPr>
+              <w:t>Medical Certificate</w:t>
+            </w:r>
+          </w:p>
+        </w:tc>
+        <w:tc>
+          <w:tcPr>
+            <w:tcW w:w="630" w:type="dxa"/>
+            <w:tcBorders>
+              <w:top w:val="single" w:sz="4" w:space="0" w:color="000000"/>
+              <w:left w:val="single" w:sz="4" w:space="0" w:color="000000"/>
+              <w:bottom w:val="single" w:sz="4" w:space="0" w:color="000000"/>
+              <w:right w:val="single" w:sz="4" w:space="0" w:color="000000"/>
+            </w:tcBorders>
+            <w:vAlign w:val="center"/>
+          </w:tcPr>
+          <w:p>
+            <w:pPr>
+              <w:rPr>
+                <w:rFonts w:ascii="MS Gothic" w:eastAsia="MS Gothic" w:hAnsi="MS Gothic"/>
+                <w:sz w:val="14"/>
+                <w:szCs w:val="14"/>
+              </w:rPr>
+            </w:pPr>
+            <w:r>
+              <w:rPr>
+                <w:rFonts w:ascii="MS Gothic" w:eastAsia="MS Gothic" w:hAnsi="MS Gothic"/>
+                <w:sz w:val="10"/>
+                <w:szCs w:val="10"/>
+              </w:rPr>
+              <w:t>{</w:t>
+            </w:r>
+            <w:proofErr w:type="spellStart"/>
+            <w:r>
+              <w:rPr>
+                <w:rFonts w:ascii="MS Gothic" w:eastAsia="MS Gothic" w:hAnsi="MS Gothic"/>
+                <w:sz w:val="10"/>
+                <w:szCs w:val="10"/>
+              </w:rPr>
+              <w:t>reqMedicine</w:t>
+            </w:r>
+            <w:r>
+              <w:rPr>
+                <w:rFonts w:ascii="MS Gothic" w:eastAsia="MS Gothic" w:hAnsi="MS Gothic"/>
+                <w:sz w:val="10"/>
+                <w:szCs w:val="10"/>
+              </w:rPr>
+              <w:t>Eyeglass</w:t>
+            </w:r>
+            <w:r>
+              <w:rPr>
+                <w:rFonts w:ascii="MS Gothic" w:eastAsia="MS Gothic" w:hAnsi="MS Gothic"/>
+                <w:sz w:val="10"/>
+                <w:szCs w:val="10"/>
+              </w:rPr>
+              <w:t>Certificate</w:t>
+            </w:r>
+            <w:proofErr w:type="spellEnd"/>
+            <w:r>
+              <w:rPr>
+                <w:rFonts w:ascii="MS Gothic" w:eastAsia="MS Gothic" w:hAnsi="MS Gothic"/>
+                <w:sz w:val="10"/>
+                <w:szCs w:val="10"/>
+              </w:rPr>
+              <w:t>}</w:t>
+            </w:r>
+          </w:p>
+        </w:tc>
+      </w:tr>
+      <w:tr>
+        <w:tblPrEx>
+          <w:shd w:val="clear" w:color="auto" w:fill="CED7E7"/>
+        </w:tblPrEx>
+        <w:trPr>
+          <w:trHeight w:val="746"/>
+        </w:trPr>
+        <w:tc>
+          <w:tcPr>
+            <w:tcW w:w="180" w:type="dxa"/>
+            <w:tcBorders>
+              <w:top w:val="single" w:sz="4" w:space="0" w:color="000000"/>
+              <w:left w:val="single" w:sz="4" w:space="0" w:color="000000"/>
+              <w:bottom w:val="single" w:sz="4" w:space="0" w:color="000000"/>
+              <w:right w:val="single" w:sz="4" w:space="0" w:color="000000"/>
+            </w:tcBorders>
+            <w:tcMar>
+              <w:top w:w="80" w:type="dxa"/>
+              <w:left w:w="80" w:type="dxa"/>
+              <w:bottom w:w="80" w:type="dxa"/>
+              <w:right w:w="80" w:type="dxa"/>
+            </w:tcMar>
+            <w:vAlign w:val="center"/>
+          </w:tcPr>
+          <w:p>
+            <w:pPr>
+              <w:pStyle w:val="Default"/>
+              <w:jc w:val="center"/>
+            </w:pPr>
+            <w:r>
+              <w:rPr>
+                <w:rFonts w:ascii="Georgia" w:hAnsi="Georgia"/>
+                <w:sz w:val="16"/>
+                <w:szCs w:val="16"/>
+              </w:rPr>
+              <w:t>2</w:t>
+            </w:r>
+          </w:p>
+        </w:tc>
+        <w:tc>
+          <w:tcPr>
+            <w:tcW w:w="981" w:type="dxa"/>
+            <w:tcBorders>
+              <w:top w:val="single" w:sz="4" w:space="0" w:color="000000"/>
+              <w:left w:val="single" w:sz="4" w:space="0" w:color="000000"/>
+              <w:bottom w:val="single" w:sz="4" w:space="0" w:color="000000"/>
+              <w:right w:val="single" w:sz="4" w:space="0" w:color="000000"/>
+            </w:tcBorders>
+            <w:tcMar>
+              <w:top w:w="80" w:type="dxa"/>
+              <w:left w:w="80" w:type="dxa"/>
+              <w:bottom w:w="80" w:type="dxa"/>
+              <w:right w:w="80" w:type="dxa"/>
+            </w:tcMar>
+            <w:vAlign w:val="center"/>
+          </w:tcPr>
+          <w:p>
+            <w:pPr>
+              <w:pStyle w:val="Default"/>
+              <w:jc w:val="center"/>
+              <w:rPr>
+                <w:sz w:val="14"/>
+                <w:szCs w:val="14"/>
+              </w:rPr>
+            </w:pPr>
+            <w:r>
+              <w:rPr>
+                <w:rFonts w:ascii="Georgia" w:hAnsi="Georgia"/>
+                <w:sz w:val="14"/>
+                <w:szCs w:val="14"/>
+              </w:rPr>
+              <w:t>Medical Certificate</w:t>
+            </w:r>
+          </w:p>
+        </w:tc>
+        <w:tc>
+          <w:tcPr>
+            <w:tcW w:w="709" w:type="dxa"/>
+            <w:tcBorders>
+              <w:top w:val="single" w:sz="4" w:space="0" w:color="000000"/>
+              <w:left w:val="single" w:sz="4" w:space="0" w:color="000000"/>
+              <w:bottom w:val="single" w:sz="4" w:space="0" w:color="000000"/>
+              <w:right w:val="single" w:sz="4" w:space="0" w:color="000000"/>
+            </w:tcBorders>
+            <w:tcMar>
+              <w:top w:w="80" w:type="dxa"/>
+              <w:left w:w="80" w:type="dxa"/>
+              <w:bottom w:w="80" w:type="dxa"/>
+              <w:right w:w="80" w:type="dxa"/>
+            </w:tcMar>
+            <w:vAlign w:val="center"/>
+          </w:tcPr>
+          <w:p>
+            <w:pPr>
+              <w:rPr>
+                <w:sz w:val="10"/>
+                <w:szCs w:val="10"/>
+              </w:rPr>
+            </w:pPr>
+            <w:r>
+              <w:rPr>
+                <w:rFonts w:ascii="MS Gothic" w:eastAsia="MS Gothic" w:hAnsi="MS Gothic"/>
+                <w:sz w:val="10"/>
+                <w:szCs w:val="10"/>
+              </w:rPr>
+              <w:t>{</w:t>
+            </w:r>
+            <w:proofErr w:type="spellStart"/>
+            <w:r>
+              <w:rPr>
+                <w:rFonts w:ascii="MS Gothic" w:eastAsia="MS Gothic" w:hAnsi="MS Gothic"/>
+                <w:sz w:val="10"/>
+                <w:szCs w:val="10"/>
+              </w:rPr>
+              <w:t>reqMedicineMedicalCertificate</w:t>
+            </w:r>
+            <w:proofErr w:type="spellEnd"/>
+            <w:r>
+              <w:rPr>
+                <w:rFonts w:ascii="MS Gothic" w:eastAsia="MS Gothic" w:hAnsi="MS Gothic"/>
+                <w:sz w:val="10"/>
+                <w:szCs w:val="10"/>
+              </w:rPr>
+              <w:t>}</w:t>
+            </w:r>
+          </w:p>
+        </w:tc>
+        <w:tc>
+          <w:tcPr>
+            <w:tcW w:w="1077" w:type="dxa"/>
+            <w:tcBorders>
+              <w:top w:val="single" w:sz="4" w:space="0" w:color="000000"/>
+              <w:left w:val="single" w:sz="4" w:space="0" w:color="000000"/>
+              <w:bottom w:val="single" w:sz="4" w:space="0" w:color="000000"/>
+              <w:right w:val="single" w:sz="4" w:space="0" w:color="000000"/>
+            </w:tcBorders>
+            <w:tcMar>
+              <w:top w:w="80" w:type="dxa"/>
+              <w:left w:w="80" w:type="dxa"/>
+              <w:bottom w:w="80" w:type="dxa"/>
+              <w:right w:w="80" w:type="dxa"/>
+            </w:tcMar>
+            <w:vAlign w:val="center"/>
+          </w:tcPr>
+          <w:p>
+            <w:pPr>
+              <w:spacing w:before="160" w:line="288" w:lineRule="auto"/>
+              <w:jc w:val="center"/>
+              <w:rPr>
+                <w:sz w:val="14"/>
+                <w:szCs w:val="14"/>
+              </w:rPr>
+            </w:pPr>
+            <w:r>
+              <w:rPr>
+                <w:rFonts w:ascii="Georgia" w:hAnsi="Georgia" w:cs="Arial Unicode MS"/>
+                <w:color w:val="000000"/>
+                <w:sz w:val="14"/>
+                <w:szCs w:val="14"/>
+                <w14:textOutline w14:w="0" w14:cap="flat" w14:cmpd="sng" w14:algn="ctr">
+                  <w14:noFill/>
+                  <w14:prstDash w14:val="solid"/>
+                  <w14:bevel/>
+                </w14:textOutline>
+              </w:rPr>
+              <w:t>Medical Certificate</w:t>
+            </w:r>
+          </w:p>
+        </w:tc>
+        <w:tc>
+          <w:tcPr>
+            <w:tcW w:w="720" w:type="dxa"/>
+            <w:tcBorders>
+              <w:top w:val="single" w:sz="4" w:space="0" w:color="000000"/>
+              <w:left w:val="single" w:sz="4" w:space="0" w:color="000000"/>
+              <w:bottom w:val="single" w:sz="4" w:space="0" w:color="000000"/>
+              <w:right w:val="single" w:sz="4" w:space="0" w:color="000000"/>
+            </w:tcBorders>
+            <w:tcMar>
+              <w:top w:w="80" w:type="dxa"/>
+              <w:left w:w="80" w:type="dxa"/>
+              <w:bottom w:w="80" w:type="dxa"/>
+              <w:right w:w="80" w:type="dxa"/>
+            </w:tcMar>
+            <w:vAlign w:val="center"/>
+          </w:tcPr>
+          <w:p>
+            <w:pPr>
+              <w:rPr>
+                <w:sz w:val="10"/>
+                <w:szCs w:val="10"/>
+              </w:rPr>
+            </w:pPr>
+            <w:r>
+              <w:rPr>
+                <w:rFonts w:ascii="MS Gothic" w:eastAsia="MS Gothic" w:hAnsi="MS Gothic"/>
+                <w:sz w:val="10"/>
+                <w:szCs w:val="10"/>
+              </w:rPr>
+              <w:t>{</w:t>
+            </w:r>
+            <w:proofErr w:type="spellStart"/>
+            <w:r>
+              <w:rPr>
+                <w:rFonts w:ascii="MS Gothic" w:eastAsia="MS Gothic" w:hAnsi="MS Gothic"/>
+                <w:sz w:val="10"/>
+                <w:szCs w:val="10"/>
+              </w:rPr>
+              <w:t>reqMedicalMedicalCertificate</w:t>
+            </w:r>
+            <w:proofErr w:type="spellEnd"/>
+            <w:r>
+              <w:rPr>
+                <w:rFonts w:ascii="MS Gothic" w:eastAsia="MS Gothic" w:hAnsi="MS Gothic"/>
+                <w:sz w:val="10"/>
+                <w:szCs w:val="10"/>
+              </w:rPr>
+              <w:t>}</w:t>
+            </w:r>
+          </w:p>
+        </w:tc>
+        <w:tc>
+          <w:tcPr>
+            <w:tcW w:w="1170" w:type="dxa"/>
+            <w:tcBorders>
+              <w:top w:val="single" w:sz="4" w:space="0" w:color="000000"/>
+              <w:left w:val="single" w:sz="4" w:space="0" w:color="000000"/>
+              <w:bottom w:val="single" w:sz="4" w:space="0" w:color="000000"/>
+              <w:right w:val="single" w:sz="4" w:space="0" w:color="000000"/>
+            </w:tcBorders>
+            <w:tcMar>
+              <w:top w:w="80" w:type="dxa"/>
+              <w:left w:w="80" w:type="dxa"/>
+              <w:bottom w:w="80" w:type="dxa"/>
+              <w:right w:w="80" w:type="dxa"/>
+            </w:tcMar>
+            <w:vAlign w:val="center"/>
+          </w:tcPr>
+          <w:p>
+            <w:pPr>
+              <w:spacing w:before="160" w:line="288" w:lineRule="auto"/>
+              <w:jc w:val="center"/>
+              <w:rPr>
+                <w:sz w:val="14"/>
+                <w:szCs w:val="14"/>
+              </w:rPr>
+            </w:pPr>
+            <w:r>
+              <w:rPr>
+                <w:rFonts w:ascii="Georgia" w:hAnsi="Georgia" w:cs="Arial Unicode MS"/>
+                <w:color w:val="000000"/>
+                <w:sz w:val="14"/>
+                <w:szCs w:val="14"/>
+                <w14:textOutline w14:w="0" w14:cap="flat" w14:cmpd="sng" w14:algn="ctr">
+                  <w14:noFill/>
+                  <w14:prstDash w14:val="solid"/>
+                  <w14:bevel/>
+                </w14:textOutline>
+              </w:rPr>
+              <w:t>Final Bill</w:t>
+            </w:r>
+          </w:p>
+        </w:tc>
+        <w:tc>
+          <w:tcPr>
+            <w:tcW w:w="990" w:type="dxa"/>
+            <w:tcBorders>
+              <w:top w:val="single" w:sz="4" w:space="0" w:color="000000"/>
+              <w:left w:val="single" w:sz="4" w:space="0" w:color="000000"/>
+              <w:bottom w:val="single" w:sz="4" w:space="0" w:color="000000"/>
+              <w:right w:val="single" w:sz="4" w:space="0" w:color="000000"/>
+            </w:tcBorders>
+            <w:tcMar>
+              <w:top w:w="80" w:type="dxa"/>
+              <w:left w:w="80" w:type="dxa"/>
+              <w:bottom w:w="80" w:type="dxa"/>
+              <w:right w:w="80" w:type="dxa"/>
+            </w:tcMar>
+            <w:vAlign w:val="center"/>
+          </w:tcPr>
+          <w:p>
+            <w:pPr>
+              <w:rPr>
+                <w:sz w:val="10"/>
+                <w:szCs w:val="10"/>
+              </w:rPr>
+            </w:pPr>
+            <w:r>
+              <w:rPr>
+                <w:rFonts w:ascii="MS Gothic" w:eastAsia="MS Gothic" w:hAnsi="MS Gothic"/>
+                <w:sz w:val="10"/>
+                <w:szCs w:val="10"/>
+              </w:rPr>
+              <w:t>{</w:t>
+            </w:r>
+            <w:proofErr w:type="spellStart"/>
+            <w:r>
+              <w:rPr>
+                <w:rFonts w:ascii="MS Gothic" w:eastAsia="MS Gothic" w:hAnsi="MS Gothic"/>
+                <w:sz w:val="10"/>
+                <w:szCs w:val="10"/>
+              </w:rPr>
+              <w:t>req</w:t>
+            </w:r>
+            <w:r>
+              <w:rPr>
+                <w:rFonts w:ascii="MS Gothic" w:eastAsia="MS Gothic" w:hAnsi="MS Gothic"/>
+                <w:sz w:val="10"/>
+                <w:szCs w:val="10"/>
+              </w:rPr>
+              <w:t>Hospital</w:t>
+            </w:r>
+            <w:r>
+              <w:rPr>
+                <w:rFonts w:ascii="MS Gothic" w:eastAsia="MS Gothic" w:hAnsi="MS Gothic"/>
+                <w:sz w:val="10"/>
+                <w:szCs w:val="10"/>
+              </w:rPr>
+              <w:t>FinalBill</w:t>
+            </w:r>
+            <w:proofErr w:type="spellEnd"/>
+            <w:r>
+              <w:rPr>
+                <w:rFonts w:ascii="MS Gothic" w:eastAsia="MS Gothic" w:hAnsi="MS Gothic"/>
+                <w:sz w:val="10"/>
+                <w:szCs w:val="10"/>
+              </w:rPr>
+              <w:t>}</w:t>
+            </w:r>
+          </w:p>
+        </w:tc>
+        <w:tc>
+          <w:tcPr>
+            <w:tcW w:w="1170" w:type="dxa"/>
+            <w:tcBorders>
+              <w:top w:val="single" w:sz="4" w:space="0" w:color="000000"/>
+              <w:left w:val="single" w:sz="4" w:space="0" w:color="000000"/>
+              <w:bottom w:val="single" w:sz="4" w:space="0" w:color="000000"/>
+              <w:right w:val="single" w:sz="4" w:space="0" w:color="000000"/>
+            </w:tcBorders>
+            <w:tcMar>
+              <w:top w:w="80" w:type="dxa"/>
+              <w:left w:w="80" w:type="dxa"/>
+              <w:bottom w:w="80" w:type="dxa"/>
+              <w:right w:w="80" w:type="dxa"/>
+            </w:tcMar>
+            <w:vAlign w:val="center"/>
+          </w:tcPr>
+          <w:p>
+            <w:pPr>
+              <w:spacing w:before="160" w:line="288" w:lineRule="auto"/>
+              <w:jc w:val="center"/>
+              <w:rPr>
+                <w:sz w:val="14"/>
+                <w:szCs w:val="14"/>
+              </w:rPr>
+            </w:pPr>
+            <w:r>
+              <w:rPr>
+                <w:rFonts w:ascii="Georgia" w:hAnsi="Georgia" w:cs="Arial Unicode MS"/>
+                <w:color w:val="000000"/>
+                <w:sz w:val="14"/>
+                <w:szCs w:val="14"/>
+                <w14:textOutline w14:w="0" w14:cap="flat" w14:cmpd="sng" w14:algn="ctr">
+                  <w14:noFill/>
+                  <w14:prstDash w14:val="solid"/>
+                  <w14:bevel/>
+                </w14:textOutline>
+              </w:rPr>
+              <w:t>Billing Statement/Statement of Account</w:t>
+            </w:r>
+          </w:p>
+        </w:tc>
+        <w:tc>
+          <w:tcPr>
+            <w:tcW w:w="720" w:type="dxa"/>
+            <w:tcBorders>
+              <w:top w:val="single" w:sz="4" w:space="0" w:color="000000"/>
+              <w:left w:val="single" w:sz="4" w:space="0" w:color="000000"/>
+              <w:bottom w:val="single" w:sz="4" w:space="0" w:color="000000"/>
+              <w:right w:val="single" w:sz="4" w:space="0" w:color="000000"/>
+            </w:tcBorders>
+            <w:tcMar>
+              <w:top w:w="80" w:type="dxa"/>
+              <w:left w:w="80" w:type="dxa"/>
+              <w:bottom w:w="80" w:type="dxa"/>
+              <w:right w:w="80" w:type="dxa"/>
+            </w:tcMar>
+            <w:vAlign w:val="center"/>
+          </w:tcPr>
+          <w:p>
+            <w:pPr>
+              <w:rPr>
+                <w:sz w:val="10"/>
+                <w:szCs w:val="10"/>
+              </w:rPr>
+            </w:pPr>
+            <w:r>
+              <w:rPr>
+                <w:rFonts w:ascii="MS Gothic" w:eastAsia="MS Gothic" w:hAnsi="MS Gothic"/>
+                <w:sz w:val="10"/>
+                <w:szCs w:val="10"/>
+              </w:rPr>
+              <w:t>{</w:t>
+            </w:r>
+            <w:proofErr w:type="spellStart"/>
+            <w:r>
+              <w:rPr>
+                <w:rFonts w:ascii="MS Gothic" w:eastAsia="MS Gothic" w:hAnsi="MS Gothic"/>
+                <w:sz w:val="10"/>
+                <w:szCs w:val="10"/>
+              </w:rPr>
+              <w:t>req</w:t>
+            </w:r>
+            <w:r>
+              <w:rPr>
+                <w:rFonts w:ascii="MS Gothic" w:eastAsia="MS Gothic" w:hAnsi="MS Gothic"/>
+                <w:sz w:val="10"/>
+                <w:szCs w:val="10"/>
+              </w:rPr>
+              <w:t>Burial</w:t>
+            </w:r>
+            <w:r>
+              <w:rPr>
+                <w:rFonts w:ascii="MS Gothic" w:eastAsia="MS Gothic" w:hAnsi="MS Gothic"/>
+                <w:sz w:val="10"/>
+                <w:szCs w:val="10"/>
+              </w:rPr>
+              <w:t>BillingStatement</w:t>
+            </w:r>
+            <w:proofErr w:type="spellEnd"/>
+            <w:r>
+              <w:rPr>
+                <w:rFonts w:ascii="MS Gothic" w:eastAsia="MS Gothic" w:hAnsi="MS Gothic"/>
+                <w:sz w:val="10"/>
+                <w:szCs w:val="10"/>
+              </w:rPr>
+              <w:t>}</w:t>
+            </w:r>
+          </w:p>
+        </w:tc>
+        <w:tc>
+          <w:tcPr>
+            <w:tcW w:w="990" w:type="dxa"/>
+            <w:tcBorders>
+              <w:top w:val="single" w:sz="4" w:space="0" w:color="000000"/>
+              <w:left w:val="single" w:sz="4" w:space="0" w:color="000000"/>
+              <w:bottom w:val="single" w:sz="4" w:space="0" w:color="000000"/>
+              <w:right w:val="single" w:sz="4" w:space="0" w:color="000000"/>
+            </w:tcBorders>
+          </w:tcPr>
+          <w:p>
+            <w:pPr>
+              <w:rPr>
+                <w:rFonts w:ascii="MS Gothic" w:eastAsia="MS Gothic" w:hAnsi="MS Gothic"/>
+                <w:sz w:val="14"/>
+                <w:szCs w:val="14"/>
+              </w:rPr>
+            </w:pPr>
+            <w:r>
+              <w:rPr>
+                <w:rFonts w:ascii="Georgia" w:hAnsi="Georgia"/>
+                <w:sz w:val="14"/>
+                <w:szCs w:val="14"/>
+              </w:rPr>
+              <w:t>Certificate of Indigency</w:t>
+            </w:r>
+          </w:p>
+        </w:tc>
+        <w:tc>
+          <w:tcPr>
+            <w:tcW w:w="630" w:type="dxa"/>
+            <w:tcBorders>
+              <w:top w:val="single" w:sz="4" w:space="0" w:color="000000"/>
+              <w:left w:val="single" w:sz="4" w:space="0" w:color="000000"/>
+              <w:bottom w:val="single" w:sz="4" w:space="0" w:color="000000"/>
+              <w:right w:val="single" w:sz="4" w:space="0" w:color="000000"/>
+            </w:tcBorders>
+            <w:vAlign w:val="center"/>
+          </w:tcPr>
+          <w:p>
+            <w:pPr>
+              <w:rPr>
+                <w:rFonts w:ascii="MS Gothic" w:eastAsia="MS Gothic" w:hAnsi="MS Gothic"/>
+                <w:sz w:val="14"/>
+                <w:szCs w:val="14"/>
+              </w:rPr>
+            </w:pPr>
+            <w:r>
+              <w:rPr>
+                <w:rFonts w:ascii="MS Gothic" w:eastAsia="MS Gothic" w:hAnsi="MS Gothic"/>
+                <w:sz w:val="10"/>
+                <w:szCs w:val="10"/>
+              </w:rPr>
+              <w:t>{</w:t>
+            </w:r>
+            <w:proofErr w:type="spellStart"/>
+            <w:r>
+              <w:rPr>
+                <w:rFonts w:ascii="MS Gothic" w:eastAsia="MS Gothic" w:hAnsi="MS Gothic"/>
+                <w:sz w:val="10"/>
+                <w:szCs w:val="10"/>
+              </w:rPr>
+              <w:t>req</w:t>
+            </w:r>
+            <w:r>
+              <w:rPr>
+                <w:rFonts w:ascii="MS Gothic" w:eastAsia="MS Gothic" w:hAnsi="MS Gothic"/>
+                <w:sz w:val="10"/>
+                <w:szCs w:val="10"/>
+              </w:rPr>
+              <w:t>Eyeglass</w:t>
+            </w:r>
+            <w:r>
+              <w:rPr>
+                <w:rFonts w:ascii="MS Gothic" w:eastAsia="MS Gothic" w:hAnsi="MS Gothic"/>
+                <w:sz w:val="10"/>
+                <w:szCs w:val="10"/>
+              </w:rPr>
+              <w:t>CertificateIndigency</w:t>
             </w:r>
             <w:proofErr w:type="spellEnd"/>
             <w:r>
@@ -2474,7 +3525,7 @@
                 <w:sz w:val="16"/>
                 <w:szCs w:val="16"/>
               </w:rPr>
-              <w:t>1</w:t>
+              <w:t>3</w:t>
             </w:r>
           </w:p>
         </w:tc>
@@ -2499,14 +3550,18 @@
             <w:pPr>
               <w:pStyle w:val="Default"/>
               <w:jc w:val="center"/>
+              <w:rPr>
+                <w:sz w:val="14"/>
+                <w:szCs w:val="14"/>
+              </w:rPr>
             </w:pPr>
             <w:r>
               <w:rPr>
                 <w:rFonts w:ascii="Georgia" w:hAnsi="Georgia"/>
-                <w:sz w:val="16"/>
-                <w:szCs w:val="16"/>
-              </w:rPr>
-              <w:t>Letter Request</w:t>
+                <w:sz w:val="14"/>
+                <w:szCs w:val="14"/>
+              </w:rPr>
+              <w:t>Prescription</w:t>
             </w:r>
           </w:p>
         </w:tc>
@@ -2549,7 +3604,7 @@
                 <w:sz w:val="10"/>
                 <w:szCs w:val="10"/>
               </w:rPr>
-              <w:t>reqMedicineLetterRequest</w:t>
+              <w:t>reqMedicinePrescription</w:t>
             </w:r>
             <w:proofErr w:type="spellEnd"/>
             <w:r>
@@ -2583,20 +3638,24 @@
             <w:pPr>
               <w:spacing w:before="160" w:line="288" w:lineRule="auto"/>
               <w:jc w:val="center"/>
+              <w:rPr>
+                <w:sz w:val="14"/>
+                <w:szCs w:val="14"/>
+              </w:rPr>
             </w:pPr>
             <w:r>
               <w:rPr>
                 <w:rFonts w:ascii="Georgia" w:hAnsi="Georgia" w:cs="Arial Unicode MS"/>
                 <w:color w:val="000000"/>
-                <w:sz w:val="16"/>
-                <w:szCs w:val="16"/>
+                <w:sz w:val="14"/>
+                <w:szCs w:val="14"/>
                 <w14:textOutline w14:w="0" w14:cap="flat" w14:cmpd="sng" w14:algn="ctr">
                   <w14:noFill/>
                   <w14:prstDash w14:val="solid"/>
                   <w14:bevel/>
                 </w14:textOutline>
               </w:rPr>
-              <w:t>Request Form</w:t>
+              <w:t>Price Quotation</w:t>
             </w:r>
           </w:p>
         </w:tc>
@@ -2639,7 +3698,7 @@
                 <w:sz w:val="10"/>
                 <w:szCs w:val="10"/>
               </w:rPr>
-              <w:t>reqMedicalRequestForm</w:t>
+              <w:t>reqMedicalPriceQuotation</w:t>
             </w:r>
             <w:proofErr w:type="spellEnd"/>
             <w:r>
@@ -2673,20 +3732,24 @@
             <w:pPr>
               <w:spacing w:before="160" w:line="288" w:lineRule="auto"/>
               <w:jc w:val="center"/>
+              <w:rPr>
+                <w:sz w:val="14"/>
+                <w:szCs w:val="14"/>
+              </w:rPr>
             </w:pPr>
             <w:r>
               <w:rPr>
                 <w:rFonts w:ascii="Georgia" w:hAnsi="Georgia" w:cs="Arial Unicode MS"/>
                 <w:color w:val="000000"/>
-                <w:sz w:val="16"/>
-                <w:szCs w:val="16"/>
+                <w:sz w:val="14"/>
+                <w:szCs w:val="14"/>
                 <w14:textOutline w14:w="0" w14:cap="flat" w14:cmpd="sng" w14:algn="ctr">
                   <w14:noFill/>
                   <w14:prstDash w14:val="solid"/>
                   <w14:bevel/>
                 </w14:textOutline>
               </w:rPr>
-              <w:t>Clinical Abstract</w:t>
+              <w:t>Promissory Note</w:t>
             </w:r>
           </w:p>
         </w:tc>
@@ -2737,15 +3800,15 @@
                 <w:sz w:val="10"/>
                 <w:szCs w:val="10"/>
               </w:rPr>
-              <w:t>hospital</w:t>
-            </w:r>
-            <w:r>
-              <w:rPr>
-                <w:rFonts w:ascii="MS Gothic" w:eastAsia="MS Gothic" w:hAnsi="MS Gothic"/>
-                <w:sz w:val="10"/>
-                <w:szCs w:val="10"/>
-              </w:rPr>
-              <w:t>ClinicalAbstract</w:t>
+              <w:t>Hospital</w:t>
+            </w:r>
+            <w:r>
+              <w:rPr>
+                <w:rFonts w:ascii="MS Gothic" w:eastAsia="MS Gothic" w:hAnsi="MS Gothic"/>
+                <w:sz w:val="10"/>
+                <w:szCs w:val="10"/>
+              </w:rPr>
+              <w:t>PromissoryNote</w:t>
             </w:r>
             <w:proofErr w:type="spellEnd"/>
             <w:r>
@@ -2779,20 +3842,24 @@
             <w:pPr>
               <w:spacing w:before="160" w:line="288" w:lineRule="auto"/>
               <w:jc w:val="center"/>
+              <w:rPr>
+                <w:sz w:val="14"/>
+                <w:szCs w:val="14"/>
+              </w:rPr>
             </w:pPr>
             <w:r>
               <w:rPr>
                 <w:rFonts w:ascii="Georgia" w:hAnsi="Georgia" w:cs="Arial Unicode MS"/>
                 <w:color w:val="000000"/>
-                <w:sz w:val="16"/>
-                <w:szCs w:val="16"/>
+                <w:sz w:val="14"/>
+                <w:szCs w:val="14"/>
                 <w14:textOutline w14:w="0" w14:cap="flat" w14:cmpd="sng" w14:algn="ctr">
                   <w14:noFill/>
                   <w14:prstDash w14:val="solid"/>
                   <w14:bevel/>
                 </w14:textOutline>
               </w:rPr>
-              <w:t>Certified True Copy of Death Certificate</w:t>
+              <w:t>Certificate of Indigency</w:t>
             </w:r>
           </w:p>
         </w:tc>
@@ -2851,7 +3918,7 @@
                 <w:sz w:val="10"/>
                 <w:szCs w:val="10"/>
               </w:rPr>
-              <w:t>DeathCertificate</w:t>
+              <w:t>CertificateIndigency</w:t>
             </w:r>
             <w:proofErr w:type="spellEnd"/>
             <w:r>
@@ -2882,1054 +3949,11 @@
                 <w:szCs w:val="14"/>
               </w:rPr>
             </w:pPr>
-          </w:p>
-          <w:p>
-            <w:pPr>
-              <w:rPr>
-                <w:rFonts w:ascii="MS Gothic" w:eastAsia="MS Gothic" w:hAnsi="MS Gothic"/>
+            <w:r>
+              <w:rPr>
+                <w:rFonts w:ascii="Georgia" w:hAnsi="Georgia"/>
                 <w:sz w:val="14"/>
                 <w:szCs w:val="14"/>
-              </w:rPr>
-            </w:pPr>
-            <w:r>
-              <w:rPr>
-                <w:rFonts w:ascii="Georgia" w:hAnsi="Georgia"/>
-                <w:sz w:val="16"/>
-                <w:szCs w:val="16"/>
-              </w:rPr>
-              <w:t>Medical Certificate</w:t>
-            </w:r>
-          </w:p>
-        </w:tc>
-        <w:tc>
-          <w:tcPr>
-            <w:tcW w:w="630" w:type="dxa"/>
-            <w:tcBorders>
-              <w:top w:val="single" w:sz="4" w:space="0" w:color="000000"/>
-              <w:left w:val="single" w:sz="4" w:space="0" w:color="000000"/>
-              <w:bottom w:val="single" w:sz="4" w:space="0" w:color="000000"/>
-              <w:right w:val="single" w:sz="4" w:space="0" w:color="000000"/>
-            </w:tcBorders>
-            <w:vAlign w:val="center"/>
-          </w:tcPr>
-          <w:p>
-            <w:pPr>
-              <w:rPr>
-                <w:rFonts w:ascii="MS Gothic" w:eastAsia="MS Gothic" w:hAnsi="MS Gothic"/>
-                <w:sz w:val="14"/>
-                <w:szCs w:val="14"/>
-              </w:rPr>
-            </w:pPr>
-            <w:r>
-              <w:rPr>
-                <w:rFonts w:ascii="MS Gothic" w:eastAsia="MS Gothic" w:hAnsi="MS Gothic"/>
-                <w:sz w:val="10"/>
-                <w:szCs w:val="10"/>
-              </w:rPr>
-              <w:t>{</w:t>
-            </w:r>
-            <w:proofErr w:type="spellStart"/>
-            <w:r>
-              <w:rPr>
-                <w:rFonts w:ascii="MS Gothic" w:eastAsia="MS Gothic" w:hAnsi="MS Gothic"/>
-                <w:sz w:val="10"/>
-                <w:szCs w:val="10"/>
-              </w:rPr>
-              <w:t>reqMedicine</w:t>
-            </w:r>
-            <w:r>
-              <w:rPr>
-                <w:rFonts w:ascii="MS Gothic" w:eastAsia="MS Gothic" w:hAnsi="MS Gothic"/>
-                <w:sz w:val="10"/>
-                <w:szCs w:val="10"/>
-              </w:rPr>
-              <w:t>Eyeglass</w:t>
-            </w:r>
-            <w:r>
-              <w:rPr>
-                <w:rFonts w:ascii="MS Gothic" w:eastAsia="MS Gothic" w:hAnsi="MS Gothic"/>
-                <w:sz w:val="10"/>
-                <w:szCs w:val="10"/>
-              </w:rPr>
-              <w:t>Certificate</w:t>
-            </w:r>
-            <w:proofErr w:type="spellEnd"/>
-            <w:r>
-              <w:rPr>
-                <w:rFonts w:ascii="MS Gothic" w:eastAsia="MS Gothic" w:hAnsi="MS Gothic"/>
-                <w:sz w:val="10"/>
-                <w:szCs w:val="10"/>
-              </w:rPr>
-              <w:t>}</w:t>
-            </w:r>
-          </w:p>
-        </w:tc>
-      </w:tr>
-      <w:tr>
-        <w:tblPrEx>
-          <w:shd w:val="clear" w:color="auto" w:fill="CED7E7"/>
-        </w:tblPrEx>
-        <w:trPr>
-          <w:trHeight w:val="416"/>
-        </w:trPr>
-        <w:tc>
-          <w:tcPr>
-            <w:tcW w:w="180" w:type="dxa"/>
-            <w:tcBorders>
-              <w:top w:val="single" w:sz="4" w:space="0" w:color="000000"/>
-              <w:left w:val="single" w:sz="4" w:space="0" w:color="000000"/>
-              <w:bottom w:val="single" w:sz="4" w:space="0" w:color="000000"/>
-              <w:right w:val="single" w:sz="4" w:space="0" w:color="000000"/>
-            </w:tcBorders>
-            <w:tcMar>
-              <w:top w:w="80" w:type="dxa"/>
-              <w:left w:w="80" w:type="dxa"/>
-              <w:bottom w:w="80" w:type="dxa"/>
-              <w:right w:w="80" w:type="dxa"/>
-            </w:tcMar>
-            <w:vAlign w:val="center"/>
-          </w:tcPr>
-          <w:p>
-            <w:pPr>
-              <w:pStyle w:val="Default"/>
-              <w:jc w:val="center"/>
-            </w:pPr>
-            <w:r>
-              <w:rPr>
-                <w:rFonts w:ascii="Georgia" w:hAnsi="Georgia"/>
-                <w:sz w:val="16"/>
-                <w:szCs w:val="16"/>
-              </w:rPr>
-              <w:t>2</w:t>
-            </w:r>
-          </w:p>
-        </w:tc>
-        <w:tc>
-          <w:tcPr>
-            <w:tcW w:w="981" w:type="dxa"/>
-            <w:tcBorders>
-              <w:top w:val="single" w:sz="4" w:space="0" w:color="000000"/>
-              <w:left w:val="single" w:sz="4" w:space="0" w:color="000000"/>
-              <w:bottom w:val="single" w:sz="4" w:space="0" w:color="000000"/>
-              <w:right w:val="single" w:sz="4" w:space="0" w:color="000000"/>
-            </w:tcBorders>
-            <w:tcMar>
-              <w:top w:w="80" w:type="dxa"/>
-              <w:left w:w="80" w:type="dxa"/>
-              <w:bottom w:w="80" w:type="dxa"/>
-              <w:right w:w="80" w:type="dxa"/>
-            </w:tcMar>
-            <w:vAlign w:val="center"/>
-          </w:tcPr>
-          <w:p>
-            <w:pPr>
-              <w:pStyle w:val="Default"/>
-              <w:jc w:val="center"/>
-            </w:pPr>
-            <w:r>
-              <w:rPr>
-                <w:rFonts w:ascii="Georgia" w:hAnsi="Georgia"/>
-                <w:sz w:val="16"/>
-                <w:szCs w:val="16"/>
-              </w:rPr>
-              <w:t>Medical Certificate</w:t>
-            </w:r>
-          </w:p>
-        </w:tc>
-        <w:tc>
-          <w:tcPr>
-            <w:tcW w:w="709" w:type="dxa"/>
-            <w:tcBorders>
-              <w:top w:val="single" w:sz="4" w:space="0" w:color="000000"/>
-              <w:left w:val="single" w:sz="4" w:space="0" w:color="000000"/>
-              <w:bottom w:val="single" w:sz="4" w:space="0" w:color="000000"/>
-              <w:right w:val="single" w:sz="4" w:space="0" w:color="000000"/>
-            </w:tcBorders>
-            <w:tcMar>
-              <w:top w:w="80" w:type="dxa"/>
-              <w:left w:w="80" w:type="dxa"/>
-              <w:bottom w:w="80" w:type="dxa"/>
-              <w:right w:w="80" w:type="dxa"/>
-            </w:tcMar>
-            <w:vAlign w:val="center"/>
-          </w:tcPr>
-          <w:p>
-            <w:pPr>
-              <w:rPr>
-                <w:sz w:val="10"/>
-                <w:szCs w:val="10"/>
-              </w:rPr>
-            </w:pPr>
-            <w:r>
-              <w:rPr>
-                <w:rFonts w:ascii="MS Gothic" w:eastAsia="MS Gothic" w:hAnsi="MS Gothic"/>
-                <w:sz w:val="10"/>
-                <w:szCs w:val="10"/>
-              </w:rPr>
-              <w:t>{</w:t>
-            </w:r>
-            <w:proofErr w:type="spellStart"/>
-            <w:r>
-              <w:rPr>
-                <w:rFonts w:ascii="MS Gothic" w:eastAsia="MS Gothic" w:hAnsi="MS Gothic"/>
-                <w:sz w:val="10"/>
-                <w:szCs w:val="10"/>
-              </w:rPr>
-              <w:t>reqMedicineMedicalCertificate</w:t>
-            </w:r>
-            <w:proofErr w:type="spellEnd"/>
-            <w:r>
-              <w:rPr>
-                <w:rFonts w:ascii="MS Gothic" w:eastAsia="MS Gothic" w:hAnsi="MS Gothic"/>
-                <w:sz w:val="10"/>
-                <w:szCs w:val="10"/>
-              </w:rPr>
-              <w:t>}</w:t>
-            </w:r>
-          </w:p>
-        </w:tc>
-        <w:tc>
-          <w:tcPr>
-            <w:tcW w:w="1077" w:type="dxa"/>
-            <w:tcBorders>
-              <w:top w:val="single" w:sz="4" w:space="0" w:color="000000"/>
-              <w:left w:val="single" w:sz="4" w:space="0" w:color="000000"/>
-              <w:bottom w:val="single" w:sz="4" w:space="0" w:color="000000"/>
-              <w:right w:val="single" w:sz="4" w:space="0" w:color="000000"/>
-            </w:tcBorders>
-            <w:tcMar>
-              <w:top w:w="80" w:type="dxa"/>
-              <w:left w:w="80" w:type="dxa"/>
-              <w:bottom w:w="80" w:type="dxa"/>
-              <w:right w:w="80" w:type="dxa"/>
-            </w:tcMar>
-            <w:vAlign w:val="center"/>
-          </w:tcPr>
-          <w:p>
-            <w:pPr>
-              <w:spacing w:before="160" w:line="288" w:lineRule="auto"/>
-              <w:jc w:val="center"/>
-            </w:pPr>
-            <w:r>
-              <w:rPr>
-                <w:rFonts w:ascii="Georgia" w:hAnsi="Georgia" w:cs="Arial Unicode MS"/>
-                <w:color w:val="000000"/>
-                <w:sz w:val="16"/>
-                <w:szCs w:val="16"/>
-                <w14:textOutline w14:w="0" w14:cap="flat" w14:cmpd="sng" w14:algn="ctr">
-                  <w14:noFill/>
-                  <w14:prstDash w14:val="solid"/>
-                  <w14:bevel/>
-                </w14:textOutline>
-              </w:rPr>
-              <w:t>Medical Certificate</w:t>
-            </w:r>
-          </w:p>
-        </w:tc>
-        <w:tc>
-          <w:tcPr>
-            <w:tcW w:w="720" w:type="dxa"/>
-            <w:tcBorders>
-              <w:top w:val="single" w:sz="4" w:space="0" w:color="000000"/>
-              <w:left w:val="single" w:sz="4" w:space="0" w:color="000000"/>
-              <w:bottom w:val="single" w:sz="4" w:space="0" w:color="000000"/>
-              <w:right w:val="single" w:sz="4" w:space="0" w:color="000000"/>
-            </w:tcBorders>
-            <w:tcMar>
-              <w:top w:w="80" w:type="dxa"/>
-              <w:left w:w="80" w:type="dxa"/>
-              <w:bottom w:w="80" w:type="dxa"/>
-              <w:right w:w="80" w:type="dxa"/>
-            </w:tcMar>
-            <w:vAlign w:val="center"/>
-          </w:tcPr>
-          <w:p>
-            <w:pPr>
-              <w:rPr>
-                <w:sz w:val="10"/>
-                <w:szCs w:val="10"/>
-              </w:rPr>
-            </w:pPr>
-            <w:r>
-              <w:rPr>
-                <w:rFonts w:ascii="MS Gothic" w:eastAsia="MS Gothic" w:hAnsi="MS Gothic"/>
-                <w:sz w:val="10"/>
-                <w:szCs w:val="10"/>
-              </w:rPr>
-              <w:t>{</w:t>
-            </w:r>
-            <w:proofErr w:type="spellStart"/>
-            <w:r>
-              <w:rPr>
-                <w:rFonts w:ascii="MS Gothic" w:eastAsia="MS Gothic" w:hAnsi="MS Gothic"/>
-                <w:sz w:val="10"/>
-                <w:szCs w:val="10"/>
-              </w:rPr>
-              <w:t>reqMedicalMedicalCertificate</w:t>
-            </w:r>
-            <w:proofErr w:type="spellEnd"/>
-            <w:r>
-              <w:rPr>
-                <w:rFonts w:ascii="MS Gothic" w:eastAsia="MS Gothic" w:hAnsi="MS Gothic"/>
-                <w:sz w:val="10"/>
-                <w:szCs w:val="10"/>
-              </w:rPr>
-              <w:t>}</w:t>
-            </w:r>
-          </w:p>
-        </w:tc>
-        <w:tc>
-          <w:tcPr>
-            <w:tcW w:w="1170" w:type="dxa"/>
-            <w:tcBorders>
-              <w:top w:val="single" w:sz="4" w:space="0" w:color="000000"/>
-              <w:left w:val="single" w:sz="4" w:space="0" w:color="000000"/>
-              <w:bottom w:val="single" w:sz="4" w:space="0" w:color="000000"/>
-              <w:right w:val="single" w:sz="4" w:space="0" w:color="000000"/>
-            </w:tcBorders>
-            <w:tcMar>
-              <w:top w:w="80" w:type="dxa"/>
-              <w:left w:w="80" w:type="dxa"/>
-              <w:bottom w:w="80" w:type="dxa"/>
-              <w:right w:w="80" w:type="dxa"/>
-            </w:tcMar>
-            <w:vAlign w:val="center"/>
-          </w:tcPr>
-          <w:p>
-            <w:pPr>
-              <w:spacing w:before="160" w:line="288" w:lineRule="auto"/>
-              <w:jc w:val="center"/>
-            </w:pPr>
-            <w:r>
-              <w:rPr>
-                <w:rFonts w:ascii="Georgia" w:hAnsi="Georgia" w:cs="Arial Unicode MS"/>
-                <w:color w:val="000000"/>
-                <w:sz w:val="16"/>
-                <w:szCs w:val="16"/>
-                <w14:textOutline w14:w="0" w14:cap="flat" w14:cmpd="sng" w14:algn="ctr">
-                  <w14:noFill/>
-                  <w14:prstDash w14:val="solid"/>
-                  <w14:bevel/>
-                </w14:textOutline>
-              </w:rPr>
-              <w:t>Final Bill</w:t>
-            </w:r>
-          </w:p>
-        </w:tc>
-        <w:tc>
-          <w:tcPr>
-            <w:tcW w:w="990" w:type="dxa"/>
-            <w:tcBorders>
-              <w:top w:val="single" w:sz="4" w:space="0" w:color="000000"/>
-              <w:left w:val="single" w:sz="4" w:space="0" w:color="000000"/>
-              <w:bottom w:val="single" w:sz="4" w:space="0" w:color="000000"/>
-              <w:right w:val="single" w:sz="4" w:space="0" w:color="000000"/>
-            </w:tcBorders>
-            <w:tcMar>
-              <w:top w:w="80" w:type="dxa"/>
-              <w:left w:w="80" w:type="dxa"/>
-              <w:bottom w:w="80" w:type="dxa"/>
-              <w:right w:w="80" w:type="dxa"/>
-            </w:tcMar>
-            <w:vAlign w:val="center"/>
-          </w:tcPr>
-          <w:p>
-            <w:pPr>
-              <w:rPr>
-                <w:sz w:val="10"/>
-                <w:szCs w:val="10"/>
-              </w:rPr>
-            </w:pPr>
-            <w:r>
-              <w:rPr>
-                <w:rFonts w:ascii="MS Gothic" w:eastAsia="MS Gothic" w:hAnsi="MS Gothic"/>
-                <w:sz w:val="10"/>
-                <w:szCs w:val="10"/>
-              </w:rPr>
-              <w:t>{</w:t>
-            </w:r>
-            <w:proofErr w:type="spellStart"/>
-            <w:r>
-              <w:rPr>
-                <w:rFonts w:ascii="MS Gothic" w:eastAsia="MS Gothic" w:hAnsi="MS Gothic"/>
-                <w:sz w:val="10"/>
-                <w:szCs w:val="10"/>
-              </w:rPr>
-              <w:t>req</w:t>
-            </w:r>
-            <w:r>
-              <w:rPr>
-                <w:rFonts w:ascii="MS Gothic" w:eastAsia="MS Gothic" w:hAnsi="MS Gothic"/>
-                <w:sz w:val="10"/>
-                <w:szCs w:val="10"/>
-              </w:rPr>
-              <w:t>Hospital</w:t>
-            </w:r>
-            <w:r>
-              <w:rPr>
-                <w:rFonts w:ascii="MS Gothic" w:eastAsia="MS Gothic" w:hAnsi="MS Gothic"/>
-                <w:sz w:val="10"/>
-                <w:szCs w:val="10"/>
-              </w:rPr>
-              <w:t>FinalBill</w:t>
-            </w:r>
-            <w:proofErr w:type="spellEnd"/>
-            <w:r>
-              <w:rPr>
-                <w:rFonts w:ascii="MS Gothic" w:eastAsia="MS Gothic" w:hAnsi="MS Gothic"/>
-                <w:sz w:val="10"/>
-                <w:szCs w:val="10"/>
-              </w:rPr>
-              <w:t>}</w:t>
-            </w:r>
-          </w:p>
-        </w:tc>
-        <w:tc>
-          <w:tcPr>
-            <w:tcW w:w="1170" w:type="dxa"/>
-            <w:tcBorders>
-              <w:top w:val="single" w:sz="4" w:space="0" w:color="000000"/>
-              <w:left w:val="single" w:sz="4" w:space="0" w:color="000000"/>
-              <w:bottom w:val="single" w:sz="4" w:space="0" w:color="000000"/>
-              <w:right w:val="single" w:sz="4" w:space="0" w:color="000000"/>
-            </w:tcBorders>
-            <w:tcMar>
-              <w:top w:w="80" w:type="dxa"/>
-              <w:left w:w="80" w:type="dxa"/>
-              <w:bottom w:w="80" w:type="dxa"/>
-              <w:right w:w="80" w:type="dxa"/>
-            </w:tcMar>
-            <w:vAlign w:val="center"/>
-          </w:tcPr>
-          <w:p>
-            <w:pPr>
-              <w:spacing w:before="160" w:line="288" w:lineRule="auto"/>
-              <w:jc w:val="center"/>
-            </w:pPr>
-            <w:r>
-              <w:rPr>
-                <w:rFonts w:ascii="Georgia" w:hAnsi="Georgia" w:cs="Arial Unicode MS"/>
-                <w:color w:val="000000"/>
-                <w:sz w:val="16"/>
-                <w:szCs w:val="16"/>
-                <w14:textOutline w14:w="0" w14:cap="flat" w14:cmpd="sng" w14:algn="ctr">
-                  <w14:noFill/>
-                  <w14:prstDash w14:val="solid"/>
-                  <w14:bevel/>
-                </w14:textOutline>
-              </w:rPr>
-              <w:t>Billing Statement/Statement of Account</w:t>
-            </w:r>
-          </w:p>
-        </w:tc>
-        <w:tc>
-          <w:tcPr>
-            <w:tcW w:w="720" w:type="dxa"/>
-            <w:tcBorders>
-              <w:top w:val="single" w:sz="4" w:space="0" w:color="000000"/>
-              <w:left w:val="single" w:sz="4" w:space="0" w:color="000000"/>
-              <w:bottom w:val="single" w:sz="4" w:space="0" w:color="000000"/>
-              <w:right w:val="single" w:sz="4" w:space="0" w:color="000000"/>
-            </w:tcBorders>
-            <w:tcMar>
-              <w:top w:w="80" w:type="dxa"/>
-              <w:left w:w="80" w:type="dxa"/>
-              <w:bottom w:w="80" w:type="dxa"/>
-              <w:right w:w="80" w:type="dxa"/>
-            </w:tcMar>
-            <w:vAlign w:val="center"/>
-          </w:tcPr>
-          <w:p>
-            <w:pPr>
-              <w:rPr>
-                <w:sz w:val="10"/>
-                <w:szCs w:val="10"/>
-              </w:rPr>
-            </w:pPr>
-            <w:r>
-              <w:rPr>
-                <w:rFonts w:ascii="MS Gothic" w:eastAsia="MS Gothic" w:hAnsi="MS Gothic"/>
-                <w:sz w:val="10"/>
-                <w:szCs w:val="10"/>
-              </w:rPr>
-              <w:t>{</w:t>
-            </w:r>
-            <w:proofErr w:type="spellStart"/>
-            <w:r>
-              <w:rPr>
-                <w:rFonts w:ascii="MS Gothic" w:eastAsia="MS Gothic" w:hAnsi="MS Gothic"/>
-                <w:sz w:val="10"/>
-                <w:szCs w:val="10"/>
-              </w:rPr>
-              <w:t>req</w:t>
-            </w:r>
-            <w:r>
-              <w:rPr>
-                <w:rFonts w:ascii="MS Gothic" w:eastAsia="MS Gothic" w:hAnsi="MS Gothic"/>
-                <w:sz w:val="10"/>
-                <w:szCs w:val="10"/>
-              </w:rPr>
-              <w:t>Burial</w:t>
-            </w:r>
-            <w:r>
-              <w:rPr>
-                <w:rFonts w:ascii="MS Gothic" w:eastAsia="MS Gothic" w:hAnsi="MS Gothic"/>
-                <w:sz w:val="10"/>
-                <w:szCs w:val="10"/>
-              </w:rPr>
-              <w:t>BillingStatement</w:t>
-            </w:r>
-            <w:proofErr w:type="spellEnd"/>
-            <w:r>
-              <w:rPr>
-                <w:rFonts w:ascii="MS Gothic" w:eastAsia="MS Gothic" w:hAnsi="MS Gothic"/>
-                <w:sz w:val="10"/>
-                <w:szCs w:val="10"/>
-              </w:rPr>
-              <w:t>}</w:t>
-            </w:r>
-          </w:p>
-        </w:tc>
-        <w:tc>
-          <w:tcPr>
-            <w:tcW w:w="990" w:type="dxa"/>
-            <w:tcBorders>
-              <w:top w:val="single" w:sz="4" w:space="0" w:color="000000"/>
-              <w:left w:val="single" w:sz="4" w:space="0" w:color="000000"/>
-              <w:bottom w:val="single" w:sz="4" w:space="0" w:color="000000"/>
-              <w:right w:val="single" w:sz="4" w:space="0" w:color="000000"/>
-            </w:tcBorders>
-          </w:tcPr>
-          <w:p>
-            <w:pPr>
-              <w:rPr>
-                <w:rFonts w:ascii="MS Gothic" w:eastAsia="MS Gothic" w:hAnsi="MS Gothic"/>
-                <w:sz w:val="14"/>
-                <w:szCs w:val="14"/>
-              </w:rPr>
-            </w:pPr>
-            <w:r>
-              <w:rPr>
-                <w:rFonts w:ascii="Georgia" w:hAnsi="Georgia"/>
-                <w:sz w:val="16"/>
-                <w:szCs w:val="16"/>
-              </w:rPr>
-              <w:t>Certificate of Indigency</w:t>
-            </w:r>
-          </w:p>
-        </w:tc>
-        <w:tc>
-          <w:tcPr>
-            <w:tcW w:w="630" w:type="dxa"/>
-            <w:tcBorders>
-              <w:top w:val="single" w:sz="4" w:space="0" w:color="000000"/>
-              <w:left w:val="single" w:sz="4" w:space="0" w:color="000000"/>
-              <w:bottom w:val="single" w:sz="4" w:space="0" w:color="000000"/>
-              <w:right w:val="single" w:sz="4" w:space="0" w:color="000000"/>
-            </w:tcBorders>
-            <w:vAlign w:val="center"/>
-          </w:tcPr>
-          <w:p>
-            <w:pPr>
-              <w:rPr>
-                <w:rFonts w:ascii="MS Gothic" w:eastAsia="MS Gothic" w:hAnsi="MS Gothic"/>
-                <w:sz w:val="14"/>
-                <w:szCs w:val="14"/>
-              </w:rPr>
-            </w:pPr>
-            <w:r>
-              <w:rPr>
-                <w:rFonts w:ascii="MS Gothic" w:eastAsia="MS Gothic" w:hAnsi="MS Gothic"/>
-                <w:sz w:val="10"/>
-                <w:szCs w:val="10"/>
-              </w:rPr>
-              <w:t>{</w:t>
-            </w:r>
-            <w:proofErr w:type="spellStart"/>
-            <w:r>
-              <w:rPr>
-                <w:rFonts w:ascii="MS Gothic" w:eastAsia="MS Gothic" w:hAnsi="MS Gothic"/>
-                <w:sz w:val="10"/>
-                <w:szCs w:val="10"/>
-              </w:rPr>
-              <w:t>req</w:t>
-            </w:r>
-            <w:r>
-              <w:rPr>
-                <w:rFonts w:ascii="MS Gothic" w:eastAsia="MS Gothic" w:hAnsi="MS Gothic"/>
-                <w:sz w:val="10"/>
-                <w:szCs w:val="10"/>
-              </w:rPr>
-              <w:t>Eyeglass</w:t>
-            </w:r>
-            <w:r>
-              <w:rPr>
-                <w:rFonts w:ascii="MS Gothic" w:eastAsia="MS Gothic" w:hAnsi="MS Gothic"/>
-                <w:sz w:val="10"/>
-                <w:szCs w:val="10"/>
-              </w:rPr>
-              <w:t>CertificateIndigency</w:t>
-            </w:r>
-            <w:proofErr w:type="spellEnd"/>
-            <w:r>
-              <w:rPr>
-                <w:rFonts w:ascii="MS Gothic" w:eastAsia="MS Gothic" w:hAnsi="MS Gothic"/>
-                <w:sz w:val="10"/>
-                <w:szCs w:val="10"/>
-              </w:rPr>
-              <w:t>}</w:t>
-            </w:r>
-          </w:p>
-        </w:tc>
-      </w:tr>
-      <w:tr>
-        <w:tblPrEx>
-          <w:shd w:val="clear" w:color="auto" w:fill="CED7E7"/>
-        </w:tblPrEx>
-        <w:trPr>
-          <w:trHeight w:val="416"/>
-        </w:trPr>
-        <w:tc>
-          <w:tcPr>
-            <w:tcW w:w="180" w:type="dxa"/>
-            <w:tcBorders>
-              <w:top w:val="single" w:sz="4" w:space="0" w:color="000000"/>
-              <w:left w:val="single" w:sz="4" w:space="0" w:color="000000"/>
-              <w:bottom w:val="single" w:sz="4" w:space="0" w:color="000000"/>
-              <w:right w:val="single" w:sz="4" w:space="0" w:color="000000"/>
-            </w:tcBorders>
-            <w:tcMar>
-              <w:top w:w="80" w:type="dxa"/>
-              <w:left w:w="80" w:type="dxa"/>
-              <w:bottom w:w="80" w:type="dxa"/>
-              <w:right w:w="80" w:type="dxa"/>
-            </w:tcMar>
-            <w:vAlign w:val="center"/>
-          </w:tcPr>
-          <w:p>
-            <w:pPr>
-              <w:pStyle w:val="Default"/>
-              <w:jc w:val="center"/>
-            </w:pPr>
-            <w:r>
-              <w:rPr>
-                <w:rFonts w:ascii="Georgia" w:hAnsi="Georgia"/>
-                <w:sz w:val="16"/>
-                <w:szCs w:val="16"/>
-              </w:rPr>
-              <w:t>3</w:t>
-            </w:r>
-          </w:p>
-        </w:tc>
-        <w:tc>
-          <w:tcPr>
-            <w:tcW w:w="981" w:type="dxa"/>
-            <w:tcBorders>
-              <w:top w:val="single" w:sz="4" w:space="0" w:color="000000"/>
-              <w:left w:val="single" w:sz="4" w:space="0" w:color="000000"/>
-              <w:bottom w:val="single" w:sz="4" w:space="0" w:color="000000"/>
-              <w:right w:val="single" w:sz="4" w:space="0" w:color="000000"/>
-            </w:tcBorders>
-            <w:tcMar>
-              <w:top w:w="80" w:type="dxa"/>
-              <w:left w:w="80" w:type="dxa"/>
-              <w:bottom w:w="80" w:type="dxa"/>
-              <w:right w:w="80" w:type="dxa"/>
-            </w:tcMar>
-            <w:vAlign w:val="center"/>
-          </w:tcPr>
-          <w:p>
-            <w:pPr>
-              <w:pStyle w:val="Default"/>
-              <w:jc w:val="center"/>
-            </w:pPr>
-            <w:r>
-              <w:rPr>
-                <w:rFonts w:ascii="Georgia" w:hAnsi="Georgia"/>
-                <w:sz w:val="16"/>
-                <w:szCs w:val="16"/>
-              </w:rPr>
-              <w:t>Prescription</w:t>
-            </w:r>
-          </w:p>
-        </w:tc>
-        <w:tc>
-          <w:tcPr>
-            <w:tcW w:w="709" w:type="dxa"/>
-            <w:tcBorders>
-              <w:top w:val="single" w:sz="4" w:space="0" w:color="000000"/>
-              <w:left w:val="single" w:sz="4" w:space="0" w:color="000000"/>
-              <w:bottom w:val="single" w:sz="4" w:space="0" w:color="000000"/>
-              <w:right w:val="single" w:sz="4" w:space="0" w:color="000000"/>
-            </w:tcBorders>
-            <w:tcMar>
-              <w:top w:w="80" w:type="dxa"/>
-              <w:left w:w="80" w:type="dxa"/>
-              <w:bottom w:w="80" w:type="dxa"/>
-              <w:right w:w="80" w:type="dxa"/>
-            </w:tcMar>
-            <w:vAlign w:val="center"/>
-          </w:tcPr>
-          <w:p>
-            <w:pPr>
-              <w:rPr>
-                <w:sz w:val="10"/>
-                <w:szCs w:val="10"/>
-              </w:rPr>
-            </w:pPr>
-            <w:r>
-              <w:rPr>
-                <w:rFonts w:ascii="MS Gothic" w:eastAsia="MS Gothic" w:hAnsi="MS Gothic"/>
-                <w:sz w:val="10"/>
-                <w:szCs w:val="10"/>
-              </w:rPr>
-              <w:t>{</w:t>
-            </w:r>
-            <w:proofErr w:type="spellStart"/>
-            <w:r>
-              <w:rPr>
-                <w:rFonts w:ascii="MS Gothic" w:eastAsia="MS Gothic" w:hAnsi="MS Gothic"/>
-                <w:sz w:val="10"/>
-                <w:szCs w:val="10"/>
-              </w:rPr>
-              <w:t>reqMedicinePrescription</w:t>
-            </w:r>
-            <w:proofErr w:type="spellEnd"/>
-            <w:r>
-              <w:rPr>
-                <w:rFonts w:ascii="MS Gothic" w:eastAsia="MS Gothic" w:hAnsi="MS Gothic"/>
-                <w:sz w:val="10"/>
-                <w:szCs w:val="10"/>
-              </w:rPr>
-              <w:t>}</w:t>
-            </w:r>
-          </w:p>
-        </w:tc>
-        <w:tc>
-          <w:tcPr>
-            <w:tcW w:w="1077" w:type="dxa"/>
-            <w:tcBorders>
-              <w:top w:val="single" w:sz="4" w:space="0" w:color="000000"/>
-              <w:left w:val="single" w:sz="4" w:space="0" w:color="000000"/>
-              <w:bottom w:val="single" w:sz="4" w:space="0" w:color="000000"/>
-              <w:right w:val="single" w:sz="4" w:space="0" w:color="000000"/>
-            </w:tcBorders>
-            <w:tcMar>
-              <w:top w:w="80" w:type="dxa"/>
-              <w:left w:w="80" w:type="dxa"/>
-              <w:bottom w:w="80" w:type="dxa"/>
-              <w:right w:w="80" w:type="dxa"/>
-            </w:tcMar>
-            <w:vAlign w:val="center"/>
-          </w:tcPr>
-          <w:p>
-            <w:pPr>
-              <w:spacing w:before="160" w:line="288" w:lineRule="auto"/>
-              <w:jc w:val="center"/>
-            </w:pPr>
-            <w:r>
-              <w:rPr>
-                <w:rFonts w:ascii="Georgia" w:hAnsi="Georgia" w:cs="Arial Unicode MS"/>
-                <w:color w:val="000000"/>
-                <w:sz w:val="16"/>
-                <w:szCs w:val="16"/>
-                <w14:textOutline w14:w="0" w14:cap="flat" w14:cmpd="sng" w14:algn="ctr">
-                  <w14:noFill/>
-                  <w14:prstDash w14:val="solid"/>
-                  <w14:bevel/>
-                </w14:textOutline>
-              </w:rPr>
-              <w:t>Price Quotation</w:t>
-            </w:r>
-          </w:p>
-        </w:tc>
-        <w:tc>
-          <w:tcPr>
-            <w:tcW w:w="720" w:type="dxa"/>
-            <w:tcBorders>
-              <w:top w:val="single" w:sz="4" w:space="0" w:color="000000"/>
-              <w:left w:val="single" w:sz="4" w:space="0" w:color="000000"/>
-              <w:bottom w:val="single" w:sz="4" w:space="0" w:color="000000"/>
-              <w:right w:val="single" w:sz="4" w:space="0" w:color="000000"/>
-            </w:tcBorders>
-            <w:tcMar>
-              <w:top w:w="80" w:type="dxa"/>
-              <w:left w:w="80" w:type="dxa"/>
-              <w:bottom w:w="80" w:type="dxa"/>
-              <w:right w:w="80" w:type="dxa"/>
-            </w:tcMar>
-            <w:vAlign w:val="center"/>
-          </w:tcPr>
-          <w:p>
-            <w:pPr>
-              <w:rPr>
-                <w:sz w:val="10"/>
-                <w:szCs w:val="10"/>
-              </w:rPr>
-            </w:pPr>
-            <w:r>
-              <w:rPr>
-                <w:rFonts w:ascii="MS Gothic" w:eastAsia="MS Gothic" w:hAnsi="MS Gothic"/>
-                <w:sz w:val="10"/>
-                <w:szCs w:val="10"/>
-              </w:rPr>
-              <w:t>{</w:t>
-            </w:r>
-            <w:proofErr w:type="spellStart"/>
-            <w:r>
-              <w:rPr>
-                <w:rFonts w:ascii="MS Gothic" w:eastAsia="MS Gothic" w:hAnsi="MS Gothic"/>
-                <w:sz w:val="10"/>
-                <w:szCs w:val="10"/>
-              </w:rPr>
-              <w:t>reqMedicalPriceQuotation</w:t>
-            </w:r>
-            <w:proofErr w:type="spellEnd"/>
-            <w:r>
-              <w:rPr>
-                <w:rFonts w:ascii="MS Gothic" w:eastAsia="MS Gothic" w:hAnsi="MS Gothic"/>
-                <w:sz w:val="10"/>
-                <w:szCs w:val="10"/>
-              </w:rPr>
-              <w:t>}</w:t>
-            </w:r>
-          </w:p>
-        </w:tc>
-        <w:tc>
-          <w:tcPr>
-            <w:tcW w:w="1170" w:type="dxa"/>
-            <w:tcBorders>
-              <w:top w:val="single" w:sz="4" w:space="0" w:color="000000"/>
-              <w:left w:val="single" w:sz="4" w:space="0" w:color="000000"/>
-              <w:bottom w:val="single" w:sz="4" w:space="0" w:color="000000"/>
-              <w:right w:val="single" w:sz="4" w:space="0" w:color="000000"/>
-            </w:tcBorders>
-            <w:tcMar>
-              <w:top w:w="80" w:type="dxa"/>
-              <w:left w:w="80" w:type="dxa"/>
-              <w:bottom w:w="80" w:type="dxa"/>
-              <w:right w:w="80" w:type="dxa"/>
-            </w:tcMar>
-            <w:vAlign w:val="center"/>
-          </w:tcPr>
-          <w:p>
-            <w:pPr>
-              <w:spacing w:before="160" w:line="288" w:lineRule="auto"/>
-              <w:jc w:val="center"/>
-            </w:pPr>
-            <w:r>
-              <w:rPr>
-                <w:rFonts w:ascii="Georgia" w:hAnsi="Georgia" w:cs="Arial Unicode MS"/>
-                <w:color w:val="000000"/>
-                <w:sz w:val="16"/>
-                <w:szCs w:val="16"/>
-                <w14:textOutline w14:w="0" w14:cap="flat" w14:cmpd="sng" w14:algn="ctr">
-                  <w14:noFill/>
-                  <w14:prstDash w14:val="solid"/>
-                  <w14:bevel/>
-                </w14:textOutline>
-              </w:rPr>
-              <w:t>Promissory Note</w:t>
-            </w:r>
-          </w:p>
-        </w:tc>
-        <w:tc>
-          <w:tcPr>
-            <w:tcW w:w="990" w:type="dxa"/>
-            <w:tcBorders>
-              <w:top w:val="single" w:sz="4" w:space="0" w:color="000000"/>
-              <w:left w:val="single" w:sz="4" w:space="0" w:color="000000"/>
-              <w:bottom w:val="single" w:sz="4" w:space="0" w:color="000000"/>
-              <w:right w:val="single" w:sz="4" w:space="0" w:color="000000"/>
-            </w:tcBorders>
-            <w:tcMar>
-              <w:top w:w="80" w:type="dxa"/>
-              <w:left w:w="80" w:type="dxa"/>
-              <w:bottom w:w="80" w:type="dxa"/>
-              <w:right w:w="80" w:type="dxa"/>
-            </w:tcMar>
-            <w:vAlign w:val="center"/>
-          </w:tcPr>
-          <w:p>
-            <w:pPr>
-              <w:rPr>
-                <w:sz w:val="10"/>
-                <w:szCs w:val="10"/>
-              </w:rPr>
-            </w:pPr>
-            <w:r>
-              <w:rPr>
-                <w:rFonts w:ascii="MS Gothic" w:eastAsia="MS Gothic" w:hAnsi="MS Gothic"/>
-                <w:sz w:val="10"/>
-                <w:szCs w:val="10"/>
-              </w:rPr>
-              <w:t>{</w:t>
-            </w:r>
-            <w:proofErr w:type="spellStart"/>
-            <w:r>
-              <w:rPr>
-                <w:rFonts w:ascii="MS Gothic" w:eastAsia="MS Gothic" w:hAnsi="MS Gothic"/>
-                <w:sz w:val="10"/>
-                <w:szCs w:val="10"/>
-              </w:rPr>
-              <w:t>req</w:t>
-            </w:r>
-            <w:r>
-              <w:rPr>
-                <w:rFonts w:ascii="MS Gothic" w:eastAsia="MS Gothic" w:hAnsi="MS Gothic"/>
-                <w:sz w:val="10"/>
-                <w:szCs w:val="10"/>
-              </w:rPr>
-              <w:t>Hospital</w:t>
-            </w:r>
-            <w:r>
-              <w:rPr>
-                <w:rFonts w:ascii="MS Gothic" w:eastAsia="MS Gothic" w:hAnsi="MS Gothic"/>
-                <w:sz w:val="10"/>
-                <w:szCs w:val="10"/>
-              </w:rPr>
-              <w:t>PromissoryNote</w:t>
-            </w:r>
-            <w:proofErr w:type="spellEnd"/>
-            <w:r>
-              <w:rPr>
-                <w:rFonts w:ascii="MS Gothic" w:eastAsia="MS Gothic" w:hAnsi="MS Gothic"/>
-                <w:sz w:val="10"/>
-                <w:szCs w:val="10"/>
-              </w:rPr>
-              <w:t>}</w:t>
-            </w:r>
-          </w:p>
-        </w:tc>
-        <w:tc>
-          <w:tcPr>
-            <w:tcW w:w="1170" w:type="dxa"/>
-            <w:tcBorders>
-              <w:top w:val="single" w:sz="4" w:space="0" w:color="000000"/>
-              <w:left w:val="single" w:sz="4" w:space="0" w:color="000000"/>
-              <w:bottom w:val="single" w:sz="4" w:space="0" w:color="000000"/>
-              <w:right w:val="single" w:sz="4" w:space="0" w:color="000000"/>
-            </w:tcBorders>
-            <w:tcMar>
-              <w:top w:w="80" w:type="dxa"/>
-              <w:left w:w="80" w:type="dxa"/>
-              <w:bottom w:w="80" w:type="dxa"/>
-              <w:right w:w="80" w:type="dxa"/>
-            </w:tcMar>
-            <w:vAlign w:val="center"/>
-          </w:tcPr>
-          <w:p>
-            <w:pPr>
-              <w:spacing w:before="160" w:line="288" w:lineRule="auto"/>
-              <w:jc w:val="center"/>
-            </w:pPr>
-            <w:r>
-              <w:rPr>
-                <w:rFonts w:ascii="Georgia" w:hAnsi="Georgia" w:cs="Arial Unicode MS"/>
-                <w:color w:val="000000"/>
-                <w:sz w:val="16"/>
-                <w:szCs w:val="16"/>
-                <w14:textOutline w14:w="0" w14:cap="flat" w14:cmpd="sng" w14:algn="ctr">
-                  <w14:noFill/>
-                  <w14:prstDash w14:val="solid"/>
-                  <w14:bevel/>
-                </w14:textOutline>
-              </w:rPr>
-              <w:t>Certificate of Indigency</w:t>
-            </w:r>
-          </w:p>
-        </w:tc>
-        <w:tc>
-          <w:tcPr>
-            <w:tcW w:w="720" w:type="dxa"/>
-            <w:tcBorders>
-              <w:top w:val="single" w:sz="4" w:space="0" w:color="000000"/>
-              <w:left w:val="single" w:sz="4" w:space="0" w:color="000000"/>
-              <w:bottom w:val="single" w:sz="4" w:space="0" w:color="000000"/>
-              <w:right w:val="single" w:sz="4" w:space="0" w:color="000000"/>
-            </w:tcBorders>
-            <w:tcMar>
-              <w:top w:w="80" w:type="dxa"/>
-              <w:left w:w="80" w:type="dxa"/>
-              <w:bottom w:w="80" w:type="dxa"/>
-              <w:right w:w="80" w:type="dxa"/>
-            </w:tcMar>
-            <w:vAlign w:val="center"/>
-          </w:tcPr>
-          <w:p>
-            <w:pPr>
-              <w:rPr>
-                <w:sz w:val="10"/>
-                <w:szCs w:val="10"/>
-              </w:rPr>
-            </w:pPr>
-            <w:r>
-              <w:rPr>
-                <w:rFonts w:ascii="MS Gothic" w:eastAsia="MS Gothic" w:hAnsi="MS Gothic"/>
-                <w:sz w:val="10"/>
-                <w:szCs w:val="10"/>
-              </w:rPr>
-              <w:t>{</w:t>
-            </w:r>
-            <w:proofErr w:type="spellStart"/>
-            <w:r>
-              <w:rPr>
-                <w:rFonts w:ascii="MS Gothic" w:eastAsia="MS Gothic" w:hAnsi="MS Gothic"/>
-                <w:sz w:val="10"/>
-                <w:szCs w:val="10"/>
-              </w:rPr>
-              <w:t>req</w:t>
-            </w:r>
-            <w:r>
-              <w:rPr>
-                <w:rFonts w:ascii="MS Gothic" w:eastAsia="MS Gothic" w:hAnsi="MS Gothic"/>
-                <w:sz w:val="10"/>
-                <w:szCs w:val="10"/>
-              </w:rPr>
-              <w:t>Burial</w:t>
-            </w:r>
-            <w:r>
-              <w:rPr>
-                <w:rFonts w:ascii="MS Gothic" w:eastAsia="MS Gothic" w:hAnsi="MS Gothic"/>
-                <w:sz w:val="10"/>
-                <w:szCs w:val="10"/>
-              </w:rPr>
-              <w:t>CertificateIndigency</w:t>
-            </w:r>
-            <w:proofErr w:type="spellEnd"/>
-            <w:r>
-              <w:rPr>
-                <w:rFonts w:ascii="MS Gothic" w:eastAsia="MS Gothic" w:hAnsi="MS Gothic"/>
-                <w:sz w:val="10"/>
-                <w:szCs w:val="10"/>
-              </w:rPr>
-              <w:t>}</w:t>
-            </w:r>
-          </w:p>
-        </w:tc>
-        <w:tc>
-          <w:tcPr>
-            <w:tcW w:w="990" w:type="dxa"/>
-            <w:tcBorders>
-              <w:top w:val="single" w:sz="4" w:space="0" w:color="000000"/>
-              <w:left w:val="single" w:sz="4" w:space="0" w:color="000000"/>
-              <w:bottom w:val="single" w:sz="4" w:space="0" w:color="000000"/>
-              <w:right w:val="single" w:sz="4" w:space="0" w:color="000000"/>
-            </w:tcBorders>
-          </w:tcPr>
-          <w:p>
-            <w:pPr>
-              <w:rPr>
-                <w:rFonts w:ascii="MS Gothic" w:eastAsia="MS Gothic" w:hAnsi="MS Gothic"/>
-                <w:sz w:val="14"/>
-                <w:szCs w:val="14"/>
-              </w:rPr>
-            </w:pPr>
-            <w:r>
-              <w:rPr>
-                <w:rFonts w:ascii="Georgia" w:hAnsi="Georgia"/>
-                <w:sz w:val="16"/>
-                <w:szCs w:val="16"/>
               </w:rPr>
               <w:t>Photocopy of ID</w:t>
             </w:r>
@@ -4059,12 +4083,16 @@
             <w:pPr>
               <w:pStyle w:val="Default"/>
               <w:jc w:val="center"/>
+              <w:rPr>
+                <w:sz w:val="14"/>
+                <w:szCs w:val="14"/>
+              </w:rPr>
             </w:pPr>
             <w:r>
               <w:rPr>
                 <w:rFonts w:ascii="Georgia" w:hAnsi="Georgia"/>
-                <w:sz w:val="16"/>
-                <w:szCs w:val="16"/>
+                <w:sz w:val="14"/>
+                <w:szCs w:val="14"/>
               </w:rPr>
               <w:t>Certificate of Indigency</w:t>
             </w:r>
@@ -4143,13 +4171,17 @@
             <w:pPr>
               <w:spacing w:before="160" w:line="288" w:lineRule="auto"/>
               <w:jc w:val="center"/>
+              <w:rPr>
+                <w:sz w:val="14"/>
+                <w:szCs w:val="14"/>
+              </w:rPr>
             </w:pPr>
             <w:r>
               <w:rPr>
                 <w:rFonts w:ascii="Georgia" w:hAnsi="Georgia" w:cs="Arial Unicode MS"/>
                 <w:color w:val="000000"/>
-                <w:sz w:val="16"/>
-                <w:szCs w:val="16"/>
+                <w:sz w:val="14"/>
+                <w:szCs w:val="14"/>
                 <w14:textOutline w14:w="0" w14:cap="flat" w14:cmpd="sng" w14:algn="ctr">
                   <w14:noFill/>
                   <w14:prstDash w14:val="solid"/>
@@ -4233,13 +4265,17 @@
             <w:pPr>
               <w:spacing w:before="160" w:line="288" w:lineRule="auto"/>
               <w:jc w:val="center"/>
+              <w:rPr>
+                <w:sz w:val="14"/>
+                <w:szCs w:val="14"/>
+              </w:rPr>
             </w:pPr>
             <w:r>
               <w:rPr>
                 <w:rFonts w:ascii="Georgia" w:hAnsi="Georgia" w:cs="Arial Unicode MS"/>
                 <w:color w:val="000000"/>
-                <w:sz w:val="16"/>
-                <w:szCs w:val="16"/>
+                <w:sz w:val="14"/>
+                <w:szCs w:val="14"/>
                 <w14:textOutline w14:w="0" w14:cap="flat" w14:cmpd="sng" w14:algn="ctr">
                   <w14:noFill/>
                   <w14:prstDash w14:val="solid"/>
@@ -4339,13 +4375,17 @@
             <w:pPr>
               <w:spacing w:before="160" w:line="288" w:lineRule="auto"/>
               <w:jc w:val="center"/>
+              <w:rPr>
+                <w:sz w:val="14"/>
+                <w:szCs w:val="14"/>
+              </w:rPr>
             </w:pPr>
             <w:r>
               <w:rPr>
                 <w:rFonts w:ascii="Georgia" w:hAnsi="Georgia" w:cs="Arial Unicode MS"/>
                 <w:color w:val="000000"/>
-                <w:sz w:val="16"/>
-                <w:szCs w:val="16"/>
+                <w:sz w:val="14"/>
+                <w:szCs w:val="14"/>
                 <w14:textOutline w14:w="0" w14:cap="flat" w14:cmpd="sng" w14:algn="ctr">
                   <w14:noFill/>
                   <w14:prstDash w14:val="solid"/>
@@ -4526,12 +4566,16 @@
             <w:pPr>
               <w:pStyle w:val="Default"/>
               <w:jc w:val="center"/>
+              <w:rPr>
+                <w:sz w:val="14"/>
+                <w:szCs w:val="14"/>
+              </w:rPr>
             </w:pPr>
             <w:r>
               <w:rPr>
                 <w:rFonts w:ascii="Georgia" w:hAnsi="Georgia"/>
-                <w:sz w:val="16"/>
-                <w:szCs w:val="16"/>
+                <w:sz w:val="14"/>
+                <w:szCs w:val="14"/>
               </w:rPr>
               <w:t>Photocopy of ID</w:t>
             </w:r>
@@ -4610,13 +4654,17 @@
             <w:pPr>
               <w:spacing w:before="160" w:line="288" w:lineRule="auto"/>
               <w:jc w:val="center"/>
+              <w:rPr>
+                <w:sz w:val="14"/>
+                <w:szCs w:val="14"/>
+              </w:rPr>
             </w:pPr>
             <w:r>
               <w:rPr>
                 <w:rFonts w:ascii="Georgia" w:hAnsi="Georgia" w:cs="Arial Unicode MS"/>
                 <w:color w:val="000000"/>
-                <w:sz w:val="16"/>
-                <w:szCs w:val="16"/>
+                <w:sz w:val="14"/>
+                <w:szCs w:val="14"/>
                 <w14:textOutline w14:w="0" w14:cap="flat" w14:cmpd="sng" w14:algn="ctr">
                   <w14:noFill/>
                   <w14:prstDash w14:val="solid"/>
@@ -4700,13 +4748,17 @@
             <w:pPr>
               <w:spacing w:before="160" w:line="288" w:lineRule="auto"/>
               <w:jc w:val="center"/>
+              <w:rPr>
+                <w:sz w:val="14"/>
+                <w:szCs w:val="14"/>
+              </w:rPr>
             </w:pPr>
             <w:r>
               <w:rPr>
                 <w:rFonts w:ascii="Georgia" w:hAnsi="Georgia" w:cs="Arial Unicode MS"/>
                 <w:color w:val="000000"/>
-                <w:sz w:val="16"/>
-                <w:szCs w:val="16"/>
+                <w:sz w:val="14"/>
+                <w:szCs w:val="14"/>
                 <w14:textOutline w14:w="0" w14:cap="flat" w14:cmpd="sng" w14:algn="ctr">
                   <w14:noFill/>
                   <w14:prstDash w14:val="solid"/>
@@ -4853,7 +4905,7 @@
           <w:shd w:val="clear" w:color="auto" w:fill="CED7E7"/>
         </w:tblPrEx>
         <w:trPr>
-          <w:trHeight w:val="638"/>
+          <w:trHeight w:val="494"/>
         </w:trPr>
         <w:tc>
           <w:tcPr>
@@ -4908,23 +4960,18 @@
             <w:pPr>
               <w:pStyle w:val="Default"/>
               <w:jc w:val="center"/>
+              <w:rPr>
+                <w:sz w:val="14"/>
+                <w:szCs w:val="14"/>
+              </w:rPr>
             </w:pPr>
             <w:r>
               <w:rPr>
                 <w:rFonts w:ascii="Georgia" w:hAnsi="Georgia"/>
-                <w:sz w:val="16"/>
-                <w:szCs w:val="16"/>
-              </w:rPr>
-              <w:t xml:space="preserve">Certificate of No Available </w:t>
-            </w:r>
-            <w:r>
-              <w:rPr>
-                <w:rFonts w:ascii="Georgia" w:hAnsi="Georgia"/>
-                <w:sz w:val="16"/>
-                <w:szCs w:val="16"/>
-              </w:rPr>
-              <w:lastRenderedPageBreak/>
-              <w:t>Medicine as Prescribed</w:t>
+                <w:sz w:val="14"/>
+                <w:szCs w:val="14"/>
+              </w:rPr>
+              <w:t>Certificate of No Available Medicine as Prescribed</w:t>
             </w:r>
           </w:p>
         </w:tc>
@@ -4958,7 +5005,6 @@
                 <w:sz w:val="10"/>
                 <w:szCs w:val="10"/>
               </w:rPr>
-              <w:lastRenderedPageBreak/>
               <w:t>{</w:t>
             </w:r>
             <w:proofErr w:type="spellStart"/>
@@ -5253,7 +5299,21 @@
           <w:sz w:val="20"/>
           <w:szCs w:val="20"/>
         </w:rPr>
-        <w:t>} personally came to this Office to seek emergency assistance for {</w:t>
+        <w:t xml:space="preserve">} personally came to this Office to seek emergency </w:t>
+      </w:r>
+      <w:r>
+        <w:rPr>
+          <w:rFonts w:ascii="Georgia" w:hAnsi="Georgia"/>
+          <w:b/>
+          <w:bCs/>
+          <w:i/>
+          <w:iCs/>
+          <w:kern w:val="0"/>
+          <w:sz w:val="20"/>
+          <w:szCs w:val="20"/>
+        </w:rPr>
+        <w:lastRenderedPageBreak/>
+        <w:t>assistance for {</w:t>
       </w:r>
       <w:proofErr w:type="spellStart"/>
       <w:r>
@@ -5393,7 +5453,36 @@
           <w:szCs w:val="20"/>
         </w:rPr>
         <w:tab/>
-        <w:t>The beneficiary and family reside in {address}. The family belongs to the less fortunate members of the community, having {incomeSituation}. {caseSpecificFindings} The family is concerned about how to cope with the resulting expenses, as they have no other source of income sufficient to cover their needs. For this reason, the family sought assistance from the City Government to help ease their financial burden. In view of the foregoing, the beneficiary is recommended for financial assistance as indicated below.</w:t>
+        <w:t>The beneficiary and family reside in {address}. The family belongs to the less fortunate members of the community, having {incomeSituation}. {</w:t>
+      </w:r>
+      <w:proofErr w:type="spellStart"/>
+      <w:r>
+        <w:rPr>
+          <w:rFonts w:ascii="Georgia" w:hAnsi="Georgia"/>
+          <w:kern w:val="0"/>
+          <w:sz w:val="20"/>
+          <w:szCs w:val="20"/>
+        </w:rPr>
+        <w:t>caseSpecificFindings</w:t>
+      </w:r>
+      <w:proofErr w:type="spellEnd"/>
+      <w:r>
+        <w:rPr>
+          <w:rFonts w:ascii="Georgia" w:hAnsi="Georgia"/>
+          <w:kern w:val="0"/>
+          <w:sz w:val="20"/>
+          <w:szCs w:val="20"/>
+        </w:rPr>
+        <w:t>}. The</w:t>
+      </w:r>
+      <w:r>
+        <w:rPr>
+          <w:rFonts w:ascii="Georgia" w:hAnsi="Georgia"/>
+          <w:kern w:val="0"/>
+          <w:sz w:val="20"/>
+          <w:szCs w:val="20"/>
+        </w:rPr>
+        <w:t xml:space="preserve"> family is concerned about how to cope with the resulting expenses, as they have no other source of income sufficient to cover their needs. For this reason, the family sought assistance from the City Government to help ease their financial burden. In view of the foregoing, the beneficiary is recommended for financial assistance as indicated below.</w:t>
       </w:r>
     </w:p>
     <w:p>
@@ -5505,11 +5594,26 @@
         <w:widowControl w:val="0"/>
         <w:rPr>
           <w:rFonts w:ascii="Georgia" w:eastAsia="Georgia" w:hAnsi="Georgia" w:cs="Georgia"/>
+          <w:b/>
+          <w:bCs/>
+          <w:i/>
+          <w:iCs/>
           <w:kern w:val="0"/>
           <w:sz w:val="20"/>
           <w:szCs w:val="20"/>
         </w:rPr>
       </w:pPr>
+      <w:r>
+        <w:rPr>
+          <w:rFonts w:ascii="Georgia" w:hAnsi="Georgia"/>
+          <w:i/>
+          <w:iCs/>
+          <w:kern w:val="0"/>
+          <w:sz w:val="20"/>
+          <w:szCs w:val="20"/>
+        </w:rPr>
+        <w:t>Prepared and submitted by:</w:t>
+      </w:r>
     </w:p>
     <w:p>
       <w:pPr>
@@ -5519,8 +5623,6 @@
           <w:rFonts w:ascii="Georgia" w:eastAsia="Georgia" w:hAnsi="Georgia" w:cs="Georgia"/>
           <w:b/>
           <w:bCs/>
-          <w:i/>
-          <w:iCs/>
           <w:kern w:val="0"/>
           <w:sz w:val="20"/>
           <w:szCs w:val="20"/>
@@ -5528,14 +5630,1107 @@
       </w:pPr>
       <w:r>
         <w:rPr>
-          <w:rFonts w:ascii="Georgia" w:hAnsi="Georgia"/>
-          <w:i/>
-          <w:iCs/>
-          <w:kern w:val="0"/>
-          <w:sz w:val="20"/>
-          <w:szCs w:val="20"/>
-        </w:rPr>
-        <w:t>Prepared and submitted by:</w:t>
+          <w:rFonts w:ascii="Georgia" w:eastAsia="Georgia" w:hAnsi="Georgia" w:cs="Georgia"/>
+          <w:b/>
+          <w:bCs/>
+          <w:noProof/>
+          <w:kern w:val="0"/>
+          <w:sz w:val="20"/>
+          <w:szCs w:val="20"/>
+          <w14:textOutline w14:w="0" w14:cap="rnd" w14:cmpd="sng" w14:algn="ctr">
+            <w14:noFill/>
+            <w14:prstDash w14:val="solid"/>
+            <w14:bevel/>
+          </w14:textOutline>
+        </w:rPr>
+        <mc:AlternateContent>
+          <mc:Choice Requires="wps">
+            <w:drawing>
+              <wp:anchor distT="0" distB="0" distL="114300" distR="114300" simplePos="0" relativeHeight="251670528" behindDoc="0" locked="0" layoutInCell="1" allowOverlap="1" wp14:anchorId="56C1BEDE" wp14:editId="74F5AA50">
+                <wp:simplePos x="0" y="0"/>
+                <wp:positionH relativeFrom="margin">
+                  <wp:align>right</wp:align>
+                </wp:positionH>
+                <wp:positionV relativeFrom="paragraph">
+                  <wp:posOffset>145643</wp:posOffset>
+                </wp:positionV>
+                <wp:extent cx="2907102" cy="2581275"/>
+                <wp:effectExtent l="0" t="0" r="0" b="0"/>
+                <wp:wrapNone/>
+                <wp:docPr id="8203409" name="Text Box 4"/>
+                <wp:cNvGraphicFramePr/>
+                <a:graphic xmlns:a="http://schemas.openxmlformats.org/drawingml/2006/main">
+                  <a:graphicData uri="http://schemas.microsoft.com/office/word/2010/wordprocessingShape">
+                    <wps:wsp>
+                      <wps:cNvSpPr txBox="1"/>
+                      <wps:spPr>
+                        <a:xfrm>
+                          <a:off x="0" y="0"/>
+                          <a:ext cx="2907102" cy="2581275"/>
+                        </a:xfrm>
+                        <a:prstGeom prst="rect">
+                          <a:avLst/>
+                        </a:prstGeom>
+                        <a:noFill/>
+                        <a:ln w="12700" cap="flat">
+                          <a:noFill/>
+                          <a:miter lim="400000"/>
+                        </a:ln>
+                        <a:effectLst/>
+                        <a:sp3d/>
+                      </wps:spPr>
+                      <wps:style>
+                        <a:lnRef idx="0">
+                          <a:scrgbClr r="0" g="0" b="0"/>
+                        </a:lnRef>
+                        <a:fillRef idx="0">
+                          <a:scrgbClr r="0" g="0" b="0"/>
+                        </a:fillRef>
+                        <a:effectRef idx="0">
+                          <a:scrgbClr r="0" g="0" b="0"/>
+                        </a:effectRef>
+                        <a:fontRef idx="none"/>
+                      </wps:style>
+                      <wps:txbx>
+                        <w:txbxContent>
+                          <w:p>
+                            <w:pPr>
+                              <w:jc w:val="center"/>
+                            </w:pPr>
+                            <w:r>
+                              <w:t>{</w:t>
+                            </w:r>
+                            <w:proofErr w:type="spellStart"/>
+                            <w:r>
+                              <w:rPr>
+                                <w:b/>
+                                <w:bCs/>
+                              </w:rPr>
+                              <w:t>Certifification</w:t>
+                            </w:r>
+                            <w:proofErr w:type="spellEnd"/>
+                            <w:r>
+                              <w:t>}</w:t>
+                            </w:r>
+                          </w:p>
+                          <w:p/>
+                          <w:p>
+                            <w:pPr>
+                              <w:jc w:val="center"/>
+                              <w:rPr>
+                                <w:sz w:val="16"/>
+                                <w:szCs w:val="16"/>
+                              </w:rPr>
+                            </w:pPr>
+                            <w:r>
+                              <w:rPr>
+                                <w:sz w:val="16"/>
+                                <w:szCs w:val="16"/>
+                              </w:rPr>
+                              <w:t>{</w:t>
+                            </w:r>
+                            <w:r>
+                              <w:rPr>
+                                <w:sz w:val="16"/>
+                                <w:szCs w:val="16"/>
+                              </w:rPr>
+                              <w:t>This is to certify that the following medicine/s are not part of the regular procurement of the City Health Office:</w:t>
+                            </w:r>
+                            <w:r>
+                              <w:rPr>
+                                <w:sz w:val="16"/>
+                                <w:szCs w:val="16"/>
+                              </w:rPr>
+                              <w:t>}</w:t>
+                            </w:r>
+                          </w:p>
+                          <w:p>
+                            <w:pPr>
+                              <w:rPr>
+                                <w:sz w:val="16"/>
+                                <w:szCs w:val="16"/>
+                              </w:rPr>
+                            </w:pPr>
+                          </w:p>
+                          <w:p>
+                            <w:pPr>
+                              <w:rPr>
+                                <w:sz w:val="16"/>
+                                <w:szCs w:val="16"/>
+                              </w:rPr>
+                            </w:pPr>
+                            <w:r>
+                              <w:rPr>
+                                <w:sz w:val="16"/>
+                                <w:szCs w:val="16"/>
+                              </w:rPr>
+                              <w:t>{1. {</w:t>
+                            </w:r>
+                            <w:proofErr w:type="spellStart"/>
+                            <w:r>
+                              <w:rPr>
+                                <w:sz w:val="16"/>
+                                <w:szCs w:val="16"/>
+                              </w:rPr>
+                              <w:t>ifOneMedIsNotAvail</w:t>
+                            </w:r>
+                            <w:proofErr w:type="spellEnd"/>
+                            <w:r>
+                              <w:rPr>
+                                <w:sz w:val="16"/>
+                                <w:szCs w:val="16"/>
+                              </w:rPr>
+                              <w:t>}}</w:t>
+                            </w:r>
+                            <w:r>
+                              <w:rPr>
+                                <w:sz w:val="16"/>
+                                <w:szCs w:val="16"/>
+                              </w:rPr>
+                              <w:t xml:space="preserve">    :</w:t>
+                            </w:r>
+                            <w:r>
+                              <w:rPr>
+                                <w:sz w:val="16"/>
+                                <w:szCs w:val="16"/>
+                              </w:rPr>
+                              <w:t xml:space="preserve">    {</w:t>
+                            </w:r>
+                            <w:proofErr w:type="spellStart"/>
+                            <w:r>
+                              <w:rPr>
+                                <w:sz w:val="16"/>
+                                <w:szCs w:val="16"/>
+                              </w:rPr>
+                              <w:t>dateofMedicineUnavail</w:t>
+                            </w:r>
+                            <w:proofErr w:type="spellEnd"/>
+                            <w:r>
+                              <w:rPr>
+                                <w:sz w:val="16"/>
+                                <w:szCs w:val="16"/>
+                              </w:rPr>
+                              <w:t>}</w:t>
+                            </w:r>
+                          </w:p>
+                          <w:p>
+                            <w:pPr>
+                              <w:rPr>
+                                <w:sz w:val="16"/>
+                                <w:szCs w:val="16"/>
+                              </w:rPr>
+                            </w:pPr>
+                            <w:r>
+                              <w:rPr>
+                                <w:sz w:val="16"/>
+                                <w:szCs w:val="16"/>
+                              </w:rPr>
+                              <w:t>{2. {</w:t>
+                            </w:r>
+                            <w:proofErr w:type="spellStart"/>
+                            <w:r>
+                              <w:rPr>
+                                <w:sz w:val="16"/>
+                                <w:szCs w:val="16"/>
+                              </w:rPr>
+                              <w:t>ifTwoMedIsNotAvail</w:t>
+                            </w:r>
+                            <w:proofErr w:type="spellEnd"/>
+                            <w:r>
+                              <w:rPr>
+                                <w:sz w:val="16"/>
+                                <w:szCs w:val="16"/>
+                              </w:rPr>
+                              <w:t>}}</w:t>
+                            </w:r>
+                            <w:r>
+                              <w:rPr>
+                                <w:sz w:val="16"/>
+                                <w:szCs w:val="16"/>
+                              </w:rPr>
+                              <w:t xml:space="preserve">   :</w:t>
+                            </w:r>
+                            <w:r>
+                              <w:rPr>
+                                <w:sz w:val="16"/>
+                                <w:szCs w:val="16"/>
+                              </w:rPr>
+                              <w:t xml:space="preserve">    {</w:t>
+                            </w:r>
+                            <w:proofErr w:type="spellStart"/>
+                            <w:r>
+                              <w:rPr>
+                                <w:sz w:val="16"/>
+                                <w:szCs w:val="16"/>
+                              </w:rPr>
+                              <w:t>dateofMedicineUnavail</w:t>
+                            </w:r>
+                            <w:proofErr w:type="spellEnd"/>
+                            <w:r>
+                              <w:rPr>
+                                <w:sz w:val="16"/>
+                                <w:szCs w:val="16"/>
+                              </w:rPr>
+                              <w:t>}</w:t>
+                            </w:r>
+                          </w:p>
+                          <w:p>
+                            <w:pPr>
+                              <w:rPr>
+                                <w:sz w:val="16"/>
+                                <w:szCs w:val="16"/>
+                              </w:rPr>
+                            </w:pPr>
+                            <w:r>
+                              <w:rPr>
+                                <w:sz w:val="16"/>
+                                <w:szCs w:val="16"/>
+                              </w:rPr>
+                              <w:t>{3. {</w:t>
+                            </w:r>
+                            <w:proofErr w:type="spellStart"/>
+                            <w:r>
+                              <w:rPr>
+                                <w:sz w:val="16"/>
+                                <w:szCs w:val="16"/>
+                              </w:rPr>
+                              <w:t>ifThreeMedIsNotAvail</w:t>
+                            </w:r>
+                            <w:proofErr w:type="spellEnd"/>
+                            <w:r>
+                              <w:rPr>
+                                <w:sz w:val="16"/>
+                                <w:szCs w:val="16"/>
+                              </w:rPr>
+                              <w:t>}}</w:t>
+                            </w:r>
+                            <w:r>
+                              <w:rPr>
+                                <w:sz w:val="16"/>
+                                <w:szCs w:val="16"/>
+                              </w:rPr>
+                              <w:t xml:space="preserve"> :</w:t>
+                            </w:r>
+                            <w:r>
+                              <w:rPr>
+                                <w:sz w:val="16"/>
+                                <w:szCs w:val="16"/>
+                              </w:rPr>
+                              <w:t xml:space="preserve">  {</w:t>
+                            </w:r>
+                            <w:proofErr w:type="spellStart"/>
+                            <w:r>
+                              <w:rPr>
+                                <w:sz w:val="16"/>
+                                <w:szCs w:val="16"/>
+                              </w:rPr>
+                              <w:t>dateofMedicineUnavail</w:t>
+                            </w:r>
+                            <w:proofErr w:type="spellEnd"/>
+                            <w:r>
+                              <w:rPr>
+                                <w:sz w:val="16"/>
+                                <w:szCs w:val="16"/>
+                              </w:rPr>
+                              <w:t>}</w:t>
+                            </w:r>
+                          </w:p>
+                          <w:p>
+                            <w:pPr>
+                              <w:rPr>
+                                <w:sz w:val="16"/>
+                                <w:szCs w:val="16"/>
+                              </w:rPr>
+                            </w:pPr>
+                            <w:r>
+                              <w:rPr>
+                                <w:sz w:val="16"/>
+                                <w:szCs w:val="16"/>
+                              </w:rPr>
+                              <w:t>{4. {</w:t>
+                            </w:r>
+                            <w:proofErr w:type="spellStart"/>
+                            <w:r>
+                              <w:rPr>
+                                <w:sz w:val="16"/>
+                                <w:szCs w:val="16"/>
+                              </w:rPr>
+                              <w:t>ifFourMedIsNotAvail</w:t>
+                            </w:r>
+                            <w:proofErr w:type="spellEnd"/>
+                            <w:r>
+                              <w:rPr>
+                                <w:sz w:val="16"/>
+                                <w:szCs w:val="16"/>
+                              </w:rPr>
+                              <w:t>}}</w:t>
+                            </w:r>
+                            <w:r>
+                              <w:rPr>
+                                <w:sz w:val="16"/>
+                                <w:szCs w:val="16"/>
+                              </w:rPr>
+                              <w:t xml:space="preserve">   </w:t>
+                            </w:r>
+                            <w:r>
+                              <w:rPr>
+                                <w:sz w:val="16"/>
+                                <w:szCs w:val="16"/>
+                              </w:rPr>
+                              <w:t>:</w:t>
+                            </w:r>
+                            <w:r>
+                              <w:rPr>
+                                <w:sz w:val="16"/>
+                                <w:szCs w:val="16"/>
+                              </w:rPr>
+                              <w:t xml:space="preserve"> {</w:t>
+                            </w:r>
+                            <w:proofErr w:type="spellStart"/>
+                            <w:r>
+                              <w:rPr>
+                                <w:sz w:val="16"/>
+                                <w:szCs w:val="16"/>
+                              </w:rPr>
+                              <w:t>dateofMedicineUnavail</w:t>
+                            </w:r>
+                            <w:proofErr w:type="spellEnd"/>
+                            <w:r>
+                              <w:rPr>
+                                <w:sz w:val="16"/>
+                                <w:szCs w:val="16"/>
+                              </w:rPr>
+                              <w:t>}</w:t>
+                            </w:r>
+                          </w:p>
+                          <w:p>
+                            <w:pPr>
+                              <w:rPr>
+                                <w:sz w:val="16"/>
+                                <w:szCs w:val="16"/>
+                              </w:rPr>
+                            </w:pPr>
+                            <w:r>
+                              <w:rPr>
+                                <w:sz w:val="16"/>
+                                <w:szCs w:val="16"/>
+                              </w:rPr>
+                              <w:t>{5. {</w:t>
+                            </w:r>
+                            <w:proofErr w:type="spellStart"/>
+                            <w:r>
+                              <w:rPr>
+                                <w:sz w:val="16"/>
+                                <w:szCs w:val="16"/>
+                              </w:rPr>
+                              <w:t>ifFiveMedIsNotAvail</w:t>
+                            </w:r>
+                            <w:proofErr w:type="spellEnd"/>
+                            <w:r>
+                              <w:rPr>
+                                <w:sz w:val="16"/>
+                                <w:szCs w:val="16"/>
+                              </w:rPr>
+                              <w:t>}}</w:t>
+                            </w:r>
+                            <w:r>
+                              <w:rPr>
+                                <w:sz w:val="16"/>
+                                <w:szCs w:val="16"/>
+                              </w:rPr>
+                              <w:t xml:space="preserve">   </w:t>
+                            </w:r>
+                            <w:r>
+                              <w:rPr>
+                                <w:sz w:val="16"/>
+                                <w:szCs w:val="16"/>
+                              </w:rPr>
+                              <w:t>:</w:t>
+                            </w:r>
+                            <w:r>
+                              <w:rPr>
+                                <w:sz w:val="16"/>
+                                <w:szCs w:val="16"/>
+                              </w:rPr>
+                              <w:t>{</w:t>
+                            </w:r>
+                            <w:proofErr w:type="spellStart"/>
+                            <w:r>
+                              <w:rPr>
+                                <w:sz w:val="16"/>
+                                <w:szCs w:val="16"/>
+                              </w:rPr>
+                              <w:t>dateofMedicineUnavail</w:t>
+                            </w:r>
+                            <w:proofErr w:type="spellEnd"/>
+                            <w:r>
+                              <w:rPr>
+                                <w:sz w:val="16"/>
+                                <w:szCs w:val="16"/>
+                              </w:rPr>
+                              <w:t>}</w:t>
+                            </w:r>
+                          </w:p>
+                          <w:p>
+                            <w:pPr>
+                              <w:rPr>
+                                <w:sz w:val="16"/>
+                                <w:szCs w:val="16"/>
+                              </w:rPr>
+                            </w:pPr>
+                          </w:p>
+                          <w:p>
+                            <w:pPr>
+                              <w:rPr>
+                                <w:sz w:val="16"/>
+                                <w:szCs w:val="16"/>
+                              </w:rPr>
+                            </w:pPr>
+                            <w:r>
+                              <w:rPr>
+                                <w:sz w:val="16"/>
+                                <w:szCs w:val="16"/>
+                              </w:rPr>
+                              <w:t>{Given this {date}day of {month},{year}}</w:t>
+                            </w:r>
+                          </w:p>
+                          <w:p>
+                            <w:pPr>
+                              <w:rPr>
+                                <w:sz w:val="16"/>
+                                <w:szCs w:val="16"/>
+                              </w:rPr>
+                            </w:pPr>
+                          </w:p>
+                          <w:p>
+                            <w:pPr>
+                              <w:rPr>
+                                <w:sz w:val="16"/>
+                                <w:szCs w:val="16"/>
+                              </w:rPr>
+                            </w:pPr>
+                            <w:r>
+                              <w:rPr>
+                                <w:sz w:val="16"/>
+                                <w:szCs w:val="16"/>
+                              </w:rPr>
+                              <w:t>{Noted by:}</w:t>
+                            </w:r>
+                          </w:p>
+                          <w:p>
+                            <w:pPr>
+                              <w:rPr>
+                                <w:sz w:val="16"/>
+                                <w:szCs w:val="16"/>
+                              </w:rPr>
+                            </w:pPr>
+                          </w:p>
+                          <w:p>
+                            <w:pPr>
+                              <w:rPr>
+                                <w:sz w:val="16"/>
+                                <w:szCs w:val="16"/>
+                              </w:rPr>
+                            </w:pPr>
+                            <w:r>
+                              <w:rPr>
+                                <w:sz w:val="16"/>
+                                <w:szCs w:val="16"/>
+                              </w:rPr>
+                              <w:t>{</w:t>
+                            </w:r>
+                            <w:proofErr w:type="spellStart"/>
+                            <w:r>
+                              <w:rPr>
+                                <w:sz w:val="16"/>
+                                <w:szCs w:val="16"/>
+                              </w:rPr>
+                              <w:t>choDoctorName</w:t>
+                            </w:r>
+                            <w:proofErr w:type="spellEnd"/>
+                            <w:r>
+                              <w:rPr>
+                                <w:sz w:val="16"/>
+                                <w:szCs w:val="16"/>
+                              </w:rPr>
+                              <w:t>,{MD}}</w:t>
+                            </w:r>
+                          </w:p>
+                          <w:p>
+                            <w:pPr>
+                              <w:rPr>
+                                <w:sz w:val="16"/>
+                                <w:szCs w:val="16"/>
+                              </w:rPr>
+                            </w:pPr>
+                            <w:r>
+                              <w:rPr>
+                                <w:sz w:val="16"/>
+                                <w:szCs w:val="16"/>
+                              </w:rPr>
+                              <w:t>{position}</w:t>
+                            </w:r>
+                          </w:p>
+                          <w:p>
+                            <w:pPr>
+                              <w:rPr>
+                                <w:sz w:val="16"/>
+                                <w:szCs w:val="16"/>
+                              </w:rPr>
+                            </w:pPr>
+                          </w:p>
+                          <w:p>
+                            <w:pPr>
+                              <w:rPr>
+                                <w:sz w:val="16"/>
+                                <w:szCs w:val="16"/>
+                              </w:rPr>
+                            </w:pPr>
+                          </w:p>
+                          <w:p>
+                            <w:pPr>
+                              <w:rPr>
+                                <w:sz w:val="16"/>
+                                <w:szCs w:val="16"/>
+                              </w:rPr>
+                            </w:pPr>
+                          </w:p>
+                        </w:txbxContent>
+                      </wps:txbx>
+                      <wps:bodyPr rot="0" spcFirstLastPara="1" vertOverflow="overflow" horzOverflow="overflow" vert="horz" wrap="square" lIns="45719" tIns="45719" rIns="45719" bIns="45719" numCol="1" spcCol="38100" rtlCol="0" fromWordArt="0" anchor="t" anchorCtr="0" forceAA="0" compatLnSpc="1">
+                        <a:prstTxWarp prst="textNoShape">
+                          <a:avLst/>
+                        </a:prstTxWarp>
+                        <a:noAutofit/>
+                      </wps:bodyPr>
+                    </wps:wsp>
+                  </a:graphicData>
+                </a:graphic>
+                <wp14:sizeRelV relativeFrom="margin">
+                  <wp14:pctHeight>0</wp14:pctHeight>
+                </wp14:sizeRelV>
+              </wp:anchor>
+            </w:drawing>
+          </mc:Choice>
+          <mc:Fallback>
+            <w:pict>
+              <v:shapetype w14:anchorId="56C1BEDE" id="_x0000_t202" coordsize="21600,21600" o:spt="202" path="m,l,21600r21600,l21600,xe">
+                <v:stroke joinstyle="miter"/>
+                <v:path gradientshapeok="t" o:connecttype="rect"/>
+              </v:shapetype>
+              <v:shape id="Text Box 4" o:spid="_x0000_s1026" type="#_x0000_t202" style="position:absolute;left:0;text-align:left;margin-left:177.7pt;margin-top:11.45pt;width:228.9pt;height:203.25pt;z-index:251670528;visibility:visible;mso-wrap-style:square;mso-height-percent:0;mso-wrap-distance-left:9pt;mso-wrap-distance-top:0;mso-wrap-distance-right:9pt;mso-wrap-distance-bottom:0;mso-position-horizontal:right;mso-position-horizontal-relative:margin;mso-position-vertical:absolute;mso-position-vertical-relative:text;mso-height-percent:0;mso-height-relative:margin;v-text-anchor:top" o:gfxdata="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" filled="f" stroked="f" strokeweight="1pt">
+                <v:stroke miterlimit="4"/>
+                <v:textbox inset="1.27mm,1.27mm,1.27mm,1.27mm">
+                  <w:txbxContent>
+                    <w:p>
+                      <w:pPr>
+                        <w:jc w:val="center"/>
+                      </w:pPr>
+                      <w:r>
+                        <w:t>{</w:t>
+                      </w:r>
+                      <w:proofErr w:type="spellStart"/>
+                      <w:r>
+                        <w:rPr>
+                          <w:b/>
+                          <w:bCs/>
+                        </w:rPr>
+                        <w:t>Certifification</w:t>
+                      </w:r>
+                      <w:proofErr w:type="spellEnd"/>
+                      <w:r>
+                        <w:t>}</w:t>
+                      </w:r>
+                    </w:p>
+                    <w:p/>
+                    <w:p>
+                      <w:pPr>
+                        <w:jc w:val="center"/>
+                        <w:rPr>
+                          <w:sz w:val="16"/>
+                          <w:szCs w:val="16"/>
+                        </w:rPr>
+                      </w:pPr>
+                      <w:r>
+                        <w:rPr>
+                          <w:sz w:val="16"/>
+                          <w:szCs w:val="16"/>
+                        </w:rPr>
+                        <w:t>{</w:t>
+                      </w:r>
+                      <w:r>
+                        <w:rPr>
+                          <w:sz w:val="16"/>
+                          <w:szCs w:val="16"/>
+                        </w:rPr>
+                        <w:t>This is to certify that the following medicine/s are not part of the regular procurement of the City Health Office:</w:t>
+                      </w:r>
+                      <w:r>
+                        <w:rPr>
+                          <w:sz w:val="16"/>
+                          <w:szCs w:val="16"/>
+                        </w:rPr>
+                        <w:t>}</w:t>
+                      </w:r>
+                    </w:p>
+                    <w:p>
+                      <w:pPr>
+                        <w:rPr>
+                          <w:sz w:val="16"/>
+                          <w:szCs w:val="16"/>
+                        </w:rPr>
+                      </w:pPr>
+                    </w:p>
+                    <w:p>
+                      <w:pPr>
+                        <w:rPr>
+                          <w:sz w:val="16"/>
+                          <w:szCs w:val="16"/>
+                        </w:rPr>
+                      </w:pPr>
+                      <w:r>
+                        <w:rPr>
+                          <w:sz w:val="16"/>
+                          <w:szCs w:val="16"/>
+                        </w:rPr>
+                        <w:t>{1. {</w:t>
+                      </w:r>
+                      <w:proofErr w:type="spellStart"/>
+                      <w:r>
+                        <w:rPr>
+                          <w:sz w:val="16"/>
+                          <w:szCs w:val="16"/>
+                        </w:rPr>
+                        <w:t>ifOneMedIsNotAvail</w:t>
+                      </w:r>
+                      <w:proofErr w:type="spellEnd"/>
+                      <w:r>
+                        <w:rPr>
+                          <w:sz w:val="16"/>
+                          <w:szCs w:val="16"/>
+                        </w:rPr>
+                        <w:t>}}</w:t>
+                      </w:r>
+                      <w:r>
+                        <w:rPr>
+                          <w:sz w:val="16"/>
+                          <w:szCs w:val="16"/>
+                        </w:rPr>
+                        <w:t xml:space="preserve">    :</w:t>
+                      </w:r>
+                      <w:r>
+                        <w:rPr>
+                          <w:sz w:val="16"/>
+                          <w:szCs w:val="16"/>
+                        </w:rPr>
+                        <w:t xml:space="preserve">    {</w:t>
+                      </w:r>
+                      <w:proofErr w:type="spellStart"/>
+                      <w:r>
+                        <w:rPr>
+                          <w:sz w:val="16"/>
+                          <w:szCs w:val="16"/>
+                        </w:rPr>
+                        <w:t>dateofMedicineUnavail</w:t>
+                      </w:r>
+                      <w:proofErr w:type="spellEnd"/>
+                      <w:r>
+                        <w:rPr>
+                          <w:sz w:val="16"/>
+                          <w:szCs w:val="16"/>
+                        </w:rPr>
+                        <w:t>}</w:t>
+                      </w:r>
+                    </w:p>
+                    <w:p>
+                      <w:pPr>
+                        <w:rPr>
+                          <w:sz w:val="16"/>
+                          <w:szCs w:val="16"/>
+                        </w:rPr>
+                      </w:pPr>
+                      <w:r>
+                        <w:rPr>
+                          <w:sz w:val="16"/>
+                          <w:szCs w:val="16"/>
+                        </w:rPr>
+                        <w:t>{2. {</w:t>
+                      </w:r>
+                      <w:proofErr w:type="spellStart"/>
+                      <w:r>
+                        <w:rPr>
+                          <w:sz w:val="16"/>
+                          <w:szCs w:val="16"/>
+                        </w:rPr>
+                        <w:t>ifTwoMedIsNotAvail</w:t>
+                      </w:r>
+                      <w:proofErr w:type="spellEnd"/>
+                      <w:r>
+                        <w:rPr>
+                          <w:sz w:val="16"/>
+                          <w:szCs w:val="16"/>
+                        </w:rPr>
+                        <w:t>}}</w:t>
+                      </w:r>
+                      <w:r>
+                        <w:rPr>
+                          <w:sz w:val="16"/>
+                          <w:szCs w:val="16"/>
+                        </w:rPr>
+                        <w:t xml:space="preserve">   :</w:t>
+                      </w:r>
+                      <w:r>
+                        <w:rPr>
+                          <w:sz w:val="16"/>
+                          <w:szCs w:val="16"/>
+                        </w:rPr>
+                        <w:t xml:space="preserve">    {</w:t>
+                      </w:r>
+                      <w:proofErr w:type="spellStart"/>
+                      <w:r>
+                        <w:rPr>
+                          <w:sz w:val="16"/>
+                          <w:szCs w:val="16"/>
+                        </w:rPr>
+                        <w:t>dateofMedicineUnavail</w:t>
+                      </w:r>
+                      <w:proofErr w:type="spellEnd"/>
+                      <w:r>
+                        <w:rPr>
+                          <w:sz w:val="16"/>
+                          <w:szCs w:val="16"/>
+                        </w:rPr>
+                        <w:t>}</w:t>
+                      </w:r>
+                    </w:p>
+                    <w:p>
+                      <w:pPr>
+                        <w:rPr>
+                          <w:sz w:val="16"/>
+                          <w:szCs w:val="16"/>
+                        </w:rPr>
+                      </w:pPr>
+                      <w:r>
+                        <w:rPr>
+                          <w:sz w:val="16"/>
+                          <w:szCs w:val="16"/>
+                        </w:rPr>
+                        <w:t>{3. {</w:t>
+                      </w:r>
+                      <w:proofErr w:type="spellStart"/>
+                      <w:r>
+                        <w:rPr>
+                          <w:sz w:val="16"/>
+                          <w:szCs w:val="16"/>
+                        </w:rPr>
+                        <w:t>ifThreeMedIsNotAvail</w:t>
+                      </w:r>
+                      <w:proofErr w:type="spellEnd"/>
+                      <w:r>
+                        <w:rPr>
+                          <w:sz w:val="16"/>
+                          <w:szCs w:val="16"/>
+                        </w:rPr>
+                        <w:t>}}</w:t>
+                      </w:r>
+                      <w:r>
+                        <w:rPr>
+                          <w:sz w:val="16"/>
+                          <w:szCs w:val="16"/>
+                        </w:rPr>
+                        <w:t xml:space="preserve"> :</w:t>
+                      </w:r>
+                      <w:r>
+                        <w:rPr>
+                          <w:sz w:val="16"/>
+                          <w:szCs w:val="16"/>
+                        </w:rPr>
+                        <w:t xml:space="preserve">  {</w:t>
+                      </w:r>
+                      <w:proofErr w:type="spellStart"/>
+                      <w:r>
+                        <w:rPr>
+                          <w:sz w:val="16"/>
+                          <w:szCs w:val="16"/>
+                        </w:rPr>
+                        <w:t>dateofMedicineUnavail</w:t>
+                      </w:r>
+                      <w:proofErr w:type="spellEnd"/>
+                      <w:r>
+                        <w:rPr>
+                          <w:sz w:val="16"/>
+                          <w:szCs w:val="16"/>
+                        </w:rPr>
+                        <w:t>}</w:t>
+                      </w:r>
+                    </w:p>
+                    <w:p>
+                      <w:pPr>
+                        <w:rPr>
+                          <w:sz w:val="16"/>
+                          <w:szCs w:val="16"/>
+                        </w:rPr>
+                      </w:pPr>
+                      <w:r>
+                        <w:rPr>
+                          <w:sz w:val="16"/>
+                          <w:szCs w:val="16"/>
+                        </w:rPr>
+                        <w:t>{4. {</w:t>
+                      </w:r>
+                      <w:proofErr w:type="spellStart"/>
+                      <w:r>
+                        <w:rPr>
+                          <w:sz w:val="16"/>
+                          <w:szCs w:val="16"/>
+                        </w:rPr>
+                        <w:t>ifFourMedIsNotAvail</w:t>
+                      </w:r>
+                      <w:proofErr w:type="spellEnd"/>
+                      <w:r>
+                        <w:rPr>
+                          <w:sz w:val="16"/>
+                          <w:szCs w:val="16"/>
+                        </w:rPr>
+                        <w:t>}}</w:t>
+                      </w:r>
+                      <w:r>
+                        <w:rPr>
+                          <w:sz w:val="16"/>
+                          <w:szCs w:val="16"/>
+                        </w:rPr>
+                        <w:t xml:space="preserve">   </w:t>
+                      </w:r>
+                      <w:r>
+                        <w:rPr>
+                          <w:sz w:val="16"/>
+                          <w:szCs w:val="16"/>
+                        </w:rPr>
+                        <w:t>:</w:t>
+                      </w:r>
+                      <w:r>
+                        <w:rPr>
+                          <w:sz w:val="16"/>
+                          <w:szCs w:val="16"/>
+                        </w:rPr>
+                        <w:t xml:space="preserve"> {</w:t>
+                      </w:r>
+                      <w:proofErr w:type="spellStart"/>
+                      <w:r>
+                        <w:rPr>
+                          <w:sz w:val="16"/>
+                          <w:szCs w:val="16"/>
+                        </w:rPr>
+                        <w:t>dateofMedicineUnavail</w:t>
+                      </w:r>
+                      <w:proofErr w:type="spellEnd"/>
+                      <w:r>
+                        <w:rPr>
+                          <w:sz w:val="16"/>
+                          <w:szCs w:val="16"/>
+                        </w:rPr>
+                        <w:t>}</w:t>
+                      </w:r>
+                    </w:p>
+                    <w:p>
+                      <w:pPr>
+                        <w:rPr>
+                          <w:sz w:val="16"/>
+                          <w:szCs w:val="16"/>
+                        </w:rPr>
+                      </w:pPr>
+                      <w:r>
+                        <w:rPr>
+                          <w:sz w:val="16"/>
+                          <w:szCs w:val="16"/>
+                        </w:rPr>
+                        <w:t>{5. {</w:t>
+                      </w:r>
+                      <w:proofErr w:type="spellStart"/>
+                      <w:r>
+                        <w:rPr>
+                          <w:sz w:val="16"/>
+                          <w:szCs w:val="16"/>
+                        </w:rPr>
+                        <w:t>ifFiveMedIsNotAvail</w:t>
+                      </w:r>
+                      <w:proofErr w:type="spellEnd"/>
+                      <w:r>
+                        <w:rPr>
+                          <w:sz w:val="16"/>
+                          <w:szCs w:val="16"/>
+                        </w:rPr>
+                        <w:t>}}</w:t>
+                      </w:r>
+                      <w:r>
+                        <w:rPr>
+                          <w:sz w:val="16"/>
+                          <w:szCs w:val="16"/>
+                        </w:rPr>
+                        <w:t xml:space="preserve">   </w:t>
+                      </w:r>
+                      <w:r>
+                        <w:rPr>
+                          <w:sz w:val="16"/>
+                          <w:szCs w:val="16"/>
+                        </w:rPr>
+                        <w:t>:</w:t>
+                      </w:r>
+                      <w:r>
+                        <w:rPr>
+                          <w:sz w:val="16"/>
+                          <w:szCs w:val="16"/>
+                        </w:rPr>
+                        <w:t>{</w:t>
+                      </w:r>
+                      <w:proofErr w:type="spellStart"/>
+                      <w:r>
+                        <w:rPr>
+                          <w:sz w:val="16"/>
+                          <w:szCs w:val="16"/>
+                        </w:rPr>
+                        <w:t>dateofMedicineUnavail</w:t>
+                      </w:r>
+                      <w:proofErr w:type="spellEnd"/>
+                      <w:r>
+                        <w:rPr>
+                          <w:sz w:val="16"/>
+                          <w:szCs w:val="16"/>
+                        </w:rPr>
+                        <w:t>}</w:t>
+                      </w:r>
+                    </w:p>
+                    <w:p>
+                      <w:pPr>
+                        <w:rPr>
+                          <w:sz w:val="16"/>
+                          <w:szCs w:val="16"/>
+                        </w:rPr>
+                      </w:pPr>
+                    </w:p>
+                    <w:p>
+                      <w:pPr>
+                        <w:rPr>
+                          <w:sz w:val="16"/>
+                          <w:szCs w:val="16"/>
+                        </w:rPr>
+                      </w:pPr>
+                      <w:r>
+                        <w:rPr>
+                          <w:sz w:val="16"/>
+                          <w:szCs w:val="16"/>
+                        </w:rPr>
+                        <w:t>{Given this {date}day of {month},{year}}</w:t>
+                      </w:r>
+                    </w:p>
+                    <w:p>
+                      <w:pPr>
+                        <w:rPr>
+                          <w:sz w:val="16"/>
+                          <w:szCs w:val="16"/>
+                        </w:rPr>
+                      </w:pPr>
+                    </w:p>
+                    <w:p>
+                      <w:pPr>
+                        <w:rPr>
+                          <w:sz w:val="16"/>
+                          <w:szCs w:val="16"/>
+                        </w:rPr>
+                      </w:pPr>
+                      <w:r>
+                        <w:rPr>
+                          <w:sz w:val="16"/>
+                          <w:szCs w:val="16"/>
+                        </w:rPr>
+                        <w:t>{Noted by:}</w:t>
+                      </w:r>
+                    </w:p>
+                    <w:p>
+                      <w:pPr>
+                        <w:rPr>
+                          <w:sz w:val="16"/>
+                          <w:szCs w:val="16"/>
+                        </w:rPr>
+                      </w:pPr>
+                    </w:p>
+                    <w:p>
+                      <w:pPr>
+                        <w:rPr>
+                          <w:sz w:val="16"/>
+                          <w:szCs w:val="16"/>
+                        </w:rPr>
+                      </w:pPr>
+                      <w:r>
+                        <w:rPr>
+                          <w:sz w:val="16"/>
+                          <w:szCs w:val="16"/>
+                        </w:rPr>
+                        <w:t>{</w:t>
+                      </w:r>
+                      <w:proofErr w:type="spellStart"/>
+                      <w:r>
+                        <w:rPr>
+                          <w:sz w:val="16"/>
+                          <w:szCs w:val="16"/>
+                        </w:rPr>
+                        <w:t>choDoctorName</w:t>
+                      </w:r>
+                      <w:proofErr w:type="spellEnd"/>
+                      <w:r>
+                        <w:rPr>
+                          <w:sz w:val="16"/>
+                          <w:szCs w:val="16"/>
+                        </w:rPr>
+                        <w:t>,{MD}}</w:t>
+                      </w:r>
+                    </w:p>
+                    <w:p>
+                      <w:pPr>
+                        <w:rPr>
+                          <w:sz w:val="16"/>
+                          <w:szCs w:val="16"/>
+                        </w:rPr>
+                      </w:pPr>
+                      <w:r>
+                        <w:rPr>
+                          <w:sz w:val="16"/>
+                          <w:szCs w:val="16"/>
+                        </w:rPr>
+                        <w:t>{position}</w:t>
+                      </w:r>
+                    </w:p>
+                    <w:p>
+                      <w:pPr>
+                        <w:rPr>
+                          <w:sz w:val="16"/>
+                          <w:szCs w:val="16"/>
+                        </w:rPr>
+                      </w:pPr>
+                    </w:p>
+                    <w:p>
+                      <w:pPr>
+                        <w:rPr>
+                          <w:sz w:val="16"/>
+                          <w:szCs w:val="16"/>
+                        </w:rPr>
+                      </w:pPr>
+                    </w:p>
+                    <w:p>
+                      <w:pPr>
+                        <w:rPr>
+                          <w:sz w:val="16"/>
+                          <w:szCs w:val="16"/>
+                        </w:rPr>
+                      </w:pPr>
+                    </w:p>
+                  </w:txbxContent>
+                </v:textbox>
+                <w10:wrap anchorx="margin"/>
+              </v:shape>
+            </w:pict>
+          </mc:Fallback>
+        </mc:AlternateContent>
       </w:r>
     </w:p>
     <w:p>
@@ -5544,34 +6739,6 @@
         <w:widowControl w:val="0"/>
         <w:rPr>
           <w:rFonts w:ascii="Georgia" w:eastAsia="Georgia" w:hAnsi="Georgia" w:cs="Georgia"/>
-          <w:b/>
-          <w:bCs/>
-          <w:kern w:val="0"/>
-          <w:sz w:val="20"/>
-          <w:szCs w:val="20"/>
-        </w:rPr>
-      </w:pPr>
-    </w:p>
-    <w:p>
-      <w:pPr>
-        <w:pStyle w:val="Body"/>
-        <w:widowControl w:val="0"/>
-        <w:rPr>
-          <w:rFonts w:ascii="Georgia" w:eastAsia="Georgia" w:hAnsi="Georgia" w:cs="Georgia"/>
-          <w:kern w:val="0"/>
-          <w:sz w:val="20"/>
-          <w:szCs w:val="20"/>
-        </w:rPr>
-      </w:pPr>
-    </w:p>
-    <w:p>
-      <w:pPr>
-        <w:pStyle w:val="Body"/>
-        <w:widowControl w:val="0"/>
-        <w:rPr>
-          <w:rFonts w:ascii="Georgia" w:eastAsia="Georgia" w:hAnsi="Georgia" w:cs="Georgia"/>
-          <w:b/>
-          <w:bCs/>
           <w:kern w:val="0"/>
           <w:sz w:val="20"/>
           <w:szCs w:val="20"/>
@@ -5673,11 +6840,7 @@
           </mc:Choice>
           <mc:Fallback>
             <w:pict>
-              <v:shapetype w14:anchorId="0C5046F4" id="_x0000_t202" coordsize="21600,21600" o:spt="202" path="m,l,21600r21600,l21600,xe">
-                <v:stroke joinstyle="miter"/>
-                <v:path gradientshapeok="t" o:connecttype="rect"/>
-              </v:shapetype>
-              <v:shape id="Text Box 2" o:spid="_x0000_s1026" type="#_x0000_t202" style="position:absolute;margin-left:0;margin-top:.4pt;width:120.1pt;height:110.6pt;z-index:-251649024;visibility:visible;mso-wrap-style:square;mso-width-percent:0;mso-height-percent:200;mso-wrap-distance-left:9pt;mso-wrap-distance-top:3.6pt;mso-wrap-distance-right:9pt;mso-wrap-distance-bottom:3.6pt;mso-position-horizontal:left;mso-position-horizontal-relative:margin;mso-position-vertical:absolute;mso-position-vertical-relative:text;mso-width-percent:0;mso-height-percent:200;mso-width-relative:margin;mso-height-relative:margin;v-text-anchor:top" o:gfxdata="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" fillcolor="white [3212]" strokecolor="white [3212]">
+              <v:shape w14:anchorId="0C5046F4" id="Text Box 2" o:spid="_x0000_s1027" type="#_x0000_t202" style="position:absolute;margin-left:0;margin-top:.4pt;width:120.1pt;height:110.6pt;z-index:-251649024;visibility:visible;mso-wrap-style:square;mso-width-percent:0;mso-height-percent:200;mso-wrap-distance-left:9pt;mso-wrap-distance-top:3.6pt;mso-wrap-distance-right:9pt;mso-wrap-distance-bottom:3.6pt;mso-position-horizontal:left;mso-position-horizontal-relative:margin;mso-position-vertical:absolute;mso-position-vertical-relative:text;mso-width-percent:0;mso-height-percent:200;mso-width-relative:margin;mso-height-relative:margin;v-text-anchor:top" o:gfxdata="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" fillcolor="white [3212]" strokecolor="white [3212]">
                 <v:textbox style="mso-fit-shape-to-text:t">
                   <w:txbxContent>
                     <w:p>
@@ -5746,11 +6909,26 @@
         <w:widowControl w:val="0"/>
         <w:rPr>
           <w:rFonts w:ascii="Georgia" w:eastAsia="Georgia" w:hAnsi="Georgia" w:cs="Georgia"/>
+          <w:b/>
+          <w:bCs/>
+          <w:i/>
+          <w:iCs/>
           <w:kern w:val="0"/>
           <w:sz w:val="20"/>
           <w:szCs w:val="20"/>
         </w:rPr>
       </w:pPr>
+      <w:r>
+        <w:rPr>
+          <w:rFonts w:ascii="Georgia" w:hAnsi="Georgia"/>
+          <w:i/>
+          <w:iCs/>
+          <w:kern w:val="0"/>
+          <w:sz w:val="20"/>
+          <w:szCs w:val="20"/>
+        </w:rPr>
+        <w:t>Reviewed by:</w:t>
+      </w:r>
     </w:p>
     <w:p>
       <w:pPr>
@@ -5760,33 +6938,6 @@
           <w:rFonts w:ascii="Georgia" w:eastAsia="Georgia" w:hAnsi="Georgia" w:cs="Georgia"/>
           <w:b/>
           <w:bCs/>
-          <w:i/>
-          <w:iCs/>
-          <w:kern w:val="0"/>
-          <w:sz w:val="20"/>
-          <w:szCs w:val="20"/>
-        </w:rPr>
-      </w:pPr>
-      <w:r>
-        <w:rPr>
-          <w:rFonts w:ascii="Georgia" w:hAnsi="Georgia"/>
-          <w:i/>
-          <w:iCs/>
-          <w:kern w:val="0"/>
-          <w:sz w:val="20"/>
-          <w:szCs w:val="20"/>
-        </w:rPr>
-        <w:t>Reviewed by:</w:t>
-      </w:r>
-    </w:p>
-    <w:p>
-      <w:pPr>
-        <w:pStyle w:val="Body"/>
-        <w:widowControl w:val="0"/>
-        <w:rPr>
-          <w:rFonts w:ascii="Georgia" w:eastAsia="Georgia" w:hAnsi="Georgia" w:cs="Georgia"/>
-          <w:b/>
-          <w:bCs/>
           <w:kern w:val="0"/>
           <w:sz w:val="20"/>
           <w:szCs w:val="20"/>
@@ -5801,11 +6952,7 @@
           <w:szCs w:val="18"/>
         </w:rPr>
         <w:pict w14:anchorId="0F9DA61A">
-          <v:shapetype id="_x0000_t202" coordsize="21600,21600" o:spt="202" path="m,l,21600r21600,l21600,xe">
-            <v:stroke joinstyle="miter"/>
-            <v:path gradientshapeok="t" o:connecttype="rect"/>
-          </v:shapetype>
-          <v:shape id="_x0000_s1027" type="#_x0000_t202" style="position:absolute;left:0;text-align:left;margin-left:20.4pt;margin-top:6.2pt;width:120.1pt;height:110.6pt;z-index:-251655168;visibility:visible;mso-wrap-style:square;mso-width-percent:0;mso-height-percent:200;mso-wrap-distance-left:9pt;mso-wrap-distance-top:3.6pt;mso-wrap-distance-right:9pt;mso-wrap-distance-bottom:3.6pt;mso-position-horizontal:absolute;mso-position-horizontal-relative:text;mso-position-vertical:absolute;mso-position-vertical-relative:text;mso-width-percent:0;mso-height-percent:200;mso-width-relative:margin;mso-height-relative:margin;v-text-anchor:top" o:gfxdata="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" fillcolor="white [3212]" strokecolor="white [3212]">
+          <v:shape id="_x0000_s1027" type="#_x0000_t202" style="position:absolute;left:0;text-align:left;margin-left:20.4pt;margin-top:6.2pt;width:120.1pt;height:49.35pt;z-index:-251655168;visibility:visible;mso-height-percent:200;mso-wrap-distance-top:3.6pt;mso-wrap-distance-bottom:3.6pt;mso-height-percent:200;mso-width-relative:margin;mso-height-relative:margin" o:gfxdata="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" fillcolor="white [3212]" strokecolor="white [3212]">
             <v:textbox style="mso-fit-shape-to-text:t">
               <w:txbxContent>
                 <w:p>
@@ -5839,18 +6986,6 @@
           <w:szCs w:val="20"/>
         </w:rPr>
       </w:pPr>
-    </w:p>
-    <w:p>
-      <w:pPr>
-        <w:pStyle w:val="Body"/>
-        <w:widowControl w:val="0"/>
-        <w:rPr>
-          <w:rFonts w:ascii="Georgia" w:eastAsia="Georgia" w:hAnsi="Georgia" w:cs="Georgia"/>
-          <w:kern w:val="0"/>
-          <w:sz w:val="20"/>
-          <w:szCs w:val="20"/>
-        </w:rPr>
-      </w:pPr>
       <w:r>
         <w:rPr>
           <w:rFonts w:ascii="Georgia" w:hAnsi="Georgia"/>
@@ -5944,22 +7079,214 @@
       </w:pPr>
       <w:r>
         <w:rPr>
+          <w:rFonts w:ascii="Georgia" w:hAnsi="Georgia"/>
+          <w:i/>
+          <w:iCs/>
+          <w:kern w:val="0"/>
+          <w:sz w:val="20"/>
+          <w:szCs w:val="20"/>
+        </w:rPr>
+        <w:t>Recommending Approval:</w:t>
+      </w:r>
+    </w:p>
+    <w:p>
+      <w:pPr>
+        <w:pStyle w:val="Body"/>
+        <w:widowControl w:val="0"/>
+        <w:rPr>
+          <w:rFonts w:ascii="Georgia" w:eastAsia="Georgia" w:hAnsi="Georgia" w:cs="Georgia"/>
+          <w:b/>
+          <w:bCs/>
+          <w:kern w:val="0"/>
+          <w:sz w:val="20"/>
+          <w:szCs w:val="20"/>
+        </w:rPr>
+      </w:pPr>
+      <w:r>
+        <w:rPr>
+          <w:rFonts w:ascii="Arial" w:hAnsi="Arial" w:cs="Arial"/>
+          <w:b/>
+          <w:noProof/>
+          <w:sz w:val="18"/>
+          <w:szCs w:val="18"/>
+        </w:rPr>
+        <w:pict w14:anchorId="2C97A252">
+          <v:shape id="_x0000_s1028" type="#_x0000_t202" style="position:absolute;left:0;text-align:left;margin-left:21pt;margin-top:3.55pt;width:156.1pt;height:49.35pt;z-index:-251653120;visibility:visible;mso-height-percent:200;mso-wrap-distance-top:3.6pt;mso-wrap-distance-bottom:3.6pt;mso-position-horizontal-relative:margin;mso-height-percent:200;mso-width-relative:margin;mso-height-relative:margin" o:gfxdata="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" fillcolor="white [3212]" strokecolor="white [3212]">
+            <v:textbox style="mso-next-textbox:#_x0000_s1028;mso-fit-shape-to-text:t">
+              <w:txbxContent>
+                <w:p>
+                  <w:r>
+                    <w:t>{</w:t>
+                  </w:r>
+                  <w:proofErr w:type="spellStart"/>
+                  <w:r>
+                    <w:t>recommendingBySignature</w:t>
+                  </w:r>
+                  <w:proofErr w:type="spellEnd"/>
+                  <w:r>
+                    <w:t>}</w:t>
+                  </w:r>
+                </w:p>
+                <w:p/>
+              </w:txbxContent>
+            </v:textbox>
+            <w10:wrap anchorx="margin"/>
+          </v:shape>
+        </w:pict>
+      </w:r>
+    </w:p>
+    <w:p>
+      <w:pPr>
+        <w:pStyle w:val="Body"/>
+        <w:widowControl w:val="0"/>
+        <w:rPr>
+          <w:rFonts w:ascii="Georgia" w:eastAsia="Georgia" w:hAnsi="Georgia" w:cs="Georgia"/>
+          <w:kern w:val="0"/>
+          <w:sz w:val="20"/>
+          <w:szCs w:val="20"/>
+        </w:rPr>
+      </w:pPr>
+    </w:p>
+    <w:p>
+      <w:pPr>
+        <w:pStyle w:val="Body"/>
+        <w:widowControl w:val="0"/>
+        <w:rPr>
+          <w:rFonts w:ascii="Georgia" w:eastAsia="Georgia" w:hAnsi="Georgia" w:cs="Georgia"/>
+          <w:kern w:val="0"/>
+          <w:sz w:val="20"/>
+          <w:szCs w:val="20"/>
+        </w:rPr>
+      </w:pPr>
+      <w:r>
+        <w:rPr>
+          <w:rFonts w:ascii="Georgia" w:hAnsi="Georgia"/>
+          <w:b/>
+          <w:bCs/>
+          <w:kern w:val="0"/>
+          <w:sz w:val="20"/>
+          <w:szCs w:val="20"/>
+        </w:rPr>
+        <w:t>{</w:t>
+      </w:r>
+      <w:proofErr w:type="spellStart"/>
+      <w:r>
+        <w:rPr>
+          <w:rFonts w:ascii="Georgia" w:hAnsi="Georgia"/>
+          <w:b/>
+          <w:bCs/>
+          <w:kern w:val="0"/>
+          <w:sz w:val="20"/>
+          <w:szCs w:val="20"/>
+        </w:rPr>
+        <w:t>cityCSWDO</w:t>
+      </w:r>
+      <w:proofErr w:type="spellEnd"/>
+      <w:r>
+        <w:rPr>
+          <w:rFonts w:ascii="Georgia" w:hAnsi="Georgia"/>
+          <w:b/>
+          <w:bCs/>
+          <w:kern w:val="0"/>
+          <w:sz w:val="20"/>
+          <w:szCs w:val="20"/>
+        </w:rPr>
+        <w:t>}</w:t>
+      </w:r>
+    </w:p>
+    <w:p>
+      <w:pPr>
+        <w:pStyle w:val="Body"/>
+        <w:widowControl w:val="0"/>
+        <w:rPr>
+          <w:rFonts w:ascii="Georgia" w:eastAsia="Georgia" w:hAnsi="Georgia" w:cs="Georgia"/>
+          <w:i/>
+          <w:iCs/>
+          <w:kern w:val="0"/>
+          <w:sz w:val="20"/>
+          <w:szCs w:val="20"/>
+        </w:rPr>
+      </w:pPr>
+      <w:r>
+        <w:rPr>
+          <w:rFonts w:ascii="Georgia" w:hAnsi="Georgia"/>
+          <w:i/>
+          <w:iCs/>
+          <w:kern w:val="0"/>
+          <w:sz w:val="20"/>
+          <w:szCs w:val="20"/>
+        </w:rPr>
+        <w:t>City Social Welfare and Development Officer</w:t>
+      </w:r>
+    </w:p>
+    <w:p>
+      <w:pPr>
+        <w:pStyle w:val="Body"/>
+        <w:widowControl w:val="0"/>
+        <w:rPr>
+          <w:rFonts w:ascii="Georgia" w:eastAsia="Georgia" w:hAnsi="Georgia" w:cs="Georgia"/>
+          <w:kern w:val="0"/>
+          <w:sz w:val="20"/>
+          <w:szCs w:val="20"/>
+        </w:rPr>
+      </w:pPr>
+    </w:p>
+    <w:p>
+      <w:pPr>
+        <w:pStyle w:val="Body"/>
+        <w:widowControl w:val="0"/>
+        <w:rPr>
+          <w:rFonts w:ascii="Georgia" w:eastAsia="Georgia" w:hAnsi="Georgia" w:cs="Georgia"/>
+          <w:b/>
+          <w:bCs/>
+          <w:kern w:val="0"/>
+          <w:sz w:val="20"/>
+          <w:szCs w:val="20"/>
+        </w:rPr>
+      </w:pPr>
+      <w:r>
+        <w:rPr>
+          <w:rFonts w:ascii="Georgia" w:hAnsi="Georgia"/>
+          <w:b/>
+          <w:bCs/>
+          <w:kern w:val="0"/>
+          <w:sz w:val="20"/>
+          <w:szCs w:val="20"/>
+        </w:rPr>
+        <w:t>APPROVED:</w:t>
+      </w:r>
+    </w:p>
+    <w:p>
+      <w:pPr>
+        <w:pStyle w:val="Body"/>
+        <w:widowControl w:val="0"/>
+        <w:rPr>
+          <w:rFonts w:ascii="Georgia" w:eastAsia="Georgia" w:hAnsi="Georgia" w:cs="Georgia"/>
+          <w:b/>
+          <w:bCs/>
+          <w:kern w:val="0"/>
+          <w:sz w:val="20"/>
+          <w:szCs w:val="20"/>
+        </w:rPr>
+      </w:pPr>
+      <w:r>
+        <w:rPr>
           <w:rFonts w:ascii="Arial" w:hAnsi="Arial" w:cs="Arial"/>
           <w:noProof/>
         </w:rPr>
         <mc:AlternateContent>
           <mc:Choice Requires="wps">
             <w:drawing>
-              <wp:anchor distT="45720" distB="45720" distL="114300" distR="114300" simplePos="0" relativeHeight="251669504" behindDoc="1" locked="0" layoutInCell="1" allowOverlap="1" wp14:anchorId="26597E27" wp14:editId="7C6EA0D0">
+              <wp:anchor distT="45720" distB="45720" distL="114300" distR="114300" simplePos="0" relativeHeight="251669504" behindDoc="1" locked="0" layoutInCell="1" allowOverlap="1" wp14:anchorId="26597E27" wp14:editId="5150F2CD">
                 <wp:simplePos x="0" y="0"/>
-                <wp:positionH relativeFrom="column">
-                  <wp:posOffset>3686092</wp:posOffset>
+                <wp:positionH relativeFrom="margin">
+                  <wp:align>right</wp:align>
                 </wp:positionH>
                 <wp:positionV relativeFrom="paragraph">
-                  <wp:posOffset>3810</wp:posOffset>
+                  <wp:posOffset>13970</wp:posOffset>
                 </wp:positionV>
-                <wp:extent cx="2345473" cy="2004646"/>
-                <wp:effectExtent l="0" t="0" r="17145" b="15240"/>
+                <wp:extent cx="2345055" cy="1811020"/>
+                <wp:effectExtent l="0" t="0" r="17145" b="17780"/>
                 <wp:wrapNone/>
                 <wp:docPr id="908471928" name="Text Box 2"/>
                 <wp:cNvGraphicFramePr>
@@ -5974,7 +7301,7 @@
                       <wps:spPr bwMode="auto">
                         <a:xfrm>
                           <a:off x="0" y="0"/>
-                          <a:ext cx="2345473" cy="2004646"/>
+                          <a:ext cx="2345055" cy="1811020"/>
                         </a:xfrm>
                         <a:prstGeom prst="rect">
                           <a:avLst/>
@@ -6143,7 +7470,7 @@
           </mc:Choice>
           <mc:Fallback>
             <w:pict>
-              <v:shape w14:anchorId="26597E27" id="_x0000_s1027" type="#_x0000_t202" style="position:absolute;left:0;text-align:left;margin-left:290.25pt;margin-top:.3pt;width:184.7pt;height:157.85pt;z-index:-251646976;visibility:visible;mso-wrap-style:square;mso-width-percent:0;mso-height-percent:0;mso-wrap-distance-left:9pt;mso-wrap-distance-top:3.6pt;mso-wrap-distance-right:9pt;mso-wrap-distance-bottom:3.6pt;mso-position-horizontal:absolute;mso-position-horizontal-relative:text;mso-position-vertical:absolute;mso-position-vertical-relative:text;mso-width-percent:0;mso-height-percent:0;mso-width-relative:margin;mso-height-relative:margin;v-text-anchor:top" o:gfxdata="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" strokecolor="white [3212]">
+              <v:shape w14:anchorId="26597E27" id="_x0000_s1028" type="#_x0000_t202" style="position:absolute;left:0;text-align:left;margin-left:133.45pt;margin-top:1.1pt;width:184.65pt;height:142.6pt;z-index:-251646976;visibility:visible;mso-wrap-style:square;mso-width-percent:0;mso-height-percent:0;mso-wrap-distance-left:9pt;mso-wrap-distance-top:3.6pt;mso-wrap-distance-right:9pt;mso-wrap-distance-bottom:3.6pt;mso-position-horizontal:right;mso-position-horizontal-relative:margin;mso-position-vertical:absolute;mso-position-vertical-relative:text;mso-width-percent:0;mso-height-percent:0;mso-width-relative:margin;mso-height-relative:margin;v-text-anchor:top" o:gfxdata="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" strokecolor="white [3212]">
                 <v:textbox>
                   <w:txbxContent>
                     <w:p>
@@ -6279,6 +7606,7 @@
                     <w:p/>
                   </w:txbxContent>
                 </v:textbox>
+                <w10:wrap anchorx="margin"/>
               </v:shape>
             </w:pict>
           </mc:Fallback>
@@ -6286,216 +7614,12 @@
       </w:r>
       <w:r>
         <w:rPr>
-          <w:rFonts w:ascii="Georgia" w:hAnsi="Georgia"/>
-          <w:i/>
-          <w:iCs/>
-          <w:kern w:val="0"/>
-          <w:sz w:val="20"/>
-          <w:szCs w:val="20"/>
-        </w:rPr>
-        <w:t>Recommending Approval:</w:t>
-      </w:r>
-    </w:p>
-    <w:p>
-      <w:pPr>
-        <w:pStyle w:val="Body"/>
-        <w:widowControl w:val="0"/>
-        <w:rPr>
-          <w:rFonts w:ascii="Georgia" w:eastAsia="Georgia" w:hAnsi="Georgia" w:cs="Georgia"/>
-          <w:b/>
-          <w:bCs/>
-          <w:kern w:val="0"/>
-          <w:sz w:val="20"/>
-          <w:szCs w:val="20"/>
-        </w:rPr>
-      </w:pPr>
-      <w:r>
-        <w:rPr>
           <w:rFonts w:ascii="Arial" w:hAnsi="Arial" w:cs="Arial"/>
           <w:b/>
           <w:noProof/>
-          <w:sz w:val="18"/>
-          <w:szCs w:val="18"/>
-        </w:rPr>
-        <w:pict w14:anchorId="2C97A252">
-          <v:shape id="_x0000_s1028" type="#_x0000_t202" style="position:absolute;left:0;text-align:left;margin-left:21pt;margin-top:3.55pt;width:156.1pt;height:110.6pt;z-index:-251653120;visibility:visible;mso-wrap-style:square;mso-width-percent:0;mso-height-percent:200;mso-wrap-distance-left:9pt;mso-wrap-distance-top:3.6pt;mso-wrap-distance-right:9pt;mso-wrap-distance-bottom:3.6pt;mso-position-horizontal:absolute;mso-position-horizontal-relative:margin;mso-position-vertical:absolute;mso-position-vertical-relative:text;mso-width-percent:0;mso-height-percent:200;mso-width-relative:margin;mso-height-relative:margin;v-text-anchor:top" o:gfxdata="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" fillcolor="white [3212]" strokecolor="white [3212]">
-            <v:textbox style="mso-next-textbox:#_x0000_s1028;mso-fit-shape-to-text:t">
-              <w:txbxContent>
-                <w:p>
-                  <w:r>
-                    <w:t>{</w:t>
-                  </w:r>
-                  <w:proofErr w:type="spellStart"/>
-                  <w:r>
-                    <w:t>recommendingBySignature</w:t>
-                  </w:r>
-                  <w:proofErr w:type="spellEnd"/>
-                  <w:r>
-                    <w:t>}</w:t>
-                  </w:r>
-                </w:p>
-                <w:p/>
-              </w:txbxContent>
-            </v:textbox>
-            <w10:wrap anchorx="margin"/>
-          </v:shape>
-        </w:pict>
-      </w:r>
-    </w:p>
-    <w:p>
-      <w:pPr>
-        <w:pStyle w:val="Body"/>
-        <w:widowControl w:val="0"/>
-        <w:rPr>
-          <w:rFonts w:ascii="Georgia" w:eastAsia="Georgia" w:hAnsi="Georgia" w:cs="Georgia"/>
-          <w:kern w:val="0"/>
-          <w:sz w:val="20"/>
-          <w:szCs w:val="20"/>
-        </w:rPr>
-      </w:pPr>
-    </w:p>
-    <w:p>
-      <w:pPr>
-        <w:pStyle w:val="Body"/>
-        <w:widowControl w:val="0"/>
-        <w:rPr>
-          <w:rFonts w:ascii="Georgia" w:eastAsia="Georgia" w:hAnsi="Georgia" w:cs="Georgia"/>
-          <w:kern w:val="0"/>
-          <w:sz w:val="20"/>
-          <w:szCs w:val="20"/>
-        </w:rPr>
-      </w:pPr>
-      <w:r>
-        <w:rPr>
-          <w:rFonts w:ascii="Georgia" w:hAnsi="Georgia"/>
-          <w:b/>
-          <w:bCs/>
-          <w:kern w:val="0"/>
-          <w:sz w:val="20"/>
-          <w:szCs w:val="20"/>
-        </w:rPr>
-        <w:t>{</w:t>
-      </w:r>
-      <w:proofErr w:type="spellStart"/>
-      <w:r>
-        <w:rPr>
-          <w:rFonts w:ascii="Georgia" w:hAnsi="Georgia"/>
-          <w:b/>
-          <w:bCs/>
-          <w:kern w:val="0"/>
-          <w:sz w:val="20"/>
-          <w:szCs w:val="20"/>
-        </w:rPr>
-        <w:t>cityCSWDO</w:t>
-      </w:r>
-      <w:proofErr w:type="spellEnd"/>
-      <w:r>
-        <w:rPr>
-          <w:rFonts w:ascii="Georgia" w:hAnsi="Georgia"/>
-          <w:b/>
-          <w:bCs/>
-          <w:kern w:val="0"/>
-          <w:sz w:val="20"/>
-          <w:szCs w:val="20"/>
-        </w:rPr>
-        <w:t>}</w:t>
-      </w:r>
-    </w:p>
-    <w:p>
-      <w:pPr>
-        <w:pStyle w:val="Body"/>
-        <w:widowControl w:val="0"/>
-        <w:rPr>
-          <w:rFonts w:ascii="Georgia" w:eastAsia="Georgia" w:hAnsi="Georgia" w:cs="Georgia"/>
-          <w:i/>
-          <w:iCs/>
-          <w:kern w:val="0"/>
-          <w:sz w:val="20"/>
-          <w:szCs w:val="20"/>
-        </w:rPr>
-      </w:pPr>
-      <w:r>
-        <w:rPr>
-          <w:rFonts w:ascii="Georgia" w:hAnsi="Georgia"/>
-          <w:i/>
-          <w:iCs/>
-          <w:kern w:val="0"/>
-          <w:sz w:val="20"/>
-          <w:szCs w:val="20"/>
-        </w:rPr>
-        <w:t>City Social Welfare and Development Officer</w:t>
-      </w:r>
-    </w:p>
-    <w:p>
-      <w:pPr>
-        <w:pStyle w:val="Body"/>
-        <w:widowControl w:val="0"/>
-        <w:rPr>
-          <w:rFonts w:ascii="Georgia" w:eastAsia="Georgia" w:hAnsi="Georgia" w:cs="Georgia"/>
-          <w:kern w:val="0"/>
-          <w:sz w:val="20"/>
-          <w:szCs w:val="20"/>
-        </w:rPr>
-      </w:pPr>
-    </w:p>
-    <w:p>
-      <w:pPr>
-        <w:pStyle w:val="Body"/>
-        <w:widowControl w:val="0"/>
-        <w:rPr>
-          <w:rFonts w:ascii="Georgia" w:eastAsia="Georgia" w:hAnsi="Georgia" w:cs="Georgia"/>
-          <w:kern w:val="0"/>
-          <w:sz w:val="20"/>
-          <w:szCs w:val="20"/>
-        </w:rPr>
-      </w:pPr>
-    </w:p>
-    <w:p>
-      <w:pPr>
-        <w:pStyle w:val="Body"/>
-        <w:widowControl w:val="0"/>
-        <w:rPr>
-          <w:rFonts w:ascii="Georgia" w:eastAsia="Georgia" w:hAnsi="Georgia" w:cs="Georgia"/>
-          <w:b/>
-          <w:bCs/>
-          <w:kern w:val="0"/>
-          <w:sz w:val="20"/>
-          <w:szCs w:val="20"/>
-        </w:rPr>
-      </w:pPr>
-      <w:r>
-        <w:rPr>
-          <w:rFonts w:ascii="Georgia" w:hAnsi="Georgia"/>
-          <w:b/>
-          <w:bCs/>
-          <w:kern w:val="0"/>
-          <w:sz w:val="20"/>
-          <w:szCs w:val="20"/>
-        </w:rPr>
-        <w:t>APPROVED:</w:t>
-      </w:r>
-    </w:p>
-    <w:p>
-      <w:pPr>
-        <w:pStyle w:val="Body"/>
-        <w:widowControl w:val="0"/>
-        <w:rPr>
-          <w:rFonts w:ascii="Georgia" w:eastAsia="Georgia" w:hAnsi="Georgia" w:cs="Georgia"/>
-          <w:b/>
-          <w:bCs/>
-          <w:kern w:val="0"/>
-          <w:sz w:val="20"/>
-          <w:szCs w:val="20"/>
-        </w:rPr>
-      </w:pPr>
-      <w:r>
-        <w:rPr>
-          <w:rFonts w:ascii="Arial" w:hAnsi="Arial" w:cs="Arial"/>
-          <w:b/>
-          <w:noProof/>
         </w:rPr>
         <w:pict w14:anchorId="5A6F8C01">
-          <v:shape id="_x0000_s1029" type="#_x0000_t202" style="position:absolute;left:0;text-align:left;margin-left:20.4pt;margin-top:5.65pt;width:146.85pt;height:110.6pt;z-index:-251651072;visibility:visible;mso-wrap-style:square;mso-width-percent:0;mso-height-percent:200;mso-wrap-distance-left:9pt;mso-wrap-distance-top:3.6pt;mso-wrap-distance-right:9pt;mso-wrap-distance-bottom:3.6pt;mso-position-horizontal:absolute;mso-position-horizontal-relative:text;mso-position-vertical:absolute;mso-position-vertical-relative:text;mso-width-percent:0;mso-height-percent:200;mso-width-relative:margin;mso-height-relative:margin;v-text-anchor:top" o:gfxdata="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" fillcolor="white [3212]" strokecolor="white [3212]">
+          <v:shape id="_x0000_s1029" type="#_x0000_t202" style="position:absolute;left:0;text-align:left;margin-left:20.4pt;margin-top:5.65pt;width:146.85pt;height:35.55pt;z-index:-251651072;visibility:visible;mso-height-percent:200;mso-wrap-distance-top:3.6pt;mso-wrap-distance-bottom:3.6pt;mso-position-horizontal-relative:text;mso-position-vertical-relative:text;mso-height-percent:200;mso-width-relative:margin;mso-height-relative:margin" o:gfxdata="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" fillcolor="white [3212]" strokecolor="white [3212]">
             <v:textbox style="mso-fit-shape-to-text:t">
               <w:txbxContent>
                 <w:p>
@@ -6625,8 +7749,6 @@
         <w:widowControl w:val="0"/>
         <w:rPr>
           <w:rFonts w:ascii="Georgia" w:hAnsi="Georgia"/>
-          <w:i/>
-          <w:iCs/>
           <w:kern w:val="0"/>
           <w:sz w:val="20"/>
           <w:szCs w:val="20"/>
@@ -6639,8 +7761,8 @@
         <w:widowControl w:val="0"/>
         <w:rPr>
           <w:rFonts w:ascii="Georgia" w:hAnsi="Georgia"/>
-          <w:i/>
-          <w:iCs/>
+          <w:b/>
+          <w:bCs/>
           <w:kern w:val="0"/>
           <w:sz w:val="20"/>
           <w:szCs w:val="20"/>
@@ -7119,7 +8241,7 @@
               <v:stroke joinstyle="miter"/>
               <v:path gradientshapeok="t" o:connecttype="rect"/>
             </v:shapetype>
-            <v:shape id="officeArt object" o:spid="_x0000_s1028" type="#_x0000_t202" alt="Text Box 2" style="position:absolute;left:0;text-align:left;margin-left:213.55pt;margin-top:20.5pt;width:178.7pt;height:44.8pt;z-index:-251657216;visibility:visible;mso-wrap-style:square;mso-wrap-distance-left:12pt;mso-wrap-distance-top:12pt;mso-wrap-distance-right:12pt;mso-wrap-distance-bottom:12pt;mso-position-horizontal:absolute;mso-position-horizontal-relative:page;mso-position-vertical:absolute;mso-position-vertical-relative:page;v-text-anchor:top" o:gfxdata="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" filled="f" stroked="f" strokeweight="1pt">
+            <v:shape id="officeArt object" o:spid="_x0000_s1029" type="#_x0000_t202" alt="Text Box 2" style="position:absolute;left:0;text-align:left;margin-left:213.55pt;margin-top:20.5pt;width:178.7pt;height:44.8pt;z-index:-251657216;visibility:visible;mso-wrap-style:square;mso-wrap-distance-left:12pt;mso-wrap-distance-top:12pt;mso-wrap-distance-right:12pt;mso-wrap-distance-bottom:12pt;mso-position-horizontal:absolute;mso-position-horizontal-relative:page;mso-position-vertical:absolute;mso-position-vertical-relative:page;v-text-anchor:top" o:gfxdata="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" filled="f" stroked="f" strokeweight="1pt">
               <v:stroke miterlimit="4"/>
               <v:textbox inset="1.27mm,1.27mm,1.27mm,1.27mm">
                 <w:txbxContent>

</xml_diff>

<commit_message>
fix(pdf): perfectly align signature images inline above official names
</commit_message>
<xml_diff>
--- a/templates/CGV AICS Template.fixed.docx
+++ b/templates/CGV AICS Template.fixed.docx
@@ -256,9 +256,9 @@
           <w:sz w:val="14"/>
           <w:szCs w:val="14"/>
         </w:rPr>
-        <w:t>}Hospitalization Expenses    {</w:t>
-      </w:r>
-      <w:proofErr w:type="spellStart"/>
+        <w:t xml:space="preserve">}Hospitalization Expenses </w:t>
+      </w:r>
+      <w:proofErr w:type="gramStart"/>
       <w:r>
         <w:rPr>
           <w:rFonts w:ascii="MS Gothic" w:eastAsia="MS Gothic" w:hAnsi="MS Gothic"/>
@@ -266,9 +266,10 @@
           <w:sz w:val="14"/>
           <w:szCs w:val="14"/>
         </w:rPr>
-        <w:t>medicalCheckBox</w:t>
-      </w:r>
-      <w:proofErr w:type="spellEnd"/>
+        <w:t xml:space="preserve">   {</w:t>
+      </w:r>
+      <w:proofErr w:type="spellStart"/>
+      <w:proofErr w:type="gramEnd"/>
       <w:r>
         <w:rPr>
           <w:rFonts w:ascii="MS Gothic" w:eastAsia="MS Gothic" w:hAnsi="MS Gothic"/>
@@ -276,9 +277,30 @@
           <w:sz w:val="14"/>
           <w:szCs w:val="14"/>
         </w:rPr>
-        <w:t>}Medical Procedure/Examination  {</w:t>
+        <w:t>medicalCheckBox</w:t>
+      </w:r>
+      <w:proofErr w:type="spellEnd"/>
+      <w:r>
+        <w:rPr>
+          <w:rFonts w:ascii="MS Gothic" w:eastAsia="MS Gothic" w:hAnsi="MS Gothic"/>
+          <w:kern w:val="0"/>
+          <w:sz w:val="14"/>
+          <w:szCs w:val="14"/>
+        </w:rPr>
+        <w:t>}Medical Procedure/</w:t>
+      </w:r>
+      <w:proofErr w:type="gramStart"/>
+      <w:r>
+        <w:rPr>
+          <w:rFonts w:ascii="MS Gothic" w:eastAsia="MS Gothic" w:hAnsi="MS Gothic"/>
+          <w:kern w:val="0"/>
+          <w:sz w:val="14"/>
+          <w:szCs w:val="14"/>
+        </w:rPr>
+        <w:t>Examination  {</w:t>
       </w:r>
       <w:proofErr w:type="spellStart"/>
+      <w:proofErr w:type="gramEnd"/>
       <w:r>
         <w:rPr>
           <w:rFonts w:ascii="MS Gothic" w:eastAsia="MS Gothic" w:hAnsi="MS Gothic"/>
@@ -368,7 +390,87 @@
           <w:sz w:val="14"/>
           <w:szCs w:val="14"/>
         </w:rPr>
-        <w:t>{fourPsCheckBox}4Ps  {soloParentCheckBox}Solo Parent   {seniorCitizenCheckBox}Senior Citizen  {pwdCheckBox}PWD  {otherCategoryCheckBox}Others: {otherAssistanceText}</w:t>
+        <w:t>{fourPsCheckBox}4</w:t>
+      </w:r>
+      <w:proofErr w:type="gramStart"/>
+      <w:r>
+        <w:rPr>
+          <w:rFonts w:ascii="MS Gothic" w:eastAsia="MS Gothic" w:hAnsi="MS Gothic"/>
+          <w:kern w:val="0"/>
+          <w:sz w:val="14"/>
+          <w:szCs w:val="14"/>
+        </w:rPr>
+        <w:t>Ps  {</w:t>
+      </w:r>
+      <w:proofErr w:type="gramEnd"/>
+      <w:r>
+        <w:rPr>
+          <w:rFonts w:ascii="MS Gothic" w:eastAsia="MS Gothic" w:hAnsi="MS Gothic"/>
+          <w:kern w:val="0"/>
+          <w:sz w:val="14"/>
+          <w:szCs w:val="14"/>
+        </w:rPr>
+        <w:t>soloParentCheckBox}Solo Parent</w:t>
+      </w:r>
+      <w:proofErr w:type="gramStart"/>
+      <w:r>
+        <w:rPr>
+          <w:rFonts w:ascii="MS Gothic" w:eastAsia="MS Gothic" w:hAnsi="MS Gothic"/>
+          <w:kern w:val="0"/>
+          <w:sz w:val="14"/>
+          <w:szCs w:val="14"/>
+        </w:rPr>
+        <w:t xml:space="preserve">   {</w:t>
+      </w:r>
+      <w:proofErr w:type="gramEnd"/>
+      <w:r>
+        <w:rPr>
+          <w:rFonts w:ascii="MS Gothic" w:eastAsia="MS Gothic" w:hAnsi="MS Gothic"/>
+          <w:kern w:val="0"/>
+          <w:sz w:val="14"/>
+          <w:szCs w:val="14"/>
+        </w:rPr>
+        <w:t xml:space="preserve">seniorCitizenCheckBox}Senior </w:t>
+      </w:r>
+      <w:proofErr w:type="gramStart"/>
+      <w:r>
+        <w:rPr>
+          <w:rFonts w:ascii="MS Gothic" w:eastAsia="MS Gothic" w:hAnsi="MS Gothic"/>
+          <w:kern w:val="0"/>
+          <w:sz w:val="14"/>
+          <w:szCs w:val="14"/>
+        </w:rPr>
+        <w:t>Citizen  {</w:t>
+      </w:r>
+      <w:proofErr w:type="gramEnd"/>
+      <w:r>
+        <w:rPr>
+          <w:rFonts w:ascii="MS Gothic" w:eastAsia="MS Gothic" w:hAnsi="MS Gothic"/>
+          <w:kern w:val="0"/>
+          <w:sz w:val="14"/>
+          <w:szCs w:val="14"/>
+        </w:rPr>
+        <w:t>pwdCheckBox}</w:t>
+      </w:r>
+      <w:proofErr w:type="gramStart"/>
+      <w:r>
+        <w:rPr>
+          <w:rFonts w:ascii="MS Gothic" w:eastAsia="MS Gothic" w:hAnsi="MS Gothic"/>
+          <w:kern w:val="0"/>
+          <w:sz w:val="14"/>
+          <w:szCs w:val="14"/>
+        </w:rPr>
+        <w:t>PWD  {</w:t>
+      </w:r>
+      <w:proofErr w:type="gramEnd"/>
+      <w:r>
+        <w:rPr>
+          <w:rFonts w:ascii="MS Gothic" w:eastAsia="MS Gothic" w:hAnsi="MS Gothic"/>
+          <w:kern w:val="0"/>
+          <w:sz w:val="14"/>
+          <w:szCs w:val="14"/>
+        </w:rPr>
+        <w:t>otherCategoryCheckBox}Others: {otherAssistanceText}</w:t>
       </w:r>
     </w:p>
     <w:p>
@@ -1607,7 +1709,25 @@
                 <w:sz w:val="20"/>
                 <w:szCs w:val="20"/>
               </w:rPr>
-              <w:t>{#familyComposition}{name}</w:t>
+              <w:t>{#</w:t>
+            </w:r>
+            <w:proofErr w:type="gramStart"/>
+            <w:r>
+              <w:rPr>
+                <w:rFonts w:ascii="Georgia" w:hAnsi="Georgia" w:cs="Arial"/>
+                <w:sz w:val="20"/>
+                <w:szCs w:val="20"/>
+              </w:rPr>
+              <w:t>familyComposition}{</w:t>
+            </w:r>
+            <w:proofErr w:type="gramEnd"/>
+            <w:r>
+              <w:rPr>
+                <w:rFonts w:ascii="Georgia" w:hAnsi="Georgia" w:cs="Arial"/>
+                <w:sz w:val="20"/>
+                <w:szCs w:val="20"/>
+              </w:rPr>
+              <w:t>name}</w:t>
             </w:r>
           </w:p>
         </w:tc>
@@ -5775,6 +5895,7 @@
                               <w:t>ifOneMedIsNotAvail</w:t>
                             </w:r>
                             <w:proofErr w:type="spellEnd"/>
+                            <w:proofErr w:type="gramStart"/>
                             <w:r>
                               <w:rPr>
                                 <w:sz w:val="16"/>
@@ -5787,16 +5908,33 @@
                                 <w:sz w:val="16"/>
                                 <w:szCs w:val="16"/>
                               </w:rPr>
-                              <w:t xml:space="preserve">    :</w:t>
+                              <w:t xml:space="preserve">   </w:t>
+                            </w:r>
+                            <w:proofErr w:type="gramEnd"/>
+                            <w:r>
+                              <w:rPr>
+                                <w:sz w:val="16"/>
+                                <w:szCs w:val="16"/>
+                              </w:rPr>
+                              <w:t xml:space="preserve"> :</w:t>
                             </w:r>
                             <w:r>
                               <w:rPr>
                                 <w:sz w:val="16"/>
                                 <w:szCs w:val="16"/>
                               </w:rPr>
-                              <w:t xml:space="preserve">    {</w:t>
+                              <w:t xml:space="preserve"> </w:t>
+                            </w:r>
+                            <w:proofErr w:type="gramStart"/>
+                            <w:r>
+                              <w:rPr>
+                                <w:sz w:val="16"/>
+                                <w:szCs w:val="16"/>
+                              </w:rPr>
+                              <w:t xml:space="preserve">   {</w:t>
                             </w:r>
                             <w:proofErr w:type="spellStart"/>
+                            <w:proofErr w:type="gramEnd"/>
                             <w:r>
                               <w:rPr>
                                 <w:sz w:val="16"/>
@@ -5836,6 +5974,7 @@
                               <w:t>ifTwoMedIsNotAvail</w:t>
                             </w:r>
                             <w:proofErr w:type="spellEnd"/>
+                            <w:proofErr w:type="gramStart"/>
                             <w:r>
                               <w:rPr>
                                 <w:sz w:val="16"/>
@@ -5848,16 +5987,33 @@
                                 <w:sz w:val="16"/>
                                 <w:szCs w:val="16"/>
                               </w:rPr>
-                              <w:t xml:space="preserve">   :</w:t>
+                              <w:t xml:space="preserve">   </w:t>
+                            </w:r>
+                            <w:proofErr w:type="gramEnd"/>
+                            <w:r>
+                              <w:rPr>
+                                <w:sz w:val="16"/>
+                                <w:szCs w:val="16"/>
+                              </w:rPr>
+                              <w:t>:</w:t>
                             </w:r>
                             <w:r>
                               <w:rPr>
                                 <w:sz w:val="16"/>
                                 <w:szCs w:val="16"/>
                               </w:rPr>
-                              <w:t xml:space="preserve">    {</w:t>
+                              <w:t xml:space="preserve"> </w:t>
+                            </w:r>
+                            <w:proofErr w:type="gramStart"/>
+                            <w:r>
+                              <w:rPr>
+                                <w:sz w:val="16"/>
+                                <w:szCs w:val="16"/>
+                              </w:rPr>
+                              <w:t xml:space="preserve">   {</w:t>
                             </w:r>
                             <w:proofErr w:type="spellStart"/>
+                            <w:proofErr w:type="gramEnd"/>
                             <w:r>
                               <w:rPr>
                                 <w:sz w:val="16"/>
@@ -5902,7 +6058,15 @@
                                 <w:sz w:val="16"/>
                                 <w:szCs w:val="16"/>
                               </w:rPr>
-                              <w:t>}}</w:t>
+                              <w:t>}</w:t>
+                            </w:r>
+                            <w:proofErr w:type="gramStart"/>
+                            <w:r>
+                              <w:rPr>
+                                <w:sz w:val="16"/>
+                                <w:szCs w:val="16"/>
+                              </w:rPr>
+                              <w:t>}</w:t>
                             </w:r>
                             <w:r>
                               <w:rPr>
@@ -5911,6 +6075,7 @@
                               </w:rPr>
                               <w:t xml:space="preserve"> :</w:t>
                             </w:r>
+                            <w:proofErr w:type="gramEnd"/>
                             <w:r>
                               <w:rPr>
                                 <w:sz w:val="16"/>
@@ -5958,6 +6123,7 @@
                               <w:t>ifFourMedIsNotAvail</w:t>
                             </w:r>
                             <w:proofErr w:type="spellEnd"/>
+                            <w:proofErr w:type="gramStart"/>
                             <w:r>
                               <w:rPr>
                                 <w:sz w:val="16"/>
@@ -5972,6 +6138,7 @@
                               </w:rPr>
                               <w:t xml:space="preserve">   </w:t>
                             </w:r>
+                            <w:proofErr w:type="gramEnd"/>
                             <w:r>
                               <w:rPr>
                                 <w:sz w:val="16"/>
@@ -6026,6 +6193,7 @@
                               <w:t>ifFiveMedIsNotAvail</w:t>
                             </w:r>
                             <w:proofErr w:type="spellEnd"/>
+                            <w:proofErr w:type="gramStart"/>
                             <w:r>
                               <w:rPr>
                                 <w:sz w:val="16"/>
@@ -6040,6 +6208,7 @@
                               </w:rPr>
                               <w:t xml:space="preserve">   </w:t>
                             </w:r>
+                            <w:proofErr w:type="gramEnd"/>
                             <w:r>
                               <w:rPr>
                                 <w:sz w:val="16"/>
@@ -6091,7 +6260,23 @@
                                 <w:sz w:val="16"/>
                                 <w:szCs w:val="16"/>
                               </w:rPr>
-                              <w:t>{Given this {date}day of {month},{year}}</w:t>
+                              <w:t>{Given this {date}day of {month</w:t>
+                            </w:r>
+                            <w:proofErr w:type="gramStart"/>
+                            <w:r>
+                              <w:rPr>
+                                <w:sz w:val="16"/>
+                                <w:szCs w:val="16"/>
+                              </w:rPr>
+                              <w:t>},{</w:t>
+                            </w:r>
+                            <w:proofErr w:type="gramEnd"/>
+                            <w:r>
+                              <w:rPr>
+                                <w:sz w:val="16"/>
+                                <w:szCs w:val="16"/>
+                              </w:rPr>
+                              <w:t>year}}</w:t>
                             </w:r>
                           </w:p>
                           <w:p>
@@ -6140,6 +6325,7 @@
                               <w:t>{</w:t>
                             </w:r>
                             <w:proofErr w:type="spellStart"/>
+                            <w:proofErr w:type="gramStart"/>
                             <w:r>
                               <w:rPr>
                                 <w:sz w:val="16"/>
@@ -6153,7 +6339,15 @@
                                 <w:sz w:val="16"/>
                                 <w:szCs w:val="16"/>
                               </w:rPr>
-                              <w:t>,{MD}}</w:t>
+                              <w:t>,{</w:t>
+                            </w:r>
+                            <w:proofErr w:type="gramEnd"/>
+                            <w:r>
+                              <w:rPr>
+                                <w:sz w:val="16"/>
+                                <w:szCs w:val="16"/>
+                              </w:rPr>
+                              <w:t>MD}}</w:t>
                             </w:r>
                           </w:p>
                           <w:p>
@@ -6304,6 +6498,7 @@
                         <w:t>ifOneMedIsNotAvail</w:t>
                       </w:r>
                       <w:proofErr w:type="spellEnd"/>
+                      <w:proofErr w:type="gramStart"/>
                       <w:r>
                         <w:rPr>
                           <w:sz w:val="16"/>
@@ -6316,16 +6511,33 @@
                           <w:sz w:val="16"/>
                           <w:szCs w:val="16"/>
                         </w:rPr>
-                        <w:t xml:space="preserve">    :</w:t>
+                        <w:t xml:space="preserve">   </w:t>
+                      </w:r>
+                      <w:proofErr w:type="gramEnd"/>
+                      <w:r>
+                        <w:rPr>
+                          <w:sz w:val="16"/>
+                          <w:szCs w:val="16"/>
+                        </w:rPr>
+                        <w:t xml:space="preserve"> :</w:t>
                       </w:r>
                       <w:r>
                         <w:rPr>
                           <w:sz w:val="16"/>
                           <w:szCs w:val="16"/>
                         </w:rPr>
-                        <w:t xml:space="preserve">    {</w:t>
+                        <w:t xml:space="preserve"> </w:t>
+                      </w:r>
+                      <w:proofErr w:type="gramStart"/>
+                      <w:r>
+                        <w:rPr>
+                          <w:sz w:val="16"/>
+                          <w:szCs w:val="16"/>
+                        </w:rPr>
+                        <w:t xml:space="preserve">   {</w:t>
                       </w:r>
                       <w:proofErr w:type="spellStart"/>
+                      <w:proofErr w:type="gramEnd"/>
                       <w:r>
                         <w:rPr>
                           <w:sz w:val="16"/>
@@ -6365,6 +6577,7 @@
                         <w:t>ifTwoMedIsNotAvail</w:t>
                       </w:r>
                       <w:proofErr w:type="spellEnd"/>
+                      <w:proofErr w:type="gramStart"/>
                       <w:r>
                         <w:rPr>
                           <w:sz w:val="16"/>
@@ -6377,16 +6590,33 @@
                           <w:sz w:val="16"/>
                           <w:szCs w:val="16"/>
                         </w:rPr>
-                        <w:t xml:space="preserve">   :</w:t>
+                        <w:t xml:space="preserve">   </w:t>
+                      </w:r>
+                      <w:proofErr w:type="gramEnd"/>
+                      <w:r>
+                        <w:rPr>
+                          <w:sz w:val="16"/>
+                          <w:szCs w:val="16"/>
+                        </w:rPr>
+                        <w:t>:</w:t>
                       </w:r>
                       <w:r>
                         <w:rPr>
                           <w:sz w:val="16"/>
                           <w:szCs w:val="16"/>
                         </w:rPr>
-                        <w:t xml:space="preserve">    {</w:t>
+                        <w:t xml:space="preserve"> </w:t>
+                      </w:r>
+                      <w:proofErr w:type="gramStart"/>
+                      <w:r>
+                        <w:rPr>
+                          <w:sz w:val="16"/>
+                          <w:szCs w:val="16"/>
+                        </w:rPr>
+                        <w:t xml:space="preserve">   {</w:t>
                       </w:r>
                       <w:proofErr w:type="spellStart"/>
+                      <w:proofErr w:type="gramEnd"/>
                       <w:r>
                         <w:rPr>
                           <w:sz w:val="16"/>
@@ -6431,7 +6661,15 @@
                           <w:sz w:val="16"/>
                           <w:szCs w:val="16"/>
                         </w:rPr>
-                        <w:t>}}</w:t>
+                        <w:t>}</w:t>
+                      </w:r>
+                      <w:proofErr w:type="gramStart"/>
+                      <w:r>
+                        <w:rPr>
+                          <w:sz w:val="16"/>
+                          <w:szCs w:val="16"/>
+                        </w:rPr>
+                        <w:t>}</w:t>
                       </w:r>
                       <w:r>
                         <w:rPr>
@@ -6440,6 +6678,7 @@
                         </w:rPr>
                         <w:t xml:space="preserve"> :</w:t>
                       </w:r>
+                      <w:proofErr w:type="gramEnd"/>
                       <w:r>
                         <w:rPr>
                           <w:sz w:val="16"/>
@@ -6487,6 +6726,7 @@
                         <w:t>ifFourMedIsNotAvail</w:t>
                       </w:r>
                       <w:proofErr w:type="spellEnd"/>
+                      <w:proofErr w:type="gramStart"/>
                       <w:r>
                         <w:rPr>
                           <w:sz w:val="16"/>
@@ -6501,6 +6741,7 @@
                         </w:rPr>
                         <w:t xml:space="preserve">   </w:t>
                       </w:r>
+                      <w:proofErr w:type="gramEnd"/>
                       <w:r>
                         <w:rPr>
                           <w:sz w:val="16"/>
@@ -6555,6 +6796,7 @@
                         <w:t>ifFiveMedIsNotAvail</w:t>
                       </w:r>
                       <w:proofErr w:type="spellEnd"/>
+                      <w:proofErr w:type="gramStart"/>
                       <w:r>
                         <w:rPr>
                           <w:sz w:val="16"/>
@@ -6569,6 +6811,7 @@
                         </w:rPr>
                         <w:t xml:space="preserve">   </w:t>
                       </w:r>
+                      <w:proofErr w:type="gramEnd"/>
                       <w:r>
                         <w:rPr>
                           <w:sz w:val="16"/>
@@ -6620,7 +6863,23 @@
                           <w:sz w:val="16"/>
                           <w:szCs w:val="16"/>
                         </w:rPr>
-                        <w:t>{Given this {date}day of {month},{year}}</w:t>
+                        <w:t>{Given this {date}day of {month</w:t>
+                      </w:r>
+                      <w:proofErr w:type="gramStart"/>
+                      <w:r>
+                        <w:rPr>
+                          <w:sz w:val="16"/>
+                          <w:szCs w:val="16"/>
+                        </w:rPr>
+                        <w:t>},{</w:t>
+                      </w:r>
+                      <w:proofErr w:type="gramEnd"/>
+                      <w:r>
+                        <w:rPr>
+                          <w:sz w:val="16"/>
+                          <w:szCs w:val="16"/>
+                        </w:rPr>
+                        <w:t>year}}</w:t>
                       </w:r>
                     </w:p>
                     <w:p>
@@ -6669,6 +6928,7 @@
                         <w:t>{</w:t>
                       </w:r>
                       <w:proofErr w:type="spellStart"/>
+                      <w:proofErr w:type="gramStart"/>
                       <w:r>
                         <w:rPr>
                           <w:sz w:val="16"/>
@@ -6682,7 +6942,15 @@
                           <w:sz w:val="16"/>
                           <w:szCs w:val="16"/>
                         </w:rPr>
-                        <w:t>,{MD}}</w:t>
+                        <w:t>,{</w:t>
+                      </w:r>
+                      <w:proofErr w:type="gramEnd"/>
+                      <w:r>
+                        <w:rPr>
+                          <w:sz w:val="16"/>
+                          <w:szCs w:val="16"/>
+                        </w:rPr>
+                        <w:t>MD}}</w:t>
                       </w:r>
                     </w:p>
                     <w:p>
@@ -7421,26 +7689,10 @@
                             </w:pPr>
                             <w:r>
                               <w:rPr>
-                                <w:b/>
-                                <w:bCs/>
                                 <w:sz w:val="10"/>
                                 <w:szCs w:val="10"/>
                               </w:rPr>
-                              <w:t xml:space="preserve">   </w:t>
-                            </w:r>
-                            <w:r>
-                              <w:rPr>
-                                <w:sz w:val="10"/>
-                                <w:szCs w:val="10"/>
-                              </w:rPr>
-                              <w:t>S</w:t>
-                            </w:r>
-                            <w:r>
-                              <w:rPr>
-                                <w:sz w:val="10"/>
-                                <w:szCs w:val="10"/>
-                              </w:rPr>
-                              <w:t>can the QR code to confirm authenticity.</w:t>
+                              <w:t>.</w:t>
                             </w:r>
                             <w:r>
                               <w:rPr>
@@ -7574,26 +7826,10 @@
                       </w:pPr>
                       <w:r>
                         <w:rPr>
-                          <w:b/>
-                          <w:bCs/>
                           <w:sz w:val="10"/>
                           <w:szCs w:val="10"/>
                         </w:rPr>
-                        <w:t xml:space="preserve">   </w:t>
-                      </w:r>
-                      <w:r>
-                        <w:rPr>
-                          <w:sz w:val="10"/>
-                          <w:szCs w:val="10"/>
-                        </w:rPr>
-                        <w:t>S</w:t>
-                      </w:r>
-                      <w:r>
-                        <w:rPr>
-                          <w:sz w:val="10"/>
-                          <w:szCs w:val="10"/>
-                        </w:rPr>
-                        <w:t>can the QR code to confirm authenticity.</w:t>
+                        <w:t>.</w:t>
                       </w:r>
                       <w:r>
                         <w:rPr>

</xml_diff>

<commit_message>
docs(templates): update Problem Presented / Findings / Evaluation wording in CGV AICS template
</commit_message>
<xml_diff>
--- a/templates/CGV AICS Template.fixed.docx
+++ b/templates/CGV AICS Template.fixed.docx
@@ -703,9 +703,16 @@
       </w:r>
       <w:r>
         <w:rPr>
+          <w:rFonts w:ascii="Georgia" w:hAnsi="Georgia"/>
+          <w:kern w:val="0"/>
+          <w:sz w:val="20"/>
+          <w:szCs w:val="20"/>
+        </w:rPr>
+        <w:t xml:space="preserve">Barangay </w:t>
+      </w:r>
+      <w:r>
+        <w:rPr>
           <w:rFonts w:ascii="Georgia" w:hAnsi="Georgia" w:cs="Arial"/>
-          <w:b/>
-          <w:bCs/>
           <w:sz w:val="20"/>
           <w:szCs w:val="20"/>
         </w:rPr>
@@ -714,8 +721,6 @@
       <w:r>
         <w:rPr>
           <w:rFonts w:ascii="Georgia" w:hAnsi="Georgia" w:cs="Arial"/>
-          <w:b/>
-          <w:bCs/>
           <w:sz w:val="20"/>
           <w:szCs w:val="20"/>
         </w:rPr>
@@ -803,11 +808,20 @@
       <w:r>
         <w:rPr>
           <w:rFonts w:ascii="Georgia" w:hAnsi="Georgia" w:cs="Arial"/>
+          <w:bCs/>
+          <w:sz w:val="20"/>
+          <w:szCs w:val="20"/>
+        </w:rPr>
+        <w:t>{age}</w:t>
+      </w:r>
+      <w:r>
+        <w:rPr>
+          <w:rFonts w:ascii="Georgia" w:hAnsi="Georgia" w:cs="Arial"/>
           <w:b/>
           <w:sz w:val="20"/>
           <w:szCs w:val="20"/>
         </w:rPr>
-        <w:t xml:space="preserve">{age} </w:t>
+        <w:t xml:space="preserve"> </w:t>
       </w:r>
       <w:r>
         <w:rPr>
@@ -875,8 +889,6 @@
       <w:r>
         <w:rPr>
           <w:rFonts w:ascii="Georgia" w:hAnsi="Georgia"/>
-          <w:b/>
-          <w:bCs/>
           <w:i/>
           <w:iCs/>
           <w:kern w:val="0"/>
@@ -956,8 +968,6 @@
       <w:r>
         <w:rPr>
           <w:rFonts w:ascii="Georgia" w:hAnsi="Georgia" w:cs="Arial"/>
-          <w:b/>
-          <w:bCs/>
           <w:sz w:val="20"/>
           <w:szCs w:val="20"/>
         </w:rPr>
@@ -967,8 +977,6 @@
       <w:r>
         <w:rPr>
           <w:rFonts w:ascii="Georgia" w:hAnsi="Georgia" w:cs="Arial"/>
-          <w:b/>
-          <w:bCs/>
           <w:sz w:val="20"/>
           <w:szCs w:val="20"/>
         </w:rPr>
@@ -978,8 +986,6 @@
       <w:r>
         <w:rPr>
           <w:rFonts w:ascii="Georgia" w:hAnsi="Georgia" w:cs="Arial"/>
-          <w:b/>
-          <w:bCs/>
           <w:sz w:val="20"/>
           <w:szCs w:val="20"/>
         </w:rPr>
@@ -1061,8 +1067,6 @@
       <w:r>
         <w:rPr>
           <w:rFonts w:ascii="Georgia" w:hAnsi="Georgia" w:cs="Arial"/>
-          <w:b/>
-          <w:bCs/>
           <w:sz w:val="20"/>
           <w:szCs w:val="20"/>
         </w:rPr>
@@ -1226,8 +1230,6 @@
       <w:r>
         <w:rPr>
           <w:rFonts w:ascii="Georgia" w:hAnsi="Georgia"/>
-          <w:b/>
-          <w:bCs/>
           <w:i/>
           <w:iCs/>
           <w:kern w:val="0"/>
@@ -1398,8 +1400,6 @@
       <w:r>
         <w:rPr>
           <w:rFonts w:ascii="Georgia" w:hAnsi="Georgia"/>
-          <w:b/>
-          <w:bCs/>
           <w:i/>
           <w:iCs/>
           <w:kern w:val="0"/>
@@ -1413,8 +1413,6 @@
       <w:r>
         <w:rPr>
           <w:rFonts w:ascii="Georgia" w:hAnsi="Georgia"/>
-          <w:b/>
-          <w:bCs/>
           <w:i/>
           <w:iCs/>
           <w:kern w:val="0"/>
@@ -1428,8 +1426,6 @@
       <w:r>
         <w:rPr>
           <w:rFonts w:ascii="Georgia" w:hAnsi="Georgia"/>
-          <w:b/>
-          <w:bCs/>
           <w:i/>
           <w:iCs/>
           <w:kern w:val="0"/>
@@ -5548,9 +5544,19 @@
           <w:sz w:val="20"/>
           <w:szCs w:val="20"/>
         </w:rPr>
-        <w:t>} personally came to this Office to seek emergency assistance for {</w:t>
-      </w:r>
-      <w:proofErr w:type="spellStart"/>
+        <w:t>}</w:t>
+      </w:r>
+      <w:r>
+        <w:rPr>
+          <w:rFonts w:ascii="Georgia" w:hAnsi="Georgia"/>
+          <w:i/>
+          <w:iCs/>
+          <w:kern w:val="0"/>
+          <w:sz w:val="20"/>
+          <w:szCs w:val="20"/>
+        </w:rPr>
+        <w:t xml:space="preserve"> personally came to this Office to seek emergency assistance for </w:t>
+      </w:r>
       <w:r>
         <w:rPr>
           <w:rFonts w:ascii="Georgia" w:hAnsi="Georgia"/>
@@ -5562,9 +5568,9 @@
           <w:sz w:val="20"/>
           <w:szCs w:val="20"/>
         </w:rPr>
-        <w:t>specificNeed</w:t>
-      </w:r>
-      <w:proofErr w:type="spellEnd"/>
+        <w:t>{</w:t>
+      </w:r>
+      <w:proofErr w:type="spellStart"/>
       <w:r>
         <w:rPr>
           <w:rFonts w:ascii="Georgia" w:hAnsi="Georgia"/>
@@ -5576,9 +5582,9 @@
           <w:sz w:val="20"/>
           <w:szCs w:val="20"/>
         </w:rPr>
-        <w:t>}, {</w:t>
-      </w:r>
-      <w:proofErr w:type="spellStart"/>
+        <w:t>specificNeed</w:t>
+      </w:r>
+      <w:proofErr w:type="spellEnd"/>
       <w:r>
         <w:rPr>
           <w:rFonts w:ascii="Georgia" w:hAnsi="Georgia"/>
@@ -5590,14 +5596,35 @@
           <w:sz w:val="20"/>
           <w:szCs w:val="20"/>
         </w:rPr>
+        <w:t>},</w:t>
+      </w:r>
+      <w:r>
+        <w:rPr>
+          <w:rFonts w:ascii="Georgia" w:hAnsi="Georgia"/>
+          <w:i/>
+          <w:iCs/>
+          <w:kern w:val="0"/>
+          <w:sz w:val="20"/>
+          <w:szCs w:val="20"/>
+        </w:rPr>
+        <w:t xml:space="preserve"> {</w:t>
+      </w:r>
+      <w:proofErr w:type="spellStart"/>
+      <w:r>
+        <w:rPr>
+          <w:rFonts w:ascii="Georgia" w:hAnsi="Georgia"/>
+          <w:i/>
+          <w:iCs/>
+          <w:kern w:val="0"/>
+          <w:sz w:val="20"/>
+          <w:szCs w:val="20"/>
+        </w:rPr>
         <w:t>immediateCircumstance</w:t>
       </w:r>
       <w:proofErr w:type="spellEnd"/>
       <w:r>
         <w:rPr>
           <w:rFonts w:ascii="Georgia" w:hAnsi="Georgia"/>
-          <w:b/>
-          <w:bCs/>
           <w:i/>
           <w:iCs/>
           <w:kern w:val="0"/>
@@ -5688,12 +5715,54 @@
           <w:szCs w:val="20"/>
         </w:rPr>
         <w:tab/>
-        <w:t>The beneficiary and family reside in {address}. The family belongs to the less fortunate members of the community, having {incomeSituation}. {</w:t>
+        <w:t xml:space="preserve">The beneficiary and family reside in </w:t>
+      </w:r>
+      <w:r>
+        <w:rPr>
+          <w:rFonts w:ascii="Georgia" w:hAnsi="Georgia"/>
+          <w:kern w:val="0"/>
+          <w:sz w:val="20"/>
+          <w:szCs w:val="20"/>
+        </w:rPr>
+        <w:t xml:space="preserve">Barangay </w:t>
+      </w:r>
+      <w:r>
+        <w:rPr>
+          <w:rFonts w:ascii="Georgia" w:hAnsi="Georgia"/>
+          <w:b/>
+          <w:bCs/>
+          <w:kern w:val="0"/>
+          <w:sz w:val="20"/>
+          <w:szCs w:val="20"/>
+        </w:rPr>
+        <w:t>{address}</w:t>
+      </w:r>
+      <w:r>
+        <w:rPr>
+          <w:rFonts w:ascii="Georgia" w:hAnsi="Georgia"/>
+          <w:kern w:val="0"/>
+          <w:sz w:val="20"/>
+          <w:szCs w:val="20"/>
+        </w:rPr>
+        <w:t xml:space="preserve">. The family belongs to the less fortunate members of the community, having {incomeSituation}. </w:t>
+      </w:r>
+      <w:r>
+        <w:rPr>
+          <w:rFonts w:ascii="Georgia" w:hAnsi="Georgia"/>
+          <w:b/>
+          <w:bCs/>
+          <w:kern w:val="0"/>
+          <w:sz w:val="20"/>
+          <w:szCs w:val="20"/>
+        </w:rPr>
+        <w:t>{</w:t>
       </w:r>
       <w:proofErr w:type="spellStart"/>
       <w:r>
         <w:rPr>
           <w:rFonts w:ascii="Georgia" w:hAnsi="Georgia"/>
+          <w:b/>
+          <w:bCs/>
           <w:kern w:val="0"/>
           <w:sz w:val="20"/>
           <w:szCs w:val="20"/>
@@ -5704,11 +5773,22 @@
       <w:r>
         <w:rPr>
           <w:rFonts w:ascii="Georgia" w:hAnsi="Georgia"/>
-          <w:kern w:val="0"/>
-          <w:sz w:val="20"/>
-          <w:szCs w:val="20"/>
-        </w:rPr>
-        <w:t>}. The</w:t>
+          <w:b/>
+          <w:bCs/>
+          <w:kern w:val="0"/>
+          <w:sz w:val="20"/>
+          <w:szCs w:val="20"/>
+        </w:rPr>
+        <w:t>}.</w:t>
+      </w:r>
+      <w:r>
+        <w:rPr>
+          <w:rFonts w:ascii="Georgia" w:hAnsi="Georgia"/>
+          <w:kern w:val="0"/>
+          <w:sz w:val="20"/>
+          <w:szCs w:val="20"/>
+        </w:rPr>
+        <w:t xml:space="preserve"> The</w:t>
       </w:r>
       <w:r>
         <w:rPr>
@@ -5808,7 +5888,27 @@
           <w:sz w:val="20"/>
           <w:szCs w:val="20"/>
         </w:rPr>
-        <w:t>In view of the above, the undersigned recommends that the beneficiary avail of financial assistance from the City Government through the Assistance to Individuals in Crisis Situation (AICS) Program, through a Guarantee Letter addressed to {serviceProviderName}, for {assistancePurpose}, in the amount of {cash}.</w:t>
+        <w:t xml:space="preserve">In view of the above, the undersigned recommends that the beneficiary avail of financial assistance from the City Government through the Assistance to Individuals in Crisis Situation (AICS) Program, through a Guarantee Letter addressed to </w:t>
+      </w:r>
+      <w:r>
+        <w:rPr>
+          <w:rFonts w:ascii="Georgia" w:hAnsi="Georgia"/>
+          <w:b/>
+          <w:bCs/>
+          <w:kern w:val="0"/>
+          <w:sz w:val="20"/>
+          <w:szCs w:val="20"/>
+        </w:rPr>
+        <w:t>{serviceProviderName},</w:t>
+      </w:r>
+      <w:r>
+        <w:rPr>
+          <w:rFonts w:ascii="Georgia" w:hAnsi="Georgia"/>
+          <w:kern w:val="0"/>
+          <w:sz w:val="20"/>
+          <w:szCs w:val="20"/>
+        </w:rPr>
+        <w:t xml:space="preserve"> for {assistancePurpose}, in the amount of {cash}.</w:t>
       </w:r>
     </w:p>
     <w:p>
@@ -5975,14 +6075,7 @@
                                 <w:sz w:val="16"/>
                                 <w:szCs w:val="16"/>
                               </w:rPr>
-                              <w:t xml:space="preserve"> by</w:t>
-                            </w:r>
-                            <w:r>
-                              <w:rPr>
-                                <w:sz w:val="16"/>
-                                <w:szCs w:val="16"/>
-                              </w:rPr>
-                              <w:t>{</w:t>
+                              <w:t xml:space="preserve"> by{</w:t>
                             </w:r>
                             <w:proofErr w:type="spellStart"/>
                             <w:proofErr w:type="gramStart"/>
@@ -6571,14 +6664,7 @@
                           <w:sz w:val="16"/>
                           <w:szCs w:val="16"/>
                         </w:rPr>
-                        <w:t xml:space="preserve"> by</w:t>
-                      </w:r>
-                      <w:r>
-                        <w:rPr>
-                          <w:sz w:val="16"/>
-                          <w:szCs w:val="16"/>
-                        </w:rPr>
-                        <w:t>{</w:t>
+                        <w:t xml:space="preserve"> by{</w:t>
                       </w:r>
                       <w:proofErr w:type="spellStart"/>
                       <w:proofErr w:type="gramStart"/>
@@ -7321,6 +7407,10 @@
           <w:szCs w:val="18"/>
         </w:rPr>
         <w:pict w14:anchorId="0F9DA61A">
+          <v:shapetype id="_x0000_t202" coordsize="21600,21600" o:spt="202" path="m,l,21600r21600,l21600,xe">
+            <v:stroke joinstyle="miter"/>
+            <v:path gradientshapeok="t" o:connecttype="rect"/>
+          </v:shapetype>
           <v:shape id="_x0000_s1027" type="#_x0000_t202" style="position:absolute;left:0;text-align:left;margin-left:20.4pt;margin-top:6.2pt;width:120.1pt;height:49.35pt;z-index:-251655168;visibility:visible;mso-height-percent:200;mso-wrap-distance-top:3.6pt;mso-wrap-distance-bottom:3.6pt;mso-height-percent:200;mso-width-relative:margin;mso-height-relative:margin" o:gfxdata="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" fillcolor="white [3212]" strokecolor="white [3212]">
             <v:textbox style="mso-fit-shape-to-text:t">
               <w:txbxContent>

</xml_diff>

<commit_message>
docs(templates): further wording edits to CGV AICS template
</commit_message>
<xml_diff>
--- a/templates/CGV AICS Template.fixed.docx
+++ b/templates/CGV AICS Template.fixed.docx
@@ -5908,7 +5908,18 @@
           <w:sz w:val="20"/>
           <w:szCs w:val="20"/>
         </w:rPr>
-        <w:t xml:space="preserve"> for {assistancePurpose}, in the amount of {cash}.</w:t>
+        <w:t xml:space="preserve"> for {assistancePurpose}, in the amount of </w:t>
+      </w:r>
+      <w:r>
+        <w:rPr>
+          <w:rFonts w:ascii="Georgia" w:hAnsi="Georgia"/>
+          <w:b/>
+          <w:bCs/>
+          <w:kern w:val="0"/>
+          <w:sz w:val="20"/>
+          <w:szCs w:val="20"/>
+        </w:rPr>
+        <w:t>{cash}.</w:t>
       </w:r>
     </w:p>
     <w:p>

</xml_diff>

<commit_message>
fix(reports): remove duplicate "Barangay" word in generated documents
The CGV AICS Template hardcoded "Barangay " before the {address} merge
field, which doubled up for barangays whose stored name already started
with "Barangay" (e.g. Barangay VII). Strip that hardcoded prefix from the
template and instead standardize every barangay option (numbered and
named) to consistently include the "Barangay " prefix exactly once, so
the merge field alone renders correctly for all barangays. Also add a
defensive dedupeBarangayWord() when building report addresses in case
stale/free-typed data repeats the word.

Co-Authored-By: Claude Sonnet 5 <noreply@anthropic.com>
</commit_message>
<xml_diff>
--- a/templates/CGV AICS Template.fixed.docx
+++ b/templates/CGV AICS Template.fixed.docx
@@ -708,7 +708,7 @@
           <w:sz w:val="20"/>
           <w:szCs w:val="20"/>
         </w:rPr>
-        <w:t xml:space="preserve">Barangay </w:t>
+        <w:t xml:space="preserve"/>
       </w:r>
       <w:r>
         <w:rPr>
@@ -5724,7 +5724,7 @@
           <w:sz w:val="20"/>
           <w:szCs w:val="20"/>
         </w:rPr>
-        <w:t xml:space="preserve">Barangay </w:t>
+        <w:t xml:space="preserve"/>
       </w:r>
       <w:r>
         <w:rPr>

</xml_diff>

<commit_message>
chore(templates): trim CGV AICS Findings paragraph to core sentences
Updated the case-study Findings section to the essential narrative:
residence, income situation, case-specific findings, and the reason
assistance was sought from the City Government.

Co-Authored-By: Claude Sonnet 5 <noreply@anthropic.com>
</commit_message>
<xml_diff>
--- a/templates/CGV AICS Template.fixed.docx
+++ b/templates/CGV AICS Template.fixed.docx
@@ -1,6 +1,6 @@
 
 <file path=word/document.xml><?xml version="1.0" encoding="utf-8"?>
-<w:document xmlns:wpc="http://schemas.microsoft.com/office/word/2010/wordprocessingCanvas" xmlns:cx="http://schemas.microsoft.com/office/drawing/2014/chartex" xmlns:cx1="http://schemas.microsoft.com/office/drawing/2015/9/8/chartex" xmlns:cx2="http://schemas.microsoft.com/office/drawing/2015/10/21/chartex" xmlns:cx3="http://schemas.microsoft.com/office/drawing/2016/5/9/chartex" xmlns:cx4="http://schemas.microsoft.com/office/drawing/2016/5/10/chartex" xmlns:cx5="http://schemas.microsoft.com/office/drawing/2016/5/11/chartex" xmlns:cx6="http://schemas.microsoft.com/office/drawing/2016/5/12/chartex" xmlns:cx7="http://schemas.microsoft.com/office/drawing/2016/5/13/chartex" xmlns:cx8="http://schemas.microsoft.com/office/drawing/2016/5/14/chartex" xmlns:mc="http://schemas.openxmlformats.org/markup-compatibility/2006" xmlns:aink="http://schemas.microsoft.com/office/drawing/2016/ink" xmlns:am3d="http://schemas.microsoft.com/office/drawing/2017/model3d" xmlns:o="urn:schemas-microsoft-com:office:office" xmlns:oel="http://schemas.microsoft.com/office/2019/extlst" xmlns:r="http://schemas.openxmlformats.org/officeDocument/2006/relationships" xmlns:m="http://schemas.openxmlformats.org/officeDocument/2006/math" xmlns:v="urn:schemas-microsoft-com:vml" xmlns:wp14="http://schemas.microsoft.com/office/word/2010/wordprocessingDrawing" xmlns:wp="http://schemas.openxmlformats.org/drawingml/2006/wordprocessingDrawing" xmlns:w10="urn:schemas-microsoft-com:office:word" xmlns:w="http://schemas.openxmlformats.org/wordprocessingml/2006/main" xmlns:w14="http://schemas.microsoft.com/office/word/2010/wordml" xmlns:w15="http://schemas.microsoft.com/office/word/2012/wordml" xmlns:w16cei="http://schemas.microsoft.com/office/word/2026/wordml/cei" xmlns:w16cex="http://schemas.microsoft.com/office/word/2018/wordml/cex" xmlns:w16cid="http://schemas.microsoft.com/office/word/2016/wordml/cid" xmlns:w16="http://schemas.microsoft.com/office/word/2018/wordml" xmlns:w16du="http://schemas.microsoft.com/office/word/2023/wordml/word16du" xmlns:w16sdtdh="http://schemas.microsoft.com/office/word/2020/wordml/sdtdatahash" xmlns:w16sdtfl="http://schemas.microsoft.com/office/word/2024/wordml/sdtformatlock" xmlns:w16se="http://schemas.microsoft.com/office/word/2015/wordml/symex" xmlns:wpg="http://schemas.microsoft.com/office/word/2010/wordprocessingGroup" xmlns:wpi="http://schemas.microsoft.com/office/word/2010/wordprocessingInk" xmlns:wne="http://schemas.microsoft.com/office/word/2006/wordml" xmlns:wps="http://schemas.microsoft.com/office/word/2010/wordprocessingShape" mc:Ignorable="w14 w15 w16se w16cid w16 w16cex w16sdtdh w16sdtfl w16du wp14">
+<w:document xmlns:wpc="http://schemas.microsoft.com/office/word/2010/wordprocessingCanvas" xmlns:cx="http://schemas.microsoft.com/office/drawing/2014/chartex" xmlns:cx1="http://schemas.microsoft.com/office/drawing/2015/9/8/chartex" xmlns:cx2="http://schemas.microsoft.com/office/drawing/2015/10/21/chartex" xmlns:cx3="http://schemas.microsoft.com/office/drawing/2016/5/9/chartex" xmlns:cx4="http://schemas.microsoft.com/office/drawing/2016/5/10/chartex" xmlns:cx5="http://schemas.microsoft.com/office/drawing/2016/5/11/chartex" xmlns:cx6="http://schemas.microsoft.com/office/drawing/2016/5/12/chartex" xmlns:cx7="http://schemas.microsoft.com/office/drawing/2016/5/13/chartex" xmlns:cx8="http://schemas.microsoft.com/office/drawing/2016/5/14/chartex" xmlns:mc="http://schemas.openxmlformats.org/markup-compatibility/2006" xmlns:aink="http://schemas.microsoft.com/office/drawing/2016/ink" xmlns:am3d="http://schemas.microsoft.com/office/drawing/2017/model3d" xmlns:o="urn:schemas-microsoft-com:office:office" xmlns:oel="http://schemas.microsoft.com/office/2019/extlst" xmlns:r="http://schemas.openxmlformats.org/officeDocument/2006/relationships" xmlns:m="http://schemas.openxmlformats.org/officeDocument/2006/math" xmlns:v="urn:schemas-microsoft-com:vml" xmlns:wp14="http://schemas.microsoft.com/office/word/2010/wordprocessingDrawing" xmlns:wp="http://schemas.openxmlformats.org/drawingml/2006/wordprocessingDrawing" xmlns:w10="urn:schemas-microsoft-com:office:word" xmlns:w="http://schemas.openxmlformats.org/wordprocessingml/2006/main" xmlns:w14="http://schemas.microsoft.com/office/word/2010/wordml" xmlns:w15="http://schemas.microsoft.com/office/word/2012/wordml" xmlns:w16cex="http://schemas.microsoft.com/office/word/2018/wordml/cex" xmlns:w16cid="http://schemas.microsoft.com/office/word/2016/wordml/cid" xmlns:w16="http://schemas.microsoft.com/office/word/2018/wordml" xmlns:w16du="http://schemas.microsoft.com/office/word/2023/wordml/word16du" xmlns:w16sdtdh="http://schemas.microsoft.com/office/word/2020/wordml/sdtdatahash" xmlns:w16sdtfl="http://schemas.microsoft.com/office/word/2024/wordml/sdtformatlock" xmlns:w16se="http://schemas.microsoft.com/office/word/2015/wordml/symex" xmlns:wpg="http://schemas.microsoft.com/office/word/2010/wordprocessingGroup" xmlns:wpi="http://schemas.microsoft.com/office/word/2010/wordprocessingInk" xmlns:wne="http://schemas.microsoft.com/office/word/2006/wordml" xmlns:wps="http://schemas.microsoft.com/office/word/2010/wordprocessingShape" mc:Ignorable="w14 w15 w16se w16cid w16 w16cex w16sdtdh w16sdtfl w16du wp14">
   <w:body>
     <w:p>
       <w:pPr>
@@ -256,9 +256,9 @@
           <w:sz w:val="14"/>
           <w:szCs w:val="14"/>
         </w:rPr>
-        <w:t xml:space="preserve">}Hospitalization Expenses </w:t>
-      </w:r>
-      <w:proofErr w:type="gramStart"/>
+        <w:t>}Hospitalization Expenses    {</w:t>
+      </w:r>
+      <w:proofErr w:type="spellStart"/>
       <w:r>
         <w:rPr>
           <w:rFonts w:ascii="MS Gothic" w:eastAsia="MS Gothic" w:hAnsi="MS Gothic"/>
@@ -266,10 +266,9 @@
           <w:sz w:val="14"/>
           <w:szCs w:val="14"/>
         </w:rPr>
-        <w:t xml:space="preserve">   {</w:t>
-      </w:r>
-      <w:proofErr w:type="spellStart"/>
-      <w:proofErr w:type="gramEnd"/>
+        <w:t>medicalCheckBox</w:t>
+      </w:r>
+      <w:proofErr w:type="spellEnd"/>
       <w:r>
         <w:rPr>
           <w:rFonts w:ascii="MS Gothic" w:eastAsia="MS Gothic" w:hAnsi="MS Gothic"/>
@@ -277,30 +276,9 @@
           <w:sz w:val="14"/>
           <w:szCs w:val="14"/>
         </w:rPr>
-        <w:t>medicalCheckBox</w:t>
-      </w:r>
-      <w:proofErr w:type="spellEnd"/>
-      <w:r>
-        <w:rPr>
-          <w:rFonts w:ascii="MS Gothic" w:eastAsia="MS Gothic" w:hAnsi="MS Gothic"/>
-          <w:kern w:val="0"/>
-          <w:sz w:val="14"/>
-          <w:szCs w:val="14"/>
-        </w:rPr>
-        <w:t>}Medical Procedure/</w:t>
-      </w:r>
-      <w:proofErr w:type="gramStart"/>
-      <w:r>
-        <w:rPr>
-          <w:rFonts w:ascii="MS Gothic" w:eastAsia="MS Gothic" w:hAnsi="MS Gothic"/>
-          <w:kern w:val="0"/>
-          <w:sz w:val="14"/>
-          <w:szCs w:val="14"/>
-        </w:rPr>
-        <w:t>Examination  {</w:t>
+        <w:t>}Medical Procedure/Examination  {</w:t>
       </w:r>
       <w:proofErr w:type="spellStart"/>
-      <w:proofErr w:type="gramEnd"/>
       <w:r>
         <w:rPr>
           <w:rFonts w:ascii="MS Gothic" w:eastAsia="MS Gothic" w:hAnsi="MS Gothic"/>
@@ -390,87 +368,7 @@
           <w:sz w:val="14"/>
           <w:szCs w:val="14"/>
         </w:rPr>
-        <w:t>{fourPsCheckBox}4</w:t>
-      </w:r>
-      <w:proofErr w:type="gramStart"/>
-      <w:r>
-        <w:rPr>
-          <w:rFonts w:ascii="MS Gothic" w:eastAsia="MS Gothic" w:hAnsi="MS Gothic"/>
-          <w:kern w:val="0"/>
-          <w:sz w:val="14"/>
-          <w:szCs w:val="14"/>
-        </w:rPr>
-        <w:t>Ps  {</w:t>
-      </w:r>
-      <w:proofErr w:type="gramEnd"/>
-      <w:r>
-        <w:rPr>
-          <w:rFonts w:ascii="MS Gothic" w:eastAsia="MS Gothic" w:hAnsi="MS Gothic"/>
-          <w:kern w:val="0"/>
-          <w:sz w:val="14"/>
-          <w:szCs w:val="14"/>
-        </w:rPr>
-        <w:t>soloParentCheckBox}Solo Parent</w:t>
-      </w:r>
-      <w:proofErr w:type="gramStart"/>
-      <w:r>
-        <w:rPr>
-          <w:rFonts w:ascii="MS Gothic" w:eastAsia="MS Gothic" w:hAnsi="MS Gothic"/>
-          <w:kern w:val="0"/>
-          <w:sz w:val="14"/>
-          <w:szCs w:val="14"/>
-        </w:rPr>
-        <w:t xml:space="preserve">   {</w:t>
-      </w:r>
-      <w:proofErr w:type="gramEnd"/>
-      <w:r>
-        <w:rPr>
-          <w:rFonts w:ascii="MS Gothic" w:eastAsia="MS Gothic" w:hAnsi="MS Gothic"/>
-          <w:kern w:val="0"/>
-          <w:sz w:val="14"/>
-          <w:szCs w:val="14"/>
-        </w:rPr>
-        <w:t xml:space="preserve">seniorCitizenCheckBox}Senior </w:t>
-      </w:r>
-      <w:proofErr w:type="gramStart"/>
-      <w:r>
-        <w:rPr>
-          <w:rFonts w:ascii="MS Gothic" w:eastAsia="MS Gothic" w:hAnsi="MS Gothic"/>
-          <w:kern w:val="0"/>
-          <w:sz w:val="14"/>
-          <w:szCs w:val="14"/>
-        </w:rPr>
-        <w:t>Citizen  {</w:t>
-      </w:r>
-      <w:proofErr w:type="gramEnd"/>
-      <w:r>
-        <w:rPr>
-          <w:rFonts w:ascii="MS Gothic" w:eastAsia="MS Gothic" w:hAnsi="MS Gothic"/>
-          <w:kern w:val="0"/>
-          <w:sz w:val="14"/>
-          <w:szCs w:val="14"/>
-        </w:rPr>
-        <w:t>pwdCheckBox}</w:t>
-      </w:r>
-      <w:proofErr w:type="gramStart"/>
-      <w:r>
-        <w:rPr>
-          <w:rFonts w:ascii="MS Gothic" w:eastAsia="MS Gothic" w:hAnsi="MS Gothic"/>
-          <w:kern w:val="0"/>
-          <w:sz w:val="14"/>
-          <w:szCs w:val="14"/>
-        </w:rPr>
-        <w:t>PWD  {</w:t>
-      </w:r>
-      <w:proofErr w:type="gramEnd"/>
-      <w:r>
-        <w:rPr>
-          <w:rFonts w:ascii="MS Gothic" w:eastAsia="MS Gothic" w:hAnsi="MS Gothic"/>
-          <w:kern w:val="0"/>
-          <w:sz w:val="14"/>
-          <w:szCs w:val="14"/>
-        </w:rPr>
-        <w:t>otherCategoryCheckBox}Others: {otherAssistanceText}</w:t>
+        <w:t>{fourPsCheckBox}4Ps  {soloParentCheckBox}Solo Parent   {seniorCitizenCheckBox}Senior Citizen  {pwdCheckBox}PWD  {otherCategoryCheckBox}Others: {otherAssistanceText}</w:t>
       </w:r>
     </w:p>
     <w:p>
@@ -1696,25 +1594,7 @@
                 <w:sz w:val="20"/>
                 <w:szCs w:val="20"/>
               </w:rPr>
-              <w:t>{#</w:t>
-            </w:r>
-            <w:proofErr w:type="gramStart"/>
-            <w:r>
-              <w:rPr>
-                <w:rFonts w:ascii="Georgia" w:hAnsi="Georgia" w:cs="Arial"/>
-                <w:sz w:val="20"/>
-                <w:szCs w:val="20"/>
-              </w:rPr>
-              <w:t>familyComposition}{</w:t>
-            </w:r>
-            <w:proofErr w:type="gramEnd"/>
-            <w:r>
-              <w:rPr>
-                <w:rFonts w:ascii="Georgia" w:hAnsi="Georgia" w:cs="Arial"/>
-                <w:sz w:val="20"/>
-                <w:szCs w:val="20"/>
-              </w:rPr>
-              <w:t>name}</w:t>
+              <w:t>{#familyComposition}{name}</w:t>
             </w:r>
           </w:p>
         </w:tc>
@@ -5783,16 +5663,16 @@
           <w:sz w:val="20"/>
           <w:szCs w:val="20"/>
         </w:rPr>
-        <w:t xml:space="preserve"> The</w:t>
-      </w:r>
-      <w:r>
-        <w:rPr>
-          <w:rFonts w:ascii="Georgia" w:hAnsi="Georgia"/>
-          <w:kern w:val="0"/>
-          <w:sz w:val="20"/>
-          <w:szCs w:val="20"/>
-        </w:rPr>
-        <w:t xml:space="preserve"> family is concerned about how to cope with the resulting expenses, as they have no other source of income sufficient to cover their needs. For this reason, the family sought assistance from the City Government to help ease their financial burden. In view of the foregoing, the beneficiary is recommended for financial assistance as indicated below.</w:t>
+        <w:t xml:space="preserve"> </w:t>
+      </w:r>
+      <w:r>
+        <w:rPr>
+          <w:rFonts w:ascii="Georgia" w:hAnsi="Georgia"/>
+          <w:kern w:val="0"/>
+          <w:sz w:val="20"/>
+          <w:szCs w:val="20"/>
+        </w:rPr>
+        <w:t xml:space="preserve">For this reason, the family sought assistance from the City Government to help ease their financial burden. </w:t>
       </w:r>
     </w:p>
     <w:p>
@@ -6084,7 +5964,6 @@
                               <w:t xml:space="preserve"> by{</w:t>
                             </w:r>
                             <w:proofErr w:type="spellStart"/>
-                            <w:proofErr w:type="gramStart"/>
                             <w:r>
                               <w:rPr>
                                 <w:sz w:val="16"/>
@@ -6098,15 +5977,7 @@
                                 <w:sz w:val="16"/>
                                 <w:szCs w:val="16"/>
                               </w:rPr>
-                              <w:t>,{</w:t>
-                            </w:r>
-                            <w:proofErr w:type="gramEnd"/>
-                            <w:r>
-                              <w:rPr>
-                                <w:sz w:val="16"/>
-                                <w:szCs w:val="16"/>
-                              </w:rPr>
-                              <w:t>MD}}</w:t>
+                              <w:t>,{MD}}</w:t>
                             </w:r>
                           </w:p>
                           <w:p>
@@ -6156,7 +6027,6 @@
                               <w:t>ifOneMedIsNotAvail</w:t>
                             </w:r>
                             <w:proofErr w:type="spellEnd"/>
-                            <w:proofErr w:type="gramStart"/>
                             <w:r>
                               <w:rPr>
                                 <w:sz w:val="16"/>
@@ -6169,33 +6039,16 @@
                                 <w:sz w:val="16"/>
                                 <w:szCs w:val="16"/>
                               </w:rPr>
-                              <w:t xml:space="preserve">   </w:t>
-                            </w:r>
-                            <w:proofErr w:type="gramEnd"/>
-                            <w:r>
-                              <w:rPr>
-                                <w:sz w:val="16"/>
-                                <w:szCs w:val="16"/>
-                              </w:rPr>
-                              <w:t xml:space="preserve"> :</w:t>
+                              <w:t xml:space="preserve">    :</w:t>
                             </w:r>
                             <w:r>
                               <w:rPr>
                                 <w:sz w:val="16"/>
                                 <w:szCs w:val="16"/>
                               </w:rPr>
-                              <w:t xml:space="preserve"> </w:t>
-                            </w:r>
-                            <w:proofErr w:type="gramStart"/>
-                            <w:r>
-                              <w:rPr>
-                                <w:sz w:val="16"/>
-                                <w:szCs w:val="16"/>
-                              </w:rPr>
-                              <w:t xml:space="preserve">   {</w:t>
+                              <w:t xml:space="preserve">    {</w:t>
                             </w:r>
                             <w:proofErr w:type="spellStart"/>
-                            <w:proofErr w:type="gramEnd"/>
                             <w:r>
                               <w:rPr>
                                 <w:sz w:val="16"/>
@@ -6235,7 +6088,6 @@
                               <w:t>ifTwoMedIsNotAvail</w:t>
                             </w:r>
                             <w:proofErr w:type="spellEnd"/>
-                            <w:proofErr w:type="gramStart"/>
                             <w:r>
                               <w:rPr>
                                 <w:sz w:val="16"/>
@@ -6248,33 +6100,16 @@
                                 <w:sz w:val="16"/>
                                 <w:szCs w:val="16"/>
                               </w:rPr>
-                              <w:t xml:space="preserve">   </w:t>
-                            </w:r>
-                            <w:proofErr w:type="gramEnd"/>
-                            <w:r>
-                              <w:rPr>
-                                <w:sz w:val="16"/>
-                                <w:szCs w:val="16"/>
-                              </w:rPr>
-                              <w:t>:</w:t>
+                              <w:t xml:space="preserve">   :</w:t>
                             </w:r>
                             <w:r>
                               <w:rPr>
                                 <w:sz w:val="16"/>
                                 <w:szCs w:val="16"/>
                               </w:rPr>
-                              <w:t xml:space="preserve"> </w:t>
-                            </w:r>
-                            <w:proofErr w:type="gramStart"/>
-                            <w:r>
-                              <w:rPr>
-                                <w:sz w:val="16"/>
-                                <w:szCs w:val="16"/>
-                              </w:rPr>
-                              <w:t xml:space="preserve">   {</w:t>
+                              <w:t xml:space="preserve">    {</w:t>
                             </w:r>
                             <w:proofErr w:type="spellStart"/>
-                            <w:proofErr w:type="gramEnd"/>
                             <w:r>
                               <w:rPr>
                                 <w:sz w:val="16"/>
@@ -6319,15 +6154,7 @@
                                 <w:sz w:val="16"/>
                                 <w:szCs w:val="16"/>
                               </w:rPr>
-                              <w:t>}</w:t>
-                            </w:r>
-                            <w:proofErr w:type="gramStart"/>
-                            <w:r>
-                              <w:rPr>
-                                <w:sz w:val="16"/>
-                                <w:szCs w:val="16"/>
-                              </w:rPr>
-                              <w:t>}</w:t>
+                              <w:t>}}</w:t>
                             </w:r>
                             <w:r>
                               <w:rPr>
@@ -6336,7 +6163,6 @@
                               </w:rPr>
                               <w:t xml:space="preserve"> :</w:t>
                             </w:r>
-                            <w:proofErr w:type="gramEnd"/>
                             <w:r>
                               <w:rPr>
                                 <w:sz w:val="16"/>
@@ -6384,7 +6210,6 @@
                               <w:t>ifFourMedIsNotAvail</w:t>
                             </w:r>
                             <w:proofErr w:type="spellEnd"/>
-                            <w:proofErr w:type="gramStart"/>
                             <w:r>
                               <w:rPr>
                                 <w:sz w:val="16"/>
@@ -6399,7 +6224,6 @@
                               </w:rPr>
                               <w:t xml:space="preserve">   </w:t>
                             </w:r>
-                            <w:proofErr w:type="gramEnd"/>
                             <w:r>
                               <w:rPr>
                                 <w:sz w:val="16"/>
@@ -6454,7 +6278,6 @@
                               <w:t>ifFiveMedIsNotAvail</w:t>
                             </w:r>
                             <w:proofErr w:type="spellEnd"/>
-                            <w:proofErr w:type="gramStart"/>
                             <w:r>
                               <w:rPr>
                                 <w:sz w:val="16"/>
@@ -6469,7 +6292,6 @@
                               </w:rPr>
                               <w:t xml:space="preserve">   </w:t>
                             </w:r>
-                            <w:proofErr w:type="gramEnd"/>
                             <w:r>
                               <w:rPr>
                                 <w:sz w:val="16"/>
@@ -6521,23 +6343,7 @@
                                 <w:sz w:val="16"/>
                                 <w:szCs w:val="16"/>
                               </w:rPr>
-                              <w:t>{Given this {date}day of {month</w:t>
-                            </w:r>
-                            <w:proofErr w:type="gramStart"/>
-                            <w:r>
-                              <w:rPr>
-                                <w:sz w:val="16"/>
-                                <w:szCs w:val="16"/>
-                              </w:rPr>
-                              <w:t>},{</w:t>
-                            </w:r>
-                            <w:proofErr w:type="gramEnd"/>
-                            <w:r>
-                              <w:rPr>
-                                <w:sz w:val="16"/>
-                                <w:szCs w:val="16"/>
-                              </w:rPr>
-                              <w:t>year}}</w:t>
+                              <w:t>{Given this {date}day of {month},{year}}</w:t>
                             </w:r>
                           </w:p>
                           <w:p>
@@ -6673,7 +6479,6 @@
                         <w:t xml:space="preserve"> by{</w:t>
                       </w:r>
                       <w:proofErr w:type="spellStart"/>
-                      <w:proofErr w:type="gramStart"/>
                       <w:r>
                         <w:rPr>
                           <w:sz w:val="16"/>
@@ -6687,15 +6492,7 @@
                           <w:sz w:val="16"/>
                           <w:szCs w:val="16"/>
                         </w:rPr>
-                        <w:t>,{</w:t>
-                      </w:r>
-                      <w:proofErr w:type="gramEnd"/>
-                      <w:r>
-                        <w:rPr>
-                          <w:sz w:val="16"/>
-                          <w:szCs w:val="16"/>
-                        </w:rPr>
-                        <w:t>MD}}</w:t>
+                        <w:t>,{MD}}</w:t>
                       </w:r>
                     </w:p>
                     <w:p>
@@ -6745,7 +6542,6 @@
                         <w:t>ifOneMedIsNotAvail</w:t>
                       </w:r>
                       <w:proofErr w:type="spellEnd"/>
-                      <w:proofErr w:type="gramStart"/>
                       <w:r>
                         <w:rPr>
                           <w:sz w:val="16"/>
@@ -6758,33 +6554,16 @@
                           <w:sz w:val="16"/>
                           <w:szCs w:val="16"/>
                         </w:rPr>
-                        <w:t xml:space="preserve">   </w:t>
-                      </w:r>
-                      <w:proofErr w:type="gramEnd"/>
-                      <w:r>
-                        <w:rPr>
-                          <w:sz w:val="16"/>
-                          <w:szCs w:val="16"/>
-                        </w:rPr>
-                        <w:t xml:space="preserve"> :</w:t>
+                        <w:t xml:space="preserve">    :</w:t>
                       </w:r>
                       <w:r>
                         <w:rPr>
                           <w:sz w:val="16"/>
                           <w:szCs w:val="16"/>
                         </w:rPr>
-                        <w:t xml:space="preserve"> </w:t>
-                      </w:r>
-                      <w:proofErr w:type="gramStart"/>
-                      <w:r>
-                        <w:rPr>
-                          <w:sz w:val="16"/>
-                          <w:szCs w:val="16"/>
-                        </w:rPr>
-                        <w:t xml:space="preserve">   {</w:t>
+                        <w:t xml:space="preserve">    {</w:t>
                       </w:r>
                       <w:proofErr w:type="spellStart"/>
-                      <w:proofErr w:type="gramEnd"/>
                       <w:r>
                         <w:rPr>
                           <w:sz w:val="16"/>
@@ -6824,7 +6603,6 @@
                         <w:t>ifTwoMedIsNotAvail</w:t>
                       </w:r>
                       <w:proofErr w:type="spellEnd"/>
-                      <w:proofErr w:type="gramStart"/>
                       <w:r>
                         <w:rPr>
                           <w:sz w:val="16"/>
@@ -6837,33 +6615,16 @@
                           <w:sz w:val="16"/>
                           <w:szCs w:val="16"/>
                         </w:rPr>
-                        <w:t xml:space="preserve">   </w:t>
-                      </w:r>
-                      <w:proofErr w:type="gramEnd"/>
-                      <w:r>
-                        <w:rPr>
-                          <w:sz w:val="16"/>
-                          <w:szCs w:val="16"/>
-                        </w:rPr>
-                        <w:t>:</w:t>
+                        <w:t xml:space="preserve">   :</w:t>
                       </w:r>
                       <w:r>
                         <w:rPr>
                           <w:sz w:val="16"/>
                           <w:szCs w:val="16"/>
                         </w:rPr>
-                        <w:t xml:space="preserve"> </w:t>
-                      </w:r>
-                      <w:proofErr w:type="gramStart"/>
-                      <w:r>
-                        <w:rPr>
-                          <w:sz w:val="16"/>
-                          <w:szCs w:val="16"/>
-                        </w:rPr>
-                        <w:t xml:space="preserve">   {</w:t>
+                        <w:t xml:space="preserve">    {</w:t>
                       </w:r>
                       <w:proofErr w:type="spellStart"/>
-                      <w:proofErr w:type="gramEnd"/>
                       <w:r>
                         <w:rPr>
                           <w:sz w:val="16"/>
@@ -6908,15 +6669,7 @@
                           <w:sz w:val="16"/>
                           <w:szCs w:val="16"/>
                         </w:rPr>
-                        <w:t>}</w:t>
-                      </w:r>
-                      <w:proofErr w:type="gramStart"/>
-                      <w:r>
-                        <w:rPr>
-                          <w:sz w:val="16"/>
-                          <w:szCs w:val="16"/>
-                        </w:rPr>
-                        <w:t>}</w:t>
+                        <w:t>}}</w:t>
                       </w:r>
                       <w:r>
                         <w:rPr>
@@ -6925,7 +6678,6 @@
                         </w:rPr>
                         <w:t xml:space="preserve"> :</w:t>
                       </w:r>
-                      <w:proofErr w:type="gramEnd"/>
                       <w:r>
                         <w:rPr>
                           <w:sz w:val="16"/>
@@ -6973,7 +6725,6 @@
                         <w:t>ifFourMedIsNotAvail</w:t>
                       </w:r>
                       <w:proofErr w:type="spellEnd"/>
-                      <w:proofErr w:type="gramStart"/>
                       <w:r>
                         <w:rPr>
                           <w:sz w:val="16"/>
@@ -6988,7 +6739,6 @@
                         </w:rPr>
                         <w:t xml:space="preserve">   </w:t>
                       </w:r>
-                      <w:proofErr w:type="gramEnd"/>
                       <w:r>
                         <w:rPr>
                           <w:sz w:val="16"/>
@@ -7043,7 +6793,6 @@
                         <w:t>ifFiveMedIsNotAvail</w:t>
                       </w:r>
                       <w:proofErr w:type="spellEnd"/>
-                      <w:proofErr w:type="gramStart"/>
                       <w:r>
                         <w:rPr>
                           <w:sz w:val="16"/>
@@ -7058,7 +6807,6 @@
                         </w:rPr>
                         <w:t xml:space="preserve">   </w:t>
                       </w:r>
-                      <w:proofErr w:type="gramEnd"/>
                       <w:r>
                         <w:rPr>
                           <w:sz w:val="16"/>
@@ -7110,23 +6858,7 @@
                           <w:sz w:val="16"/>
                           <w:szCs w:val="16"/>
                         </w:rPr>
-                        <w:t>{Given this {date}day of {month</w:t>
-                      </w:r>
-                      <w:proofErr w:type="gramStart"/>
-                      <w:r>
-                        <w:rPr>
-                          <w:sz w:val="16"/>
-                          <w:szCs w:val="16"/>
-                        </w:rPr>
-                        <w:t>},{</w:t>
-                      </w:r>
-                      <w:proofErr w:type="gramEnd"/>
-                      <w:r>
-                        <w:rPr>
-                          <w:sz w:val="16"/>
-                          <w:szCs w:val="16"/>
-                        </w:rPr>
-                        <w:t>year}}</w:t>
+                        <w:t>{Given this {date}day of {month},{year}}</w:t>
                       </w:r>
                     </w:p>
                     <w:p>
@@ -8248,7 +7980,7 @@
 </file>
 
 <file path=word/endnotes.xml><?xml version="1.0" encoding="utf-8"?>
-<w:endnotes xmlns:wpc="http://schemas.microsoft.com/office/word/2010/wordprocessingCanvas" xmlns:cx="http://schemas.microsoft.com/office/drawing/2014/chartex" xmlns:cx1="http://schemas.microsoft.com/office/drawing/2015/9/8/chartex" xmlns:cx2="http://schemas.microsoft.com/office/drawing/2015/10/21/chartex" xmlns:cx3="http://schemas.microsoft.com/office/drawing/2016/5/9/chartex" xmlns:cx4="http://schemas.microsoft.com/office/drawing/2016/5/10/chartex" xmlns:cx5="http://schemas.microsoft.com/office/drawing/2016/5/11/chartex" xmlns:cx6="http://schemas.microsoft.com/office/drawing/2016/5/12/chartex" xmlns:cx7="http://schemas.microsoft.com/office/drawing/2016/5/13/chartex" xmlns:cx8="http://schemas.microsoft.com/office/drawing/2016/5/14/chartex" xmlns:mc="http://schemas.openxmlformats.org/markup-compatibility/2006" xmlns:aink="http://schemas.microsoft.com/office/drawing/2016/ink" xmlns:am3d="http://schemas.microsoft.com/office/drawing/2017/model3d" xmlns:o="urn:schemas-microsoft-com:office:office" xmlns:oel="http://schemas.microsoft.com/office/2019/extlst" xmlns:r="http://schemas.openxmlformats.org/officeDocument/2006/relationships" xmlns:m="http://schemas.openxmlformats.org/officeDocument/2006/math" xmlns:v="urn:schemas-microsoft-com:vml" xmlns:wp14="http://schemas.microsoft.com/office/word/2010/wordprocessingDrawing" xmlns:wp="http://schemas.openxmlformats.org/drawingml/2006/wordprocessingDrawing" xmlns:w10="urn:schemas-microsoft-com:office:word" xmlns:w="http://schemas.openxmlformats.org/wordprocessingml/2006/main" xmlns:w14="http://schemas.microsoft.com/office/word/2010/wordml" xmlns:w15="http://schemas.microsoft.com/office/word/2012/wordml" xmlns:w16cei="http://schemas.microsoft.com/office/word/2026/wordml/cei" xmlns:w16cex="http://schemas.microsoft.com/office/word/2018/wordml/cex" xmlns:w16cid="http://schemas.microsoft.com/office/word/2016/wordml/cid" xmlns:w16="http://schemas.microsoft.com/office/word/2018/wordml" xmlns:w16du="http://schemas.microsoft.com/office/word/2023/wordml/word16du" xmlns:w16sdtdh="http://schemas.microsoft.com/office/word/2020/wordml/sdtdatahash" xmlns:w16sdtfl="http://schemas.microsoft.com/office/word/2024/wordml/sdtformatlock" xmlns:w16se="http://schemas.microsoft.com/office/word/2015/wordml/symex" xmlns:wpg="http://schemas.microsoft.com/office/word/2010/wordprocessingGroup" xmlns:wpi="http://schemas.microsoft.com/office/word/2010/wordprocessingInk" xmlns:wne="http://schemas.microsoft.com/office/word/2006/wordml" xmlns:wps="http://schemas.microsoft.com/office/word/2010/wordprocessingShape" mc:Ignorable="w14 w15 w16se w16cid w16 w16cex w16sdtdh w16sdtfl w16du wp14">
+<w:endnotes xmlns:wpc="http://schemas.microsoft.com/office/word/2010/wordprocessingCanvas" xmlns:cx="http://schemas.microsoft.com/office/drawing/2014/chartex" xmlns:cx1="http://schemas.microsoft.com/office/drawing/2015/9/8/chartex" xmlns:cx2="http://schemas.microsoft.com/office/drawing/2015/10/21/chartex" xmlns:cx3="http://schemas.microsoft.com/office/drawing/2016/5/9/chartex" xmlns:cx4="http://schemas.microsoft.com/office/drawing/2016/5/10/chartex" xmlns:cx5="http://schemas.microsoft.com/office/drawing/2016/5/11/chartex" xmlns:cx6="http://schemas.microsoft.com/office/drawing/2016/5/12/chartex" xmlns:cx7="http://schemas.microsoft.com/office/drawing/2016/5/13/chartex" xmlns:cx8="http://schemas.microsoft.com/office/drawing/2016/5/14/chartex" xmlns:mc="http://schemas.openxmlformats.org/markup-compatibility/2006" xmlns:aink="http://schemas.microsoft.com/office/drawing/2016/ink" xmlns:am3d="http://schemas.microsoft.com/office/drawing/2017/model3d" xmlns:o="urn:schemas-microsoft-com:office:office" xmlns:oel="http://schemas.microsoft.com/office/2019/extlst" xmlns:r="http://schemas.openxmlformats.org/officeDocument/2006/relationships" xmlns:m="http://schemas.openxmlformats.org/officeDocument/2006/math" xmlns:v="urn:schemas-microsoft-com:vml" xmlns:wp14="http://schemas.microsoft.com/office/word/2010/wordprocessingDrawing" xmlns:wp="http://schemas.openxmlformats.org/drawingml/2006/wordprocessingDrawing" xmlns:w10="urn:schemas-microsoft-com:office:word" xmlns:w="http://schemas.openxmlformats.org/wordprocessingml/2006/main" xmlns:w14="http://schemas.microsoft.com/office/word/2010/wordml" xmlns:w15="http://schemas.microsoft.com/office/word/2012/wordml" xmlns:w16cex="http://schemas.microsoft.com/office/word/2018/wordml/cex" xmlns:w16cid="http://schemas.microsoft.com/office/word/2016/wordml/cid" xmlns:w16="http://schemas.microsoft.com/office/word/2018/wordml" xmlns:w16du="http://schemas.microsoft.com/office/word/2023/wordml/word16du" xmlns:w16sdtdh="http://schemas.microsoft.com/office/word/2020/wordml/sdtdatahash" xmlns:w16sdtfl="http://schemas.microsoft.com/office/word/2024/wordml/sdtformatlock" xmlns:w16se="http://schemas.microsoft.com/office/word/2015/wordml/symex" xmlns:wpg="http://schemas.microsoft.com/office/word/2010/wordprocessingGroup" xmlns:wpi="http://schemas.microsoft.com/office/word/2010/wordprocessingInk" xmlns:wne="http://schemas.microsoft.com/office/word/2006/wordml" xmlns:wps="http://schemas.microsoft.com/office/word/2010/wordprocessingShape" mc:Ignorable="w14 w15 w16se w16cid w16 w16cex w16sdtdh w16sdtfl w16du wp14">
   <w:endnote w:type="separator" w:id="-1">
     <w:p>
       <w:r>
@@ -8267,7 +7999,7 @@
 </file>
 
 <file path=word/footer1.xml><?xml version="1.0" encoding="utf-8"?>
-<w:ftr xmlns:wpc="http://schemas.microsoft.com/office/word/2010/wordprocessingCanvas" xmlns:cx="http://schemas.microsoft.com/office/drawing/2014/chartex" xmlns:cx1="http://schemas.microsoft.com/office/drawing/2015/9/8/chartex" xmlns:cx2="http://schemas.microsoft.com/office/drawing/2015/10/21/chartex" xmlns:cx3="http://schemas.microsoft.com/office/drawing/2016/5/9/chartex" xmlns:cx4="http://schemas.microsoft.com/office/drawing/2016/5/10/chartex" xmlns:cx5="http://schemas.microsoft.com/office/drawing/2016/5/11/chartex" xmlns:cx6="http://schemas.microsoft.com/office/drawing/2016/5/12/chartex" xmlns:cx7="http://schemas.microsoft.com/office/drawing/2016/5/13/chartex" xmlns:cx8="http://schemas.microsoft.com/office/drawing/2016/5/14/chartex" xmlns:mc="http://schemas.openxmlformats.org/markup-compatibility/2006" xmlns:aink="http://schemas.microsoft.com/office/drawing/2016/ink" xmlns:am3d="http://schemas.microsoft.com/office/drawing/2017/model3d" xmlns:o="urn:schemas-microsoft-com:office:office" xmlns:oel="http://schemas.microsoft.com/office/2019/extlst" xmlns:r="http://schemas.openxmlformats.org/officeDocument/2006/relationships" xmlns:m="http://schemas.openxmlformats.org/officeDocument/2006/math" xmlns:v="urn:schemas-microsoft-com:vml" xmlns:wp14="http://schemas.microsoft.com/office/word/2010/wordprocessingDrawing" xmlns:wp="http://schemas.openxmlformats.org/drawingml/2006/wordprocessingDrawing" xmlns:w10="urn:schemas-microsoft-com:office:word" xmlns:w="http://schemas.openxmlformats.org/wordprocessingml/2006/main" xmlns:w14="http://schemas.microsoft.com/office/word/2010/wordml" xmlns:w15="http://schemas.microsoft.com/office/word/2012/wordml" xmlns:w16cei="http://schemas.microsoft.com/office/word/2026/wordml/cei" xmlns:w16cex="http://schemas.microsoft.com/office/word/2018/wordml/cex" xmlns:w16cid="http://schemas.microsoft.com/office/word/2016/wordml/cid" xmlns:w16="http://schemas.microsoft.com/office/word/2018/wordml" xmlns:w16du="http://schemas.microsoft.com/office/word/2023/wordml/word16du" xmlns:w16sdtdh="http://schemas.microsoft.com/office/word/2020/wordml/sdtdatahash" xmlns:w16sdtfl="http://schemas.microsoft.com/office/word/2024/wordml/sdtformatlock" xmlns:w16se="http://schemas.microsoft.com/office/word/2015/wordml/symex" xmlns:wpg="http://schemas.microsoft.com/office/word/2010/wordprocessingGroup" xmlns:wpi="http://schemas.microsoft.com/office/word/2010/wordprocessingInk" xmlns:wne="http://schemas.microsoft.com/office/word/2006/wordml" xmlns:wps="http://schemas.microsoft.com/office/word/2010/wordprocessingShape" mc:Ignorable="w14 w15 w16se w16cid w16 w16cex w16sdtdh w16sdtfl w16du wp14">
+<w:ftr xmlns:wpc="http://schemas.microsoft.com/office/word/2010/wordprocessingCanvas" xmlns:cx="http://schemas.microsoft.com/office/drawing/2014/chartex" xmlns:cx1="http://schemas.microsoft.com/office/drawing/2015/9/8/chartex" xmlns:cx2="http://schemas.microsoft.com/office/drawing/2015/10/21/chartex" xmlns:cx3="http://schemas.microsoft.com/office/drawing/2016/5/9/chartex" xmlns:cx4="http://schemas.microsoft.com/office/drawing/2016/5/10/chartex" xmlns:cx5="http://schemas.microsoft.com/office/drawing/2016/5/11/chartex" xmlns:cx6="http://schemas.microsoft.com/office/drawing/2016/5/12/chartex" xmlns:cx7="http://schemas.microsoft.com/office/drawing/2016/5/13/chartex" xmlns:cx8="http://schemas.microsoft.com/office/drawing/2016/5/14/chartex" xmlns:mc="http://schemas.openxmlformats.org/markup-compatibility/2006" xmlns:aink="http://schemas.microsoft.com/office/drawing/2016/ink" xmlns:am3d="http://schemas.microsoft.com/office/drawing/2017/model3d" xmlns:o="urn:schemas-microsoft-com:office:office" xmlns:oel="http://schemas.microsoft.com/office/2019/extlst" xmlns:r="http://schemas.openxmlformats.org/officeDocument/2006/relationships" xmlns:m="http://schemas.openxmlformats.org/officeDocument/2006/math" xmlns:v="urn:schemas-microsoft-com:vml" xmlns:wp14="http://schemas.microsoft.com/office/word/2010/wordprocessingDrawing" xmlns:wp="http://schemas.openxmlformats.org/drawingml/2006/wordprocessingDrawing" xmlns:w10="urn:schemas-microsoft-com:office:word" xmlns:w="http://schemas.openxmlformats.org/wordprocessingml/2006/main" xmlns:w14="http://schemas.microsoft.com/office/word/2010/wordml" xmlns:w15="http://schemas.microsoft.com/office/word/2012/wordml" xmlns:w16cex="http://schemas.microsoft.com/office/word/2018/wordml/cex" xmlns:w16cid="http://schemas.microsoft.com/office/word/2016/wordml/cid" xmlns:w16="http://schemas.microsoft.com/office/word/2018/wordml" xmlns:w16du="http://schemas.microsoft.com/office/word/2023/wordml/word16du" xmlns:w16sdtdh="http://schemas.microsoft.com/office/word/2020/wordml/sdtdatahash" xmlns:w16sdtfl="http://schemas.microsoft.com/office/word/2024/wordml/sdtformatlock" xmlns:w16se="http://schemas.microsoft.com/office/word/2015/wordml/symex" xmlns:wpg="http://schemas.microsoft.com/office/word/2010/wordprocessingGroup" xmlns:wpi="http://schemas.microsoft.com/office/word/2010/wordprocessingInk" xmlns:wne="http://schemas.microsoft.com/office/word/2006/wordml" xmlns:wps="http://schemas.microsoft.com/office/word/2010/wordprocessingShape" mc:Ignorable="w14 w15 w16se w16cid w16 w16cex w16sdtdh w16sdtfl w16du wp14">
   <w:p>
     <w:pPr>
       <w:pStyle w:val="Footer"/>
@@ -8463,7 +8195,7 @@
 </file>
 
 <file path=word/footnotes.xml><?xml version="1.0" encoding="utf-8"?>
-<w:footnotes xmlns:wpc="http://schemas.microsoft.com/office/word/2010/wordprocessingCanvas" xmlns:cx="http://schemas.microsoft.com/office/drawing/2014/chartex" xmlns:cx1="http://schemas.microsoft.com/office/drawing/2015/9/8/chartex" xmlns:cx2="http://schemas.microsoft.com/office/drawing/2015/10/21/chartex" xmlns:cx3="http://schemas.microsoft.com/office/drawing/2016/5/9/chartex" xmlns:cx4="http://schemas.microsoft.com/office/drawing/2016/5/10/chartex" xmlns:cx5="http://schemas.microsoft.com/office/drawing/2016/5/11/chartex" xmlns:cx6="http://schemas.microsoft.com/office/drawing/2016/5/12/chartex" xmlns:cx7="http://schemas.microsoft.com/office/drawing/2016/5/13/chartex" xmlns:cx8="http://schemas.microsoft.com/office/drawing/2016/5/14/chartex" xmlns:mc="http://schemas.openxmlformats.org/markup-compatibility/2006" xmlns:aink="http://schemas.microsoft.com/office/drawing/2016/ink" xmlns:am3d="http://schemas.microsoft.com/office/drawing/2017/model3d" xmlns:o="urn:schemas-microsoft-com:office:office" xmlns:oel="http://schemas.microsoft.com/office/2019/extlst" xmlns:r="http://schemas.openxmlformats.org/officeDocument/2006/relationships" xmlns:m="http://schemas.openxmlformats.org/officeDocument/2006/math" xmlns:v="urn:schemas-microsoft-com:vml" xmlns:wp14="http://schemas.microsoft.com/office/word/2010/wordprocessingDrawing" xmlns:wp="http://schemas.openxmlformats.org/drawingml/2006/wordprocessingDrawing" xmlns:w10="urn:schemas-microsoft-com:office:word" xmlns:w="http://schemas.openxmlformats.org/wordprocessingml/2006/main" xmlns:w14="http://schemas.microsoft.com/office/word/2010/wordml" xmlns:w15="http://schemas.microsoft.com/office/word/2012/wordml" xmlns:w16cei="http://schemas.microsoft.com/office/word/2026/wordml/cei" xmlns:w16cex="http://schemas.microsoft.com/office/word/2018/wordml/cex" xmlns:w16cid="http://schemas.microsoft.com/office/word/2016/wordml/cid" xmlns:w16="http://schemas.microsoft.com/office/word/2018/wordml" xmlns:w16du="http://schemas.microsoft.com/office/word/2023/wordml/word16du" xmlns:w16sdtdh="http://schemas.microsoft.com/office/word/2020/wordml/sdtdatahash" xmlns:w16sdtfl="http://schemas.microsoft.com/office/word/2024/wordml/sdtformatlock" xmlns:w16se="http://schemas.microsoft.com/office/word/2015/wordml/symex" xmlns:wpg="http://schemas.microsoft.com/office/word/2010/wordprocessingGroup" xmlns:wpi="http://schemas.microsoft.com/office/word/2010/wordprocessingInk" xmlns:wne="http://schemas.microsoft.com/office/word/2006/wordml" xmlns:wps="http://schemas.microsoft.com/office/word/2010/wordprocessingShape" mc:Ignorable="w14 w15 w16se w16cid w16 w16cex w16sdtdh w16sdtfl w16du wp14">
+<w:footnotes xmlns:wpc="http://schemas.microsoft.com/office/word/2010/wordprocessingCanvas" xmlns:cx="http://schemas.microsoft.com/office/drawing/2014/chartex" xmlns:cx1="http://schemas.microsoft.com/office/drawing/2015/9/8/chartex" xmlns:cx2="http://schemas.microsoft.com/office/drawing/2015/10/21/chartex" xmlns:cx3="http://schemas.microsoft.com/office/drawing/2016/5/9/chartex" xmlns:cx4="http://schemas.microsoft.com/office/drawing/2016/5/10/chartex" xmlns:cx5="http://schemas.microsoft.com/office/drawing/2016/5/11/chartex" xmlns:cx6="http://schemas.microsoft.com/office/drawing/2016/5/12/chartex" xmlns:cx7="http://schemas.microsoft.com/office/drawing/2016/5/13/chartex" xmlns:cx8="http://schemas.microsoft.com/office/drawing/2016/5/14/chartex" xmlns:mc="http://schemas.openxmlformats.org/markup-compatibility/2006" xmlns:aink="http://schemas.microsoft.com/office/drawing/2016/ink" xmlns:am3d="http://schemas.microsoft.com/office/drawing/2017/model3d" xmlns:o="urn:schemas-microsoft-com:office:office" xmlns:oel="http://schemas.microsoft.com/office/2019/extlst" xmlns:r="http://schemas.openxmlformats.org/officeDocument/2006/relationships" xmlns:m="http://schemas.openxmlformats.org/officeDocument/2006/math" xmlns:v="urn:schemas-microsoft-com:vml" xmlns:wp14="http://schemas.microsoft.com/office/word/2010/wordprocessingDrawing" xmlns:wp="http://schemas.openxmlformats.org/drawingml/2006/wordprocessingDrawing" xmlns:w10="urn:schemas-microsoft-com:office:word" xmlns:w="http://schemas.openxmlformats.org/wordprocessingml/2006/main" xmlns:w14="http://schemas.microsoft.com/office/word/2010/wordml" xmlns:w15="http://schemas.microsoft.com/office/word/2012/wordml" xmlns:w16cex="http://schemas.microsoft.com/office/word/2018/wordml/cex" xmlns:w16cid="http://schemas.microsoft.com/office/word/2016/wordml/cid" xmlns:w16="http://schemas.microsoft.com/office/word/2018/wordml" xmlns:w16du="http://schemas.microsoft.com/office/word/2023/wordml/word16du" xmlns:w16sdtdh="http://schemas.microsoft.com/office/word/2020/wordml/sdtdatahash" xmlns:w16sdtfl="http://schemas.microsoft.com/office/word/2024/wordml/sdtformatlock" xmlns:w16se="http://schemas.microsoft.com/office/word/2015/wordml/symex" xmlns:wpg="http://schemas.microsoft.com/office/word/2010/wordprocessingGroup" xmlns:wpi="http://schemas.microsoft.com/office/word/2010/wordprocessingInk" xmlns:wne="http://schemas.microsoft.com/office/word/2006/wordml" xmlns:wps="http://schemas.microsoft.com/office/word/2010/wordprocessingShape" mc:Ignorable="w14 w15 w16se w16cid w16 w16cex w16sdtdh w16sdtfl w16du wp14">
   <w:footnote w:type="separator" w:id="-1">
     <w:p>
       <w:r>
@@ -8482,7 +8214,7 @@
 </file>
 
 <file path=word/header1.xml><?xml version="1.0" encoding="utf-8"?>
-<w:hdr xmlns:wpc="http://schemas.microsoft.com/office/word/2010/wordprocessingCanvas" xmlns:cx="http://schemas.microsoft.com/office/drawing/2014/chartex" xmlns:cx1="http://schemas.microsoft.com/office/drawing/2015/9/8/chartex" xmlns:cx2="http://schemas.microsoft.com/office/drawing/2015/10/21/chartex" xmlns:cx3="http://schemas.microsoft.com/office/drawing/2016/5/9/chartex" xmlns:cx4="http://schemas.microsoft.com/office/drawing/2016/5/10/chartex" xmlns:cx5="http://schemas.microsoft.com/office/drawing/2016/5/11/chartex" xmlns:cx6="http://schemas.microsoft.com/office/drawing/2016/5/12/chartex" xmlns:cx7="http://schemas.microsoft.com/office/drawing/2016/5/13/chartex" xmlns:cx8="http://schemas.microsoft.com/office/drawing/2016/5/14/chartex" xmlns:mc="http://schemas.openxmlformats.org/markup-compatibility/2006" xmlns:aink="http://schemas.microsoft.com/office/drawing/2016/ink" xmlns:am3d="http://schemas.microsoft.com/office/drawing/2017/model3d" xmlns:o="urn:schemas-microsoft-com:office:office" xmlns:oel="http://schemas.microsoft.com/office/2019/extlst" xmlns:r="http://schemas.openxmlformats.org/officeDocument/2006/relationships" xmlns:m="http://schemas.openxmlformats.org/officeDocument/2006/math" xmlns:v="urn:schemas-microsoft-com:vml" xmlns:wp14="http://schemas.microsoft.com/office/word/2010/wordprocessingDrawing" xmlns:wp="http://schemas.openxmlformats.org/drawingml/2006/wordprocessingDrawing" xmlns:w10="urn:schemas-microsoft-com:office:word" xmlns:w="http://schemas.openxmlformats.org/wordprocessingml/2006/main" xmlns:w14="http://schemas.microsoft.com/office/word/2010/wordml" xmlns:w15="http://schemas.microsoft.com/office/word/2012/wordml" xmlns:w16cei="http://schemas.microsoft.com/office/word/2026/wordml/cei" xmlns:w16cex="http://schemas.microsoft.com/office/word/2018/wordml/cex" xmlns:w16cid="http://schemas.microsoft.com/office/word/2016/wordml/cid" xmlns:w16="http://schemas.microsoft.com/office/word/2018/wordml" xmlns:w16du="http://schemas.microsoft.com/office/word/2023/wordml/word16du" xmlns:w16sdtdh="http://schemas.microsoft.com/office/word/2020/wordml/sdtdatahash" xmlns:w16sdtfl="http://schemas.microsoft.com/office/word/2024/wordml/sdtformatlock" xmlns:w16se="http://schemas.microsoft.com/office/word/2015/wordml/symex" xmlns:wpg="http://schemas.microsoft.com/office/word/2010/wordprocessingGroup" xmlns:wpi="http://schemas.microsoft.com/office/word/2010/wordprocessingInk" xmlns:wne="http://schemas.microsoft.com/office/word/2006/wordml" xmlns:wps="http://schemas.microsoft.com/office/word/2010/wordprocessingShape" mc:Ignorable="w14 w15 w16se w16cid w16 w16cex w16sdtdh w16sdtfl w16du wp14">
+<w:hdr xmlns:wpc="http://schemas.microsoft.com/office/word/2010/wordprocessingCanvas" xmlns:cx="http://schemas.microsoft.com/office/drawing/2014/chartex" xmlns:cx1="http://schemas.microsoft.com/office/drawing/2015/9/8/chartex" xmlns:cx2="http://schemas.microsoft.com/office/drawing/2015/10/21/chartex" xmlns:cx3="http://schemas.microsoft.com/office/drawing/2016/5/9/chartex" xmlns:cx4="http://schemas.microsoft.com/office/drawing/2016/5/10/chartex" xmlns:cx5="http://schemas.microsoft.com/office/drawing/2016/5/11/chartex" xmlns:cx6="http://schemas.microsoft.com/office/drawing/2016/5/12/chartex" xmlns:cx7="http://schemas.microsoft.com/office/drawing/2016/5/13/chartex" xmlns:cx8="http://schemas.microsoft.com/office/drawing/2016/5/14/chartex" xmlns:mc="http://schemas.openxmlformats.org/markup-compatibility/2006" xmlns:aink="http://schemas.microsoft.com/office/drawing/2016/ink" xmlns:am3d="http://schemas.microsoft.com/office/drawing/2017/model3d" xmlns:o="urn:schemas-microsoft-com:office:office" xmlns:oel="http://schemas.microsoft.com/office/2019/extlst" xmlns:r="http://schemas.openxmlformats.org/officeDocument/2006/relationships" xmlns:m="http://schemas.openxmlformats.org/officeDocument/2006/math" xmlns:v="urn:schemas-microsoft-com:vml" xmlns:wp14="http://schemas.microsoft.com/office/word/2010/wordprocessingDrawing" xmlns:wp="http://schemas.openxmlformats.org/drawingml/2006/wordprocessingDrawing" xmlns:w10="urn:schemas-microsoft-com:office:word" xmlns:w="http://schemas.openxmlformats.org/wordprocessingml/2006/main" xmlns:w14="http://schemas.microsoft.com/office/word/2010/wordml" xmlns:w15="http://schemas.microsoft.com/office/word/2012/wordml" xmlns:w16cex="http://schemas.microsoft.com/office/word/2018/wordml/cex" xmlns:w16cid="http://schemas.microsoft.com/office/word/2016/wordml/cid" xmlns:w16="http://schemas.microsoft.com/office/word/2018/wordml" xmlns:w16du="http://schemas.microsoft.com/office/word/2023/wordml/word16du" xmlns:w16sdtdh="http://schemas.microsoft.com/office/word/2020/wordml/sdtdatahash" xmlns:w16sdtfl="http://schemas.microsoft.com/office/word/2024/wordml/sdtformatlock" xmlns:w16se="http://schemas.microsoft.com/office/word/2015/wordml/symex" xmlns:wpg="http://schemas.microsoft.com/office/word/2010/wordprocessingGroup" xmlns:wpi="http://schemas.microsoft.com/office/word/2010/wordprocessingInk" xmlns:wne="http://schemas.microsoft.com/office/word/2006/wordml" xmlns:wps="http://schemas.microsoft.com/office/word/2010/wordprocessingShape" mc:Ignorable="w14 w15 w16se w16cid w16 w16cex w16sdtdh w16sdtfl w16du wp14">
   <w:p>
     <w:pPr>
       <w:pStyle w:val="Header"/>

</xml_diff>

<commit_message>
fix(medicines): normalize medicine name casing on save
- Add toTitleCase() and apply it to genericName/brandName/medicineName
  wherever a medicine is created or edited (admin medicine database
  CRUD, CSV bulk-import, case medicine encoding + its auto-add-to-master-
  list path), so typed-in casing variants (amoXicillin, AMOXICILLIN)
  collapse to one consistent format (Amoxicillin).
- Add a one-time backfill script (backend/scripts/backfillMedicineNameCasing.mjs)
  to normalize casing on records already stored before this change.
- Log backup-download failures instead of letting them go silent.
- Update CGV AICS template.

Co-Authored-By: Claude Sonnet 5 <noreply@anthropic.com>
</commit_message>
<xml_diff>
--- a/templates/CGV AICS Template.fixed.docx
+++ b/templates/CGV AICS Template.fixed.docx
@@ -5655,24 +5655,6 @@
           <w:szCs w:val="20"/>
         </w:rPr>
         <w:t>}.</w:t>
-      </w:r>
-      <w:r>
-        <w:rPr>
-          <w:rFonts w:ascii="Georgia" w:hAnsi="Georgia"/>
-          <w:kern w:val="0"/>
-          <w:sz w:val="20"/>
-          <w:szCs w:val="20"/>
-        </w:rPr>
-        <w:t xml:space="preserve"> </w:t>
-      </w:r>
-      <w:r>
-        <w:rPr>
-          <w:rFonts w:ascii="Georgia" w:hAnsi="Georgia"/>
-          <w:kern w:val="0"/>
-          <w:sz w:val="20"/>
-          <w:szCs w:val="20"/>
-        </w:rPr>
-        <w:t xml:space="preserve">For this reason, the family sought assistance from the City Government to help ease their financial burden. </w:t>
       </w:r>
     </w:p>
     <w:p>

</xml_diff>

<commit_message>
chore(templates): update CGV AICS template
Co-Authored-By: Claude Sonnet 5 <noreply@anthropic.com>
</commit_message>
<xml_diff>
--- a/templates/CGV AICS Template.fixed.docx
+++ b/templates/CGV AICS Template.fixed.docx
@@ -5515,7 +5515,7 @@
           <w:sz w:val="20"/>
           <w:szCs w:val="20"/>
         </w:rPr>
-        <w:t>}.</w:t>
+        <w:t>}</w:t>
       </w:r>
     </w:p>
     <w:p>
@@ -7127,6 +7127,10 @@
           <w:szCs w:val="18"/>
         </w:rPr>
         <w:pict w14:anchorId="0F9DA61A">
+          <v:shapetype id="_x0000_t202" coordsize="21600,21600" o:spt="202" path="m,l,21600r21600,l21600,xe">
+            <v:stroke joinstyle="miter"/>
+            <v:path gradientshapeok="t" o:connecttype="rect"/>
+          </v:shapetype>
           <v:shape id="_x0000_s1027" type="#_x0000_t202" style="position:absolute;left:0;text-align:left;margin-left:20.4pt;margin-top:6.2pt;width:120.1pt;height:49.35pt;z-index:-251655168;visibility:visible;mso-height-percent:200;mso-wrap-distance-top:3.6pt;mso-wrap-distance-bottom:3.6pt;mso-height-percent:200;mso-width-relative:margin;mso-height-relative:margin" o:gfxdata="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" fillcolor="white [3212]" strokecolor="white [3212]">
             <v:textbox style="mso-fit-shape-to-text:t">
               <w:txbxContent>

</xml_diff>

<commit_message>
fix(case-study): stop hardcoding the year in the Control No. field
The Control No. line used a literal "2026" instead of the current
year, so it would go stale on the year rollover. Template now uses a
{yearNow} tag, and the renderer supplies it from the current date.

Co-Authored-By: Claude Sonnet 5 <noreply@anthropic.com>
</commit_message>
<xml_diff>
--- a/templates/CGV AICS Template.fixed.docx
+++ b/templates/CGV AICS Template.fixed.docx
@@ -124,7 +124,39 @@
           <w:sz w:val="20"/>
           <w:szCs w:val="20"/>
         </w:rPr>
-        <w:t>-2026</w:t>
+        <w:t>-</w:t>
+      </w:r>
+      <w:r>
+        <w:rPr>
+          <w:rFonts w:ascii="Georgia" w:hAnsi="Georgia"/>
+          <w:i/>
+          <w:iCs/>
+          <w:sz w:val="20"/>
+          <w:szCs w:val="20"/>
+        </w:rPr>
+        <w:t>{</w:t>
+      </w:r>
+      <w:proofErr w:type="spellStart"/>
+      <w:r>
+        <w:rPr>
+          <w:rFonts w:ascii="Georgia" w:hAnsi="Georgia"/>
+          <w:i/>
+          <w:iCs/>
+          <w:sz w:val="20"/>
+          <w:szCs w:val="20"/>
+        </w:rPr>
+        <w:t>yearNow</w:t>
+      </w:r>
+      <w:proofErr w:type="spellEnd"/>
+      <w:r>
+        <w:rPr>
+          <w:rFonts w:ascii="Georgia" w:hAnsi="Georgia"/>
+          <w:i/>
+          <w:iCs/>
+          <w:sz w:val="20"/>
+          <w:szCs w:val="20"/>
+        </w:rPr>
+        <w:t>}</w:t>
       </w:r>
       <w:r>
         <w:rPr>
@@ -256,9 +288,9 @@
           <w:sz w:val="14"/>
           <w:szCs w:val="14"/>
         </w:rPr>
-        <w:t>}Hospitalization Expenses    {</w:t>
-      </w:r>
-      <w:proofErr w:type="spellStart"/>
+        <w:t xml:space="preserve">}Hospitalization Expenses </w:t>
+      </w:r>
+      <w:proofErr w:type="gramStart"/>
       <w:r>
         <w:rPr>
           <w:rFonts w:ascii="MS Gothic" w:eastAsia="MS Gothic" w:hAnsi="MS Gothic"/>
@@ -266,9 +298,10 @@
           <w:sz w:val="14"/>
           <w:szCs w:val="14"/>
         </w:rPr>
-        <w:t>medicalCheckBox</w:t>
-      </w:r>
-      <w:proofErr w:type="spellEnd"/>
+        <w:t xml:space="preserve">   {</w:t>
+      </w:r>
+      <w:proofErr w:type="spellStart"/>
+      <w:proofErr w:type="gramEnd"/>
       <w:r>
         <w:rPr>
           <w:rFonts w:ascii="MS Gothic" w:eastAsia="MS Gothic" w:hAnsi="MS Gothic"/>
@@ -276,9 +309,30 @@
           <w:sz w:val="14"/>
           <w:szCs w:val="14"/>
         </w:rPr>
-        <w:t>}Medical Procedure/Examination  {</w:t>
+        <w:t>medicalCheckBox</w:t>
+      </w:r>
+      <w:proofErr w:type="spellEnd"/>
+      <w:r>
+        <w:rPr>
+          <w:rFonts w:ascii="MS Gothic" w:eastAsia="MS Gothic" w:hAnsi="MS Gothic"/>
+          <w:kern w:val="0"/>
+          <w:sz w:val="14"/>
+          <w:szCs w:val="14"/>
+        </w:rPr>
+        <w:t>}Medical Procedure/</w:t>
+      </w:r>
+      <w:proofErr w:type="gramStart"/>
+      <w:r>
+        <w:rPr>
+          <w:rFonts w:ascii="MS Gothic" w:eastAsia="MS Gothic" w:hAnsi="MS Gothic"/>
+          <w:kern w:val="0"/>
+          <w:sz w:val="14"/>
+          <w:szCs w:val="14"/>
+        </w:rPr>
+        <w:t>Examination  {</w:t>
       </w:r>
       <w:proofErr w:type="spellStart"/>
+      <w:proofErr w:type="gramEnd"/>
       <w:r>
         <w:rPr>
           <w:rFonts w:ascii="MS Gothic" w:eastAsia="MS Gothic" w:hAnsi="MS Gothic"/>
@@ -368,7 +422,87 @@
           <w:sz w:val="14"/>
           <w:szCs w:val="14"/>
         </w:rPr>
-        <w:t>{fourPsCheckBox}4Ps  {soloParentCheckBox}Solo Parent   {seniorCitizenCheckBox}Senior Citizen  {pwdCheckBox}PWD  {otherCategoryCheckBox}Others: {otherAssistanceText}</w:t>
+        <w:t>{fourPsCheckBox}4</w:t>
+      </w:r>
+      <w:proofErr w:type="gramStart"/>
+      <w:r>
+        <w:rPr>
+          <w:rFonts w:ascii="MS Gothic" w:eastAsia="MS Gothic" w:hAnsi="MS Gothic"/>
+          <w:kern w:val="0"/>
+          <w:sz w:val="14"/>
+          <w:szCs w:val="14"/>
+        </w:rPr>
+        <w:t>Ps  {</w:t>
+      </w:r>
+      <w:proofErr w:type="gramEnd"/>
+      <w:r>
+        <w:rPr>
+          <w:rFonts w:ascii="MS Gothic" w:eastAsia="MS Gothic" w:hAnsi="MS Gothic"/>
+          <w:kern w:val="0"/>
+          <w:sz w:val="14"/>
+          <w:szCs w:val="14"/>
+        </w:rPr>
+        <w:t>soloParentCheckBox}Solo Parent</w:t>
+      </w:r>
+      <w:proofErr w:type="gramStart"/>
+      <w:r>
+        <w:rPr>
+          <w:rFonts w:ascii="MS Gothic" w:eastAsia="MS Gothic" w:hAnsi="MS Gothic"/>
+          <w:kern w:val="0"/>
+          <w:sz w:val="14"/>
+          <w:szCs w:val="14"/>
+        </w:rPr>
+        <w:t xml:space="preserve">   {</w:t>
+      </w:r>
+      <w:proofErr w:type="gramEnd"/>
+      <w:r>
+        <w:rPr>
+          <w:rFonts w:ascii="MS Gothic" w:eastAsia="MS Gothic" w:hAnsi="MS Gothic"/>
+          <w:kern w:val="0"/>
+          <w:sz w:val="14"/>
+          <w:szCs w:val="14"/>
+        </w:rPr>
+        <w:t xml:space="preserve">seniorCitizenCheckBox}Senior </w:t>
+      </w:r>
+      <w:proofErr w:type="gramStart"/>
+      <w:r>
+        <w:rPr>
+          <w:rFonts w:ascii="MS Gothic" w:eastAsia="MS Gothic" w:hAnsi="MS Gothic"/>
+          <w:kern w:val="0"/>
+          <w:sz w:val="14"/>
+          <w:szCs w:val="14"/>
+        </w:rPr>
+        <w:t>Citizen  {</w:t>
+      </w:r>
+      <w:proofErr w:type="gramEnd"/>
+      <w:r>
+        <w:rPr>
+          <w:rFonts w:ascii="MS Gothic" w:eastAsia="MS Gothic" w:hAnsi="MS Gothic"/>
+          <w:kern w:val="0"/>
+          <w:sz w:val="14"/>
+          <w:szCs w:val="14"/>
+        </w:rPr>
+        <w:t>pwdCheckBox}</w:t>
+      </w:r>
+      <w:proofErr w:type="gramStart"/>
+      <w:r>
+        <w:rPr>
+          <w:rFonts w:ascii="MS Gothic" w:eastAsia="MS Gothic" w:hAnsi="MS Gothic"/>
+          <w:kern w:val="0"/>
+          <w:sz w:val="14"/>
+          <w:szCs w:val="14"/>
+        </w:rPr>
+        <w:t>PWD  {</w:t>
+      </w:r>
+      <w:proofErr w:type="gramEnd"/>
+      <w:r>
+        <w:rPr>
+          <w:rFonts w:ascii="MS Gothic" w:eastAsia="MS Gothic" w:hAnsi="MS Gothic"/>
+          <w:kern w:val="0"/>
+          <w:sz w:val="14"/>
+          <w:szCs w:val="14"/>
+        </w:rPr>
+        <w:t>otherCategoryCheckBox}Others: {otherAssistanceText}</w:t>
       </w:r>
     </w:p>
     <w:p>
@@ -1594,7 +1728,25 @@
                 <w:sz w:val="20"/>
                 <w:szCs w:val="20"/>
               </w:rPr>
-              <w:t>{#familyComposition}{name}</w:t>
+              <w:t>{#</w:t>
+            </w:r>
+            <w:proofErr w:type="gramStart"/>
+            <w:r>
+              <w:rPr>
+                <w:rFonts w:ascii="Georgia" w:hAnsi="Georgia" w:cs="Arial"/>
+                <w:sz w:val="20"/>
+                <w:szCs w:val="20"/>
+              </w:rPr>
+              <w:t>familyComposition}{</w:t>
+            </w:r>
+            <w:proofErr w:type="gramEnd"/>
+            <w:r>
+              <w:rPr>
+                <w:rFonts w:ascii="Georgia" w:hAnsi="Georgia" w:cs="Arial"/>
+                <w:sz w:val="20"/>
+                <w:szCs w:val="20"/>
+              </w:rPr>
+              <w:t>name}</w:t>
             </w:r>
           </w:p>
         </w:tc>
@@ -5946,6 +6098,7 @@
                               <w:t xml:space="preserve"> by{</w:t>
                             </w:r>
                             <w:proofErr w:type="spellStart"/>
+                            <w:proofErr w:type="gramStart"/>
                             <w:r>
                               <w:rPr>
                                 <w:sz w:val="16"/>
@@ -5959,7 +6112,15 @@
                                 <w:sz w:val="16"/>
                                 <w:szCs w:val="16"/>
                               </w:rPr>
-                              <w:t>,{MD}}</w:t>
+                              <w:t>,{</w:t>
+                            </w:r>
+                            <w:proofErr w:type="gramEnd"/>
+                            <w:r>
+                              <w:rPr>
+                                <w:sz w:val="16"/>
+                                <w:szCs w:val="16"/>
+                              </w:rPr>
+                              <w:t>MD}}</w:t>
                             </w:r>
                           </w:p>
                           <w:p>
@@ -6009,6 +6170,7 @@
                               <w:t>ifOneMedIsNotAvail</w:t>
                             </w:r>
                             <w:proofErr w:type="spellEnd"/>
+                            <w:proofErr w:type="gramStart"/>
                             <w:r>
                               <w:rPr>
                                 <w:sz w:val="16"/>
@@ -6021,16 +6183,33 @@
                                 <w:sz w:val="16"/>
                                 <w:szCs w:val="16"/>
                               </w:rPr>
-                              <w:t xml:space="preserve">    :</w:t>
+                              <w:t xml:space="preserve">   </w:t>
+                            </w:r>
+                            <w:proofErr w:type="gramEnd"/>
+                            <w:r>
+                              <w:rPr>
+                                <w:sz w:val="16"/>
+                                <w:szCs w:val="16"/>
+                              </w:rPr>
+                              <w:t xml:space="preserve"> :</w:t>
                             </w:r>
                             <w:r>
                               <w:rPr>
                                 <w:sz w:val="16"/>
                                 <w:szCs w:val="16"/>
                               </w:rPr>
-                              <w:t xml:space="preserve">    {</w:t>
+                              <w:t xml:space="preserve"> </w:t>
+                            </w:r>
+                            <w:proofErr w:type="gramStart"/>
+                            <w:r>
+                              <w:rPr>
+                                <w:sz w:val="16"/>
+                                <w:szCs w:val="16"/>
+                              </w:rPr>
+                              <w:t xml:space="preserve">   {</w:t>
                             </w:r>
                             <w:proofErr w:type="spellStart"/>
+                            <w:proofErr w:type="gramEnd"/>
                             <w:r>
                               <w:rPr>
                                 <w:sz w:val="16"/>
@@ -6070,6 +6249,7 @@
                               <w:t>ifTwoMedIsNotAvail</w:t>
                             </w:r>
                             <w:proofErr w:type="spellEnd"/>
+                            <w:proofErr w:type="gramStart"/>
                             <w:r>
                               <w:rPr>
                                 <w:sz w:val="16"/>
@@ -6082,16 +6262,33 @@
                                 <w:sz w:val="16"/>
                                 <w:szCs w:val="16"/>
                               </w:rPr>
-                              <w:t xml:space="preserve">   :</w:t>
+                              <w:t xml:space="preserve">   </w:t>
+                            </w:r>
+                            <w:proofErr w:type="gramEnd"/>
+                            <w:r>
+                              <w:rPr>
+                                <w:sz w:val="16"/>
+                                <w:szCs w:val="16"/>
+                              </w:rPr>
+                              <w:t>:</w:t>
                             </w:r>
                             <w:r>
                               <w:rPr>
                                 <w:sz w:val="16"/>
                                 <w:szCs w:val="16"/>
                               </w:rPr>
-                              <w:t xml:space="preserve">    {</w:t>
+                              <w:t xml:space="preserve"> </w:t>
+                            </w:r>
+                            <w:proofErr w:type="gramStart"/>
+                            <w:r>
+                              <w:rPr>
+                                <w:sz w:val="16"/>
+                                <w:szCs w:val="16"/>
+                              </w:rPr>
+                              <w:t xml:space="preserve">   {</w:t>
                             </w:r>
                             <w:proofErr w:type="spellStart"/>
+                            <w:proofErr w:type="gramEnd"/>
                             <w:r>
                               <w:rPr>
                                 <w:sz w:val="16"/>
@@ -6136,7 +6333,15 @@
                                 <w:sz w:val="16"/>
                                 <w:szCs w:val="16"/>
                               </w:rPr>
-                              <w:t>}}</w:t>
+                              <w:t>}</w:t>
+                            </w:r>
+                            <w:proofErr w:type="gramStart"/>
+                            <w:r>
+                              <w:rPr>
+                                <w:sz w:val="16"/>
+                                <w:szCs w:val="16"/>
+                              </w:rPr>
+                              <w:t>}</w:t>
                             </w:r>
                             <w:r>
                               <w:rPr>
@@ -6145,6 +6350,7 @@
                               </w:rPr>
                               <w:t xml:space="preserve"> :</w:t>
                             </w:r>
+                            <w:proofErr w:type="gramEnd"/>
                             <w:r>
                               <w:rPr>
                                 <w:sz w:val="16"/>
@@ -6192,6 +6398,7 @@
                               <w:t>ifFourMedIsNotAvail</w:t>
                             </w:r>
                             <w:proofErr w:type="spellEnd"/>
+                            <w:proofErr w:type="gramStart"/>
                             <w:r>
                               <w:rPr>
                                 <w:sz w:val="16"/>
@@ -6206,6 +6413,7 @@
                               </w:rPr>
                               <w:t xml:space="preserve">   </w:t>
                             </w:r>
+                            <w:proofErr w:type="gramEnd"/>
                             <w:r>
                               <w:rPr>
                                 <w:sz w:val="16"/>
@@ -6260,6 +6468,7 @@
                               <w:t>ifFiveMedIsNotAvail</w:t>
                             </w:r>
                             <w:proofErr w:type="spellEnd"/>
+                            <w:proofErr w:type="gramStart"/>
                             <w:r>
                               <w:rPr>
                                 <w:sz w:val="16"/>
@@ -6274,6 +6483,7 @@
                               </w:rPr>
                               <w:t xml:space="preserve">   </w:t>
                             </w:r>
+                            <w:proofErr w:type="gramEnd"/>
                             <w:r>
                               <w:rPr>
                                 <w:sz w:val="16"/>
@@ -6325,7 +6535,23 @@
                                 <w:sz w:val="16"/>
                                 <w:szCs w:val="16"/>
                               </w:rPr>
-                              <w:t>{Given this {date}day of {month},{year}}</w:t>
+                              <w:t>{Given this {date}day of {month</w:t>
+                            </w:r>
+                            <w:proofErr w:type="gramStart"/>
+                            <w:r>
+                              <w:rPr>
+                                <w:sz w:val="16"/>
+                                <w:szCs w:val="16"/>
+                              </w:rPr>
+                              <w:t>},{</w:t>
+                            </w:r>
+                            <w:proofErr w:type="gramEnd"/>
+                            <w:r>
+                              <w:rPr>
+                                <w:sz w:val="16"/>
+                                <w:szCs w:val="16"/>
+                              </w:rPr>
+                              <w:t>year}}</w:t>
                             </w:r>
                           </w:p>
                           <w:p>

</xml_diff>